<commit_message>
docs: align delivery evidence round 2
</commit_message>
<xml_diff>
--- a/docs/design/cc_ep_deliverable2_verification_reliability_ha.docx
+++ b/docs/design/cc_ep_deliverable2_verification_reliability_ha.docx
@@ -384,8 +384,7 @@
     <w:p>
       <w:pPr>
         <w:jc w:val="center"/>
-        <w:keepNext/>
-        <w:spacing w:before="100" w:after="40"/>
+        <w:spacing w:before="100" w:after="40" w:line="240" w:lineRule="auto"/>
       </w:pPr>
       <w:r>
         <w:drawing>
@@ -957,18 +956,6 @@
     </w:p>
     <w:p>
       <w:pPr>
-        <w:pStyle w:val="Heading2"/>
-        <w:keepNext/>
-      </w:pPr>
-      <w:r>
-        <w:rPr>
-          <w:rFonts w:ascii="Calibri" w:hAnsi="Calibri" w:eastAsia="SimHei" w:cs="Calibri"/>
-        </w:rPr>
-        <w:t xml:space="preserve">2. 验证方法</w:t>
-      </w:r>
-    </w:p>
-    <w:p>
-      <w:pPr>
         <w:pStyle w:val="Heading3"/>
         <w:keepNext/>
       </w:pPr>
@@ -976,296 +963,7 @@
         <w:rPr>
           <w:rFonts w:ascii="Calibri" w:hAnsi="Calibri" w:eastAsia="SimHei" w:cs="Calibri"/>
         </w:rPr>
-        <w:t xml:space="preserve">2.1 模型分层</w:t>
-      </w:r>
-    </w:p>
-    <w:p>
-      <w:pPr>
-        <w:ind w:left="0" w:firstLine="420"/>
-      </w:pPr>
-      <w:r>
-        <w:rPr>
-          <w:rFonts w:ascii="Calibri" w:hAnsi="Calibri" w:eastAsia="Microsoft YaHei" w:cs="Calibri"/>
-        </w:rPr>
-        <w:t xml:space="preserve">验证模型按职责划分为四层：</w:t>
-      </w:r>
-    </w:p>
-    <w:p>
-      <w:pPr>
-        <w:ind w:left="0" w:firstLine="420"/>
-      </w:pPr>
-      <w:r>
-        <w:rPr>
-          <w:rFonts w:ascii="Calibri" w:hAnsi="Calibri" w:eastAsia="Microsoft YaHei" w:cs="Calibri"/>
-        </w:rPr>
-        <w:t xml:space="preserve">1. 目录核心层：请求、授权、Clear、Recall、Invalidate 和目录提交；</w:t>
-      </w:r>
-    </w:p>
-    <w:p>
-      <w:pPr>
-        <w:ind w:left="0" w:firstLine="420"/>
-      </w:pPr>
-      <w:r>
-        <w:rPr>
-          <w:rFonts w:ascii="Calibri" w:hAnsi="Calibri" w:eastAsia="Microsoft YaHei" w:cs="Calibri"/>
-        </w:rPr>
-        <w:t xml:space="preserve">2. 并发机制层：同址 outstanding、waiter、partial Ack 和 snoop 仲裁；</w:t>
-      </w:r>
-    </w:p>
-    <w:p>
-      <w:pPr>
-        <w:ind w:left="0" w:firstLine="420"/>
-      </w:pPr>
-      <w:r>
-        <w:rPr>
-          <w:rFonts w:ascii="Calibri" w:hAnsi="Calibri" w:eastAsia="Microsoft YaHei" w:cs="Calibri"/>
-        </w:rPr>
-        <w:t xml:space="preserve">3. 拓扑隔离层：多 PA、多节点和多 Socket 状态隔离；</w:t>
-      </w:r>
-    </w:p>
-    <w:p>
-      <w:pPr>
-        <w:ind w:left="0" w:firstLine="420"/>
-      </w:pPr>
-      <w:r>
-        <w:rPr>
-          <w:rFonts w:ascii="Calibri" w:hAnsi="Calibri" w:eastAsia="Microsoft YaHei" w:cs="Calibri"/>
-        </w:rPr>
-        <w:t xml:space="preserve">4. 故障传输层：消息丢失、重复、延迟和乱序。</w:t>
-      </w:r>
-    </w:p>
-    <w:p>
-      <w:pPr>
-        <w:ind w:left="0" w:firstLine="420"/>
-      </w:pPr>
-      <w:r>
-        <w:rPr>
-          <w:rFonts w:ascii="Calibri" w:hAnsi="Calibri" w:eastAsia="Microsoft YaHei" w:cs="Calibri"/>
-        </w:rPr>
-        <w:t xml:space="preserve">每个模型只承担明确的协议论证职责，最终由端到端测试补充真实数据路径、缓存容量和运行拓扑。</w:t>
-      </w:r>
-    </w:p>
-    <w:p>
-      <w:pPr>
-        <w:pStyle w:val="Heading3"/>
-        <w:keepNext/>
-      </w:pPr>
-      <w:r>
-        <w:rPr>
-          <w:rFonts w:ascii="Calibri" w:hAnsi="Calibri" w:eastAsia="SimHei" w:cs="Calibri"/>
-        </w:rPr>
-        <w:t xml:space="preserve">2.2 Safety 属性</w:t>
-      </w:r>
-    </w:p>
-    <w:p>
-      <w:pPr>
-        <w:ind w:left="0" w:firstLine="420"/>
-      </w:pPr>
-      <w:r>
-        <w:rPr>
-          <w:rFonts w:ascii="Calibri" w:hAnsi="Calibri" w:eastAsia="Microsoft YaHei" w:cs="Calibri"/>
-        </w:rPr>
-        <w:t xml:space="preserve">形式化验证中的主要 Safety 属性包括：</w:t>
-      </w:r>
-    </w:p>
-    <w:p>
-      <w:pPr>
-        <w:ind w:left="360" w:firstLine="0"/>
-      </w:pPr>
-      <w:r>
-        <w:rPr>
-          <w:rFonts w:ascii="Calibri" w:hAnsi="Calibri" w:eastAsia="Microsoft YaHei" w:cs="Calibri"/>
-        </w:rPr>
-        <w:t xml:space="preserve">• 同一缓存行至多存在一个有效写 owner；</w:t>
-      </w:r>
-    </w:p>
-    <w:p>
-      <w:pPr>
-        <w:ind w:left="360" w:firstLine="0"/>
-      </w:pPr>
-      <w:r>
-        <w:rPr>
-          <w:rFonts w:ascii="Calibri" w:hAnsi="Calibri" w:eastAsia="Microsoft YaHei" w:cs="Calibri"/>
-        </w:rPr>
-        <w:t xml:space="preserve">• owner 与 sharer 集合满足状态约束；</w:t>
-      </w:r>
-    </w:p>
-    <w:p>
-      <w:pPr>
-        <w:ind w:left="360" w:firstLine="0"/>
-      </w:pPr>
-      <w:r>
-        <w:rPr>
-          <w:rFonts w:ascii="Calibri" w:hAnsi="Calibri" w:eastAsia="Microsoft YaHei" w:cs="Calibri"/>
-        </w:rPr>
-        <w:t xml:space="preserve">• committed epoch 不回退；</w:t>
-      </w:r>
-    </w:p>
-    <w:p>
-      <w:pPr>
-        <w:ind w:left="360" w:firstLine="0"/>
-      </w:pPr>
-      <w:r>
-        <w:rPr>
-          <w:rFonts w:ascii="Calibri" w:hAnsi="Calibri" w:eastAsia="Microsoft YaHei" w:cs="Calibri"/>
-        </w:rPr>
-        <w:t xml:space="preserve">• 过期消息不能覆盖新目录状态；</w:t>
-      </w:r>
-    </w:p>
-    <w:p>
-      <w:pPr>
-        <w:ind w:left="360" w:firstLine="0"/>
-      </w:pPr>
-      <w:r>
-        <w:rPr>
-          <w:rFonts w:ascii="Calibri" w:hAnsi="Calibri" w:eastAsia="Microsoft YaHei" w:cs="Calibri"/>
-        </w:rPr>
-        <w:t xml:space="preserve">• 重复 Ack 不重复推进事务；</w:t>
-      </w:r>
-    </w:p>
-    <w:p>
-      <w:pPr>
-        <w:ind w:left="360" w:firstLine="0"/>
-      </w:pPr>
-      <w:r>
-        <w:rPr>
-          <w:rFonts w:ascii="Calibri" w:hAnsi="Calibri" w:eastAsia="Microsoft YaHei" w:cs="Calibri"/>
-        </w:rPr>
-        <w:t xml:space="preserve">• Clear 只提交匹配的 epoch、reqId 和 requester；</w:t>
-      </w:r>
-    </w:p>
-    <w:p>
-      <w:pPr>
-        <w:ind w:left="360" w:firstLine="0"/>
-      </w:pPr>
-      <w:r>
-        <w:rPr>
-          <w:rFonts w:ascii="Calibri" w:hAnsi="Calibri" w:eastAsia="Microsoft YaHei" w:cs="Calibri"/>
-        </w:rPr>
-        <w:t xml:space="preserve">• 不同 PA 和不同 Socket 的事务互不污染；</w:t>
-      </w:r>
-    </w:p>
-    <w:p>
-      <w:pPr>
-        <w:ind w:left="360" w:firstLine="0"/>
-      </w:pPr>
-      <w:r>
-        <w:rPr>
-          <w:rFonts w:ascii="Calibri" w:hAnsi="Calibri" w:eastAsia="Microsoft YaHei" w:cs="Calibri"/>
-        </w:rPr>
-        <w:t xml:space="preserve">• 已完成 waiter 不被重复重放。</w:t>
-      </w:r>
-    </w:p>
-    <w:p>
-      <w:pPr>
-        <w:pStyle w:val="Heading3"/>
-        <w:keepNext/>
-      </w:pPr>
-      <w:r>
-        <w:rPr>
-          <w:rFonts w:ascii="Calibri" w:hAnsi="Calibri" w:eastAsia="SimHei" w:cs="Calibri"/>
-        </w:rPr>
-        <w:t xml:space="preserve">2.3 Liveness 属性</w:t>
-      </w:r>
-    </w:p>
-    <w:p>
-      <w:pPr>
-        <w:ind w:left="0" w:firstLine="420"/>
-      </w:pPr>
-      <w:r>
-        <w:rPr>
-          <w:rFonts w:ascii="Calibri" w:hAnsi="Calibri" w:eastAsia="Microsoft YaHei" w:cs="Calibri"/>
-        </w:rPr>
-        <w:t xml:space="preserve">主要 Liveness 属性包括：</w:t>
-      </w:r>
-    </w:p>
-    <w:p>
-      <w:pPr>
-        <w:ind w:left="360" w:firstLine="0"/>
-      </w:pPr>
-      <w:r>
-        <w:rPr>
-          <w:rFonts w:ascii="Calibri" w:hAnsi="Calibri" w:eastAsia="Microsoft YaHei" w:cs="Calibri"/>
-        </w:rPr>
-        <w:t xml:space="preserve">• 在消息最终可达的条件下，请求最终获得授权或明确重试；</w:t>
-      </w:r>
-    </w:p>
-    <w:p>
-      <w:pPr>
-        <w:ind w:left="360" w:firstLine="0"/>
-      </w:pPr>
-      <w:r>
-        <w:rPr>
-          <w:rFonts w:ascii="Calibri" w:hAnsi="Calibri" w:eastAsia="Microsoft YaHei" w:cs="Calibri"/>
-        </w:rPr>
-        <w:t xml:space="preserve">• Recall 最终返回数据或完成 owner 降级；</w:t>
-      </w:r>
-    </w:p>
-    <w:p>
-      <w:pPr>
-        <w:ind w:left="360" w:firstLine="0"/>
-      </w:pPr>
-      <w:r>
-        <w:rPr>
-          <w:rFonts w:ascii="Calibri" w:hAnsi="Calibri" w:eastAsia="Microsoft YaHei" w:cs="Calibri"/>
-        </w:rPr>
-        <w:t xml:space="preserve">• Invalidate 在目标 Ack 收敛后完成；</w:t>
-      </w:r>
-    </w:p>
-    <w:p>
-      <w:pPr>
-        <w:ind w:left="360" w:firstLine="0"/>
-      </w:pPr>
-      <w:r>
-        <w:rPr>
-          <w:rFonts w:ascii="Calibri" w:hAnsi="Calibri" w:eastAsia="Microsoft YaHei" w:cs="Calibri"/>
-        </w:rPr>
-        <w:t xml:space="preserve">• Clear 完成后 outstanding 被退役；</w:t>
-      </w:r>
-    </w:p>
-    <w:p>
-      <w:pPr>
-        <w:ind w:left="360" w:firstLine="0"/>
-      </w:pPr>
-      <w:r>
-        <w:rPr>
-          <w:rFonts w:ascii="Calibri" w:hAnsi="Calibri" w:eastAsia="Microsoft YaHei" w:cs="Calibri"/>
-        </w:rPr>
-        <w:t xml:space="preserve">• waiter 在阻塞条件解除后得到重放；</w:t>
-      </w:r>
-    </w:p>
-    <w:p>
-      <w:pPr>
-        <w:ind w:left="360" w:firstLine="0"/>
-      </w:pPr>
-      <w:r>
-        <w:rPr>
-          <w:rFonts w:ascii="Calibri" w:hAnsi="Calibri" w:eastAsia="Microsoft YaHei" w:cs="Calibri"/>
-        </w:rPr>
-        <w:t xml:space="preserve">• EP-RNF 同址 snoop 不形成循环等待。</w:t>
-      </w:r>
-    </w:p>
-    <w:p>
-      <w:pPr>
-        <w:pStyle w:val="Heading3"/>
-        <w:keepNext/>
-      </w:pPr>
-      <w:r>
-        <w:rPr>
-          <w:rFonts w:ascii="Calibri" w:hAnsi="Calibri" w:eastAsia="SimHei" w:cs="Calibri"/>
-        </w:rPr>
-        <w:t xml:space="preserve">2.4 模型与实现对应</w:t>
-      </w:r>
-    </w:p>
-    <w:p>
-      <w:pPr>
-        <w:ind w:left="0" w:firstLine="420"/>
-      </w:pPr>
-      <w:r>
-        <w:rPr>
-          <w:rFonts w:ascii="Calibri" w:hAnsi="Calibri" w:eastAsia="Microsoft YaHei" w:cs="Calibri"/>
-        </w:rPr>
-        <w:t xml:space="preserve">模型动作与实现机制采用稳定语义对应，而不依赖源码行号：</w:t>
+        <w:t xml:space="preserve">1.4 结论与范围</w:t>
       </w:r>
     </w:p>
     <w:tbl>
@@ -1302,7 +1000,7 @@
                 <w:sz w:val="18"/>
                 <w:szCs w:val="18"/>
               </w:rPr>
-              <w:t xml:space="preserve">模型动作</w:t>
+              <w:t xml:space="preserve">项目</w:t>
             </w:r>
           </w:p>
         </w:tc>
@@ -1323,294 +1021,264 @@
                 <w:sz w:val="18"/>
                 <w:szCs w:val="18"/>
               </w:rPr>
-              <w:t xml:space="preserve">实现机制</w:t>
-            </w:r>
-          </w:p>
-        </w:tc>
-      </w:tr>
-      <w:tr>
-        <w:trPr>
-          <w:cantSplit/>
-        </w:trPr>
-        <w:tc>
-          <w:tcPr/>
-          <w:p>
-            <w:pPr>
-              <w:pStyle w:val="TableText"/>
-              <w:jc w:val="left"/>
-              <w:spacing w:before="0" w:after="0" w:line="320" w:lineRule="exact"/>
-            </w:pPr>
-            <w:r>
-              <w:rPr>
-                <w:rFonts w:ascii="Calibri" w:hAnsi="Calibri" w:eastAsia="Microsoft YaHei" w:cs="Calibri"/>
-                <w:sz w:val="18"/>
-                <w:szCs w:val="18"/>
-              </w:rPr>
-              <w:t xml:space="preserve">RequestGrant</w:t>
-            </w:r>
-          </w:p>
-        </w:tc>
-        <w:tc>
-          <w:tcPr/>
-          <w:p>
-            <w:pPr>
-              <w:pStyle w:val="TableText"/>
-              <w:jc w:val="left"/>
-              <w:spacing w:before="0" w:after="0" w:line="320" w:lineRule="exact"/>
-            </w:pPr>
-            <w:r>
-              <w:rPr>
-                <w:rFonts w:ascii="Calibri" w:hAnsi="Calibri" w:eastAsia="Microsoft YaHei" w:cs="Calibri"/>
-                <w:sz w:val="18"/>
-                <w:szCs w:val="18"/>
-              </w:rPr>
-              <w:t xml:space="preserve">UBCC 请求仲裁与 intended state 建立</w:t>
-            </w:r>
-          </w:p>
-        </w:tc>
-      </w:tr>
-      <w:tr>
-        <w:trPr>
-          <w:cantSplit/>
-        </w:trPr>
-        <w:tc>
-          <w:tcPr/>
-          <w:p>
-            <w:pPr>
-              <w:pStyle w:val="TableText"/>
-              <w:jc w:val="left"/>
-              <w:spacing w:before="0" w:after="0" w:line="320" w:lineRule="exact"/>
-            </w:pPr>
-            <w:r>
-              <w:rPr>
-                <w:rFonts w:ascii="Calibri" w:hAnsi="Calibri" w:eastAsia="Microsoft YaHei" w:cs="Calibri"/>
-                <w:sz w:val="18"/>
-                <w:szCs w:val="18"/>
-              </w:rPr>
-              <w:t xml:space="preserve">RecallOwner</w:t>
-            </w:r>
-          </w:p>
-        </w:tc>
-        <w:tc>
-          <w:tcPr/>
-          <w:p>
-            <w:pPr>
-              <w:pStyle w:val="TableText"/>
-              <w:jc w:val="left"/>
-              <w:spacing w:before="0" w:after="0" w:line="320" w:lineRule="exact"/>
-            </w:pPr>
-            <w:r>
-              <w:rPr>
-                <w:rFonts w:ascii="Calibri" w:hAnsi="Calibri" w:eastAsia="Microsoft YaHei" w:cs="Calibri"/>
-                <w:sz w:val="18"/>
-                <w:szCs w:val="18"/>
-              </w:rPr>
-              <w:t xml:space="preserve">RecallReq / RecallResp 数据回收</w:t>
-            </w:r>
-          </w:p>
-        </w:tc>
-      </w:tr>
-      <w:tr>
-        <w:trPr>
-          <w:cantSplit/>
-        </w:trPr>
-        <w:tc>
-          <w:tcPr/>
-          <w:p>
-            <w:pPr>
-              <w:pStyle w:val="TableText"/>
-              <w:jc w:val="left"/>
-              <w:spacing w:before="0" w:after="0" w:line="320" w:lineRule="exact"/>
-            </w:pPr>
-            <w:r>
-              <w:rPr>
-                <w:rFonts w:ascii="Calibri" w:hAnsi="Calibri" w:eastAsia="Microsoft YaHei" w:cs="Calibri"/>
-                <w:sz w:val="18"/>
-                <w:szCs w:val="18"/>
-              </w:rPr>
-              <w:t xml:space="preserve">InvalidateSharers</w:t>
-            </w:r>
-          </w:p>
-        </w:tc>
-        <w:tc>
-          <w:tcPr/>
-          <w:p>
-            <w:pPr>
-              <w:pStyle w:val="TableText"/>
-              <w:jc w:val="left"/>
-              <w:spacing w:before="0" w:after="0" w:line="320" w:lineRule="exact"/>
-            </w:pPr>
-            <w:r>
-              <w:rPr>
-                <w:rFonts w:ascii="Calibri" w:hAnsi="Calibri" w:eastAsia="Microsoft YaHei" w:cs="Calibri"/>
-                <w:sz w:val="18"/>
-                <w:szCs w:val="18"/>
-              </w:rPr>
-              <w:t xml:space="preserve">目标集合冻结、InvalidateReq 和 Ack 位图</w:t>
-            </w:r>
-          </w:p>
-        </w:tc>
-      </w:tr>
-      <w:tr>
-        <w:trPr>
-          <w:cantSplit/>
-        </w:trPr>
-        <w:tc>
-          <w:tcPr/>
-          <w:p>
-            <w:pPr>
-              <w:pStyle w:val="TableText"/>
-              <w:jc w:val="left"/>
-              <w:spacing w:before="0" w:after="0" w:line="320" w:lineRule="exact"/>
-            </w:pPr>
-            <w:r>
-              <w:rPr>
-                <w:rFonts w:ascii="Calibri" w:hAnsi="Calibri" w:eastAsia="Microsoft YaHei" w:cs="Calibri"/>
-                <w:sz w:val="18"/>
-                <w:szCs w:val="18"/>
-              </w:rPr>
-              <w:t xml:space="preserve">ClearCommit</w:t>
-            </w:r>
-          </w:p>
-        </w:tc>
-        <w:tc>
-          <w:tcPr/>
-          <w:p>
-            <w:pPr>
-              <w:pStyle w:val="TableText"/>
-              <w:jc w:val="left"/>
-              <w:spacing w:before="0" w:after="0" w:line="320" w:lineRule="exact"/>
-            </w:pPr>
-            <w:r>
-              <w:rPr>
-                <w:rFonts w:ascii="Calibri" w:hAnsi="Calibri" w:eastAsia="Microsoft YaHei" w:cs="Calibri"/>
-                <w:sz w:val="18"/>
-                <w:szCs w:val="18"/>
-              </w:rPr>
-              <w:t xml:space="preserve">Clear 身份校验与目录提交</w:t>
-            </w:r>
-          </w:p>
-        </w:tc>
-      </w:tr>
-      <w:tr>
-        <w:trPr>
-          <w:cantSplit/>
-        </w:trPr>
-        <w:tc>
-          <w:tcPr/>
-          <w:p>
-            <w:pPr>
-              <w:pStyle w:val="TableText"/>
-              <w:jc w:val="left"/>
-              <w:spacing w:before="0" w:after="0" w:line="320" w:lineRule="exact"/>
-            </w:pPr>
-            <w:r>
-              <w:rPr>
-                <w:rFonts w:ascii="Calibri" w:hAnsi="Calibri" w:eastAsia="Microsoft YaHei" w:cs="Calibri"/>
-                <w:sz w:val="18"/>
-                <w:szCs w:val="18"/>
-              </w:rPr>
-              <w:t xml:space="preserve">RetireWaiter</w:t>
-            </w:r>
-          </w:p>
-        </w:tc>
-        <w:tc>
-          <w:tcPr/>
-          <w:p>
-            <w:pPr>
-              <w:pStyle w:val="TableText"/>
-              <w:jc w:val="left"/>
-              <w:spacing w:before="0" w:after="0" w:line="320" w:lineRule="exact"/>
-            </w:pPr>
-            <w:r>
-              <w:rPr>
-                <w:rFonts w:ascii="Calibri" w:hAnsi="Calibri" w:eastAsia="Microsoft YaHei" w:cs="Calibri"/>
-                <w:sz w:val="18"/>
-                <w:szCs w:val="18"/>
-              </w:rPr>
-              <w:t xml:space="preserve">已完成 Read waiter 精确退役</w:t>
-            </w:r>
-          </w:p>
-        </w:tc>
-      </w:tr>
-      <w:tr>
-        <w:trPr>
-          <w:cantSplit/>
-        </w:trPr>
-        <w:tc>
-          <w:tcPr/>
-          <w:p>
-            <w:pPr>
-              <w:pStyle w:val="TableText"/>
-              <w:jc w:val="left"/>
-              <w:spacing w:before="0" w:after="0" w:line="320" w:lineRule="exact"/>
-            </w:pPr>
-            <w:r>
-              <w:rPr>
-                <w:rFonts w:ascii="Calibri" w:hAnsi="Calibri" w:eastAsia="Microsoft YaHei" w:cs="Calibri"/>
-                <w:sz w:val="18"/>
-                <w:szCs w:val="18"/>
-              </w:rPr>
-              <w:t xml:space="preserve">ReplayWaiter</w:t>
-            </w:r>
-          </w:p>
-        </w:tc>
-        <w:tc>
-          <w:tcPr/>
-          <w:p>
-            <w:pPr>
-              <w:pStyle w:val="TableText"/>
-              <w:jc w:val="left"/>
-              <w:spacing w:before="0" w:after="0" w:line="320" w:lineRule="exact"/>
-            </w:pPr>
-            <w:r>
-              <w:rPr>
-                <w:rFonts w:ascii="Calibri" w:hAnsi="Calibri" w:eastAsia="Microsoft YaHei" w:cs="Calibri"/>
-                <w:sz w:val="18"/>
-                <w:szCs w:val="18"/>
-              </w:rPr>
-              <w:t xml:space="preserve">阻塞条件解除后的请求重放</w:t>
-            </w:r>
-          </w:p>
-        </w:tc>
-      </w:tr>
-      <w:tr>
-        <w:trPr>
-          <w:cantSplit/>
-        </w:trPr>
-        <w:tc>
-          <w:tcPr/>
-          <w:p>
-            <w:pPr>
-              <w:pStyle w:val="TableText"/>
-              <w:jc w:val="left"/>
-              <w:spacing w:before="0" w:after="0" w:line="320" w:lineRule="exact"/>
-            </w:pPr>
-            <w:r>
-              <w:rPr>
-                <w:rFonts w:ascii="Calibri" w:hAnsi="Calibri" w:eastAsia="Microsoft YaHei" w:cs="Calibri"/>
-                <w:sz w:val="18"/>
-                <w:szCs w:val="18"/>
-              </w:rPr>
-              <w:t xml:space="preserve">SnoopArbitrate</w:t>
-            </w:r>
-          </w:p>
-        </w:tc>
-        <w:tc>
-          <w:tcPr/>
-          <w:p>
-            <w:pPr>
-              <w:pStyle w:val="TableText"/>
-              <w:jc w:val="left"/>
-              <w:spacing w:before="0" w:after="0" w:line="320" w:lineRule="exact"/>
-            </w:pPr>
-            <w:r>
-              <w:rPr>
-                <w:rFonts w:ascii="Calibri" w:hAnsi="Calibri" w:eastAsia="Microsoft YaHei" w:cs="Calibri"/>
-                <w:sz w:val="18"/>
-                <w:szCs w:val="18"/>
-              </w:rPr>
-              <w:t xml:space="preserve">EP-RNF 对同址 snoop 的 immediate/stale 仲裁</w:t>
+              <w:t xml:space="preserve">结论</w:t>
+            </w:r>
+          </w:p>
+        </w:tc>
+        <w:tc>
+          <w:tcPr>
+            <w:shd w:val="clear" w:color="auto" w:fill="D9E2F3"/>
+          </w:tcPr>
+          <w:p>
+            <w:pPr>
+              <w:pStyle w:val="TableText"/>
+              <w:jc w:val="left"/>
+              <w:spacing w:before="0" w:after="0" w:line="320" w:lineRule="exact"/>
+            </w:pPr>
+            <w:r>
+              <w:rPr>
+                <w:rFonts w:ascii="Calibri" w:hAnsi="Calibri" w:eastAsia="SimHei" w:cs="Calibri"/>
+                <w:b/>
+                <w:sz w:val="18"/>
+                <w:szCs w:val="18"/>
+              </w:rPr>
+              <w:t xml:space="preserve">适用范围</w:t>
+            </w:r>
+          </w:p>
+        </w:tc>
+      </w:tr>
+      <w:tr>
+        <w:trPr>
+          <w:cantSplit/>
+        </w:trPr>
+        <w:tc>
+          <w:tcPr/>
+          <w:p>
+            <w:pPr>
+              <w:pStyle w:val="TableText"/>
+              <w:jc w:val="left"/>
+              <w:spacing w:before="0" w:after="0" w:line="320" w:lineRule="exact"/>
+            </w:pPr>
+            <w:r>
+              <w:rPr>
+                <w:rFonts w:ascii="Calibri" w:hAnsi="Calibri" w:eastAsia="Microsoft YaHei" w:cs="Calibri"/>
+                <w:sz w:val="18"/>
+                <w:szCs w:val="18"/>
+              </w:rPr>
+              <w:t xml:space="preserve">实现验证</w:t>
+            </w:r>
+          </w:p>
+        </w:tc>
+        <w:tc>
+          <w:tcPr/>
+          <w:p>
+            <w:pPr>
+              <w:pStyle w:val="TableText"/>
+              <w:jc w:val="left"/>
+              <w:spacing w:before="0" w:after="0" w:line="320" w:lineRule="exact"/>
+            </w:pPr>
+            <w:r>
+              <w:rPr>
+                <w:rFonts w:ascii="Calibri" w:hAnsi="Calibri" w:eastAsia="Microsoft YaHei" w:cs="Calibri"/>
+                <w:sz w:val="18"/>
+                <w:szCs w:val="18"/>
+              </w:rPr>
+              <w:t xml:space="preserve">端到端、O3、多拓扑与 Q1-Q5 资格结果通过</w:t>
+            </w:r>
+          </w:p>
+        </w:tc>
+        <w:tc>
+          <w:tcPr/>
+          <w:p>
+            <w:pPr>
+              <w:pStyle w:val="TableText"/>
+              <w:jc w:val="left"/>
+              <w:spacing w:before="0" w:after="0" w:line="320" w:lineRule="exact"/>
+            </w:pPr>
+            <w:r>
+              <w:rPr>
+                <w:rFonts w:ascii="Calibri" w:hAnsi="Calibri" w:eastAsia="Microsoft YaHei" w:cs="Calibri"/>
+                <w:sz w:val="18"/>
+                <w:szCs w:val="18"/>
+              </w:rPr>
+              <w:t xml:space="preserve">当前实现及冻结可执行场景</w:t>
+            </w:r>
+          </w:p>
+        </w:tc>
+      </w:tr>
+      <w:tr>
+        <w:trPr>
+          <w:cantSplit/>
+        </w:trPr>
+        <w:tc>
+          <w:tcPr/>
+          <w:p>
+            <w:pPr>
+              <w:pStyle w:val="TableText"/>
+              <w:jc w:val="left"/>
+              <w:spacing w:before="0" w:after="0" w:line="320" w:lineRule="exact"/>
+            </w:pPr>
+            <w:r>
+              <w:rPr>
+                <w:rFonts w:ascii="Calibri" w:hAnsi="Calibri" w:eastAsia="Microsoft YaHei" w:cs="Calibri"/>
+                <w:sz w:val="18"/>
+                <w:szCs w:val="18"/>
+              </w:rPr>
+              <w:t xml:space="preserve">形式化验证</w:t>
+            </w:r>
+          </w:p>
+        </w:tc>
+        <w:tc>
+          <w:tcPr/>
+          <w:p>
+            <w:pPr>
+              <w:pStyle w:val="TableText"/>
+              <w:jc w:val="left"/>
+              <w:spacing w:before="0" w:after="0" w:line="320" w:lineRule="exact"/>
+            </w:pPr>
+            <w:r>
+              <w:rPr>
+                <w:rFonts w:ascii="Calibri" w:hAnsi="Calibri" w:eastAsia="Microsoft YaHei" w:cs="Calibri"/>
+                <w:sz w:val="18"/>
+                <w:szCs w:val="18"/>
+              </w:rPr>
+              <w:t xml:space="preserve">核心模型与 focused 模型覆盖各自声明的 Safety/Liveness 性质</w:t>
+            </w:r>
+          </w:p>
+        </w:tc>
+        <w:tc>
+          <w:tcPr/>
+          <w:p>
+            <w:pPr>
+              <w:pStyle w:val="TableText"/>
+              <w:jc w:val="left"/>
+              <w:spacing w:before="0" w:after="0" w:line="320" w:lineRule="exact"/>
+            </w:pPr>
+            <w:r>
+              <w:rPr>
+                <w:rFonts w:ascii="Calibri" w:hAnsi="Calibri" w:eastAsia="Microsoft YaHei" w:cs="Calibri"/>
+                <w:sz w:val="18"/>
+                <w:szCs w:val="18"/>
+              </w:rPr>
+              <w:t xml:space="preserve">有界状态、抽象环境与模型公平性假设</w:t>
+            </w:r>
+          </w:p>
+        </w:tc>
+      </w:tr>
+      <w:tr>
+        <w:trPr>
+          <w:cantSplit/>
+        </w:trPr>
+        <w:tc>
+          <w:tcPr/>
+          <w:p>
+            <w:pPr>
+              <w:pStyle w:val="TableText"/>
+              <w:jc w:val="left"/>
+              <w:spacing w:before="0" w:after="0" w:line="320" w:lineRule="exact"/>
+            </w:pPr>
+            <w:r>
+              <w:rPr>
+                <w:rFonts w:ascii="Calibri" w:hAnsi="Calibri" w:eastAsia="Microsoft YaHei" w:cs="Calibri"/>
+                <w:sz w:val="18"/>
+                <w:szCs w:val="18"/>
+              </w:rPr>
+              <w:t xml:space="preserve">HA 比较</w:t>
+            </w:r>
+          </w:p>
+        </w:tc>
+        <w:tc>
+          <w:tcPr/>
+          <w:p>
+            <w:pPr>
+              <w:pStyle w:val="TableText"/>
+              <w:jc w:val="left"/>
+              <w:spacing w:before="0" w:after="0" w:line="320" w:lineRule="exact"/>
+            </w:pPr>
+            <w:r>
+              <w:rPr>
+                <w:rFonts w:ascii="Calibri" w:hAnsi="Calibri" w:eastAsia="Microsoft YaHei" w:cs="Calibri"/>
+                <w:sz w:val="18"/>
+                <w:szCs w:val="18"/>
+              </w:rPr>
+              <w:t xml:space="preserve">冻结 HA-VI 参考范围内聚合结果支持 UBCC 优势</w:t>
+            </w:r>
+          </w:p>
+        </w:tc>
+        <w:tc>
+          <w:tcPr/>
+          <w:p>
+            <w:pPr>
+              <w:pStyle w:val="TableText"/>
+              <w:jc w:val="left"/>
+              <w:spacing w:before="0" w:after="0" w:line="320" w:lineRule="exact"/>
+            </w:pPr>
+            <w:r>
+              <w:rPr>
+                <w:rFonts w:ascii="Calibri" w:hAnsi="Calibri" w:eastAsia="Microsoft YaHei" w:cs="Calibri"/>
+                <w:sz w:val="18"/>
+                <w:szCs w:val="18"/>
+              </w:rPr>
+              <w:t xml:space="preserve">2N1S、O3、单向完成语义和两个 L3 压力点</w:t>
+            </w:r>
+          </w:p>
+        </w:tc>
+      </w:tr>
+      <w:tr>
+        <w:trPr>
+          <w:cantSplit/>
+        </w:trPr>
+        <w:tc>
+          <w:tcPr/>
+          <w:p>
+            <w:pPr>
+              <w:pStyle w:val="TableText"/>
+              <w:jc w:val="left"/>
+              <w:spacing w:before="0" w:after="0" w:line="320" w:lineRule="exact"/>
+            </w:pPr>
+            <w:r>
+              <w:rPr>
+                <w:rFonts w:ascii="Calibri" w:hAnsi="Calibri" w:eastAsia="Microsoft YaHei" w:cs="Calibri"/>
+                <w:sz w:val="18"/>
+                <w:szCs w:val="18"/>
+              </w:rPr>
+              <w:t xml:space="preserve">范围外</w:t>
+            </w:r>
+          </w:p>
+        </w:tc>
+        <w:tc>
+          <w:tcPr/>
+          <w:p>
+            <w:pPr>
+              <w:pStyle w:val="TableText"/>
+              <w:jc w:val="left"/>
+              <w:spacing w:before="0" w:after="0" w:line="320" w:lineRule="exact"/>
+            </w:pPr>
+            <w:r>
+              <w:rPr>
+                <w:rFonts w:ascii="Calibri" w:hAnsi="Calibri" w:eastAsia="Microsoft YaHei" w:cs="Calibri"/>
+                <w:sz w:val="18"/>
+                <w:szCs w:val="18"/>
+              </w:rPr>
+              <w:t xml:space="preserve">不作本次交付能力主张</w:t>
+            </w:r>
+          </w:p>
+        </w:tc>
+        <w:tc>
+          <w:tcPr/>
+          <w:p>
+            <w:pPr>
+              <w:pStyle w:val="TableText"/>
+              <w:jc w:val="left"/>
+              <w:spacing w:before="0" w:after="0" w:line="320" w:lineRule="exact"/>
+            </w:pPr>
+            <w:r>
+              <w:rPr>
+                <w:rFonts w:ascii="Calibri" w:hAnsi="Calibri" w:eastAsia="Microsoft YaHei" w:cs="Calibri"/>
+                <w:sz w:val="18"/>
+                <w:szCs w:val="18"/>
+              </w:rPr>
+              <w:t xml:space="preserve">永久 Home 故障在线恢复、物理芯片和端口级 Switch 微体系结构</w:t>
             </w:r>
           </w:p>
         </w:tc>
@@ -1625,7 +1293,7 @@
         <w:rPr>
           <w:rFonts w:ascii="Calibri" w:hAnsi="Calibri" w:eastAsia="SimHei" w:cs="Calibri"/>
         </w:rPr>
-        <w:t xml:space="preserve">3. 形式化验证结果</w:t>
+        <w:t xml:space="preserve">2. 验证方法</w:t>
       </w:r>
     </w:p>
     <w:p>
@@ -1637,7 +1305,7 @@
         <w:rPr>
           <w:rFonts w:ascii="Calibri" w:hAnsi="Calibri" w:eastAsia="SimHei" w:cs="Calibri"/>
         </w:rPr>
-        <w:t xml:space="preserve">3.1 UBCC 目录核心</w:t>
+        <w:t xml:space="preserve">2.1 模型分层</w:t>
       </w:r>
     </w:p>
     <w:p>
@@ -1648,7 +1316,7 @@
         <w:rPr>
           <w:rFonts w:ascii="Calibri" w:hAnsi="Calibri" w:eastAsia="Microsoft YaHei" w:cs="Calibri"/>
         </w:rPr>
-        <w:t xml:space="preserve">目录核心模型覆盖请求、授权、Clear、Recall 和 Invalidate 的状态迁移，验证目录提交前后</w:t>
+        <w:t xml:space="preserve">验证模型按职责划分为四层：</w:t>
       </w:r>
     </w:p>
     <w:p>
@@ -1659,7 +1327,7 @@
         <w:rPr>
           <w:rFonts w:ascii="Calibri" w:hAnsi="Calibri" w:eastAsia="Microsoft YaHei" w:cs="Calibri"/>
         </w:rPr>
-        <w:t xml:space="preserve">owner、sharer、epoch 和 outstanding 关系保持一致。</w:t>
+        <w:t xml:space="preserve">1. 目录核心层：请求、授权、Clear、Recall、Invalidate 和目录提交；</w:t>
       </w:r>
     </w:p>
     <w:p>
@@ -1670,51 +1338,40 @@
         <w:rPr>
           <w:rFonts w:ascii="Calibri" w:hAnsi="Calibri" w:eastAsia="Microsoft YaHei" w:cs="Calibri"/>
         </w:rPr>
-        <w:t xml:space="preserve">验证结果表明：</w:t>
-      </w:r>
-    </w:p>
-    <w:p>
-      <w:pPr>
-        <w:ind w:left="360" w:firstLine="0"/>
-      </w:pPr>
-      <w:r>
-        <w:rPr>
-          <w:rFonts w:ascii="Calibri" w:hAnsi="Calibri" w:eastAsia="Microsoft YaHei" w:cs="Calibri"/>
-        </w:rPr>
-        <w:t xml:space="preserve">• 授权在途期间 committed state 保持安全；</w:t>
-      </w:r>
-    </w:p>
-    <w:p>
-      <w:pPr>
-        <w:ind w:left="360" w:firstLine="0"/>
-      </w:pPr>
-      <w:r>
-        <w:rPr>
-          <w:rFonts w:ascii="Calibri" w:hAnsi="Calibri" w:eastAsia="Microsoft YaHei" w:cs="Calibri"/>
-        </w:rPr>
-        <w:t xml:space="preserve">• Clear 只提交匹配事务；</w:t>
-      </w:r>
-    </w:p>
-    <w:p>
-      <w:pPr>
-        <w:ind w:left="360" w:firstLine="0"/>
-      </w:pPr>
-      <w:r>
-        <w:rPr>
-          <w:rFonts w:ascii="Calibri" w:hAnsi="Calibri" w:eastAsia="Microsoft YaHei" w:cs="Calibri"/>
-        </w:rPr>
-        <w:t xml:space="preserve">• Recall 与 Invalidate 不产生双 owner；</w:t>
-      </w:r>
-    </w:p>
-    <w:p>
-      <w:pPr>
-        <w:ind w:left="360" w:firstLine="0"/>
-      </w:pPr>
-      <w:r>
-        <w:rPr>
-          <w:rFonts w:ascii="Calibri" w:hAnsi="Calibri" w:eastAsia="Microsoft YaHei" w:cs="Calibri"/>
-        </w:rPr>
-        <w:t xml:space="preserve">• 重复和延迟消息不会改变已完成事务结果。</w:t>
+        <w:t xml:space="preserve">2. 并发机制层：同址 outstanding、waiter、partial Ack 和 snoop 仲裁；</w:t>
+      </w:r>
+    </w:p>
+    <w:p>
+      <w:pPr>
+        <w:ind w:left="0" w:firstLine="420"/>
+      </w:pPr>
+      <w:r>
+        <w:rPr>
+          <w:rFonts w:ascii="Calibri" w:hAnsi="Calibri" w:eastAsia="Microsoft YaHei" w:cs="Calibri"/>
+        </w:rPr>
+        <w:t xml:space="preserve">3. 拓扑隔离层：多 PA、多节点和多 Socket 状态隔离；</w:t>
+      </w:r>
+    </w:p>
+    <w:p>
+      <w:pPr>
+        <w:ind w:left="0" w:firstLine="420"/>
+      </w:pPr>
+      <w:r>
+        <w:rPr>
+          <w:rFonts w:ascii="Calibri" w:hAnsi="Calibri" w:eastAsia="Microsoft YaHei" w:cs="Calibri"/>
+        </w:rPr>
+        <w:t xml:space="preserve">4. 故障传输层：消息丢失、重复、延迟和乱序。</w:t>
+      </w:r>
+    </w:p>
+    <w:p>
+      <w:pPr>
+        <w:ind w:left="0" w:firstLine="420"/>
+      </w:pPr>
+      <w:r>
+        <w:rPr>
+          <w:rFonts w:ascii="Calibri" w:hAnsi="Calibri" w:eastAsia="Microsoft YaHei" w:cs="Calibri"/>
+        </w:rPr>
+        <w:t xml:space="preserve">每个模型只承担明确的协议论证职责，最终由端到端测试补充真实数据路径、缓存容量和运行拓扑。</w:t>
       </w:r>
     </w:p>
     <w:p>
@@ -1726,209 +1383,7 @@
         <w:rPr>
           <w:rFonts w:ascii="Calibri" w:hAnsi="Calibri" w:eastAsia="SimHei" w:cs="Calibri"/>
         </w:rPr>
-        <w:t xml:space="preserve">3.2 传输故障模型</w:t>
-      </w:r>
-    </w:p>
-    <w:p>
-      <w:pPr>
-        <w:ind w:left="0" w:firstLine="420"/>
-      </w:pPr>
-      <w:r>
-        <w:rPr>
-          <w:rFonts w:ascii="Calibri" w:hAnsi="Calibri" w:eastAsia="Microsoft YaHei" w:cs="Calibri"/>
-        </w:rPr>
-        <w:t xml:space="preserve">传输故障模型枚举丢失、重复和乱序消息，验证 epoch、reqId、Ack 位图和幂等确认能够阻止</w:t>
-      </w:r>
-    </w:p>
-    <w:p>
-      <w:pPr>
-        <w:ind w:left="0" w:firstLine="420"/>
-      </w:pPr>
-      <w:r>
-        <w:rPr>
-          <w:rFonts w:ascii="Calibri" w:hAnsi="Calibri" w:eastAsia="Microsoft YaHei" w:cs="Calibri"/>
-        </w:rPr>
-        <w:t xml:space="preserve">重复提交与过期状态覆盖。</w:t>
-      </w:r>
-    </w:p>
-    <w:p>
-      <w:pPr>
-        <w:pStyle w:val="Heading3"/>
-        <w:keepNext/>
-      </w:pPr>
-      <w:r>
-        <w:rPr>
-          <w:rFonts w:ascii="Calibri" w:hAnsi="Calibri" w:eastAsia="SimHei" w:cs="Calibri"/>
-        </w:rPr>
-        <w:t xml:space="preserve">3.3 多 PA 与多 Socket 隔离</w:t>
-      </w:r>
-    </w:p>
-    <w:p>
-      <w:pPr>
-        <w:ind w:left="0" w:firstLine="420"/>
-      </w:pPr>
-      <w:r>
-        <w:rPr>
-          <w:rFonts w:ascii="Calibri" w:hAnsi="Calibri" w:eastAsia="Microsoft YaHei" w:cs="Calibri"/>
-        </w:rPr>
-        <w:t xml:space="preserve">多 PA 和多 Socket 模型验证不同地址、不同 Home Socket 和不同 requester 的状态独立性。</w:t>
-      </w:r>
-    </w:p>
-    <w:p>
-      <w:pPr>
-        <w:ind w:left="0" w:firstLine="420"/>
-      </w:pPr>
-      <w:r>
-        <w:rPr>
-          <w:rFonts w:ascii="Calibri" w:hAnsi="Calibri" w:eastAsia="Microsoft YaHei" w:cs="Calibri"/>
-        </w:rPr>
-        <w:t xml:space="preserve">任一事务的 outstanding、waiter、Ack 集合和提交结果不会污染其他事务。</w:t>
-      </w:r>
-    </w:p>
-    <w:p>
-      <w:pPr>
-        <w:pStyle w:val="Heading3"/>
-        <w:keepNext/>
-      </w:pPr>
-      <w:r>
-        <w:rPr>
-          <w:rFonts w:ascii="Calibri" w:hAnsi="Calibri" w:eastAsia="SimHei" w:cs="Calibri"/>
-        </w:rPr>
-        <w:t xml:space="preserve">3.4 EP-RNF snoop 仲裁</w:t>
-      </w:r>
-    </w:p>
-    <w:p>
-      <w:pPr>
-        <w:ind w:left="0" w:firstLine="420"/>
-      </w:pPr>
-      <w:r>
-        <w:rPr>
-          <w:rFonts w:ascii="Calibri" w:hAnsi="Calibri" w:eastAsia="Microsoft YaHei" w:cs="Calibri"/>
-        </w:rPr>
-        <w:t xml:space="preserve">EP-RNF focused 模型覆盖 active Recall、ReadShared、ReadUnique、CleanUnique 与多类 snoop</w:t>
-      </w:r>
-    </w:p>
-    <w:p>
-      <w:pPr>
-        <w:ind w:left="0" w:firstLine="420"/>
-      </w:pPr>
-      <w:r>
-        <w:rPr>
-          <w:rFonts w:ascii="Calibri" w:hAnsi="Calibri" w:eastAsia="Microsoft YaHei" w:cs="Calibri"/>
-        </w:rPr>
-        <w:t xml:space="preserve">组合。模型验证 immediate 和 stale 响应规则能够打破同址循环等待，同时保持数据权限约束。</w:t>
-      </w:r>
-    </w:p>
-    <w:p>
-      <w:pPr>
-        <w:ind w:left="0" w:firstLine="420"/>
-      </w:pPr>
-      <w:r>
-        <w:rPr>
-          <w:rFonts w:ascii="Calibri" w:hAnsi="Calibri" w:eastAsia="Microsoft YaHei" w:cs="Calibri"/>
-        </w:rPr>
-        <w:t xml:space="preserve">该模型完成 328 个状态的全空间检查，Safety 属性全部通过。</w:t>
-      </w:r>
-    </w:p>
-    <w:p>
-      <w:pPr>
-        <w:pStyle w:val="Heading3"/>
-        <w:keepNext/>
-      </w:pPr>
-      <w:r>
-        <w:rPr>
-          <w:rFonts w:ascii="Calibri" w:hAnsi="Calibri" w:eastAsia="SimHei" w:cs="Calibri"/>
-        </w:rPr>
-        <w:t xml:space="preserve">3.5 committed waiter 精确退役</w:t>
-      </w:r>
-    </w:p>
-    <w:p>
-      <w:pPr>
-        <w:ind w:left="0" w:firstLine="420"/>
-      </w:pPr>
-      <w:r>
-        <w:rPr>
-          <w:rFonts w:ascii="Calibri" w:hAnsi="Calibri" w:eastAsia="Microsoft YaHei" w:cs="Calibri"/>
-        </w:rPr>
-        <w:t xml:space="preserve">成功提交 Clear 后，UBCC 按 (PA, node, socket, reqId) 精确退役已经完成的 Read waiter，</w:t>
-      </w:r>
-    </w:p>
-    <w:p>
-      <w:pPr>
-        <w:ind w:left="0" w:firstLine="420"/>
-      </w:pPr>
-      <w:r>
-        <w:rPr>
-          <w:rFonts w:ascii="Calibri" w:hAnsi="Calibri" w:eastAsia="Microsoft YaHei" w:cs="Calibri"/>
-        </w:rPr>
-        <w:t xml:space="preserve">保留其他 requester、事务身份和操作类型，再安全重放剩余请求。</w:t>
-      </w:r>
-    </w:p>
-    <w:p>
-      <w:pPr>
-        <w:ind w:left="0" w:firstLine="420"/>
-      </w:pPr>
-      <w:r>
-        <w:rPr>
-          <w:rFonts w:ascii="Calibri" w:hAnsi="Calibri" w:eastAsia="Microsoft YaHei" w:cs="Calibri"/>
-        </w:rPr>
-        <w:t xml:space="preserve">该 focused 模型完成 274,593 个状态的检查，验证以下性质：</w:t>
-      </w:r>
-    </w:p>
-    <w:p>
-      <w:pPr>
-        <w:ind w:left="360" w:firstLine="0"/>
-      </w:pPr>
-      <w:r>
-        <w:rPr>
-          <w:rFonts w:ascii="Calibri" w:hAnsi="Calibri" w:eastAsia="Microsoft YaHei" w:cs="Calibri"/>
-        </w:rPr>
-        <w:t xml:space="preserve">• 已完成 waiter 不会再次创建同类 outstanding；</w:t>
-      </w:r>
-    </w:p>
-    <w:p>
-      <w:pPr>
-        <w:ind w:left="360" w:firstLine="0"/>
-      </w:pPr>
-      <w:r>
-        <w:rPr>
-          <w:rFonts w:ascii="Calibri" w:hAnsi="Calibri" w:eastAsia="Microsoft YaHei" w:cs="Calibri"/>
-        </w:rPr>
-        <w:t xml:space="preserve">• 非匹配 waiter 不被误删；</w:t>
-      </w:r>
-    </w:p>
-    <w:p>
-      <w:pPr>
-        <w:ind w:left="360" w:firstLine="0"/>
-      </w:pPr>
-      <w:r>
-        <w:rPr>
-          <w:rFonts w:ascii="Calibri" w:hAnsi="Calibri" w:eastAsia="Microsoft YaHei" w:cs="Calibri"/>
-        </w:rPr>
-        <w:t xml:space="preserve">• Writeback、Upgrade 和 Evict waiter 保持独立；</w:t>
-      </w:r>
-    </w:p>
-    <w:p>
-      <w:pPr>
-        <w:ind w:left="360" w:firstLine="0"/>
-      </w:pPr>
-      <w:r>
-        <w:rPr>
-          <w:rFonts w:ascii="Calibri" w:hAnsi="Calibri" w:eastAsia="Microsoft YaHei" w:cs="Calibri"/>
-        </w:rPr>
-        <w:t xml:space="preserve">• replay 不改变已提交目录状态。</w:t>
-      </w:r>
-    </w:p>
-    <w:p>
-      <w:pPr>
-        <w:pStyle w:val="Heading3"/>
-        <w:keepNext/>
-      </w:pPr>
-      <w:r>
-        <w:rPr>
-          <w:rFonts w:ascii="Calibri" w:hAnsi="Calibri" w:eastAsia="SimHei" w:cs="Calibri"/>
-        </w:rPr>
-        <w:t xml:space="preserve">3.6 结果汇总</w:t>
+        <w:t xml:space="preserve">2.2 形式化验证证据层级</w:t>
       </w:r>
     </w:p>
     <w:tbl>
@@ -1965,7 +1420,7 @@
                 <w:sz w:val="18"/>
                 <w:szCs w:val="18"/>
               </w:rPr>
-              <w:t xml:space="preserve">模型组</w:t>
+              <w:t xml:space="preserve">证据层级</w:t>
             </w:r>
           </w:p>
         </w:tc>
@@ -1986,7 +1441,7 @@
                 <w:sz w:val="18"/>
                 <w:szCs w:val="18"/>
               </w:rPr>
-              <w:t xml:space="preserve">核心论证</w:t>
+              <w:t xml:space="preserve">当前证据</w:t>
             </w:r>
           </w:p>
         </w:tc>
@@ -2007,7 +1462,7 @@
                 <w:sz w:val="18"/>
                 <w:szCs w:val="18"/>
               </w:rPr>
-              <w:t xml:space="preserve">Safety</w:t>
+              <w:t xml:space="preserve">可支持的结论</w:t>
             </w:r>
           </w:p>
         </w:tc>
@@ -2028,392 +1483,886 @@
                 <w:sz w:val="18"/>
                 <w:szCs w:val="18"/>
               </w:rPr>
-              <w:t xml:space="preserve">Liveness</w:t>
-            </w:r>
-          </w:p>
-        </w:tc>
-      </w:tr>
-      <w:tr>
-        <w:trPr>
-          <w:cantSplit/>
-        </w:trPr>
-        <w:tc>
-          <w:tcPr/>
-          <w:p>
-            <w:pPr>
-              <w:pStyle w:val="TableText"/>
-              <w:jc w:val="left"/>
-              <w:spacing w:before="0" w:after="0" w:line="320" w:lineRule="exact"/>
-            </w:pPr>
-            <w:r>
-              <w:rPr>
-                <w:rFonts w:ascii="Calibri" w:hAnsi="Calibri" w:eastAsia="Microsoft YaHei" w:cs="Calibri"/>
-                <w:sz w:val="18"/>
-                <w:szCs w:val="18"/>
-              </w:rPr>
-              <w:t xml:space="preserve">UBCC 目录核心</w:t>
-            </w:r>
-          </w:p>
-        </w:tc>
-        <w:tc>
-          <w:tcPr/>
-          <w:p>
-            <w:pPr>
-              <w:pStyle w:val="TableText"/>
-              <w:jc w:val="left"/>
-              <w:spacing w:before="0" w:after="0" w:line="320" w:lineRule="exact"/>
-            </w:pPr>
-            <w:r>
-              <w:rPr>
-                <w:rFonts w:ascii="Calibri" w:hAnsi="Calibri" w:eastAsia="Microsoft YaHei" w:cs="Calibri"/>
-                <w:sz w:val="18"/>
-                <w:szCs w:val="18"/>
-              </w:rPr>
-              <w:t xml:space="preserve">目录状态、授权与提交</w:t>
-            </w:r>
-          </w:p>
-        </w:tc>
-        <w:tc>
-          <w:tcPr/>
-          <w:p>
-            <w:pPr>
-              <w:pStyle w:val="TableText"/>
-              <w:jc w:val="left"/>
-              <w:spacing w:before="0" w:after="0" w:line="320" w:lineRule="exact"/>
-            </w:pPr>
-            <w:r>
-              <w:rPr>
-                <w:rFonts w:ascii="Calibri" w:hAnsi="Calibri" w:eastAsia="Microsoft YaHei" w:cs="Calibri"/>
-                <w:sz w:val="18"/>
-                <w:szCs w:val="18"/>
-              </w:rPr>
-              <w:t xml:space="preserve">通过</w:t>
-            </w:r>
-          </w:p>
-        </w:tc>
-        <w:tc>
-          <w:tcPr/>
-          <w:p>
-            <w:pPr>
-              <w:pStyle w:val="TableText"/>
-              <w:jc w:val="left"/>
-              <w:spacing w:before="0" w:after="0" w:line="320" w:lineRule="exact"/>
-            </w:pPr>
-            <w:r>
-              <w:rPr>
-                <w:rFonts w:ascii="Calibri" w:hAnsi="Calibri" w:eastAsia="Microsoft YaHei" w:cs="Calibri"/>
-                <w:sz w:val="18"/>
-                <w:szCs w:val="18"/>
-              </w:rPr>
-              <w:t xml:space="preserve">通过</w:t>
-            </w:r>
-          </w:p>
-        </w:tc>
-      </w:tr>
-      <w:tr>
-        <w:trPr>
-          <w:cantSplit/>
-        </w:trPr>
-        <w:tc>
-          <w:tcPr/>
-          <w:p>
-            <w:pPr>
-              <w:pStyle w:val="TableText"/>
-              <w:jc w:val="left"/>
-              <w:spacing w:before="0" w:after="0" w:line="320" w:lineRule="exact"/>
-            </w:pPr>
-            <w:r>
-              <w:rPr>
-                <w:rFonts w:ascii="Calibri" w:hAnsi="Calibri" w:eastAsia="Microsoft YaHei" w:cs="Calibri"/>
-                <w:sz w:val="18"/>
-                <w:szCs w:val="18"/>
-              </w:rPr>
-              <w:t xml:space="preserve">传输故障</w:t>
-            </w:r>
-          </w:p>
-        </w:tc>
-        <w:tc>
-          <w:tcPr/>
-          <w:p>
-            <w:pPr>
-              <w:pStyle w:val="TableText"/>
-              <w:jc w:val="left"/>
-              <w:spacing w:before="0" w:after="0" w:line="320" w:lineRule="exact"/>
-            </w:pPr>
-            <w:r>
-              <w:rPr>
-                <w:rFonts w:ascii="Calibri" w:hAnsi="Calibri" w:eastAsia="Microsoft YaHei" w:cs="Calibri"/>
-                <w:sz w:val="18"/>
-                <w:szCs w:val="18"/>
-              </w:rPr>
-              <w:t xml:space="preserve">丢失、重复、乱序</w:t>
-            </w:r>
-          </w:p>
-        </w:tc>
-        <w:tc>
-          <w:tcPr/>
-          <w:p>
-            <w:pPr>
-              <w:pStyle w:val="TableText"/>
-              <w:jc w:val="left"/>
-              <w:spacing w:before="0" w:after="0" w:line="320" w:lineRule="exact"/>
-            </w:pPr>
-            <w:r>
-              <w:rPr>
-                <w:rFonts w:ascii="Calibri" w:hAnsi="Calibri" w:eastAsia="Microsoft YaHei" w:cs="Calibri"/>
-                <w:sz w:val="18"/>
-                <w:szCs w:val="18"/>
-              </w:rPr>
-              <w:t xml:space="preserve">通过</w:t>
-            </w:r>
-          </w:p>
-        </w:tc>
-        <w:tc>
-          <w:tcPr/>
-          <w:p>
-            <w:pPr>
-              <w:pStyle w:val="TableText"/>
-              <w:jc w:val="left"/>
-              <w:spacing w:before="0" w:after="0" w:line="320" w:lineRule="exact"/>
-            </w:pPr>
-            <w:r>
-              <w:rPr>
-                <w:rFonts w:ascii="Calibri" w:hAnsi="Calibri" w:eastAsia="Microsoft YaHei" w:cs="Calibri"/>
-                <w:sz w:val="18"/>
-                <w:szCs w:val="18"/>
-              </w:rPr>
-              <w:t xml:space="preserve">通过</w:t>
-            </w:r>
-          </w:p>
-        </w:tc>
-      </w:tr>
-      <w:tr>
-        <w:trPr>
-          <w:cantSplit/>
-        </w:trPr>
-        <w:tc>
-          <w:tcPr/>
-          <w:p>
-            <w:pPr>
-              <w:pStyle w:val="TableText"/>
-              <w:jc w:val="left"/>
-              <w:spacing w:before="0" w:after="0" w:line="320" w:lineRule="exact"/>
-            </w:pPr>
-            <w:r>
-              <w:rPr>
-                <w:rFonts w:ascii="Calibri" w:hAnsi="Calibri" w:eastAsia="Microsoft YaHei" w:cs="Calibri"/>
-                <w:sz w:val="18"/>
-                <w:szCs w:val="18"/>
-              </w:rPr>
-              <w:t xml:space="preserve">多 PA / 多 Socket</w:t>
-            </w:r>
-          </w:p>
-        </w:tc>
-        <w:tc>
-          <w:tcPr/>
-          <w:p>
-            <w:pPr>
-              <w:pStyle w:val="TableText"/>
-              <w:jc w:val="left"/>
-              <w:spacing w:before="0" w:after="0" w:line="320" w:lineRule="exact"/>
-            </w:pPr>
-            <w:r>
-              <w:rPr>
-                <w:rFonts w:ascii="Calibri" w:hAnsi="Calibri" w:eastAsia="Microsoft YaHei" w:cs="Calibri"/>
-                <w:sz w:val="18"/>
-                <w:szCs w:val="18"/>
-              </w:rPr>
-              <w:t xml:space="preserve">状态隔离</w:t>
-            </w:r>
-          </w:p>
-        </w:tc>
-        <w:tc>
-          <w:tcPr/>
-          <w:p>
-            <w:pPr>
-              <w:pStyle w:val="TableText"/>
-              <w:jc w:val="left"/>
-              <w:spacing w:before="0" w:after="0" w:line="320" w:lineRule="exact"/>
-            </w:pPr>
-            <w:r>
-              <w:rPr>
-                <w:rFonts w:ascii="Calibri" w:hAnsi="Calibri" w:eastAsia="Microsoft YaHei" w:cs="Calibri"/>
-                <w:sz w:val="18"/>
-                <w:szCs w:val="18"/>
-              </w:rPr>
-              <w:t xml:space="preserve">通过</w:t>
-            </w:r>
-          </w:p>
-        </w:tc>
-        <w:tc>
-          <w:tcPr/>
-          <w:p>
-            <w:pPr>
-              <w:pStyle w:val="TableText"/>
-              <w:jc w:val="left"/>
-              <w:spacing w:before="0" w:after="0" w:line="320" w:lineRule="exact"/>
-            </w:pPr>
-            <w:r>
-              <w:rPr>
-                <w:rFonts w:ascii="Calibri" w:hAnsi="Calibri" w:eastAsia="Microsoft YaHei" w:cs="Calibri"/>
-                <w:sz w:val="18"/>
-                <w:szCs w:val="18"/>
-              </w:rPr>
-              <w:t xml:space="preserve">通过</w:t>
-            </w:r>
-          </w:p>
-        </w:tc>
-      </w:tr>
-      <w:tr>
-        <w:trPr>
-          <w:cantSplit/>
-        </w:trPr>
-        <w:tc>
-          <w:tcPr/>
-          <w:p>
-            <w:pPr>
-              <w:pStyle w:val="TableText"/>
-              <w:jc w:val="left"/>
-              <w:spacing w:before="0" w:after="0" w:line="320" w:lineRule="exact"/>
-            </w:pPr>
-            <w:r>
-              <w:rPr>
-                <w:rFonts w:ascii="Calibri" w:hAnsi="Calibri" w:eastAsia="Microsoft YaHei" w:cs="Calibri"/>
-                <w:sz w:val="18"/>
-                <w:szCs w:val="18"/>
-              </w:rPr>
-              <w:t xml:space="preserve">EP-RNF 仲裁</w:t>
-            </w:r>
-          </w:p>
-        </w:tc>
-        <w:tc>
-          <w:tcPr/>
-          <w:p>
-            <w:pPr>
-              <w:pStyle w:val="TableText"/>
-              <w:jc w:val="left"/>
-              <w:spacing w:before="0" w:after="0" w:line="320" w:lineRule="exact"/>
-            </w:pPr>
-            <w:r>
-              <w:rPr>
-                <w:rFonts w:ascii="Calibri" w:hAnsi="Calibri" w:eastAsia="Microsoft YaHei" w:cs="Calibri"/>
-                <w:sz w:val="18"/>
-                <w:szCs w:val="18"/>
-              </w:rPr>
-              <w:t xml:space="preserve">同址 snoop 收敛</w:t>
-            </w:r>
-          </w:p>
-        </w:tc>
-        <w:tc>
-          <w:tcPr/>
-          <w:p>
-            <w:pPr>
-              <w:pStyle w:val="TableText"/>
-              <w:jc w:val="left"/>
-              <w:spacing w:before="0" w:after="0" w:line="320" w:lineRule="exact"/>
-            </w:pPr>
-            <w:r>
-              <w:rPr>
-                <w:rFonts w:ascii="Calibri" w:hAnsi="Calibri" w:eastAsia="Microsoft YaHei" w:cs="Calibri"/>
-                <w:sz w:val="18"/>
-                <w:szCs w:val="18"/>
-              </w:rPr>
-              <w:t xml:space="preserve">通过</w:t>
-            </w:r>
-          </w:p>
-        </w:tc>
-        <w:tc>
-          <w:tcPr/>
-          <w:p>
-            <w:pPr>
-              <w:pStyle w:val="TableText"/>
-              <w:jc w:val="left"/>
-              <w:spacing w:before="0" w:after="0" w:line="320" w:lineRule="exact"/>
-            </w:pPr>
-            <w:r>
-              <w:rPr>
-                <w:rFonts w:ascii="Calibri" w:hAnsi="Calibri" w:eastAsia="Microsoft YaHei" w:cs="Calibri"/>
-                <w:sz w:val="18"/>
-                <w:szCs w:val="18"/>
-              </w:rPr>
-              <w:t xml:space="preserve">通过</w:t>
-            </w:r>
-          </w:p>
-        </w:tc>
-      </w:tr>
-      <w:tr>
-        <w:trPr>
-          <w:cantSplit/>
-        </w:trPr>
-        <w:tc>
-          <w:tcPr/>
-          <w:p>
-            <w:pPr>
-              <w:pStyle w:val="TableText"/>
-              <w:jc w:val="left"/>
-              <w:spacing w:before="0" w:after="0" w:line="320" w:lineRule="exact"/>
-            </w:pPr>
-            <w:r>
-              <w:rPr>
-                <w:rFonts w:ascii="Calibri" w:hAnsi="Calibri" w:eastAsia="Microsoft YaHei" w:cs="Calibri"/>
-                <w:sz w:val="18"/>
-                <w:szCs w:val="18"/>
-              </w:rPr>
-              <w:t xml:space="preserve">waiter 退役</w:t>
-            </w:r>
-          </w:p>
-        </w:tc>
-        <w:tc>
-          <w:tcPr/>
-          <w:p>
-            <w:pPr>
-              <w:pStyle w:val="TableText"/>
-              <w:jc w:val="left"/>
-              <w:spacing w:before="0" w:after="0" w:line="320" w:lineRule="exact"/>
-            </w:pPr>
-            <w:r>
-              <w:rPr>
-                <w:rFonts w:ascii="Calibri" w:hAnsi="Calibri" w:eastAsia="Microsoft YaHei" w:cs="Calibri"/>
-                <w:sz w:val="18"/>
-                <w:szCs w:val="18"/>
-              </w:rPr>
-              <w:t xml:space="preserve">精确退役与重放</w:t>
-            </w:r>
-          </w:p>
-        </w:tc>
-        <w:tc>
-          <w:tcPr/>
-          <w:p>
-            <w:pPr>
-              <w:pStyle w:val="TableText"/>
-              <w:jc w:val="left"/>
-              <w:spacing w:before="0" w:after="0" w:line="320" w:lineRule="exact"/>
-            </w:pPr>
-            <w:r>
-              <w:rPr>
-                <w:rFonts w:ascii="Calibri" w:hAnsi="Calibri" w:eastAsia="Microsoft YaHei" w:cs="Calibri"/>
-                <w:sz w:val="18"/>
-                <w:szCs w:val="18"/>
-              </w:rPr>
-              <w:t xml:space="preserve">通过</w:t>
-            </w:r>
-          </w:p>
-        </w:tc>
-        <w:tc>
-          <w:tcPr/>
-          <w:p>
-            <w:pPr>
-              <w:pStyle w:val="TableText"/>
-              <w:jc w:val="left"/>
-              <w:spacing w:before="0" w:after="0" w:line="320" w:lineRule="exact"/>
-            </w:pPr>
-            <w:r>
-              <w:rPr>
-                <w:rFonts w:ascii="Calibri" w:hAnsi="Calibri" w:eastAsia="Microsoft YaHei" w:cs="Calibri"/>
-                <w:sz w:val="18"/>
-                <w:szCs w:val="18"/>
-              </w:rPr>
-              <w:t xml:space="preserve">通过</w:t>
+              <w:t xml:space="preserve">不应外推为</w:t>
+            </w:r>
+          </w:p>
+        </w:tc>
+      </w:tr>
+      <w:tr>
+        <w:trPr>
+          <w:cantSplit/>
+        </w:trPr>
+        <w:tc>
+          <w:tcPr/>
+          <w:p>
+            <w:pPr>
+              <w:pStyle w:val="TableText"/>
+              <w:jc w:val="left"/>
+              <w:spacing w:before="0" w:after="0" w:line="320" w:lineRule="exact"/>
+            </w:pPr>
+            <w:r>
+              <w:rPr>
+                <w:rFonts w:ascii="Calibri" w:hAnsi="Calibri" w:eastAsia="Microsoft YaHei" w:cs="Calibri"/>
+                <w:sz w:val="18"/>
+                <w:szCs w:val="18"/>
+              </w:rPr>
+              <w:t xml:space="preserve">当前实现 + 端到端执行</w:t>
+            </w:r>
+          </w:p>
+        </w:tc>
+        <w:tc>
+          <w:tcPr/>
+          <w:p>
+            <w:pPr>
+              <w:pStyle w:val="TableText"/>
+              <w:jc w:val="left"/>
+              <w:spacing w:before="0" w:after="0" w:line="320" w:lineRule="exact"/>
+            </w:pPr>
+            <w:r>
+              <w:rPr>
+                <w:rFonts w:ascii="Calibri" w:hAnsi="Calibri" w:eastAsia="Microsoft YaHei" w:cs="Calibri"/>
+                <w:sz w:val="18"/>
+                <w:szCs w:val="18"/>
+              </w:rPr>
+              <w:t xml:space="preserve">协议实现、定向机制测试、O3、多拓扑、性能正确性门禁和 Q1-Q5</w:t>
+            </w:r>
+          </w:p>
+        </w:tc>
+        <w:tc>
+          <w:tcPr/>
+          <w:p>
+            <w:pPr>
+              <w:pStyle w:val="TableText"/>
+              <w:jc w:val="left"/>
+              <w:spacing w:before="0" w:after="0" w:line="320" w:lineRule="exact"/>
+            </w:pPr>
+            <w:r>
+              <w:rPr>
+                <w:rFonts w:ascii="Calibri" w:hAnsi="Calibri" w:eastAsia="Microsoft YaHei" w:cs="Calibri"/>
+                <w:sz w:val="18"/>
+                <w:szCs w:val="18"/>
+              </w:rPr>
+              <w:t xml:space="preserve">已执行场景中的数据、权限、收敛与故障恢复结果</w:t>
+            </w:r>
+          </w:p>
+        </w:tc>
+        <w:tc>
+          <w:tcPr/>
+          <w:p>
+            <w:pPr>
+              <w:pStyle w:val="TableText"/>
+              <w:jc w:val="left"/>
+              <w:spacing w:before="0" w:after="0" w:line="320" w:lineRule="exact"/>
+            </w:pPr>
+            <w:r>
+              <w:rPr>
+                <w:rFonts w:ascii="Calibri" w:hAnsi="Calibri" w:eastAsia="Microsoft YaHei" w:cs="Calibri"/>
+                <w:sz w:val="18"/>
+                <w:szCs w:val="18"/>
+              </w:rPr>
+              <w:t xml:space="preserve">对所有环境和所有故障的穷尽证明</w:t>
+            </w:r>
+          </w:p>
+        </w:tc>
+      </w:tr>
+      <w:tr>
+        <w:trPr>
+          <w:cantSplit/>
+        </w:trPr>
+        <w:tc>
+          <w:tcPr/>
+          <w:p>
+            <w:pPr>
+              <w:pStyle w:val="TableText"/>
+              <w:jc w:val="left"/>
+              <w:spacing w:before="0" w:after="0" w:line="320" w:lineRule="exact"/>
+            </w:pPr>
+            <w:r>
+              <w:rPr>
+                <w:rFonts w:ascii="Calibri" w:hAnsi="Calibri" w:eastAsia="Microsoft YaHei" w:cs="Calibri"/>
+                <w:sz w:val="18"/>
+                <w:szCs w:val="18"/>
+              </w:rPr>
+              <w:t xml:space="preserve">有界 / focused 形式化模型</w:t>
+            </w:r>
+          </w:p>
+        </w:tc>
+        <w:tc>
+          <w:tcPr/>
+          <w:p>
+            <w:pPr>
+              <w:pStyle w:val="TableText"/>
+              <w:jc w:val="left"/>
+              <w:spacing w:before="0" w:after="0" w:line="320" w:lineRule="exact"/>
+            </w:pPr>
+            <w:r>
+              <w:rPr>
+                <w:rFonts w:ascii="Calibri" w:hAnsi="Calibri" w:eastAsia="Microsoft YaHei" w:cs="Calibri"/>
+                <w:sz w:val="18"/>
+                <w:szCs w:val="18"/>
+              </w:rPr>
+              <w:t xml:space="preserve">目录核心、传输故障、多 PA/Socket、snoop 仲裁与 waiter 退役模型</w:t>
+            </w:r>
+          </w:p>
+        </w:tc>
+        <w:tc>
+          <w:tcPr/>
+          <w:p>
+            <w:pPr>
+              <w:pStyle w:val="TableText"/>
+              <w:jc w:val="left"/>
+              <w:spacing w:before="0" w:after="0" w:line="320" w:lineRule="exact"/>
+            </w:pPr>
+            <w:r>
+              <w:rPr>
+                <w:rFonts w:ascii="Calibri" w:hAnsi="Calibri" w:eastAsia="Microsoft YaHei" w:cs="Calibri"/>
+                <w:sz w:val="18"/>
+                <w:szCs w:val="18"/>
+              </w:rPr>
+              <w:t xml:space="preserve">各模型状态空间和公平性假设内的 Safety/Liveness 性质</w:t>
+            </w:r>
+          </w:p>
+        </w:tc>
+        <w:tc>
+          <w:tcPr/>
+          <w:p>
+            <w:pPr>
+              <w:pStyle w:val="TableText"/>
+              <w:jc w:val="left"/>
+              <w:spacing w:before="0" w:after="0" w:line="320" w:lineRule="exact"/>
+            </w:pPr>
+            <w:r>
+              <w:rPr>
+                <w:rFonts w:ascii="Calibri" w:hAnsi="Calibri" w:eastAsia="Microsoft YaHei" w:cs="Calibri"/>
+                <w:sz w:val="18"/>
+                <w:szCs w:val="18"/>
+              </w:rPr>
+              <w:t xml:space="preserve">未建模硬件细节或完整系统的无界证明</w:t>
+            </w:r>
+          </w:p>
+        </w:tc>
+      </w:tr>
+      <w:tr>
+        <w:trPr>
+          <w:cantSplit/>
+        </w:trPr>
+        <w:tc>
+          <w:tcPr/>
+          <w:p>
+            <w:pPr>
+              <w:pStyle w:val="TableText"/>
+              <w:jc w:val="left"/>
+              <w:spacing w:before="0" w:after="0" w:line="320" w:lineRule="exact"/>
+            </w:pPr>
+            <w:r>
+              <w:rPr>
+                <w:rFonts w:ascii="Calibri" w:hAnsi="Calibri" w:eastAsia="Microsoft YaHei" w:cs="Calibri"/>
+                <w:sz w:val="18"/>
+                <w:szCs w:val="18"/>
+              </w:rPr>
+              <w:t xml:space="preserve">理论分析</w:t>
+            </w:r>
+          </w:p>
+        </w:tc>
+        <w:tc>
+          <w:tcPr/>
+          <w:p>
+            <w:pPr>
+              <w:pStyle w:val="TableText"/>
+              <w:jc w:val="left"/>
+              <w:spacing w:before="0" w:after="0" w:line="320" w:lineRule="exact"/>
+            </w:pPr>
+            <w:r>
+              <w:rPr>
+                <w:rFonts w:ascii="Calibri" w:hAnsi="Calibri" w:eastAsia="Microsoft YaHei" w:cs="Calibri"/>
+                <w:sz w:val="18"/>
+                <w:szCs w:val="18"/>
+              </w:rPr>
+              <w:t xml:space="preserve">协议路径、目录组织、HA-VI 结构差异与复杂度解释</w:t>
+            </w:r>
+          </w:p>
+        </w:tc>
+        <w:tc>
+          <w:tcPr/>
+          <w:p>
+            <w:pPr>
+              <w:pStyle w:val="TableText"/>
+              <w:jc w:val="left"/>
+              <w:spacing w:before="0" w:after="0" w:line="320" w:lineRule="exact"/>
+            </w:pPr>
+            <w:r>
+              <w:rPr>
+                <w:rFonts w:ascii="Calibri" w:hAnsi="Calibri" w:eastAsia="Microsoft YaHei" w:cs="Calibri"/>
+                <w:sz w:val="18"/>
+                <w:szCs w:val="18"/>
+              </w:rPr>
+              <w:t xml:space="preserve">解释机制差异和实验结果来源</w:t>
+            </w:r>
+          </w:p>
+        </w:tc>
+        <w:tc>
+          <w:tcPr/>
+          <w:p>
+            <w:pPr>
+              <w:pStyle w:val="TableText"/>
+              <w:jc w:val="left"/>
+              <w:spacing w:before="0" w:after="0" w:line="320" w:lineRule="exact"/>
+            </w:pPr>
+            <w:r>
+              <w:rPr>
+                <w:rFonts w:ascii="Calibri" w:hAnsi="Calibri" w:eastAsia="Microsoft YaHei" w:cs="Calibri"/>
+                <w:sz w:val="18"/>
+                <w:szCs w:val="18"/>
+              </w:rPr>
+              <w:t xml:space="preserve">实现通过、性能胜负或物理芯片测量</w:t>
+            </w:r>
+          </w:p>
+        </w:tc>
+      </w:tr>
+      <w:tr>
+        <w:trPr>
+          <w:cantSplit/>
+        </w:trPr>
+        <w:tc>
+          <w:tcPr/>
+          <w:p>
+            <w:pPr>
+              <w:pStyle w:val="TableText"/>
+              <w:jc w:val="left"/>
+              <w:spacing w:before="0" w:after="0" w:line="320" w:lineRule="exact"/>
+            </w:pPr>
+            <w:r>
+              <w:rPr>
+                <w:rFonts w:ascii="Calibri" w:hAnsi="Calibri" w:eastAsia="Microsoft YaHei" w:cs="Calibri"/>
+                <w:sz w:val="18"/>
+                <w:szCs w:val="18"/>
+              </w:rPr>
+              <w:t xml:space="preserve">本次范围外</w:t>
+            </w:r>
+          </w:p>
+        </w:tc>
+        <w:tc>
+          <w:tcPr/>
+          <w:p>
+            <w:pPr>
+              <w:pStyle w:val="TableText"/>
+              <w:jc w:val="left"/>
+              <w:spacing w:before="0" w:after="0" w:line="320" w:lineRule="exact"/>
+            </w:pPr>
+            <w:r>
+              <w:rPr>
+                <w:rFonts w:ascii="Calibri" w:hAnsi="Calibri" w:eastAsia="Microsoft YaHei" w:cs="Calibri"/>
+                <w:sz w:val="18"/>
+                <w:szCs w:val="18"/>
+              </w:rPr>
+              <w:t xml:space="preserve">永久 Home 失效恢复、客户物理 HA 和端口级 Switch 微体系结构</w:t>
+            </w:r>
+          </w:p>
+        </w:tc>
+        <w:tc>
+          <w:tcPr/>
+          <w:p>
+            <w:pPr>
+              <w:pStyle w:val="TableText"/>
+              <w:jc w:val="left"/>
+              <w:spacing w:before="0" w:after="0" w:line="320" w:lineRule="exact"/>
+            </w:pPr>
+            <w:r>
+              <w:rPr>
+                <w:rFonts w:ascii="Calibri" w:hAnsi="Calibri" w:eastAsia="Microsoft YaHei" w:cs="Calibri"/>
+                <w:sz w:val="18"/>
+                <w:szCs w:val="18"/>
+              </w:rPr>
+              <w:t xml:space="preserve">明确交付边界</w:t>
+            </w:r>
+          </w:p>
+        </w:tc>
+        <w:tc>
+          <w:tcPr/>
+          <w:p>
+            <w:pPr>
+              <w:pStyle w:val="TableText"/>
+              <w:jc w:val="left"/>
+              <w:spacing w:before="0" w:after="0" w:line="320" w:lineRule="exact"/>
+            </w:pPr>
+            <w:r>
+              <w:rPr>
+                <w:rFonts w:ascii="Calibri" w:hAnsi="Calibri" w:eastAsia="Microsoft YaHei" w:cs="Calibri"/>
+                <w:sz w:val="18"/>
+                <w:szCs w:val="18"/>
+              </w:rPr>
+              <w:t xml:space="preserve">已验证或已实现能力</w:t>
+            </w:r>
+          </w:p>
+        </w:tc>
+      </w:tr>
+    </w:tbl>
+    <w:p>
+      <w:pPr>
+        <w:pStyle w:val="Heading3"/>
+        <w:keepNext/>
+      </w:pPr>
+      <w:r>
+        <w:rPr>
+          <w:rFonts w:ascii="Calibri" w:hAnsi="Calibri" w:eastAsia="SimHei" w:cs="Calibri"/>
+        </w:rPr>
+        <w:t xml:space="preserve">2.3 Safety 属性</w:t>
+      </w:r>
+    </w:p>
+    <w:p>
+      <w:pPr>
+        <w:ind w:left="0" w:firstLine="420"/>
+      </w:pPr>
+      <w:r>
+        <w:rPr>
+          <w:rFonts w:ascii="Calibri" w:hAnsi="Calibri" w:eastAsia="Microsoft YaHei" w:cs="Calibri"/>
+        </w:rPr>
+        <w:t xml:space="preserve">形式化验证中的主要 Safety 属性包括：</w:t>
+      </w:r>
+    </w:p>
+    <w:p>
+      <w:pPr>
+        <w:ind w:left="360" w:firstLine="0"/>
+      </w:pPr>
+      <w:r>
+        <w:rPr>
+          <w:rFonts w:ascii="Calibri" w:hAnsi="Calibri" w:eastAsia="Microsoft YaHei" w:cs="Calibri"/>
+        </w:rPr>
+        <w:t xml:space="preserve">• 同一缓存行至多存在一个有效写 owner；</w:t>
+      </w:r>
+    </w:p>
+    <w:p>
+      <w:pPr>
+        <w:ind w:left="360" w:firstLine="0"/>
+      </w:pPr>
+      <w:r>
+        <w:rPr>
+          <w:rFonts w:ascii="Calibri" w:hAnsi="Calibri" w:eastAsia="Microsoft YaHei" w:cs="Calibri"/>
+        </w:rPr>
+        <w:t xml:space="preserve">• owner 与 sharer 集合满足状态约束；</w:t>
+      </w:r>
+    </w:p>
+    <w:p>
+      <w:pPr>
+        <w:ind w:left="360" w:firstLine="0"/>
+      </w:pPr>
+      <w:r>
+        <w:rPr>
+          <w:rFonts w:ascii="Calibri" w:hAnsi="Calibri" w:eastAsia="Microsoft YaHei" w:cs="Calibri"/>
+        </w:rPr>
+        <w:t xml:space="preserve">• committed epoch 不回退；</w:t>
+      </w:r>
+    </w:p>
+    <w:p>
+      <w:pPr>
+        <w:ind w:left="360" w:firstLine="0"/>
+      </w:pPr>
+      <w:r>
+        <w:rPr>
+          <w:rFonts w:ascii="Calibri" w:hAnsi="Calibri" w:eastAsia="Microsoft YaHei" w:cs="Calibri"/>
+        </w:rPr>
+        <w:t xml:space="preserve">• 过期消息不能覆盖新目录状态；</w:t>
+      </w:r>
+    </w:p>
+    <w:p>
+      <w:pPr>
+        <w:ind w:left="360" w:firstLine="0"/>
+      </w:pPr>
+      <w:r>
+        <w:rPr>
+          <w:rFonts w:ascii="Calibri" w:hAnsi="Calibri" w:eastAsia="Microsoft YaHei" w:cs="Calibri"/>
+        </w:rPr>
+        <w:t xml:space="preserve">• 重复 Ack 不重复推进事务；</w:t>
+      </w:r>
+    </w:p>
+    <w:p>
+      <w:pPr>
+        <w:ind w:left="360" w:firstLine="0"/>
+      </w:pPr>
+      <w:r>
+        <w:rPr>
+          <w:rFonts w:ascii="Calibri" w:hAnsi="Calibri" w:eastAsia="Microsoft YaHei" w:cs="Calibri"/>
+        </w:rPr>
+        <w:t xml:space="preserve">• Clear 只提交匹配的 epoch、reqId 和 requester；</w:t>
+      </w:r>
+    </w:p>
+    <w:p>
+      <w:pPr>
+        <w:ind w:left="360" w:firstLine="0"/>
+      </w:pPr>
+      <w:r>
+        <w:rPr>
+          <w:rFonts w:ascii="Calibri" w:hAnsi="Calibri" w:eastAsia="Microsoft YaHei" w:cs="Calibri"/>
+        </w:rPr>
+        <w:t xml:space="preserve">• 不同 PA 和不同 Socket 的事务互不污染；</w:t>
+      </w:r>
+    </w:p>
+    <w:p>
+      <w:pPr>
+        <w:ind w:left="360" w:firstLine="0"/>
+      </w:pPr>
+      <w:r>
+        <w:rPr>
+          <w:rFonts w:ascii="Calibri" w:hAnsi="Calibri" w:eastAsia="Microsoft YaHei" w:cs="Calibri"/>
+        </w:rPr>
+        <w:t xml:space="preserve">• 已完成 waiter 不被重复重放。</w:t>
+      </w:r>
+    </w:p>
+    <w:p>
+      <w:pPr>
+        <w:pStyle w:val="Heading3"/>
+        <w:keepNext/>
+      </w:pPr>
+      <w:r>
+        <w:rPr>
+          <w:rFonts w:ascii="Calibri" w:hAnsi="Calibri" w:eastAsia="SimHei" w:cs="Calibri"/>
+        </w:rPr>
+        <w:t xml:space="preserve">2.4 Liveness 属性</w:t>
+      </w:r>
+    </w:p>
+    <w:p>
+      <w:pPr>
+        <w:ind w:left="0" w:firstLine="420"/>
+      </w:pPr>
+      <w:r>
+        <w:rPr>
+          <w:rFonts w:ascii="Calibri" w:hAnsi="Calibri" w:eastAsia="Microsoft YaHei" w:cs="Calibri"/>
+        </w:rPr>
+        <w:t xml:space="preserve">主要 Liveness 属性包括：</w:t>
+      </w:r>
+    </w:p>
+    <w:p>
+      <w:pPr>
+        <w:ind w:left="360" w:firstLine="0"/>
+      </w:pPr>
+      <w:r>
+        <w:rPr>
+          <w:rFonts w:ascii="Calibri" w:hAnsi="Calibri" w:eastAsia="Microsoft YaHei" w:cs="Calibri"/>
+        </w:rPr>
+        <w:t xml:space="preserve">• 在消息最终可达的条件下，请求最终获得授权或明确重试；</w:t>
+      </w:r>
+    </w:p>
+    <w:p>
+      <w:pPr>
+        <w:ind w:left="360" w:firstLine="0"/>
+      </w:pPr>
+      <w:r>
+        <w:rPr>
+          <w:rFonts w:ascii="Calibri" w:hAnsi="Calibri" w:eastAsia="Microsoft YaHei" w:cs="Calibri"/>
+        </w:rPr>
+        <w:t xml:space="preserve">• Recall 最终返回数据或完成 owner 降级；</w:t>
+      </w:r>
+    </w:p>
+    <w:p>
+      <w:pPr>
+        <w:ind w:left="360" w:firstLine="0"/>
+      </w:pPr>
+      <w:r>
+        <w:rPr>
+          <w:rFonts w:ascii="Calibri" w:hAnsi="Calibri" w:eastAsia="Microsoft YaHei" w:cs="Calibri"/>
+        </w:rPr>
+        <w:t xml:space="preserve">• Invalidate 在目标 Ack 收敛后完成；</w:t>
+      </w:r>
+    </w:p>
+    <w:p>
+      <w:pPr>
+        <w:ind w:left="360" w:firstLine="0"/>
+      </w:pPr>
+      <w:r>
+        <w:rPr>
+          <w:rFonts w:ascii="Calibri" w:hAnsi="Calibri" w:eastAsia="Microsoft YaHei" w:cs="Calibri"/>
+        </w:rPr>
+        <w:t xml:space="preserve">• Clear 完成后 outstanding 被退役；</w:t>
+      </w:r>
+    </w:p>
+    <w:p>
+      <w:pPr>
+        <w:ind w:left="360" w:firstLine="0"/>
+      </w:pPr>
+      <w:r>
+        <w:rPr>
+          <w:rFonts w:ascii="Calibri" w:hAnsi="Calibri" w:eastAsia="Microsoft YaHei" w:cs="Calibri"/>
+        </w:rPr>
+        <w:t xml:space="preserve">• waiter 在阻塞条件解除后得到重放；</w:t>
+      </w:r>
+    </w:p>
+    <w:p>
+      <w:pPr>
+        <w:ind w:left="360" w:firstLine="0"/>
+      </w:pPr>
+      <w:r>
+        <w:rPr>
+          <w:rFonts w:ascii="Calibri" w:hAnsi="Calibri" w:eastAsia="Microsoft YaHei" w:cs="Calibri"/>
+        </w:rPr>
+        <w:t xml:space="preserve">• EP-RNF 同址 snoop 不形成循环等待。</w:t>
+      </w:r>
+    </w:p>
+    <w:p>
+      <w:pPr>
+        <w:pStyle w:val="Heading3"/>
+        <w:keepNext/>
+      </w:pPr>
+      <w:r>
+        <w:rPr>
+          <w:rFonts w:ascii="Calibri" w:hAnsi="Calibri" w:eastAsia="SimHei" w:cs="Calibri"/>
+        </w:rPr>
+        <w:t xml:space="preserve">2.5 模型与实现对应</w:t>
+      </w:r>
+    </w:p>
+    <w:p>
+      <w:pPr>
+        <w:ind w:left="0" w:firstLine="420"/>
+      </w:pPr>
+      <w:r>
+        <w:rPr>
+          <w:rFonts w:ascii="Calibri" w:hAnsi="Calibri" w:eastAsia="Microsoft YaHei" w:cs="Calibri"/>
+        </w:rPr>
+        <w:t xml:space="preserve">模型动作与实现机制采用稳定语义对应，而不依赖源码行号：</w:t>
+      </w:r>
+    </w:p>
+    <w:tbl>
+      <w:tblPr>
+        <w:tblStyle w:val="TableGrid"/>
+        <w:tblW w:w="5000" w:type="pct"/>
+        <w:tblLayout w:type="autofit"/>
+        <w:tblCellMar>
+          <w:top w:w="60" w:type="dxa"/>
+          <w:left w:w="90" w:type="dxa"/>
+          <w:bottom w:w="60" w:type="dxa"/>
+          <w:right w:w="90" w:type="dxa"/>
+        </w:tblCellMar>
+      </w:tblPr>
+      <w:tr>
+        <w:trPr>
+          <w:cantSplit/>
+          <w:tblHeader/>
+        </w:trPr>
+        <w:tc>
+          <w:tcPr>
+            <w:shd w:val="clear" w:color="auto" w:fill="D9E2F3"/>
+          </w:tcPr>
+          <w:p>
+            <w:pPr>
+              <w:pStyle w:val="TableText"/>
+              <w:jc w:val="left"/>
+              <w:spacing w:before="0" w:after="0" w:line="320" w:lineRule="exact"/>
+            </w:pPr>
+            <w:r>
+              <w:rPr>
+                <w:rFonts w:ascii="Calibri" w:hAnsi="Calibri" w:eastAsia="SimHei" w:cs="Calibri"/>
+                <w:b/>
+                <w:sz w:val="18"/>
+                <w:szCs w:val="18"/>
+              </w:rPr>
+              <w:t xml:space="preserve">模型动作</w:t>
+            </w:r>
+          </w:p>
+        </w:tc>
+        <w:tc>
+          <w:tcPr>
+            <w:shd w:val="clear" w:color="auto" w:fill="D9E2F3"/>
+          </w:tcPr>
+          <w:p>
+            <w:pPr>
+              <w:pStyle w:val="TableText"/>
+              <w:jc w:val="left"/>
+              <w:spacing w:before="0" w:after="0" w:line="320" w:lineRule="exact"/>
+            </w:pPr>
+            <w:r>
+              <w:rPr>
+                <w:rFonts w:ascii="Calibri" w:hAnsi="Calibri" w:eastAsia="SimHei" w:cs="Calibri"/>
+                <w:b/>
+                <w:sz w:val="18"/>
+                <w:szCs w:val="18"/>
+              </w:rPr>
+              <w:t xml:space="preserve">实现机制</w:t>
+            </w:r>
+          </w:p>
+        </w:tc>
+      </w:tr>
+      <w:tr>
+        <w:trPr>
+          <w:cantSplit/>
+        </w:trPr>
+        <w:tc>
+          <w:tcPr/>
+          <w:p>
+            <w:pPr>
+              <w:pStyle w:val="TableText"/>
+              <w:jc w:val="left"/>
+              <w:spacing w:before="0" w:after="0" w:line="320" w:lineRule="exact"/>
+            </w:pPr>
+            <w:r>
+              <w:rPr>
+                <w:rFonts w:ascii="Calibri" w:hAnsi="Calibri" w:eastAsia="Microsoft YaHei" w:cs="Calibri"/>
+                <w:sz w:val="18"/>
+                <w:szCs w:val="18"/>
+              </w:rPr>
+              <w:t xml:space="preserve">RequestGrant</w:t>
+            </w:r>
+          </w:p>
+        </w:tc>
+        <w:tc>
+          <w:tcPr/>
+          <w:p>
+            <w:pPr>
+              <w:pStyle w:val="TableText"/>
+              <w:jc w:val="left"/>
+              <w:spacing w:before="0" w:after="0" w:line="320" w:lineRule="exact"/>
+            </w:pPr>
+            <w:r>
+              <w:rPr>
+                <w:rFonts w:ascii="Calibri" w:hAnsi="Calibri" w:eastAsia="Microsoft YaHei" w:cs="Calibri"/>
+                <w:sz w:val="18"/>
+                <w:szCs w:val="18"/>
+              </w:rPr>
+              <w:t xml:space="preserve">UBCC 请求仲裁与 intended state 建立</w:t>
+            </w:r>
+          </w:p>
+        </w:tc>
+      </w:tr>
+      <w:tr>
+        <w:trPr>
+          <w:cantSplit/>
+        </w:trPr>
+        <w:tc>
+          <w:tcPr/>
+          <w:p>
+            <w:pPr>
+              <w:pStyle w:val="TableText"/>
+              <w:jc w:val="left"/>
+              <w:spacing w:before="0" w:after="0" w:line="320" w:lineRule="exact"/>
+            </w:pPr>
+            <w:r>
+              <w:rPr>
+                <w:rFonts w:ascii="Calibri" w:hAnsi="Calibri" w:eastAsia="Microsoft YaHei" w:cs="Calibri"/>
+                <w:sz w:val="18"/>
+                <w:szCs w:val="18"/>
+              </w:rPr>
+              <w:t xml:space="preserve">RecallOwner</w:t>
+            </w:r>
+          </w:p>
+        </w:tc>
+        <w:tc>
+          <w:tcPr/>
+          <w:p>
+            <w:pPr>
+              <w:pStyle w:val="TableText"/>
+              <w:jc w:val="left"/>
+              <w:spacing w:before="0" w:after="0" w:line="320" w:lineRule="exact"/>
+            </w:pPr>
+            <w:r>
+              <w:rPr>
+                <w:rFonts w:ascii="Calibri" w:hAnsi="Calibri" w:eastAsia="Microsoft YaHei" w:cs="Calibri"/>
+                <w:sz w:val="18"/>
+                <w:szCs w:val="18"/>
+              </w:rPr>
+              <w:t xml:space="preserve">RecallReq / RecallResp 数据回收</w:t>
+            </w:r>
+          </w:p>
+        </w:tc>
+      </w:tr>
+      <w:tr>
+        <w:trPr>
+          <w:cantSplit/>
+        </w:trPr>
+        <w:tc>
+          <w:tcPr/>
+          <w:p>
+            <w:pPr>
+              <w:pStyle w:val="TableText"/>
+              <w:jc w:val="left"/>
+              <w:spacing w:before="0" w:after="0" w:line="320" w:lineRule="exact"/>
+            </w:pPr>
+            <w:r>
+              <w:rPr>
+                <w:rFonts w:ascii="Calibri" w:hAnsi="Calibri" w:eastAsia="Microsoft YaHei" w:cs="Calibri"/>
+                <w:sz w:val="18"/>
+                <w:szCs w:val="18"/>
+              </w:rPr>
+              <w:t xml:space="preserve">InvalidateSharers</w:t>
+            </w:r>
+          </w:p>
+        </w:tc>
+        <w:tc>
+          <w:tcPr/>
+          <w:p>
+            <w:pPr>
+              <w:pStyle w:val="TableText"/>
+              <w:jc w:val="left"/>
+              <w:spacing w:before="0" w:after="0" w:line="320" w:lineRule="exact"/>
+            </w:pPr>
+            <w:r>
+              <w:rPr>
+                <w:rFonts w:ascii="Calibri" w:hAnsi="Calibri" w:eastAsia="Microsoft YaHei" w:cs="Calibri"/>
+                <w:sz w:val="18"/>
+                <w:szCs w:val="18"/>
+              </w:rPr>
+              <w:t xml:space="preserve">目标集合冻结、InvalidateReq 和 Ack 位图</w:t>
+            </w:r>
+          </w:p>
+        </w:tc>
+      </w:tr>
+      <w:tr>
+        <w:trPr>
+          <w:cantSplit/>
+        </w:trPr>
+        <w:tc>
+          <w:tcPr/>
+          <w:p>
+            <w:pPr>
+              <w:pStyle w:val="TableText"/>
+              <w:jc w:val="left"/>
+              <w:spacing w:before="0" w:after="0" w:line="320" w:lineRule="exact"/>
+            </w:pPr>
+            <w:r>
+              <w:rPr>
+                <w:rFonts w:ascii="Calibri" w:hAnsi="Calibri" w:eastAsia="Microsoft YaHei" w:cs="Calibri"/>
+                <w:sz w:val="18"/>
+                <w:szCs w:val="18"/>
+              </w:rPr>
+              <w:t xml:space="preserve">ClearCommit</w:t>
+            </w:r>
+          </w:p>
+        </w:tc>
+        <w:tc>
+          <w:tcPr/>
+          <w:p>
+            <w:pPr>
+              <w:pStyle w:val="TableText"/>
+              <w:jc w:val="left"/>
+              <w:spacing w:before="0" w:after="0" w:line="320" w:lineRule="exact"/>
+            </w:pPr>
+            <w:r>
+              <w:rPr>
+                <w:rFonts w:ascii="Calibri" w:hAnsi="Calibri" w:eastAsia="Microsoft YaHei" w:cs="Calibri"/>
+                <w:sz w:val="18"/>
+                <w:szCs w:val="18"/>
+              </w:rPr>
+              <w:t xml:space="preserve">Clear 身份校验与目录提交</w:t>
+            </w:r>
+          </w:p>
+        </w:tc>
+      </w:tr>
+      <w:tr>
+        <w:trPr>
+          <w:cantSplit/>
+        </w:trPr>
+        <w:tc>
+          <w:tcPr/>
+          <w:p>
+            <w:pPr>
+              <w:pStyle w:val="TableText"/>
+              <w:jc w:val="left"/>
+              <w:spacing w:before="0" w:after="0" w:line="320" w:lineRule="exact"/>
+            </w:pPr>
+            <w:r>
+              <w:rPr>
+                <w:rFonts w:ascii="Calibri" w:hAnsi="Calibri" w:eastAsia="Microsoft YaHei" w:cs="Calibri"/>
+                <w:sz w:val="18"/>
+                <w:szCs w:val="18"/>
+              </w:rPr>
+              <w:t xml:space="preserve">RetireWaiter</w:t>
+            </w:r>
+          </w:p>
+        </w:tc>
+        <w:tc>
+          <w:tcPr/>
+          <w:p>
+            <w:pPr>
+              <w:pStyle w:val="TableText"/>
+              <w:jc w:val="left"/>
+              <w:spacing w:before="0" w:after="0" w:line="320" w:lineRule="exact"/>
+            </w:pPr>
+            <w:r>
+              <w:rPr>
+                <w:rFonts w:ascii="Calibri" w:hAnsi="Calibri" w:eastAsia="Microsoft YaHei" w:cs="Calibri"/>
+                <w:sz w:val="18"/>
+                <w:szCs w:val="18"/>
+              </w:rPr>
+              <w:t xml:space="preserve">已完成 Read waiter 精确退役</w:t>
+            </w:r>
+          </w:p>
+        </w:tc>
+      </w:tr>
+      <w:tr>
+        <w:trPr>
+          <w:cantSplit/>
+        </w:trPr>
+        <w:tc>
+          <w:tcPr/>
+          <w:p>
+            <w:pPr>
+              <w:pStyle w:val="TableText"/>
+              <w:jc w:val="left"/>
+              <w:spacing w:before="0" w:after="0" w:line="320" w:lineRule="exact"/>
+            </w:pPr>
+            <w:r>
+              <w:rPr>
+                <w:rFonts w:ascii="Calibri" w:hAnsi="Calibri" w:eastAsia="Microsoft YaHei" w:cs="Calibri"/>
+                <w:sz w:val="18"/>
+                <w:szCs w:val="18"/>
+              </w:rPr>
+              <w:t xml:space="preserve">ReplayWaiter</w:t>
+            </w:r>
+          </w:p>
+        </w:tc>
+        <w:tc>
+          <w:tcPr/>
+          <w:p>
+            <w:pPr>
+              <w:pStyle w:val="TableText"/>
+              <w:jc w:val="left"/>
+              <w:spacing w:before="0" w:after="0" w:line="320" w:lineRule="exact"/>
+            </w:pPr>
+            <w:r>
+              <w:rPr>
+                <w:rFonts w:ascii="Calibri" w:hAnsi="Calibri" w:eastAsia="Microsoft YaHei" w:cs="Calibri"/>
+                <w:sz w:val="18"/>
+                <w:szCs w:val="18"/>
+              </w:rPr>
+              <w:t xml:space="preserve">阻塞条件解除后的请求重放</w:t>
+            </w:r>
+          </w:p>
+        </w:tc>
+      </w:tr>
+      <w:tr>
+        <w:trPr>
+          <w:cantSplit/>
+        </w:trPr>
+        <w:tc>
+          <w:tcPr/>
+          <w:p>
+            <w:pPr>
+              <w:pStyle w:val="TableText"/>
+              <w:jc w:val="left"/>
+              <w:spacing w:before="0" w:after="0" w:line="320" w:lineRule="exact"/>
+            </w:pPr>
+            <w:r>
+              <w:rPr>
+                <w:rFonts w:ascii="Calibri" w:hAnsi="Calibri" w:eastAsia="Microsoft YaHei" w:cs="Calibri"/>
+                <w:sz w:val="18"/>
+                <w:szCs w:val="18"/>
+              </w:rPr>
+              <w:t xml:space="preserve">SnoopArbitrate</w:t>
+            </w:r>
+          </w:p>
+        </w:tc>
+        <w:tc>
+          <w:tcPr/>
+          <w:p>
+            <w:pPr>
+              <w:pStyle w:val="TableText"/>
+              <w:jc w:val="left"/>
+              <w:spacing w:before="0" w:after="0" w:line="320" w:lineRule="exact"/>
+            </w:pPr>
+            <w:r>
+              <w:rPr>
+                <w:rFonts w:ascii="Calibri" w:hAnsi="Calibri" w:eastAsia="Microsoft YaHei" w:cs="Calibri"/>
+                <w:sz w:val="18"/>
+                <w:szCs w:val="18"/>
+              </w:rPr>
+              <w:t xml:space="preserve">EP-RNF 对同址 snoop 的 immediate/stale 仲裁</w:t>
             </w:r>
           </w:p>
         </w:tc>
@@ -2428,7 +2377,7 @@
         <w:rPr>
           <w:rFonts w:ascii="Calibri" w:hAnsi="Calibri" w:eastAsia="SimHei" w:cs="Calibri"/>
         </w:rPr>
-        <w:t xml:space="preserve">4. 可靠性机制</w:t>
+        <w:t xml:space="preserve">3. 形式化验证结果</w:t>
       </w:r>
     </w:p>
     <w:p>
@@ -2440,6 +2389,809 @@
         <w:rPr>
           <w:rFonts w:ascii="Calibri" w:hAnsi="Calibri" w:eastAsia="SimHei" w:cs="Calibri"/>
         </w:rPr>
+        <w:t xml:space="preserve">3.1 UBCC 目录核心</w:t>
+      </w:r>
+    </w:p>
+    <w:p>
+      <w:pPr>
+        <w:ind w:left="0" w:firstLine="420"/>
+      </w:pPr>
+      <w:r>
+        <w:rPr>
+          <w:rFonts w:ascii="Calibri" w:hAnsi="Calibri" w:eastAsia="Microsoft YaHei" w:cs="Calibri"/>
+        </w:rPr>
+        <w:t xml:space="preserve">目录核心模型覆盖请求、授权、Clear、Recall 和 Invalidate 的状态迁移，验证目录提交前后</w:t>
+      </w:r>
+    </w:p>
+    <w:p>
+      <w:pPr>
+        <w:ind w:left="0" w:firstLine="420"/>
+      </w:pPr>
+      <w:r>
+        <w:rPr>
+          <w:rFonts w:ascii="Calibri" w:hAnsi="Calibri" w:eastAsia="Microsoft YaHei" w:cs="Calibri"/>
+        </w:rPr>
+        <w:t xml:space="preserve">owner、sharer、epoch 和 outstanding 关系保持一致。</w:t>
+      </w:r>
+    </w:p>
+    <w:p>
+      <w:pPr>
+        <w:ind w:left="0" w:firstLine="420"/>
+      </w:pPr>
+      <w:r>
+        <w:rPr>
+          <w:rFonts w:ascii="Calibri" w:hAnsi="Calibri" w:eastAsia="Microsoft YaHei" w:cs="Calibri"/>
+        </w:rPr>
+        <w:t xml:space="preserve">验证结果表明：</w:t>
+      </w:r>
+    </w:p>
+    <w:p>
+      <w:pPr>
+        <w:ind w:left="360" w:firstLine="0"/>
+      </w:pPr>
+      <w:r>
+        <w:rPr>
+          <w:rFonts w:ascii="Calibri" w:hAnsi="Calibri" w:eastAsia="Microsoft YaHei" w:cs="Calibri"/>
+        </w:rPr>
+        <w:t xml:space="preserve">• 授权在途期间 committed state 保持安全；</w:t>
+      </w:r>
+    </w:p>
+    <w:p>
+      <w:pPr>
+        <w:ind w:left="360" w:firstLine="0"/>
+      </w:pPr>
+      <w:r>
+        <w:rPr>
+          <w:rFonts w:ascii="Calibri" w:hAnsi="Calibri" w:eastAsia="Microsoft YaHei" w:cs="Calibri"/>
+        </w:rPr>
+        <w:t xml:space="preserve">• Clear 只提交匹配事务；</w:t>
+      </w:r>
+    </w:p>
+    <w:p>
+      <w:pPr>
+        <w:ind w:left="360" w:firstLine="0"/>
+      </w:pPr>
+      <w:r>
+        <w:rPr>
+          <w:rFonts w:ascii="Calibri" w:hAnsi="Calibri" w:eastAsia="Microsoft YaHei" w:cs="Calibri"/>
+        </w:rPr>
+        <w:t xml:space="preserve">• Recall 与 Invalidate 不产生双 owner；</w:t>
+      </w:r>
+    </w:p>
+    <w:p>
+      <w:pPr>
+        <w:ind w:left="360" w:firstLine="0"/>
+      </w:pPr>
+      <w:r>
+        <w:rPr>
+          <w:rFonts w:ascii="Calibri" w:hAnsi="Calibri" w:eastAsia="Microsoft YaHei" w:cs="Calibri"/>
+        </w:rPr>
+        <w:t xml:space="preserve">• 重复和延迟消息不会改变已完成事务结果。</w:t>
+      </w:r>
+    </w:p>
+    <w:p>
+      <w:pPr>
+        <w:pStyle w:val="Heading3"/>
+        <w:keepNext/>
+      </w:pPr>
+      <w:r>
+        <w:rPr>
+          <w:rFonts w:ascii="Calibri" w:hAnsi="Calibri" w:eastAsia="SimHei" w:cs="Calibri"/>
+        </w:rPr>
+        <w:t xml:space="preserve">3.2 传输故障模型</w:t>
+      </w:r>
+    </w:p>
+    <w:p>
+      <w:pPr>
+        <w:ind w:left="0" w:firstLine="420"/>
+      </w:pPr>
+      <w:r>
+        <w:rPr>
+          <w:rFonts w:ascii="Calibri" w:hAnsi="Calibri" w:eastAsia="Microsoft YaHei" w:cs="Calibri"/>
+        </w:rPr>
+        <w:t xml:space="preserve">传输故障模型枚举丢失、重复和乱序消息，验证 epoch、reqId、Ack 位图和幂等确认能够阻止</w:t>
+      </w:r>
+    </w:p>
+    <w:p>
+      <w:pPr>
+        <w:ind w:left="0" w:firstLine="420"/>
+      </w:pPr>
+      <w:r>
+        <w:rPr>
+          <w:rFonts w:ascii="Calibri" w:hAnsi="Calibri" w:eastAsia="Microsoft YaHei" w:cs="Calibri"/>
+        </w:rPr>
+        <w:t xml:space="preserve">重复提交与过期状态覆盖。</w:t>
+      </w:r>
+    </w:p>
+    <w:p>
+      <w:pPr>
+        <w:pStyle w:val="Heading3"/>
+        <w:keepNext/>
+      </w:pPr>
+      <w:r>
+        <w:rPr>
+          <w:rFonts w:ascii="Calibri" w:hAnsi="Calibri" w:eastAsia="SimHei" w:cs="Calibri"/>
+        </w:rPr>
+        <w:t xml:space="preserve">3.3 多 PA 与多 Socket 隔离</w:t>
+      </w:r>
+    </w:p>
+    <w:p>
+      <w:pPr>
+        <w:ind w:left="0" w:firstLine="420"/>
+      </w:pPr>
+      <w:r>
+        <w:rPr>
+          <w:rFonts w:ascii="Calibri" w:hAnsi="Calibri" w:eastAsia="Microsoft YaHei" w:cs="Calibri"/>
+        </w:rPr>
+        <w:t xml:space="preserve">多 PA 和多 Socket 模型验证不同地址、不同 Home Socket 和不同 requester 的状态独立性。</w:t>
+      </w:r>
+    </w:p>
+    <w:p>
+      <w:pPr>
+        <w:ind w:left="0" w:firstLine="420"/>
+      </w:pPr>
+      <w:r>
+        <w:rPr>
+          <w:rFonts w:ascii="Calibri" w:hAnsi="Calibri" w:eastAsia="Microsoft YaHei" w:cs="Calibri"/>
+        </w:rPr>
+        <w:t xml:space="preserve">任一事务的 outstanding、waiter、Ack 集合和提交结果不会污染其他事务。</w:t>
+      </w:r>
+    </w:p>
+    <w:p>
+      <w:pPr>
+        <w:pStyle w:val="Heading3"/>
+        <w:keepNext/>
+      </w:pPr>
+      <w:r>
+        <w:rPr>
+          <w:rFonts w:ascii="Calibri" w:hAnsi="Calibri" w:eastAsia="SimHei" w:cs="Calibri"/>
+        </w:rPr>
+        <w:t xml:space="preserve">3.4 EP-RNF snoop 仲裁</w:t>
+      </w:r>
+    </w:p>
+    <w:p>
+      <w:pPr>
+        <w:ind w:left="0" w:firstLine="420"/>
+      </w:pPr>
+      <w:r>
+        <w:rPr>
+          <w:rFonts w:ascii="Calibri" w:hAnsi="Calibri" w:eastAsia="Microsoft YaHei" w:cs="Calibri"/>
+        </w:rPr>
+        <w:t xml:space="preserve">EP-RNF focused 模型覆盖 active Recall、ReadShared、ReadUnique、CleanUnique 与多类 snoop</w:t>
+      </w:r>
+    </w:p>
+    <w:p>
+      <w:pPr>
+        <w:ind w:left="0" w:firstLine="420"/>
+      </w:pPr>
+      <w:r>
+        <w:rPr>
+          <w:rFonts w:ascii="Calibri" w:hAnsi="Calibri" w:eastAsia="Microsoft YaHei" w:cs="Calibri"/>
+        </w:rPr>
+        <w:t xml:space="preserve">组合。模型验证 immediate 和 stale 响应规则能够打破同址循环等待，同时保持数据权限约束。</w:t>
+      </w:r>
+    </w:p>
+    <w:p>
+      <w:pPr>
+        <w:ind w:left="0" w:firstLine="420"/>
+      </w:pPr>
+      <w:r>
+        <w:rPr>
+          <w:rFonts w:ascii="Calibri" w:hAnsi="Calibri" w:eastAsia="Microsoft YaHei" w:cs="Calibri"/>
+        </w:rPr>
+        <w:t xml:space="preserve">该模型完成 328 个状态的全空间检查，Safety 属性全部通过。</w:t>
+      </w:r>
+    </w:p>
+    <w:p>
+      <w:pPr>
+        <w:pStyle w:val="Heading3"/>
+        <w:keepNext/>
+      </w:pPr>
+      <w:r>
+        <w:rPr>
+          <w:rFonts w:ascii="Calibri" w:hAnsi="Calibri" w:eastAsia="SimHei" w:cs="Calibri"/>
+        </w:rPr>
+        <w:t xml:space="preserve">3.5 committed waiter 精确退役</w:t>
+      </w:r>
+    </w:p>
+    <w:p>
+      <w:pPr>
+        <w:ind w:left="0" w:firstLine="420"/>
+      </w:pPr>
+      <w:r>
+        <w:rPr>
+          <w:rFonts w:ascii="Calibri" w:hAnsi="Calibri" w:eastAsia="Microsoft YaHei" w:cs="Calibri"/>
+        </w:rPr>
+        <w:t xml:space="preserve">成功提交 Clear 后，UBCC 按 (PA, node, socket, reqId) 精确退役已经完成的 Read waiter，</w:t>
+      </w:r>
+    </w:p>
+    <w:p>
+      <w:pPr>
+        <w:ind w:left="0" w:firstLine="420"/>
+      </w:pPr>
+      <w:r>
+        <w:rPr>
+          <w:rFonts w:ascii="Calibri" w:hAnsi="Calibri" w:eastAsia="Microsoft YaHei" w:cs="Calibri"/>
+        </w:rPr>
+        <w:t xml:space="preserve">保留其他 requester、事务身份和操作类型，再安全重放剩余请求。</w:t>
+      </w:r>
+    </w:p>
+    <w:p>
+      <w:pPr>
+        <w:ind w:left="0" w:firstLine="420"/>
+      </w:pPr>
+      <w:r>
+        <w:rPr>
+          <w:rFonts w:ascii="Calibri" w:hAnsi="Calibri" w:eastAsia="Microsoft YaHei" w:cs="Calibri"/>
+        </w:rPr>
+        <w:t xml:space="preserve">该 focused 模型完成 274,593 个状态的检查，验证以下性质：</w:t>
+      </w:r>
+    </w:p>
+    <w:p>
+      <w:pPr>
+        <w:ind w:left="360" w:firstLine="0"/>
+      </w:pPr>
+      <w:r>
+        <w:rPr>
+          <w:rFonts w:ascii="Calibri" w:hAnsi="Calibri" w:eastAsia="Microsoft YaHei" w:cs="Calibri"/>
+        </w:rPr>
+        <w:t xml:space="preserve">• 已完成 waiter 不会再次创建同类 outstanding；</w:t>
+      </w:r>
+    </w:p>
+    <w:p>
+      <w:pPr>
+        <w:ind w:left="360" w:firstLine="0"/>
+      </w:pPr>
+      <w:r>
+        <w:rPr>
+          <w:rFonts w:ascii="Calibri" w:hAnsi="Calibri" w:eastAsia="Microsoft YaHei" w:cs="Calibri"/>
+        </w:rPr>
+        <w:t xml:space="preserve">• 非匹配 waiter 不被误删；</w:t>
+      </w:r>
+    </w:p>
+    <w:p>
+      <w:pPr>
+        <w:ind w:left="360" w:firstLine="0"/>
+      </w:pPr>
+      <w:r>
+        <w:rPr>
+          <w:rFonts w:ascii="Calibri" w:hAnsi="Calibri" w:eastAsia="Microsoft YaHei" w:cs="Calibri"/>
+        </w:rPr>
+        <w:t xml:space="preserve">• Writeback、Upgrade 和 Evict waiter 保持独立；</w:t>
+      </w:r>
+    </w:p>
+    <w:p>
+      <w:pPr>
+        <w:ind w:left="360" w:firstLine="0"/>
+      </w:pPr>
+      <w:r>
+        <w:rPr>
+          <w:rFonts w:ascii="Calibri" w:hAnsi="Calibri" w:eastAsia="Microsoft YaHei" w:cs="Calibri"/>
+        </w:rPr>
+        <w:t xml:space="preserve">• replay 不改变已提交目录状态。</w:t>
+      </w:r>
+    </w:p>
+    <w:p>
+      <w:pPr>
+        <w:pStyle w:val="Heading3"/>
+        <w:keepNext/>
+      </w:pPr>
+      <w:r>
+        <w:rPr>
+          <w:rFonts w:ascii="Calibri" w:hAnsi="Calibri" w:eastAsia="SimHei" w:cs="Calibri"/>
+        </w:rPr>
+        <w:t xml:space="preserve">3.6 结果汇总</w:t>
+      </w:r>
+    </w:p>
+    <w:tbl>
+      <w:tblPr>
+        <w:tblStyle w:val="TableGrid"/>
+        <w:tblW w:w="5000" w:type="pct"/>
+        <w:tblLayout w:type="autofit"/>
+        <w:tblCellMar>
+          <w:top w:w="60" w:type="dxa"/>
+          <w:left w:w="90" w:type="dxa"/>
+          <w:bottom w:w="60" w:type="dxa"/>
+          <w:right w:w="90" w:type="dxa"/>
+        </w:tblCellMar>
+      </w:tblPr>
+      <w:tr>
+        <w:trPr>
+          <w:cantSplit/>
+          <w:tblHeader/>
+        </w:trPr>
+        <w:tc>
+          <w:tcPr>
+            <w:shd w:val="clear" w:color="auto" w:fill="D9E2F3"/>
+          </w:tcPr>
+          <w:p>
+            <w:pPr>
+              <w:pStyle w:val="TableText"/>
+              <w:jc w:val="left"/>
+              <w:spacing w:before="0" w:after="0" w:line="320" w:lineRule="exact"/>
+            </w:pPr>
+            <w:r>
+              <w:rPr>
+                <w:rFonts w:ascii="Calibri" w:hAnsi="Calibri" w:eastAsia="SimHei" w:cs="Calibri"/>
+                <w:b/>
+                <w:sz w:val="18"/>
+                <w:szCs w:val="18"/>
+              </w:rPr>
+              <w:t xml:space="preserve">模型组</w:t>
+            </w:r>
+          </w:p>
+        </w:tc>
+        <w:tc>
+          <w:tcPr>
+            <w:shd w:val="clear" w:color="auto" w:fill="D9E2F3"/>
+          </w:tcPr>
+          <w:p>
+            <w:pPr>
+              <w:pStyle w:val="TableText"/>
+              <w:jc w:val="left"/>
+              <w:spacing w:before="0" w:after="0" w:line="320" w:lineRule="exact"/>
+            </w:pPr>
+            <w:r>
+              <w:rPr>
+                <w:rFonts w:ascii="Calibri" w:hAnsi="Calibri" w:eastAsia="SimHei" w:cs="Calibri"/>
+                <w:b/>
+                <w:sz w:val="18"/>
+                <w:szCs w:val="18"/>
+              </w:rPr>
+              <w:t xml:space="preserve">核心论证</w:t>
+            </w:r>
+          </w:p>
+        </w:tc>
+        <w:tc>
+          <w:tcPr>
+            <w:shd w:val="clear" w:color="auto" w:fill="D9E2F3"/>
+          </w:tcPr>
+          <w:p>
+            <w:pPr>
+              <w:pStyle w:val="TableText"/>
+              <w:jc w:val="left"/>
+              <w:spacing w:before="0" w:after="0" w:line="320" w:lineRule="exact"/>
+            </w:pPr>
+            <w:r>
+              <w:rPr>
+                <w:rFonts w:ascii="Calibri" w:hAnsi="Calibri" w:eastAsia="SimHei" w:cs="Calibri"/>
+                <w:b/>
+                <w:sz w:val="18"/>
+                <w:szCs w:val="18"/>
+              </w:rPr>
+              <w:t xml:space="preserve">Safety</w:t>
+            </w:r>
+          </w:p>
+        </w:tc>
+        <w:tc>
+          <w:tcPr>
+            <w:shd w:val="clear" w:color="auto" w:fill="D9E2F3"/>
+          </w:tcPr>
+          <w:p>
+            <w:pPr>
+              <w:pStyle w:val="TableText"/>
+              <w:jc w:val="left"/>
+              <w:spacing w:before="0" w:after="0" w:line="320" w:lineRule="exact"/>
+            </w:pPr>
+            <w:r>
+              <w:rPr>
+                <w:rFonts w:ascii="Calibri" w:hAnsi="Calibri" w:eastAsia="SimHei" w:cs="Calibri"/>
+                <w:b/>
+                <w:sz w:val="18"/>
+                <w:szCs w:val="18"/>
+              </w:rPr>
+              <w:t xml:space="preserve">Liveness</w:t>
+            </w:r>
+          </w:p>
+        </w:tc>
+      </w:tr>
+      <w:tr>
+        <w:trPr>
+          <w:cantSplit/>
+        </w:trPr>
+        <w:tc>
+          <w:tcPr/>
+          <w:p>
+            <w:pPr>
+              <w:pStyle w:val="TableText"/>
+              <w:jc w:val="left"/>
+              <w:spacing w:before="0" w:after="0" w:line="320" w:lineRule="exact"/>
+            </w:pPr>
+            <w:r>
+              <w:rPr>
+                <w:rFonts w:ascii="Calibri" w:hAnsi="Calibri" w:eastAsia="Microsoft YaHei" w:cs="Calibri"/>
+                <w:sz w:val="18"/>
+                <w:szCs w:val="18"/>
+              </w:rPr>
+              <w:t xml:space="preserve">UBCC 目录核心</w:t>
+            </w:r>
+          </w:p>
+        </w:tc>
+        <w:tc>
+          <w:tcPr/>
+          <w:p>
+            <w:pPr>
+              <w:pStyle w:val="TableText"/>
+              <w:jc w:val="left"/>
+              <w:spacing w:before="0" w:after="0" w:line="320" w:lineRule="exact"/>
+            </w:pPr>
+            <w:r>
+              <w:rPr>
+                <w:rFonts w:ascii="Calibri" w:hAnsi="Calibri" w:eastAsia="Microsoft YaHei" w:cs="Calibri"/>
+                <w:sz w:val="18"/>
+                <w:szCs w:val="18"/>
+              </w:rPr>
+              <w:t xml:space="preserve">目录状态、授权与提交</w:t>
+            </w:r>
+          </w:p>
+        </w:tc>
+        <w:tc>
+          <w:tcPr/>
+          <w:p>
+            <w:pPr>
+              <w:pStyle w:val="TableText"/>
+              <w:jc w:val="left"/>
+              <w:spacing w:before="0" w:after="0" w:line="320" w:lineRule="exact"/>
+            </w:pPr>
+            <w:r>
+              <w:rPr>
+                <w:rFonts w:ascii="Calibri" w:hAnsi="Calibri" w:eastAsia="Microsoft YaHei" w:cs="Calibri"/>
+                <w:sz w:val="18"/>
+                <w:szCs w:val="18"/>
+              </w:rPr>
+              <w:t xml:space="preserve">通过</w:t>
+            </w:r>
+          </w:p>
+        </w:tc>
+        <w:tc>
+          <w:tcPr/>
+          <w:p>
+            <w:pPr>
+              <w:pStyle w:val="TableText"/>
+              <w:jc w:val="left"/>
+              <w:spacing w:before="0" w:after="0" w:line="320" w:lineRule="exact"/>
+            </w:pPr>
+            <w:r>
+              <w:rPr>
+                <w:rFonts w:ascii="Calibri" w:hAnsi="Calibri" w:eastAsia="Microsoft YaHei" w:cs="Calibri"/>
+                <w:sz w:val="18"/>
+                <w:szCs w:val="18"/>
+              </w:rPr>
+              <w:t xml:space="preserve">通过</w:t>
+            </w:r>
+          </w:p>
+        </w:tc>
+      </w:tr>
+      <w:tr>
+        <w:trPr>
+          <w:cantSplit/>
+        </w:trPr>
+        <w:tc>
+          <w:tcPr/>
+          <w:p>
+            <w:pPr>
+              <w:pStyle w:val="TableText"/>
+              <w:jc w:val="left"/>
+              <w:spacing w:before="0" w:after="0" w:line="320" w:lineRule="exact"/>
+            </w:pPr>
+            <w:r>
+              <w:rPr>
+                <w:rFonts w:ascii="Calibri" w:hAnsi="Calibri" w:eastAsia="Microsoft YaHei" w:cs="Calibri"/>
+                <w:sz w:val="18"/>
+                <w:szCs w:val="18"/>
+              </w:rPr>
+              <w:t xml:space="preserve">传输故障</w:t>
+            </w:r>
+          </w:p>
+        </w:tc>
+        <w:tc>
+          <w:tcPr/>
+          <w:p>
+            <w:pPr>
+              <w:pStyle w:val="TableText"/>
+              <w:jc w:val="left"/>
+              <w:spacing w:before="0" w:after="0" w:line="320" w:lineRule="exact"/>
+            </w:pPr>
+            <w:r>
+              <w:rPr>
+                <w:rFonts w:ascii="Calibri" w:hAnsi="Calibri" w:eastAsia="Microsoft YaHei" w:cs="Calibri"/>
+                <w:sz w:val="18"/>
+                <w:szCs w:val="18"/>
+              </w:rPr>
+              <w:t xml:space="preserve">丢失、重复、乱序</w:t>
+            </w:r>
+          </w:p>
+        </w:tc>
+        <w:tc>
+          <w:tcPr/>
+          <w:p>
+            <w:pPr>
+              <w:pStyle w:val="TableText"/>
+              <w:jc w:val="left"/>
+              <w:spacing w:before="0" w:after="0" w:line="320" w:lineRule="exact"/>
+            </w:pPr>
+            <w:r>
+              <w:rPr>
+                <w:rFonts w:ascii="Calibri" w:hAnsi="Calibri" w:eastAsia="Microsoft YaHei" w:cs="Calibri"/>
+                <w:sz w:val="18"/>
+                <w:szCs w:val="18"/>
+              </w:rPr>
+              <w:t xml:space="preserve">通过</w:t>
+            </w:r>
+          </w:p>
+        </w:tc>
+        <w:tc>
+          <w:tcPr/>
+          <w:p>
+            <w:pPr>
+              <w:pStyle w:val="TableText"/>
+              <w:jc w:val="left"/>
+              <w:spacing w:before="0" w:after="0" w:line="320" w:lineRule="exact"/>
+            </w:pPr>
+            <w:r>
+              <w:rPr>
+                <w:rFonts w:ascii="Calibri" w:hAnsi="Calibri" w:eastAsia="Microsoft YaHei" w:cs="Calibri"/>
+                <w:sz w:val="18"/>
+                <w:szCs w:val="18"/>
+              </w:rPr>
+              <w:t xml:space="preserve">通过</w:t>
+            </w:r>
+          </w:p>
+        </w:tc>
+      </w:tr>
+      <w:tr>
+        <w:trPr>
+          <w:cantSplit/>
+        </w:trPr>
+        <w:tc>
+          <w:tcPr/>
+          <w:p>
+            <w:pPr>
+              <w:pStyle w:val="TableText"/>
+              <w:jc w:val="left"/>
+              <w:spacing w:before="0" w:after="0" w:line="320" w:lineRule="exact"/>
+            </w:pPr>
+            <w:r>
+              <w:rPr>
+                <w:rFonts w:ascii="Calibri" w:hAnsi="Calibri" w:eastAsia="Microsoft YaHei" w:cs="Calibri"/>
+                <w:sz w:val="18"/>
+                <w:szCs w:val="18"/>
+              </w:rPr>
+              <w:t xml:space="preserve">多 PA / 多 Socket</w:t>
+            </w:r>
+          </w:p>
+        </w:tc>
+        <w:tc>
+          <w:tcPr/>
+          <w:p>
+            <w:pPr>
+              <w:pStyle w:val="TableText"/>
+              <w:jc w:val="left"/>
+              <w:spacing w:before="0" w:after="0" w:line="320" w:lineRule="exact"/>
+            </w:pPr>
+            <w:r>
+              <w:rPr>
+                <w:rFonts w:ascii="Calibri" w:hAnsi="Calibri" w:eastAsia="Microsoft YaHei" w:cs="Calibri"/>
+                <w:sz w:val="18"/>
+                <w:szCs w:val="18"/>
+              </w:rPr>
+              <w:t xml:space="preserve">状态隔离</w:t>
+            </w:r>
+          </w:p>
+        </w:tc>
+        <w:tc>
+          <w:tcPr/>
+          <w:p>
+            <w:pPr>
+              <w:pStyle w:val="TableText"/>
+              <w:jc w:val="left"/>
+              <w:spacing w:before="0" w:after="0" w:line="320" w:lineRule="exact"/>
+            </w:pPr>
+            <w:r>
+              <w:rPr>
+                <w:rFonts w:ascii="Calibri" w:hAnsi="Calibri" w:eastAsia="Microsoft YaHei" w:cs="Calibri"/>
+                <w:sz w:val="18"/>
+                <w:szCs w:val="18"/>
+              </w:rPr>
+              <w:t xml:space="preserve">通过</w:t>
+            </w:r>
+          </w:p>
+        </w:tc>
+        <w:tc>
+          <w:tcPr/>
+          <w:p>
+            <w:pPr>
+              <w:pStyle w:val="TableText"/>
+              <w:jc w:val="left"/>
+              <w:spacing w:before="0" w:after="0" w:line="320" w:lineRule="exact"/>
+            </w:pPr>
+            <w:r>
+              <w:rPr>
+                <w:rFonts w:ascii="Calibri" w:hAnsi="Calibri" w:eastAsia="Microsoft YaHei" w:cs="Calibri"/>
+                <w:sz w:val="18"/>
+                <w:szCs w:val="18"/>
+              </w:rPr>
+              <w:t xml:space="preserve">通过</w:t>
+            </w:r>
+          </w:p>
+        </w:tc>
+      </w:tr>
+      <w:tr>
+        <w:trPr>
+          <w:cantSplit/>
+        </w:trPr>
+        <w:tc>
+          <w:tcPr/>
+          <w:p>
+            <w:pPr>
+              <w:pStyle w:val="TableText"/>
+              <w:jc w:val="left"/>
+              <w:spacing w:before="0" w:after="0" w:line="320" w:lineRule="exact"/>
+            </w:pPr>
+            <w:r>
+              <w:rPr>
+                <w:rFonts w:ascii="Calibri" w:hAnsi="Calibri" w:eastAsia="Microsoft YaHei" w:cs="Calibri"/>
+                <w:sz w:val="18"/>
+                <w:szCs w:val="18"/>
+              </w:rPr>
+              <w:t xml:space="preserve">EP-RNF 仲裁</w:t>
+            </w:r>
+          </w:p>
+        </w:tc>
+        <w:tc>
+          <w:tcPr/>
+          <w:p>
+            <w:pPr>
+              <w:pStyle w:val="TableText"/>
+              <w:jc w:val="left"/>
+              <w:spacing w:before="0" w:after="0" w:line="320" w:lineRule="exact"/>
+            </w:pPr>
+            <w:r>
+              <w:rPr>
+                <w:rFonts w:ascii="Calibri" w:hAnsi="Calibri" w:eastAsia="Microsoft YaHei" w:cs="Calibri"/>
+                <w:sz w:val="18"/>
+                <w:szCs w:val="18"/>
+              </w:rPr>
+              <w:t xml:space="preserve">同址 snoop 收敛</w:t>
+            </w:r>
+          </w:p>
+        </w:tc>
+        <w:tc>
+          <w:tcPr/>
+          <w:p>
+            <w:pPr>
+              <w:pStyle w:val="TableText"/>
+              <w:jc w:val="left"/>
+              <w:spacing w:before="0" w:after="0" w:line="320" w:lineRule="exact"/>
+            </w:pPr>
+            <w:r>
+              <w:rPr>
+                <w:rFonts w:ascii="Calibri" w:hAnsi="Calibri" w:eastAsia="Microsoft YaHei" w:cs="Calibri"/>
+                <w:sz w:val="18"/>
+                <w:szCs w:val="18"/>
+              </w:rPr>
+              <w:t xml:space="preserve">通过</w:t>
+            </w:r>
+          </w:p>
+        </w:tc>
+        <w:tc>
+          <w:tcPr/>
+          <w:p>
+            <w:pPr>
+              <w:pStyle w:val="TableText"/>
+              <w:jc w:val="left"/>
+              <w:spacing w:before="0" w:after="0" w:line="320" w:lineRule="exact"/>
+            </w:pPr>
+            <w:r>
+              <w:rPr>
+                <w:rFonts w:ascii="Calibri" w:hAnsi="Calibri" w:eastAsia="Microsoft YaHei" w:cs="Calibri"/>
+                <w:sz w:val="18"/>
+                <w:szCs w:val="18"/>
+              </w:rPr>
+              <w:t xml:space="preserve">通过</w:t>
+            </w:r>
+          </w:p>
+        </w:tc>
+      </w:tr>
+      <w:tr>
+        <w:trPr>
+          <w:cantSplit/>
+        </w:trPr>
+        <w:tc>
+          <w:tcPr/>
+          <w:p>
+            <w:pPr>
+              <w:pStyle w:val="TableText"/>
+              <w:jc w:val="left"/>
+              <w:spacing w:before="0" w:after="0" w:line="320" w:lineRule="exact"/>
+            </w:pPr>
+            <w:r>
+              <w:rPr>
+                <w:rFonts w:ascii="Calibri" w:hAnsi="Calibri" w:eastAsia="Microsoft YaHei" w:cs="Calibri"/>
+                <w:sz w:val="18"/>
+                <w:szCs w:val="18"/>
+              </w:rPr>
+              <w:t xml:space="preserve">waiter 退役</w:t>
+            </w:r>
+          </w:p>
+        </w:tc>
+        <w:tc>
+          <w:tcPr/>
+          <w:p>
+            <w:pPr>
+              <w:pStyle w:val="TableText"/>
+              <w:jc w:val="left"/>
+              <w:spacing w:before="0" w:after="0" w:line="320" w:lineRule="exact"/>
+            </w:pPr>
+            <w:r>
+              <w:rPr>
+                <w:rFonts w:ascii="Calibri" w:hAnsi="Calibri" w:eastAsia="Microsoft YaHei" w:cs="Calibri"/>
+                <w:sz w:val="18"/>
+                <w:szCs w:val="18"/>
+              </w:rPr>
+              <w:t xml:space="preserve">精确退役与重放</w:t>
+            </w:r>
+          </w:p>
+        </w:tc>
+        <w:tc>
+          <w:tcPr/>
+          <w:p>
+            <w:pPr>
+              <w:pStyle w:val="TableText"/>
+              <w:jc w:val="left"/>
+              <w:spacing w:before="0" w:after="0" w:line="320" w:lineRule="exact"/>
+            </w:pPr>
+            <w:r>
+              <w:rPr>
+                <w:rFonts w:ascii="Calibri" w:hAnsi="Calibri" w:eastAsia="Microsoft YaHei" w:cs="Calibri"/>
+                <w:sz w:val="18"/>
+                <w:szCs w:val="18"/>
+              </w:rPr>
+              <w:t xml:space="preserve">通过</w:t>
+            </w:r>
+          </w:p>
+        </w:tc>
+        <w:tc>
+          <w:tcPr/>
+          <w:p>
+            <w:pPr>
+              <w:pStyle w:val="TableText"/>
+              <w:jc w:val="left"/>
+              <w:spacing w:before="0" w:after="0" w:line="320" w:lineRule="exact"/>
+            </w:pPr>
+            <w:r>
+              <w:rPr>
+                <w:rFonts w:ascii="Calibri" w:hAnsi="Calibri" w:eastAsia="Microsoft YaHei" w:cs="Calibri"/>
+                <w:sz w:val="18"/>
+                <w:szCs w:val="18"/>
+              </w:rPr>
+              <w:t xml:space="preserve">通过</w:t>
+            </w:r>
+          </w:p>
+        </w:tc>
+      </w:tr>
+    </w:tbl>
+    <w:p>
+      <w:pPr>
+        <w:pStyle w:val="Heading2"/>
+        <w:keepNext/>
+      </w:pPr>
+      <w:r>
+        <w:rPr>
+          <w:rFonts w:ascii="Calibri" w:hAnsi="Calibri" w:eastAsia="SimHei" w:cs="Calibri"/>
+        </w:rPr>
+        <w:t xml:space="preserve">4. 可靠性机制</w:t>
+      </w:r>
+    </w:p>
+    <w:p>
+      <w:pPr>
+        <w:pStyle w:val="Heading3"/>
+        <w:keepNext/>
+      </w:pPr>
+      <w:r>
+        <w:rPr>
+          <w:rFonts w:ascii="Calibri" w:hAnsi="Calibri" w:eastAsia="SimHei" w:cs="Calibri"/>
+        </w:rPr>
         <w:t xml:space="preserve">4.1 两阶段目录提交</w:t>
       </w:r>
     </w:p>
@@ -2512,8 +3264,7 @@
     <w:p>
       <w:pPr>
         <w:jc w:val="center"/>
-        <w:keepNext/>
-        <w:spacing w:before="100" w:after="40"/>
+        <w:spacing w:before="100" w:after="40" w:line="240" w:lineRule="auto"/>
       </w:pPr>
       <w:r>
         <w:drawing>
@@ -4037,8 +4788,7 @@
     <w:p>
       <w:pPr>
         <w:jc w:val="center"/>
-        <w:keepNext/>
-        <w:spacing w:before="100" w:after="40"/>
+        <w:spacing w:before="100" w:after="40" w:line="240" w:lineRule="auto"/>
       </w:pPr>
       <w:r>
         <w:drawing>
@@ -5175,7 +5925,7 @@
         <w:rPr>
           <w:rFonts w:ascii="Calibri" w:hAnsi="Calibri" w:eastAsia="SimHei" w:cs="Calibri"/>
         </w:rPr>
-        <w:t xml:space="preserve">6.2 理论结构比较</w:t>
+        <w:t xml:space="preserve">6.2 假设与公平性边界</w:t>
       </w:r>
     </w:p>
     <w:tbl>
@@ -5233,7 +5983,7 @@
                 <w:sz w:val="18"/>
                 <w:szCs w:val="18"/>
               </w:rPr>
-              <w:t xml:space="preserve">UBCC</w:t>
+              <w:t xml:space="preserve">客户确认 / 冻结参考假设</w:t>
             </w:r>
           </w:p>
         </w:tc>
@@ -5254,336 +6004,361 @@
                 <w:sz w:val="18"/>
                 <w:szCs w:val="18"/>
               </w:rPr>
-              <w:t xml:space="preserve">HA-VI 冻结参考</w:t>
-            </w:r>
-          </w:p>
-        </w:tc>
-        <w:tc>
-          <w:tcPr>
-            <w:shd w:val="clear" w:color="auto" w:fill="D9E2F3"/>
-          </w:tcPr>
-          <w:p>
-            <w:pPr>
-              <w:pStyle w:val="TableText"/>
-              <w:jc w:val="left"/>
-              <w:spacing w:before="0" w:after="0" w:line="320" w:lineRule="exact"/>
-            </w:pPr>
-            <w:r>
-              <w:rPr>
-                <w:rFonts w:ascii="Calibri" w:hAnsi="Calibri" w:eastAsia="SimHei" w:cs="Calibri"/>
-                <w:b/>
-                <w:sz w:val="18"/>
-                <w:szCs w:val="18"/>
-              </w:rPr>
-              <w:t xml:space="preserve">理论含义</w:t>
-            </w:r>
-          </w:p>
-        </w:tc>
-      </w:tr>
-      <w:tr>
-        <w:trPr>
-          <w:cantSplit/>
-        </w:trPr>
-        <w:tc>
-          <w:tcPr/>
-          <w:p>
-            <w:pPr>
-              <w:pStyle w:val="TableText"/>
-              <w:jc w:val="left"/>
-              <w:spacing w:before="0" w:after="0" w:line="320" w:lineRule="exact"/>
-            </w:pPr>
-            <w:r>
-              <w:rPr>
-                <w:rFonts w:ascii="Calibri" w:hAnsi="Calibri" w:eastAsia="Microsoft YaHei" w:cs="Calibri"/>
-                <w:sz w:val="18"/>
-                <w:szCs w:val="18"/>
-              </w:rPr>
-              <w:t xml:space="preserve">全局状态表达</w:t>
-            </w:r>
-          </w:p>
-        </w:tc>
-        <w:tc>
-          <w:tcPr/>
-          <w:p>
-            <w:pPr>
-              <w:pStyle w:val="TableText"/>
-              <w:jc w:val="left"/>
-              <w:spacing w:before="0" w:after="0" w:line="320" w:lineRule="exact"/>
-            </w:pPr>
-            <w:r>
-              <w:rPr>
-                <w:rFonts w:ascii="Calibri" w:hAnsi="Calibri" w:eastAsia="Microsoft YaHei" w:cs="Calibri"/>
-                <w:sz w:val="18"/>
-                <w:szCs w:val="18"/>
-              </w:rPr>
-              <w:t xml:space="preserve">精确 owner、sharer 与事务身份</w:t>
-            </w:r>
-          </w:p>
-        </w:tc>
-        <w:tc>
-          <w:tcPr/>
-          <w:p>
-            <w:pPr>
-              <w:pStyle w:val="TableText"/>
-              <w:jc w:val="left"/>
-              <w:spacing w:before="0" w:after="0" w:line="320" w:lineRule="exact"/>
-            </w:pPr>
-            <w:r>
-              <w:rPr>
-                <w:rFonts w:ascii="Calibri" w:hAnsi="Calibri" w:eastAsia="Microsoft YaHei" w:cs="Calibri"/>
-                <w:sz w:val="18"/>
-                <w:szCs w:val="18"/>
-              </w:rPr>
-              <w:t xml:space="preserve">VI 有效/无效关系的窄化表达</w:t>
-            </w:r>
-          </w:p>
-        </w:tc>
-        <w:tc>
-          <w:tcPr/>
-          <w:p>
-            <w:pPr>
-              <w:pStyle w:val="TableText"/>
-              <w:jc w:val="left"/>
-              <w:spacing w:before="0" w:after="0" w:line="320" w:lineRule="exact"/>
-            </w:pPr>
-            <w:r>
-              <w:rPr>
-                <w:rFonts w:ascii="Calibri" w:hAnsi="Calibri" w:eastAsia="Microsoft YaHei" w:cs="Calibri"/>
-                <w:sz w:val="18"/>
-                <w:szCs w:val="18"/>
-              </w:rPr>
-              <w:t xml:space="preserve">UBCC 可直接形成精确 Recall/Invalidate 目标</w:t>
-            </w:r>
-          </w:p>
-        </w:tc>
-      </w:tr>
-      <w:tr>
-        <w:trPr>
-          <w:cantSplit/>
-        </w:trPr>
-        <w:tc>
-          <w:tcPr/>
-          <w:p>
-            <w:pPr>
-              <w:pStyle w:val="TableText"/>
-              <w:jc w:val="left"/>
-              <w:spacing w:before="0" w:after="0" w:line="320" w:lineRule="exact"/>
-            </w:pPr>
-            <w:r>
-              <w:rPr>
-                <w:rFonts w:ascii="Calibri" w:hAnsi="Calibri" w:eastAsia="Microsoft YaHei" w:cs="Calibri"/>
-                <w:sz w:val="18"/>
-                <w:szCs w:val="18"/>
-              </w:rPr>
-              <w:t xml:space="preserve">目录资源</w:t>
-            </w:r>
-          </w:p>
-        </w:tc>
-        <w:tc>
-          <w:tcPr/>
-          <w:p>
-            <w:pPr>
-              <w:pStyle w:val="TableText"/>
-              <w:jc w:val="left"/>
-              <w:spacing w:before="0" w:after="0" w:line="320" w:lineRule="exact"/>
-            </w:pPr>
-            <w:r>
-              <w:rPr>
-                <w:rFonts w:ascii="Calibri" w:hAnsi="Calibri" w:eastAsia="Microsoft YaHei" w:cs="Calibri"/>
-                <w:sz w:val="18"/>
-                <w:szCs w:val="18"/>
-              </w:rPr>
-              <w:t xml:space="preserve">独立 ResidentDir + Backstore</w:t>
-            </w:r>
-          </w:p>
-        </w:tc>
-        <w:tc>
-          <w:tcPr/>
-          <w:p>
-            <w:pPr>
-              <w:pStyle w:val="TableText"/>
-              <w:jc w:val="left"/>
-              <w:spacing w:before="0" w:after="0" w:line="320" w:lineRule="exact"/>
-            </w:pPr>
-            <w:r>
-              <w:rPr>
-                <w:rFonts w:ascii="Calibri" w:hAnsi="Calibri" w:eastAsia="Microsoft YaHei" w:cs="Calibri"/>
-                <w:sz w:val="18"/>
-                <w:szCs w:val="18"/>
-              </w:rPr>
-              <w:t xml:space="preserve">冻结参考目录组织</w:t>
-            </w:r>
-          </w:p>
-        </w:tc>
-        <w:tc>
-          <w:tcPr/>
-          <w:p>
-            <w:pPr>
-              <w:pStyle w:val="TableText"/>
-              <w:jc w:val="left"/>
-              <w:spacing w:before="0" w:after="0" w:line="320" w:lineRule="exact"/>
-            </w:pPr>
-            <w:r>
-              <w:rPr>
-                <w:rFonts w:ascii="Calibri" w:hAnsi="Calibri" w:eastAsia="Microsoft YaHei" w:cs="Calibri"/>
-                <w:sz w:val="18"/>
-                <w:szCs w:val="18"/>
-              </w:rPr>
-              <w:t xml:space="preserve">UBCC 将全局元数据与节点内 Home 资源解耦</w:t>
-            </w:r>
-          </w:p>
-        </w:tc>
-      </w:tr>
-      <w:tr>
-        <w:trPr>
-          <w:cantSplit/>
-        </w:trPr>
-        <w:tc>
-          <w:tcPr/>
-          <w:p>
-            <w:pPr>
-              <w:pStyle w:val="TableText"/>
-              <w:jc w:val="left"/>
-              <w:spacing w:before="0" w:after="0" w:line="320" w:lineRule="exact"/>
-            </w:pPr>
-            <w:r>
-              <w:rPr>
-                <w:rFonts w:ascii="Calibri" w:hAnsi="Calibri" w:eastAsia="Microsoft YaHei" w:cs="Calibri"/>
-                <w:sz w:val="18"/>
-                <w:szCs w:val="18"/>
-              </w:rPr>
-              <w:t xml:space="preserve">提交语义</w:t>
-            </w:r>
-          </w:p>
-        </w:tc>
-        <w:tc>
-          <w:tcPr/>
-          <w:p>
-            <w:pPr>
-              <w:pStyle w:val="TableText"/>
-              <w:jc w:val="left"/>
-              <w:spacing w:before="0" w:after="0" w:line="320" w:lineRule="exact"/>
-            </w:pPr>
-            <w:r>
-              <w:rPr>
-                <w:rFonts w:ascii="Calibri" w:hAnsi="Calibri" w:eastAsia="Microsoft YaHei" w:cs="Calibri"/>
-                <w:sz w:val="18"/>
-                <w:szCs w:val="18"/>
-              </w:rPr>
-              <w:t xml:space="preserve">Grant 与 Clear 两阶段提交</w:t>
-            </w:r>
-          </w:p>
-        </w:tc>
-        <w:tc>
-          <w:tcPr/>
-          <w:p>
-            <w:pPr>
-              <w:pStyle w:val="TableText"/>
-              <w:jc w:val="left"/>
-              <w:spacing w:before="0" w:after="0" w:line="320" w:lineRule="exact"/>
-            </w:pPr>
-            <w:r>
-              <w:rPr>
-                <w:rFonts w:ascii="Calibri" w:hAnsi="Calibri" w:eastAsia="Microsoft YaHei" w:cs="Calibri"/>
-                <w:sz w:val="18"/>
-                <w:szCs w:val="18"/>
-              </w:rPr>
-              <w:t xml:space="preserve">参考模型完成链</w:t>
-            </w:r>
-          </w:p>
-        </w:tc>
-        <w:tc>
-          <w:tcPr/>
-          <w:p>
-            <w:pPr>
-              <w:pStyle w:val="TableText"/>
-              <w:jc w:val="left"/>
-              <w:spacing w:before="0" w:after="0" w:line="320" w:lineRule="exact"/>
-            </w:pPr>
-            <w:r>
-              <w:rPr>
-                <w:rFonts w:ascii="Calibri" w:hAnsi="Calibri" w:eastAsia="Microsoft YaHei" w:cs="Calibri"/>
-                <w:sz w:val="18"/>
-                <w:szCs w:val="18"/>
-              </w:rPr>
-              <w:t xml:space="preserve">UBCC 显式区分承诺与提交，并支持幂等恢复</w:t>
-            </w:r>
-          </w:p>
-        </w:tc>
-      </w:tr>
-      <w:tr>
-        <w:trPr>
-          <w:cantSplit/>
-        </w:trPr>
-        <w:tc>
-          <w:tcPr/>
-          <w:p>
-            <w:pPr>
-              <w:pStyle w:val="TableText"/>
-              <w:jc w:val="left"/>
-              <w:spacing w:before="0" w:after="0" w:line="320" w:lineRule="exact"/>
-            </w:pPr>
-            <w:r>
-              <w:rPr>
-                <w:rFonts w:ascii="Calibri" w:hAnsi="Calibri" w:eastAsia="Microsoft YaHei" w:cs="Calibri"/>
-                <w:sz w:val="18"/>
-                <w:szCs w:val="18"/>
-              </w:rPr>
-              <w:t xml:space="preserve">数据源选择</w:t>
-            </w:r>
-          </w:p>
-        </w:tc>
-        <w:tc>
-          <w:tcPr/>
-          <w:p>
-            <w:pPr>
-              <w:pStyle w:val="TableText"/>
-              <w:jc w:val="left"/>
-              <w:spacing w:before="0" w:after="0" w:line="320" w:lineRule="exact"/>
-            </w:pPr>
-            <w:r>
-              <w:rPr>
-                <w:rFonts w:ascii="Calibri" w:hAnsi="Calibri" w:eastAsia="Microsoft YaHei" w:cs="Calibri"/>
-                <w:sz w:val="18"/>
-                <w:szCs w:val="18"/>
-              </w:rPr>
-              <w:t xml:space="preserve">按 owner 定位权威数据</w:t>
-            </w:r>
-          </w:p>
-        </w:tc>
-        <w:tc>
-          <w:tcPr/>
-          <w:p>
-            <w:pPr>
-              <w:pStyle w:val="TableText"/>
-              <w:jc w:val="left"/>
-              <w:spacing w:before="0" w:after="0" w:line="320" w:lineRule="exact"/>
-            </w:pPr>
-            <w:r>
-              <w:rPr>
-                <w:rFonts w:ascii="Calibri" w:hAnsi="Calibri" w:eastAsia="Microsoft YaHei" w:cs="Calibri"/>
-                <w:sz w:val="18"/>
-                <w:szCs w:val="18"/>
-              </w:rPr>
-              <w:t xml:space="preserve">按参考模型状态路径处理</w:t>
-            </w:r>
-          </w:p>
-        </w:tc>
-        <w:tc>
-          <w:tcPr/>
-          <w:p>
-            <w:pPr>
-              <w:pStyle w:val="TableText"/>
-              <w:jc w:val="left"/>
-              <w:spacing w:before="0" w:after="0" w:line="320" w:lineRule="exact"/>
-            </w:pPr>
-            <w:r>
-              <w:rPr>
-                <w:rFonts w:ascii="Calibri" w:hAnsi="Calibri" w:eastAsia="Microsoft YaHei" w:cs="Calibri"/>
-                <w:sz w:val="18"/>
-                <w:szCs w:val="18"/>
-              </w:rPr>
-              <w:t xml:space="preserve">对 ownership handoff 和 shared-to-writer 路径影响最直接</w:t>
+              <w:t xml:space="preserve">未建模硬件或禁止外推项</w:t>
+            </w:r>
+          </w:p>
+        </w:tc>
+      </w:tr>
+      <w:tr>
+        <w:trPr>
+          <w:cantSplit/>
+        </w:trPr>
+        <w:tc>
+          <w:tcPr/>
+          <w:p>
+            <w:pPr>
+              <w:pStyle w:val="TableText"/>
+              <w:jc w:val="left"/>
+              <w:spacing w:before="0" w:after="0" w:line="320" w:lineRule="exact"/>
+            </w:pPr>
+            <w:r>
+              <w:rPr>
+                <w:rFonts w:ascii="Calibri" w:hAnsi="Calibri" w:eastAsia="Microsoft YaHei" w:cs="Calibri"/>
+                <w:sz w:val="18"/>
+                <w:szCs w:val="18"/>
+              </w:rPr>
+              <w:t xml:space="preserve">系统与处理器</w:t>
+            </w:r>
+          </w:p>
+        </w:tc>
+        <w:tc>
+          <w:tcPr/>
+          <w:p>
+            <w:pPr>
+              <w:pStyle w:val="TableText"/>
+              <w:jc w:val="left"/>
+              <w:spacing w:before="0" w:after="0" w:line="320" w:lineRule="exact"/>
+            </w:pPr>
+            <w:r>
+              <w:rPr>
+                <w:rFonts w:ascii="Calibri" w:hAnsi="Calibri" w:eastAsia="Microsoft YaHei" w:cs="Calibri"/>
+                <w:sz w:val="18"/>
+                <w:szCs w:val="18"/>
+              </w:rPr>
+              <w:t xml:space="preserve">2N1S、O3；UBCC 与 HA-VI 使用相同节点和处理器条件</w:t>
+            </w:r>
+          </w:p>
+        </w:tc>
+        <w:tc>
+          <w:tcPr/>
+          <w:p>
+            <w:pPr>
+              <w:pStyle w:val="TableText"/>
+              <w:jc w:val="left"/>
+              <w:spacing w:before="0" w:after="0" w:line="320" w:lineRule="exact"/>
+            </w:pPr>
+            <w:r>
+              <w:rPr>
+                <w:rFonts w:ascii="Calibri" w:hAnsi="Calibri" w:eastAsia="Microsoft YaHei" w:cs="Calibri"/>
+                <w:sz w:val="18"/>
+                <w:szCs w:val="18"/>
+              </w:rPr>
+              <w:t xml:space="preserve">客户物理芯片的核、缓存和 Home 微体系结构</w:t>
+            </w:r>
+          </w:p>
+        </w:tc>
+      </w:tr>
+      <w:tr>
+        <w:trPr>
+          <w:cantSplit/>
+        </w:trPr>
+        <w:tc>
+          <w:tcPr/>
+          <w:p>
+            <w:pPr>
+              <w:pStyle w:val="TableText"/>
+              <w:jc w:val="left"/>
+              <w:spacing w:before="0" w:after="0" w:line="320" w:lineRule="exact"/>
+            </w:pPr>
+            <w:r>
+              <w:rPr>
+                <w:rFonts w:ascii="Calibri" w:hAnsi="Calibri" w:eastAsia="Microsoft YaHei" w:cs="Calibri"/>
+                <w:sz w:val="18"/>
+                <w:szCs w:val="18"/>
+              </w:rPr>
+              <w:t xml:space="preserve">workload 与输入</w:t>
+            </w:r>
+          </w:p>
+        </w:tc>
+        <w:tc>
+          <w:tcPr/>
+          <w:p>
+            <w:pPr>
+              <w:pStyle w:val="TableText"/>
+              <w:jc w:val="left"/>
+              <w:spacing w:before="0" w:after="0" w:line="320" w:lineRule="exact"/>
+            </w:pPr>
+            <w:r>
+              <w:rPr>
+                <w:rFonts w:ascii="Calibri" w:hAnsi="Calibri" w:eastAsia="Microsoft YaHei" w:cs="Calibri"/>
+                <w:sz w:val="18"/>
+                <w:szCs w:val="18"/>
+              </w:rPr>
+              <w:t xml:space="preserve">相同 testcase、输入、操作配比和 L3 压力点</w:t>
+            </w:r>
+          </w:p>
+        </w:tc>
+        <w:tc>
+          <w:tcPr/>
+          <w:p>
+            <w:pPr>
+              <w:pStyle w:val="TableText"/>
+              <w:jc w:val="left"/>
+              <w:spacing w:before="0" w:after="0" w:line="320" w:lineRule="exact"/>
+            </w:pPr>
+            <w:r>
+              <w:rPr>
+                <w:rFonts w:ascii="Calibri" w:hAnsi="Calibri" w:eastAsia="Microsoft YaHei" w:cs="Calibri"/>
+                <w:sz w:val="18"/>
+                <w:szCs w:val="18"/>
+              </w:rPr>
+              <w:t xml:space="preserve">未冻结 workload、流量分布和更大规模压力</w:t>
+            </w:r>
+          </w:p>
+        </w:tc>
+      </w:tr>
+      <w:tr>
+        <w:trPr>
+          <w:cantSplit/>
+        </w:trPr>
+        <w:tc>
+          <w:tcPr/>
+          <w:p>
+            <w:pPr>
+              <w:pStyle w:val="TableText"/>
+              <w:jc w:val="left"/>
+              <w:spacing w:before="0" w:after="0" w:line="320" w:lineRule="exact"/>
+            </w:pPr>
+            <w:r>
+              <w:rPr>
+                <w:rFonts w:ascii="Calibri" w:hAnsi="Calibri" w:eastAsia="Microsoft YaHei" w:cs="Calibri"/>
+                <w:sz w:val="18"/>
+                <w:szCs w:val="18"/>
+              </w:rPr>
+              <w:t xml:space="preserve">完成与计量</w:t>
+            </w:r>
+          </w:p>
+        </w:tc>
+        <w:tc>
+          <w:tcPr/>
+          <w:p>
+            <w:pPr>
+              <w:pStyle w:val="TableText"/>
+              <w:jc w:val="left"/>
+              <w:spacing w:before="0" w:after="0" w:line="320" w:lineRule="exact"/>
+            </w:pPr>
+            <w:r>
+              <w:rPr>
+                <w:rFonts w:ascii="Calibri" w:hAnsi="Calibri" w:eastAsia="Microsoft YaHei" w:cs="Calibri"/>
+                <w:sz w:val="18"/>
+                <w:szCs w:val="18"/>
+              </w:rPr>
+              <w:t xml:space="preserve">相同根操作完成边界；单向完成语义</w:t>
+            </w:r>
+          </w:p>
+        </w:tc>
+        <w:tc>
+          <w:tcPr/>
+          <w:p>
+            <w:pPr>
+              <w:pStyle w:val="TableText"/>
+              <w:jc w:val="left"/>
+              <w:spacing w:before="0" w:after="0" w:line="320" w:lineRule="exact"/>
+            </w:pPr>
+            <w:r>
+              <w:rPr>
+                <w:rFonts w:ascii="Calibri" w:hAnsi="Calibri" w:eastAsia="Microsoft YaHei" w:cs="Calibri"/>
+                <w:sz w:val="18"/>
+                <w:szCs w:val="18"/>
+              </w:rPr>
+              <w:t xml:space="preserve">物理链路握手、未纳入主值的内部服务阶段</w:t>
+            </w:r>
+          </w:p>
+        </w:tc>
+      </w:tr>
+      <w:tr>
+        <w:trPr>
+          <w:cantSplit/>
+        </w:trPr>
+        <w:tc>
+          <w:tcPr/>
+          <w:p>
+            <w:pPr>
+              <w:pStyle w:val="TableText"/>
+              <w:jc w:val="left"/>
+              <w:spacing w:before="0" w:after="0" w:line="320" w:lineRule="exact"/>
+            </w:pPr>
+            <w:r>
+              <w:rPr>
+                <w:rFonts w:ascii="Calibri" w:hAnsi="Calibri" w:eastAsia="Microsoft YaHei" w:cs="Calibri"/>
+                <w:sz w:val="18"/>
+                <w:szCs w:val="18"/>
+              </w:rPr>
+              <w:t xml:space="preserve">对照模型</w:t>
+            </w:r>
+          </w:p>
+        </w:tc>
+        <w:tc>
+          <w:tcPr/>
+          <w:p>
+            <w:pPr>
+              <w:pStyle w:val="TableText"/>
+              <w:jc w:val="left"/>
+              <w:spacing w:before="0" w:after="0" w:line="320" w:lineRule="exact"/>
+            </w:pPr>
+            <w:r>
+              <w:rPr>
+                <w:rFonts w:ascii="Calibri" w:hAnsi="Calibri" w:eastAsia="Microsoft YaHei" w:cs="Calibri"/>
+                <w:sz w:val="18"/>
+                <w:szCs w:val="18"/>
+              </w:rPr>
+              <w:t xml:space="preserve">冻结 HA-VI 可执行参考模型及其目录、状态和时延参数</w:t>
+            </w:r>
+          </w:p>
+        </w:tc>
+        <w:tc>
+          <w:tcPr/>
+          <w:p>
+            <w:pPr>
+              <w:pStyle w:val="TableText"/>
+              <w:jc w:val="left"/>
+              <w:spacing w:before="0" w:after="0" w:line="320" w:lineRule="exact"/>
+            </w:pPr>
+            <w:r>
+              <w:rPr>
+                <w:rFonts w:ascii="Calibri" w:hAnsi="Calibri" w:eastAsia="Microsoft YaHei" w:cs="Calibri"/>
+                <w:sz w:val="18"/>
+                <w:szCs w:val="18"/>
+              </w:rPr>
+              <w:t xml:space="preserve">客户 HA 的私有优化、缓冲、队列、预测和一致性扩展</w:t>
+            </w:r>
+          </w:p>
+        </w:tc>
+      </w:tr>
+      <w:tr>
+        <w:trPr>
+          <w:cantSplit/>
+        </w:trPr>
+        <w:tc>
+          <w:tcPr/>
+          <w:p>
+            <w:pPr>
+              <w:pStyle w:val="TableText"/>
+              <w:jc w:val="left"/>
+              <w:spacing w:before="0" w:after="0" w:line="320" w:lineRule="exact"/>
+            </w:pPr>
+            <w:r>
+              <w:rPr>
+                <w:rFonts w:ascii="Calibri" w:hAnsi="Calibri" w:eastAsia="Microsoft YaHei" w:cs="Calibri"/>
+                <w:sz w:val="18"/>
+                <w:szCs w:val="18"/>
+              </w:rPr>
+              <w:t xml:space="preserve">通信结构</w:t>
+            </w:r>
+          </w:p>
+        </w:tc>
+        <w:tc>
+          <w:tcPr/>
+          <w:p>
+            <w:pPr>
+              <w:pStyle w:val="TableText"/>
+              <w:jc w:val="left"/>
+              <w:spacing w:before="0" w:after="0" w:line="320" w:lineRule="exact"/>
+            </w:pPr>
+            <w:r>
+              <w:rPr>
+                <w:rFonts w:ascii="Calibri" w:hAnsi="Calibri" w:eastAsia="Microsoft YaHei" w:cs="Calibri"/>
+                <w:sz w:val="18"/>
+                <w:szCs w:val="18"/>
+              </w:rPr>
+              <w:t xml:space="preserve">两方案使用相同可执行比较环境</w:t>
+            </w:r>
+          </w:p>
+        </w:tc>
+        <w:tc>
+          <w:tcPr/>
+          <w:p>
+            <w:pPr>
+              <w:pStyle w:val="TableText"/>
+              <w:jc w:val="left"/>
+              <w:spacing w:before="0" w:after="0" w:line="320" w:lineRule="exact"/>
+            </w:pPr>
+            <w:r>
+              <w:rPr>
+                <w:rFonts w:ascii="Calibri" w:hAnsi="Calibri" w:eastAsia="Microsoft YaHei" w:cs="Calibri"/>
+                <w:sz w:val="18"/>
+                <w:szCs w:val="18"/>
+              </w:rPr>
+              <w:t xml:space="preserve">端口级 Switch 排队、仲裁、拥塞和链路误码</w:t>
+            </w:r>
+          </w:p>
+        </w:tc>
+      </w:tr>
+      <w:tr>
+        <w:trPr>
+          <w:cantSplit/>
+        </w:trPr>
+        <w:tc>
+          <w:tcPr/>
+          <w:p>
+            <w:pPr>
+              <w:pStyle w:val="TableText"/>
+              <w:jc w:val="left"/>
+              <w:spacing w:before="0" w:after="0" w:line="320" w:lineRule="exact"/>
+            </w:pPr>
+            <w:r>
+              <w:rPr>
+                <w:rFonts w:ascii="Calibri" w:hAnsi="Calibri" w:eastAsia="Microsoft YaHei" w:cs="Calibri"/>
+                <w:sz w:val="18"/>
+                <w:szCs w:val="18"/>
+              </w:rPr>
+              <w:t xml:space="preserve">结果解释</w:t>
+            </w:r>
+          </w:p>
+        </w:tc>
+        <w:tc>
+          <w:tcPr/>
+          <w:p>
+            <w:pPr>
+              <w:pStyle w:val="TableText"/>
+              <w:jc w:val="left"/>
+              <w:spacing w:before="0" w:after="0" w:line="320" w:lineRule="exact"/>
+            </w:pPr>
+            <w:r>
+              <w:rPr>
+                <w:rFonts w:ascii="Calibri" w:hAnsi="Calibri" w:eastAsia="Microsoft YaHei" w:cs="Calibri"/>
+                <w:sz w:val="18"/>
+                <w:szCs w:val="18"/>
+              </w:rPr>
+              <w:t xml:space="preserve">按冻结主值形成核心场景组和代表场景组的等权聚合</w:t>
+            </w:r>
+          </w:p>
+        </w:tc>
+        <w:tc>
+          <w:tcPr/>
+          <w:p>
+            <w:pPr>
+              <w:pStyle w:val="TableText"/>
+              <w:jc w:val="left"/>
+              <w:spacing w:before="0" w:after="0" w:line="320" w:lineRule="exact"/>
+            </w:pPr>
+            <w:r>
+              <w:rPr>
+                <w:rFonts w:ascii="Calibri" w:hAnsi="Calibri" w:eastAsia="Microsoft YaHei" w:cs="Calibri"/>
+                <w:sz w:val="18"/>
+                <w:szCs w:val="18"/>
+              </w:rPr>
+              <w:t xml:space="preserve">将参考模型结果宣称为客户物理实现结果</w:t>
             </w:r>
           </w:p>
         </w:tc>
@@ -5597,7 +6372,18 @@
         <w:rPr>
           <w:rFonts w:ascii="Calibri" w:hAnsi="Calibri" w:eastAsia="Microsoft YaHei" w:cs="Calibri"/>
         </w:rPr>
-        <w:t xml:space="preserve">理论比较只解释结构差异，不单独构成性能胜负结论。性能裁决来自相同输入下的冻结配对运行。</w:t>
+        <w:t xml:space="preserve">这些条件保证配对比较在已确认参考范围内使用共同输入和共同完成边界。聚合优势表示冻结</w:t>
+      </w:r>
+    </w:p>
+    <w:p>
+      <w:pPr>
+        <w:ind w:left="0" w:firstLine="420"/>
+      </w:pPr>
+      <w:r>
+        <w:rPr>
+          <w:rFonts w:ascii="Calibri" w:hAnsi="Calibri" w:eastAsia="Microsoft YaHei" w:cs="Calibri"/>
+        </w:rPr>
+        <w:t xml:space="preserve">场景组的平均主值占优，不表示每一个 testcase、内部阶段或子操作都必须占优。</w:t>
       </w:r>
     </w:p>
     <w:p>
@@ -5609,7 +6395,7 @@
         <w:rPr>
           <w:rFonts w:ascii="Calibri" w:hAnsi="Calibri" w:eastAsia="SimHei" w:cs="Calibri"/>
         </w:rPr>
-        <w:t xml:space="preserve">6.3 冻结 HA-VI 参考结果</w:t>
+        <w:t xml:space="preserve">6.3 理论结构比较</w:t>
       </w:r>
     </w:p>
     <w:tbl>
@@ -5646,7 +6432,7 @@
                 <w:sz w:val="18"/>
                 <w:szCs w:val="18"/>
               </w:rPr>
-              <w:t xml:space="preserve">L3 压力</w:t>
+              <w:t xml:space="preserve">维度</w:t>
             </w:r>
           </w:p>
         </w:tc>
@@ -5667,7 +6453,7 @@
                 <w:sz w:val="18"/>
                 <w:szCs w:val="18"/>
               </w:rPr>
-              <w:t xml:space="preserve">场景组</w:t>
+              <w:t xml:space="preserve">UBCC</w:t>
             </w:r>
           </w:p>
         </w:tc>
@@ -5688,7 +6474,7 @@
                 <w:sz w:val="18"/>
                 <w:szCs w:val="18"/>
               </w:rPr>
-              <w:t xml:space="preserve">UBCC ticks/op</w:t>
+              <w:t xml:space="preserve">HA-VI 冻结参考</w:t>
             </w:r>
           </w:p>
         </w:tc>
@@ -5709,10 +6495,360 @@
                 <w:sz w:val="18"/>
                 <w:szCs w:val="18"/>
               </w:rPr>
-              <w:t xml:space="preserve">HA-VI ticks/op</w:t>
-            </w:r>
-          </w:p>
-        </w:tc>
+              <w:t xml:space="preserve">理论含义</w:t>
+            </w:r>
+          </w:p>
+        </w:tc>
+      </w:tr>
+      <w:tr>
+        <w:trPr>
+          <w:cantSplit/>
+        </w:trPr>
+        <w:tc>
+          <w:tcPr/>
+          <w:p>
+            <w:pPr>
+              <w:pStyle w:val="TableText"/>
+              <w:jc w:val="left"/>
+              <w:spacing w:before="0" w:after="0" w:line="320" w:lineRule="exact"/>
+            </w:pPr>
+            <w:r>
+              <w:rPr>
+                <w:rFonts w:ascii="Calibri" w:hAnsi="Calibri" w:eastAsia="Microsoft YaHei" w:cs="Calibri"/>
+                <w:sz w:val="18"/>
+                <w:szCs w:val="18"/>
+              </w:rPr>
+              <w:t xml:space="preserve">全局状态表达</w:t>
+            </w:r>
+          </w:p>
+        </w:tc>
+        <w:tc>
+          <w:tcPr/>
+          <w:p>
+            <w:pPr>
+              <w:pStyle w:val="TableText"/>
+              <w:jc w:val="left"/>
+              <w:spacing w:before="0" w:after="0" w:line="320" w:lineRule="exact"/>
+            </w:pPr>
+            <w:r>
+              <w:rPr>
+                <w:rFonts w:ascii="Calibri" w:hAnsi="Calibri" w:eastAsia="Microsoft YaHei" w:cs="Calibri"/>
+                <w:sz w:val="18"/>
+                <w:szCs w:val="18"/>
+              </w:rPr>
+              <w:t xml:space="preserve">精确 owner、sharer 与事务身份</w:t>
+            </w:r>
+          </w:p>
+        </w:tc>
+        <w:tc>
+          <w:tcPr/>
+          <w:p>
+            <w:pPr>
+              <w:pStyle w:val="TableText"/>
+              <w:jc w:val="left"/>
+              <w:spacing w:before="0" w:after="0" w:line="320" w:lineRule="exact"/>
+            </w:pPr>
+            <w:r>
+              <w:rPr>
+                <w:rFonts w:ascii="Calibri" w:hAnsi="Calibri" w:eastAsia="Microsoft YaHei" w:cs="Calibri"/>
+                <w:sz w:val="18"/>
+                <w:szCs w:val="18"/>
+              </w:rPr>
+              <w:t xml:space="preserve">VI 有效/无效关系的窄化表达</w:t>
+            </w:r>
+          </w:p>
+        </w:tc>
+        <w:tc>
+          <w:tcPr/>
+          <w:p>
+            <w:pPr>
+              <w:pStyle w:val="TableText"/>
+              <w:jc w:val="left"/>
+              <w:spacing w:before="0" w:after="0" w:line="320" w:lineRule="exact"/>
+            </w:pPr>
+            <w:r>
+              <w:rPr>
+                <w:rFonts w:ascii="Calibri" w:hAnsi="Calibri" w:eastAsia="Microsoft YaHei" w:cs="Calibri"/>
+                <w:sz w:val="18"/>
+                <w:szCs w:val="18"/>
+              </w:rPr>
+              <w:t xml:space="preserve">UBCC 可直接形成精确 Recall/Invalidate 目标</w:t>
+            </w:r>
+          </w:p>
+        </w:tc>
+      </w:tr>
+      <w:tr>
+        <w:trPr>
+          <w:cantSplit/>
+        </w:trPr>
+        <w:tc>
+          <w:tcPr/>
+          <w:p>
+            <w:pPr>
+              <w:pStyle w:val="TableText"/>
+              <w:jc w:val="left"/>
+              <w:spacing w:before="0" w:after="0" w:line="320" w:lineRule="exact"/>
+            </w:pPr>
+            <w:r>
+              <w:rPr>
+                <w:rFonts w:ascii="Calibri" w:hAnsi="Calibri" w:eastAsia="Microsoft YaHei" w:cs="Calibri"/>
+                <w:sz w:val="18"/>
+                <w:szCs w:val="18"/>
+              </w:rPr>
+              <w:t xml:space="preserve">目录资源</w:t>
+            </w:r>
+          </w:p>
+        </w:tc>
+        <w:tc>
+          <w:tcPr/>
+          <w:p>
+            <w:pPr>
+              <w:pStyle w:val="TableText"/>
+              <w:jc w:val="left"/>
+              <w:spacing w:before="0" w:after="0" w:line="320" w:lineRule="exact"/>
+            </w:pPr>
+            <w:r>
+              <w:rPr>
+                <w:rFonts w:ascii="Calibri" w:hAnsi="Calibri" w:eastAsia="Microsoft YaHei" w:cs="Calibri"/>
+                <w:sz w:val="18"/>
+                <w:szCs w:val="18"/>
+              </w:rPr>
+              <w:t xml:space="preserve">独立 ResidentDir + Backstore</w:t>
+            </w:r>
+          </w:p>
+        </w:tc>
+        <w:tc>
+          <w:tcPr/>
+          <w:p>
+            <w:pPr>
+              <w:pStyle w:val="TableText"/>
+              <w:jc w:val="left"/>
+              <w:spacing w:before="0" w:after="0" w:line="320" w:lineRule="exact"/>
+            </w:pPr>
+            <w:r>
+              <w:rPr>
+                <w:rFonts w:ascii="Calibri" w:hAnsi="Calibri" w:eastAsia="Microsoft YaHei" w:cs="Calibri"/>
+                <w:sz w:val="18"/>
+                <w:szCs w:val="18"/>
+              </w:rPr>
+              <w:t xml:space="preserve">冻结参考目录组织</w:t>
+            </w:r>
+          </w:p>
+        </w:tc>
+        <w:tc>
+          <w:tcPr/>
+          <w:p>
+            <w:pPr>
+              <w:pStyle w:val="TableText"/>
+              <w:jc w:val="left"/>
+              <w:spacing w:before="0" w:after="0" w:line="320" w:lineRule="exact"/>
+            </w:pPr>
+            <w:r>
+              <w:rPr>
+                <w:rFonts w:ascii="Calibri" w:hAnsi="Calibri" w:eastAsia="Microsoft YaHei" w:cs="Calibri"/>
+                <w:sz w:val="18"/>
+                <w:szCs w:val="18"/>
+              </w:rPr>
+              <w:t xml:space="preserve">UBCC 将全局元数据与节点内 Home 资源解耦</w:t>
+            </w:r>
+          </w:p>
+        </w:tc>
+      </w:tr>
+      <w:tr>
+        <w:trPr>
+          <w:cantSplit/>
+        </w:trPr>
+        <w:tc>
+          <w:tcPr/>
+          <w:p>
+            <w:pPr>
+              <w:pStyle w:val="TableText"/>
+              <w:jc w:val="left"/>
+              <w:spacing w:before="0" w:after="0" w:line="320" w:lineRule="exact"/>
+            </w:pPr>
+            <w:r>
+              <w:rPr>
+                <w:rFonts w:ascii="Calibri" w:hAnsi="Calibri" w:eastAsia="Microsoft YaHei" w:cs="Calibri"/>
+                <w:sz w:val="18"/>
+                <w:szCs w:val="18"/>
+              </w:rPr>
+              <w:t xml:space="preserve">提交语义</w:t>
+            </w:r>
+          </w:p>
+        </w:tc>
+        <w:tc>
+          <w:tcPr/>
+          <w:p>
+            <w:pPr>
+              <w:pStyle w:val="TableText"/>
+              <w:jc w:val="left"/>
+              <w:spacing w:before="0" w:after="0" w:line="320" w:lineRule="exact"/>
+            </w:pPr>
+            <w:r>
+              <w:rPr>
+                <w:rFonts w:ascii="Calibri" w:hAnsi="Calibri" w:eastAsia="Microsoft YaHei" w:cs="Calibri"/>
+                <w:sz w:val="18"/>
+                <w:szCs w:val="18"/>
+              </w:rPr>
+              <w:t xml:space="preserve">Grant 与 Clear 两阶段提交</w:t>
+            </w:r>
+          </w:p>
+        </w:tc>
+        <w:tc>
+          <w:tcPr/>
+          <w:p>
+            <w:pPr>
+              <w:pStyle w:val="TableText"/>
+              <w:jc w:val="left"/>
+              <w:spacing w:before="0" w:after="0" w:line="320" w:lineRule="exact"/>
+            </w:pPr>
+            <w:r>
+              <w:rPr>
+                <w:rFonts w:ascii="Calibri" w:hAnsi="Calibri" w:eastAsia="Microsoft YaHei" w:cs="Calibri"/>
+                <w:sz w:val="18"/>
+                <w:szCs w:val="18"/>
+              </w:rPr>
+              <w:t xml:space="preserve">参考模型完成链</w:t>
+            </w:r>
+          </w:p>
+        </w:tc>
+        <w:tc>
+          <w:tcPr/>
+          <w:p>
+            <w:pPr>
+              <w:pStyle w:val="TableText"/>
+              <w:jc w:val="left"/>
+              <w:spacing w:before="0" w:after="0" w:line="320" w:lineRule="exact"/>
+            </w:pPr>
+            <w:r>
+              <w:rPr>
+                <w:rFonts w:ascii="Calibri" w:hAnsi="Calibri" w:eastAsia="Microsoft YaHei" w:cs="Calibri"/>
+                <w:sz w:val="18"/>
+                <w:szCs w:val="18"/>
+              </w:rPr>
+              <w:t xml:space="preserve">UBCC 显式区分承诺与提交，并支持幂等恢复</w:t>
+            </w:r>
+          </w:p>
+        </w:tc>
+      </w:tr>
+      <w:tr>
+        <w:trPr>
+          <w:cantSplit/>
+        </w:trPr>
+        <w:tc>
+          <w:tcPr/>
+          <w:p>
+            <w:pPr>
+              <w:pStyle w:val="TableText"/>
+              <w:jc w:val="left"/>
+              <w:spacing w:before="0" w:after="0" w:line="320" w:lineRule="exact"/>
+            </w:pPr>
+            <w:r>
+              <w:rPr>
+                <w:rFonts w:ascii="Calibri" w:hAnsi="Calibri" w:eastAsia="Microsoft YaHei" w:cs="Calibri"/>
+                <w:sz w:val="18"/>
+                <w:szCs w:val="18"/>
+              </w:rPr>
+              <w:t xml:space="preserve">数据源选择</w:t>
+            </w:r>
+          </w:p>
+        </w:tc>
+        <w:tc>
+          <w:tcPr/>
+          <w:p>
+            <w:pPr>
+              <w:pStyle w:val="TableText"/>
+              <w:jc w:val="left"/>
+              <w:spacing w:before="0" w:after="0" w:line="320" w:lineRule="exact"/>
+            </w:pPr>
+            <w:r>
+              <w:rPr>
+                <w:rFonts w:ascii="Calibri" w:hAnsi="Calibri" w:eastAsia="Microsoft YaHei" w:cs="Calibri"/>
+                <w:sz w:val="18"/>
+                <w:szCs w:val="18"/>
+              </w:rPr>
+              <w:t xml:space="preserve">按 owner 定位权威数据</w:t>
+            </w:r>
+          </w:p>
+        </w:tc>
+        <w:tc>
+          <w:tcPr/>
+          <w:p>
+            <w:pPr>
+              <w:pStyle w:val="TableText"/>
+              <w:jc w:val="left"/>
+              <w:spacing w:before="0" w:after="0" w:line="320" w:lineRule="exact"/>
+            </w:pPr>
+            <w:r>
+              <w:rPr>
+                <w:rFonts w:ascii="Calibri" w:hAnsi="Calibri" w:eastAsia="Microsoft YaHei" w:cs="Calibri"/>
+                <w:sz w:val="18"/>
+                <w:szCs w:val="18"/>
+              </w:rPr>
+              <w:t xml:space="preserve">按参考模型状态路径处理</w:t>
+            </w:r>
+          </w:p>
+        </w:tc>
+        <w:tc>
+          <w:tcPr/>
+          <w:p>
+            <w:pPr>
+              <w:pStyle w:val="TableText"/>
+              <w:jc w:val="left"/>
+              <w:spacing w:before="0" w:after="0" w:line="320" w:lineRule="exact"/>
+            </w:pPr>
+            <w:r>
+              <w:rPr>
+                <w:rFonts w:ascii="Calibri" w:hAnsi="Calibri" w:eastAsia="Microsoft YaHei" w:cs="Calibri"/>
+                <w:sz w:val="18"/>
+                <w:szCs w:val="18"/>
+              </w:rPr>
+              <w:t xml:space="preserve">对 ownership handoff 和 shared-to-writer 路径影响最直接</w:t>
+            </w:r>
+          </w:p>
+        </w:tc>
+      </w:tr>
+    </w:tbl>
+    <w:p>
+      <w:pPr>
+        <w:ind w:left="0" w:firstLine="420"/>
+      </w:pPr>
+      <w:r>
+        <w:rPr>
+          <w:rFonts w:ascii="Calibri" w:hAnsi="Calibri" w:eastAsia="Microsoft YaHei" w:cs="Calibri"/>
+        </w:rPr>
+        <w:t xml:space="preserve">理论比较只解释结构差异，不单独构成性能胜负结论。性能裁决来自相同输入下的冻结配对运行。</w:t>
+      </w:r>
+    </w:p>
+    <w:p>
+      <w:pPr>
+        <w:pStyle w:val="Heading3"/>
+        <w:keepNext/>
+      </w:pPr>
+      <w:r>
+        <w:rPr>
+          <w:rFonts w:ascii="Calibri" w:hAnsi="Calibri" w:eastAsia="SimHei" w:cs="Calibri"/>
+        </w:rPr>
+        <w:t xml:space="preserve">6.4 冻结 HA-VI 参考结果</w:t>
+      </w:r>
+    </w:p>
+    <w:tbl>
+      <w:tblPr>
+        <w:tblStyle w:val="TableGrid"/>
+        <w:tblW w:w="5000" w:type="pct"/>
+        <w:tblLayout w:type="autofit"/>
+        <w:tblCellMar>
+          <w:top w:w="60" w:type="dxa"/>
+          <w:left w:w="90" w:type="dxa"/>
+          <w:bottom w:w="60" w:type="dxa"/>
+          <w:right w:w="90" w:type="dxa"/>
+        </w:tblCellMar>
+      </w:tblPr>
+      <w:tr>
+        <w:trPr>
+          <w:cantSplit/>
+          <w:tblHeader/>
+        </w:trPr>
         <w:tc>
           <w:tcPr>
             <w:shd w:val="clear" w:color="auto" w:fill="D9E2F3"/>
@@ -5730,6 +6866,90 @@
                 <w:sz w:val="18"/>
                 <w:szCs w:val="18"/>
               </w:rPr>
+              <w:t xml:space="preserve">L3 压力</w:t>
+            </w:r>
+          </w:p>
+        </w:tc>
+        <w:tc>
+          <w:tcPr>
+            <w:shd w:val="clear" w:color="auto" w:fill="D9E2F3"/>
+          </w:tcPr>
+          <w:p>
+            <w:pPr>
+              <w:pStyle w:val="TableText"/>
+              <w:jc w:val="left"/>
+              <w:spacing w:before="0" w:after="0" w:line="320" w:lineRule="exact"/>
+            </w:pPr>
+            <w:r>
+              <w:rPr>
+                <w:rFonts w:ascii="Calibri" w:hAnsi="Calibri" w:eastAsia="SimHei" w:cs="Calibri"/>
+                <w:b/>
+                <w:sz w:val="18"/>
+                <w:szCs w:val="18"/>
+              </w:rPr>
+              <w:t xml:space="preserve">场景组</w:t>
+            </w:r>
+          </w:p>
+        </w:tc>
+        <w:tc>
+          <w:tcPr>
+            <w:shd w:val="clear" w:color="auto" w:fill="D9E2F3"/>
+          </w:tcPr>
+          <w:p>
+            <w:pPr>
+              <w:pStyle w:val="TableText"/>
+              <w:jc w:val="left"/>
+              <w:spacing w:before="0" w:after="0" w:line="320" w:lineRule="exact"/>
+            </w:pPr>
+            <w:r>
+              <w:rPr>
+                <w:rFonts w:ascii="Calibri" w:hAnsi="Calibri" w:eastAsia="SimHei" w:cs="Calibri"/>
+                <w:b/>
+                <w:sz w:val="18"/>
+                <w:szCs w:val="18"/>
+              </w:rPr>
+              <w:t xml:space="preserve">UBCC ticks/op</w:t>
+            </w:r>
+          </w:p>
+        </w:tc>
+        <w:tc>
+          <w:tcPr>
+            <w:shd w:val="clear" w:color="auto" w:fill="D9E2F3"/>
+          </w:tcPr>
+          <w:p>
+            <w:pPr>
+              <w:pStyle w:val="TableText"/>
+              <w:jc w:val="left"/>
+              <w:spacing w:before="0" w:after="0" w:line="320" w:lineRule="exact"/>
+            </w:pPr>
+            <w:r>
+              <w:rPr>
+                <w:rFonts w:ascii="Calibri" w:hAnsi="Calibri" w:eastAsia="SimHei" w:cs="Calibri"/>
+                <w:b/>
+                <w:sz w:val="18"/>
+                <w:szCs w:val="18"/>
+              </w:rPr>
+              <w:t xml:space="preserve">HA-VI ticks/op</w:t>
+            </w:r>
+          </w:p>
+        </w:tc>
+        <w:tc>
+          <w:tcPr>
+            <w:shd w:val="clear" w:color="auto" w:fill="D9E2F3"/>
+          </w:tcPr>
+          <w:p>
+            <w:pPr>
+              <w:pStyle w:val="TableText"/>
+              <w:jc w:val="left"/>
+              <w:spacing w:before="0" w:after="0" w:line="320" w:lineRule="exact"/>
+            </w:pPr>
+            <w:r>
+              <w:rPr>
+                <w:rFonts w:ascii="Calibri" w:hAnsi="Calibri" w:eastAsia="SimHei" w:cs="Calibri"/>
+                <w:b/>
+                <w:sz w:val="18"/>
+                <w:szCs w:val="18"/>
+              </w:rPr>
               <w:t xml:space="preserve">UBCC 降幅</w:t>
             </w:r>
           </w:p>
@@ -6417,6 +7637,17 @@
           <w:rFonts w:ascii="Calibri" w:hAnsi="Calibri" w:eastAsia="Microsoft YaHei" w:cs="Calibri"/>
         </w:rPr>
         <w:t xml:space="preserve">Home、dirty 数据副本和在线重配置机制。</w:t>
+      </w:r>
+    </w:p>
+    <w:p>
+      <w:pPr>
+        <w:ind w:left="0" w:firstLine="420"/>
+      </w:pPr>
+      <w:r>
+        <w:rPr>
+          <w:rFonts w:ascii="Calibri" w:hAnsi="Calibri" w:eastAsia="Microsoft YaHei" w:cs="Calibri"/>
+        </w:rPr>
+        <w:t xml:space="preserve">物理芯片 HA 微体系结构和端口级 Switch 排队、仲裁与拥塞不属于本次验证结论。</w:t>
       </w:r>
     </w:p>
     <w:p>

</xml_diff>

<commit_message>
docs: finalize delivery review round 3
</commit_message>
<xml_diff>
--- a/docs/design/cc_ep_deliverable2_verification_reliability_ha.docx
+++ b/docs/design/cc_ep_deliverable2_verification_reliability_ha.docx
@@ -919,30 +919,52 @@
                 <w:sz w:val="18"/>
                 <w:szCs w:val="18"/>
               </w:rPr>
-              <w:t xml:space="preserve">3N1S、3N2S、8N2S、16N1S</w:t>
-            </w:r>
-          </w:p>
-        </w:tc>
-        <w:tc>
-          <w:tcPr/>
-          <w:p>
-            <w:pPr>
-              <w:pStyle w:val="TableText"/>
-              <w:jc w:val="left"/>
-              <w:spacing w:before="0" w:after="0" w:line="320" w:lineRule="exact"/>
-            </w:pPr>
-            <w:r>
-              <w:rPr>
-                <w:rFonts w:ascii="Calibri" w:hAnsi="Calibri" w:eastAsia="Microsoft YaHei" w:cs="Calibri"/>
-                <w:sz w:val="18"/>
-                <w:szCs w:val="18"/>
-              </w:rPr>
-              <w:t xml:space="preserve">通过</w:t>
+              <w:t xml:space="preserve">3N1S、3N2S、8N2S、16N1S Level-A</w:t>
+            </w:r>
+          </w:p>
+        </w:tc>
+        <w:tc>
+          <w:tcPr/>
+          <w:p>
+            <w:pPr>
+              <w:pStyle w:val="TableText"/>
+              <w:jc w:val="left"/>
+              <w:spacing w:before="0" w:after="0" w:line="320" w:lineRule="exact"/>
+            </w:pPr>
+            <w:r>
+              <w:rPr>
+                <w:rFonts w:ascii="Calibri" w:hAnsi="Calibri" w:eastAsia="Microsoft YaHei" w:cs="Calibri"/>
+                <w:sz w:val="18"/>
+                <w:szCs w:val="18"/>
+              </w:rPr>
+              <w:t xml:space="preserve">协议节点规模与端点能力通过</w:t>
             </w:r>
           </w:p>
         </w:tc>
       </w:tr>
     </w:tbl>
+    <w:p>
+      <w:pPr>
+        <w:ind w:left="0" w:firstLine="420"/>
+      </w:pPr>
+      <w:r>
+        <w:rPr>
+          <w:rFonts w:ascii="Calibri" w:hAnsi="Calibri" w:eastAsia="Microsoft YaHei" w:cs="Calibri"/>
+        </w:rPr>
+        <w:t xml:space="preserve">表中 Liveness 结论仅适用于对应 temporal property、FairSpec/forward-progress 公平性和可恢复</w:t>
+      </w:r>
+    </w:p>
+    <w:p>
+      <w:pPr>
+        <w:ind w:left="0" w:firstLine="420"/>
+      </w:pPr>
+      <w:r>
+        <w:rPr>
+          <w:rFonts w:ascii="Calibri" w:hAnsi="Calibri" w:eastAsia="Microsoft YaHei" w:cs="Calibri"/>
+        </w:rPr>
+        <w:t xml:space="preserve">故障最终解除的模型条件；focused 仲裁与 waiter 模型只单独检查 Safety，不作独立活性证明。</w:t>
+      </w:r>
+    </w:p>
     <w:p>
       <w:pPr>
         <w:ind w:left="0" w:firstLine="420"/>
@@ -1142,7 +1164,7 @@
                 <w:sz w:val="18"/>
                 <w:szCs w:val="18"/>
               </w:rPr>
-              <w:t xml:space="preserve">核心模型与 focused 模型覆盖各自声明的 Safety/Liveness 性质</w:t>
+              <w:t xml:space="preserve">核心模型覆盖声明的 Safety/Liveness；focused 模型覆盖声明的 Safety</w:t>
             </w:r>
           </w:p>
         </w:tc>
@@ -1619,7 +1641,7 @@
                 <w:sz w:val="18"/>
                 <w:szCs w:val="18"/>
               </w:rPr>
-              <w:t xml:space="preserve">各模型状态空间和公平性假设内的 Safety/Liveness 性质</w:t>
+              <w:t xml:space="preserve">核心/传输模型的 Safety/Liveness，以及 focused 模型声明的 Safety</w:t>
             </w:r>
           </w:p>
         </w:tc>
@@ -3052,7 +3074,7 @@
                 <w:sz w:val="18"/>
                 <w:szCs w:val="18"/>
               </w:rPr>
-              <w:t xml:space="preserve">同址 snoop 收敛</w:t>
+              <w:t xml:space="preserve">同址 snoop 仲裁安全性</w:t>
             </w:r>
           </w:p>
         </w:tc>
@@ -3088,84 +3110,84 @@
                 <w:sz w:val="18"/>
                 <w:szCs w:val="18"/>
               </w:rPr>
+              <w:t xml:space="preserve">未单独检查，由可执行验证补充</w:t>
+            </w:r>
+          </w:p>
+        </w:tc>
+      </w:tr>
+      <w:tr>
+        <w:trPr>
+          <w:cantSplit/>
+        </w:trPr>
+        <w:tc>
+          <w:tcPr/>
+          <w:p>
+            <w:pPr>
+              <w:pStyle w:val="TableText"/>
+              <w:jc w:val="left"/>
+              <w:spacing w:before="0" w:after="0" w:line="320" w:lineRule="exact"/>
+            </w:pPr>
+            <w:r>
+              <w:rPr>
+                <w:rFonts w:ascii="Calibri" w:hAnsi="Calibri" w:eastAsia="Microsoft YaHei" w:cs="Calibri"/>
+                <w:sz w:val="18"/>
+                <w:szCs w:val="18"/>
+              </w:rPr>
+              <w:t xml:space="preserve">waiter 退役</w:t>
+            </w:r>
+          </w:p>
+        </w:tc>
+        <w:tc>
+          <w:tcPr/>
+          <w:p>
+            <w:pPr>
+              <w:pStyle w:val="TableText"/>
+              <w:jc w:val="left"/>
+              <w:spacing w:before="0" w:after="0" w:line="320" w:lineRule="exact"/>
+            </w:pPr>
+            <w:r>
+              <w:rPr>
+                <w:rFonts w:ascii="Calibri" w:hAnsi="Calibri" w:eastAsia="Microsoft YaHei" w:cs="Calibri"/>
+                <w:sz w:val="18"/>
+                <w:szCs w:val="18"/>
+              </w:rPr>
+              <w:t xml:space="preserve">精确退役与重放安全性</w:t>
+            </w:r>
+          </w:p>
+        </w:tc>
+        <w:tc>
+          <w:tcPr/>
+          <w:p>
+            <w:pPr>
+              <w:pStyle w:val="TableText"/>
+              <w:jc w:val="left"/>
+              <w:spacing w:before="0" w:after="0" w:line="320" w:lineRule="exact"/>
+            </w:pPr>
+            <w:r>
+              <w:rPr>
+                <w:rFonts w:ascii="Calibri" w:hAnsi="Calibri" w:eastAsia="Microsoft YaHei" w:cs="Calibri"/>
+                <w:sz w:val="18"/>
+                <w:szCs w:val="18"/>
+              </w:rPr>
               <w:t xml:space="preserve">通过</w:t>
             </w:r>
           </w:p>
         </w:tc>
-      </w:tr>
-      <w:tr>
-        <w:trPr>
-          <w:cantSplit/>
-        </w:trPr>
-        <w:tc>
-          <w:tcPr/>
-          <w:p>
-            <w:pPr>
-              <w:pStyle w:val="TableText"/>
-              <w:jc w:val="left"/>
-              <w:spacing w:before="0" w:after="0" w:line="320" w:lineRule="exact"/>
-            </w:pPr>
-            <w:r>
-              <w:rPr>
-                <w:rFonts w:ascii="Calibri" w:hAnsi="Calibri" w:eastAsia="Microsoft YaHei" w:cs="Calibri"/>
-                <w:sz w:val="18"/>
-                <w:szCs w:val="18"/>
-              </w:rPr>
-              <w:t xml:space="preserve">waiter 退役</w:t>
-            </w:r>
-          </w:p>
-        </w:tc>
-        <w:tc>
-          <w:tcPr/>
-          <w:p>
-            <w:pPr>
-              <w:pStyle w:val="TableText"/>
-              <w:jc w:val="left"/>
-              <w:spacing w:before="0" w:after="0" w:line="320" w:lineRule="exact"/>
-            </w:pPr>
-            <w:r>
-              <w:rPr>
-                <w:rFonts w:ascii="Calibri" w:hAnsi="Calibri" w:eastAsia="Microsoft YaHei" w:cs="Calibri"/>
-                <w:sz w:val="18"/>
-                <w:szCs w:val="18"/>
-              </w:rPr>
-              <w:t xml:space="preserve">精确退役与重放</w:t>
-            </w:r>
-          </w:p>
-        </w:tc>
-        <w:tc>
-          <w:tcPr/>
-          <w:p>
-            <w:pPr>
-              <w:pStyle w:val="TableText"/>
-              <w:jc w:val="left"/>
-              <w:spacing w:before="0" w:after="0" w:line="320" w:lineRule="exact"/>
-            </w:pPr>
-            <w:r>
-              <w:rPr>
-                <w:rFonts w:ascii="Calibri" w:hAnsi="Calibri" w:eastAsia="Microsoft YaHei" w:cs="Calibri"/>
-                <w:sz w:val="18"/>
-                <w:szCs w:val="18"/>
-              </w:rPr>
-              <w:t xml:space="preserve">通过</w:t>
-            </w:r>
-          </w:p>
-        </w:tc>
-        <w:tc>
-          <w:tcPr/>
-          <w:p>
-            <w:pPr>
-              <w:pStyle w:val="TableText"/>
-              <w:jc w:val="left"/>
-              <w:spacing w:before="0" w:after="0" w:line="320" w:lineRule="exact"/>
-            </w:pPr>
-            <w:r>
-              <w:rPr>
-                <w:rFonts w:ascii="Calibri" w:hAnsi="Calibri" w:eastAsia="Microsoft YaHei" w:cs="Calibri"/>
-                <w:sz w:val="18"/>
-                <w:szCs w:val="18"/>
-              </w:rPr>
-              <w:t xml:space="preserve">通过</w:t>
+        <w:tc>
+          <w:tcPr/>
+          <w:p>
+            <w:pPr>
+              <w:pStyle w:val="TableText"/>
+              <w:jc w:val="left"/>
+              <w:spacing w:before="0" w:after="0" w:line="320" w:lineRule="exact"/>
+            </w:pPr>
+            <w:r>
+              <w:rPr>
+                <w:rFonts w:ascii="Calibri" w:hAnsi="Calibri" w:eastAsia="Microsoft YaHei" w:cs="Calibri"/>
+                <w:sz w:val="18"/>
+                <w:szCs w:val="18"/>
+              </w:rPr>
+              <w:t xml:space="preserve">未单独检查，由可执行验证补充</w:t>
             </w:r>
           </w:p>
         </w:tc>
@@ -4684,7 +4706,7 @@
                 <w:sz w:val="18"/>
                 <w:szCs w:val="18"/>
               </w:rPr>
-              <w:t xml:space="preserve">3N1S、3N2S、8N2S、16N1S</w:t>
+              <w:t xml:space="preserve">3N1S、3N2S、8N2S、16N1S Level-A</w:t>
             </w:r>
           </w:p>
         </w:tc>
@@ -5817,7 +5839,7 @@
                 <w:sz w:val="18"/>
                 <w:szCs w:val="18"/>
               </w:rPr>
-              <w:t xml:space="preserve">16N1S</w:t>
+              <w:t xml:space="preserve">16N1S Level-A</w:t>
             </w:r>
           </w:p>
         </w:tc>
@@ -7580,7 +7602,7 @@
         <w:rPr>
           <w:rFonts w:ascii="Calibri" w:hAnsi="Calibri" w:eastAsia="Microsoft YaHei" w:cs="Calibri"/>
         </w:rPr>
-        <w:t xml:space="preserve">• 3N1S、3N2S、8N2S 和 16N1S 代表拓扑；</w:t>
+        <w:t xml:space="preserve">• 3N1S、3N2S、8N2S 和 16N1S Level-A 代表拓扑；</w:t>
       </w:r>
     </w:p>
     <w:p>
@@ -8868,7 +8890,7 @@
                 <w:sz w:val="18"/>
                 <w:szCs w:val="18"/>
               </w:rPr>
-              <w:t xml:space="preserve">3N1S、3N2S、8N2S、16N1S</w:t>
+              <w:t xml:space="preserve">3N1S、3N2S、8N2S、16N1S Level-A</w:t>
             </w:r>
           </w:p>
         </w:tc>

</xml_diff>

<commit_message>
docs: finalize delivery visuals round 6
</commit_message>
<xml_diff>
--- a/docs/design/cc_ep_deliverable2_verification_reliability_ha.docx
+++ b/docs/design/cc_ep_deliverable2_verification_reliability_ha.docx
@@ -473,6 +473,7 @@
             <w:pPr>
               <w:pStyle w:val="TableText"/>
               <w:jc w:val="left"/>
+              <w:wordWrap w:val="0"/>
               <w:spacing w:before="0" w:after="0" w:line="320" w:lineRule="exact"/>
             </w:pPr>
             <w:r>
@@ -494,6 +495,7 @@
             <w:pPr>
               <w:pStyle w:val="TableText"/>
               <w:jc w:val="left"/>
+              <w:wordWrap w:val="0"/>
               <w:spacing w:before="0" w:after="0" w:line="320" w:lineRule="exact"/>
             </w:pPr>
             <w:r>
@@ -515,6 +517,7 @@
             <w:pPr>
               <w:pStyle w:val="TableText"/>
               <w:jc w:val="left"/>
+              <w:wordWrap w:val="0"/>
               <w:spacing w:before="0" w:after="0" w:line="320" w:lineRule="exact"/>
             </w:pPr>
             <w:r>
@@ -539,6 +542,7 @@
             <w:pPr>
               <w:pStyle w:val="TableText"/>
               <w:jc w:val="left"/>
+              <w:wordWrap w:val="0"/>
               <w:spacing w:before="0" w:after="0" w:line="320" w:lineRule="exact"/>
             </w:pPr>
             <w:r>
@@ -557,6 +561,7 @@
             <w:pPr>
               <w:pStyle w:val="TableText"/>
               <w:jc w:val="left"/>
+              <w:wordWrap w:val="0"/>
               <w:spacing w:before="0" w:after="0" w:line="320" w:lineRule="exact"/>
             </w:pPr>
             <w:r>
@@ -575,6 +580,7 @@
             <w:pPr>
               <w:pStyle w:val="TableText"/>
               <w:jc w:val="left"/>
+              <w:wordWrap w:val="0"/>
               <w:spacing w:before="0" w:after="0" w:line="320" w:lineRule="exact"/>
             </w:pPr>
             <w:r>
@@ -598,6 +604,7 @@
             <w:pPr>
               <w:pStyle w:val="TableText"/>
               <w:jc w:val="left"/>
+              <w:wordWrap w:val="0"/>
               <w:spacing w:before="0" w:after="0" w:line="320" w:lineRule="exact"/>
             </w:pPr>
             <w:r>
@@ -616,6 +623,7 @@
             <w:pPr>
               <w:pStyle w:val="TableText"/>
               <w:jc w:val="left"/>
+              <w:wordWrap w:val="0"/>
               <w:spacing w:before="0" w:after="0" w:line="320" w:lineRule="exact"/>
             </w:pPr>
             <w:r>
@@ -634,6 +642,7 @@
             <w:pPr>
               <w:pStyle w:val="TableText"/>
               <w:jc w:val="left"/>
+              <w:wordWrap w:val="0"/>
               <w:spacing w:before="0" w:after="0" w:line="320" w:lineRule="exact"/>
             </w:pPr>
             <w:r>
@@ -657,6 +666,7 @@
             <w:pPr>
               <w:pStyle w:val="TableText"/>
               <w:jc w:val="left"/>
+              <w:wordWrap w:val="0"/>
               <w:spacing w:before="0" w:after="0" w:line="320" w:lineRule="exact"/>
             </w:pPr>
             <w:r>
@@ -675,6 +685,7 @@
             <w:pPr>
               <w:pStyle w:val="TableText"/>
               <w:jc w:val="left"/>
+              <w:wordWrap w:val="0"/>
               <w:spacing w:before="0" w:after="0" w:line="320" w:lineRule="exact"/>
             </w:pPr>
             <w:r>
@@ -693,6 +704,7 @@
             <w:pPr>
               <w:pStyle w:val="TableText"/>
               <w:jc w:val="left"/>
+              <w:wordWrap w:val="0"/>
               <w:spacing w:before="0" w:after="0" w:line="320" w:lineRule="exact"/>
             </w:pPr>
             <w:r>
@@ -716,6 +728,7 @@
             <w:pPr>
               <w:pStyle w:val="TableText"/>
               <w:jc w:val="left"/>
+              <w:wordWrap w:val="0"/>
               <w:spacing w:before="0" w:after="0" w:line="320" w:lineRule="exact"/>
             </w:pPr>
             <w:r>
@@ -734,6 +747,7 @@
             <w:pPr>
               <w:pStyle w:val="TableText"/>
               <w:jc w:val="left"/>
+              <w:wordWrap w:val="0"/>
               <w:spacing w:before="0" w:after="0" w:line="320" w:lineRule="exact"/>
             </w:pPr>
             <w:r>
@@ -752,6 +766,7 @@
             <w:pPr>
               <w:pStyle w:val="TableText"/>
               <w:jc w:val="left"/>
+              <w:wordWrap w:val="0"/>
               <w:spacing w:before="0" w:after="0" w:line="320" w:lineRule="exact"/>
             </w:pPr>
             <w:r>
@@ -775,6 +790,7 @@
             <w:pPr>
               <w:pStyle w:val="TableText"/>
               <w:jc w:val="left"/>
+              <w:wordWrap w:val="0"/>
               <w:spacing w:before="0" w:after="0" w:line="320" w:lineRule="exact"/>
             </w:pPr>
             <w:r>
@@ -793,6 +809,7 @@
             <w:pPr>
               <w:pStyle w:val="TableText"/>
               <w:jc w:val="left"/>
+              <w:wordWrap w:val="0"/>
               <w:spacing w:before="0" w:after="0" w:line="320" w:lineRule="exact"/>
             </w:pPr>
             <w:r>
@@ -811,6 +828,7 @@
             <w:pPr>
               <w:pStyle w:val="TableText"/>
               <w:jc w:val="left"/>
+              <w:wordWrap w:val="0"/>
               <w:spacing w:before="0" w:after="0" w:line="320" w:lineRule="exact"/>
             </w:pPr>
             <w:r>
@@ -834,6 +852,7 @@
             <w:pPr>
               <w:pStyle w:val="TableText"/>
               <w:jc w:val="left"/>
+              <w:wordWrap w:val="0"/>
               <w:spacing w:before="0" w:after="0" w:line="320" w:lineRule="exact"/>
             </w:pPr>
             <w:r>
@@ -852,6 +871,7 @@
             <w:pPr>
               <w:pStyle w:val="TableText"/>
               <w:jc w:val="left"/>
+              <w:wordWrap w:val="0"/>
               <w:spacing w:before="0" w:after="0" w:line="320" w:lineRule="exact"/>
             </w:pPr>
             <w:r>
@@ -870,6 +890,7 @@
             <w:pPr>
               <w:pStyle w:val="TableText"/>
               <w:jc w:val="left"/>
+              <w:wordWrap w:val="0"/>
               <w:spacing w:before="0" w:after="0" w:line="320" w:lineRule="exact"/>
             </w:pPr>
             <w:r>
@@ -893,6 +914,7 @@
             <w:pPr>
               <w:pStyle w:val="TableText"/>
               <w:jc w:val="left"/>
+              <w:wordWrap w:val="0"/>
               <w:spacing w:before="0" w:after="0" w:line="320" w:lineRule="exact"/>
             </w:pPr>
             <w:r>
@@ -911,6 +933,7 @@
             <w:pPr>
               <w:pStyle w:val="TableText"/>
               <w:jc w:val="left"/>
+              <w:wordWrap w:val="0"/>
               <w:spacing w:before="0" w:after="0" w:line="320" w:lineRule="exact"/>
             </w:pPr>
             <w:r>
@@ -929,6 +952,7 @@
             <w:pPr>
               <w:pStyle w:val="TableText"/>
               <w:jc w:val="left"/>
+              <w:wordWrap w:val="0"/>
               <w:spacing w:before="0" w:after="0" w:line="320" w:lineRule="exact"/>
             </w:pPr>
             <w:r>
@@ -1013,6 +1037,7 @@
             <w:pPr>
               <w:pStyle w:val="TableText"/>
               <w:jc w:val="left"/>
+              <w:wordWrap w:val="0"/>
               <w:spacing w:before="0" w:after="0" w:line="320" w:lineRule="exact"/>
             </w:pPr>
             <w:r>
@@ -1034,6 +1059,7 @@
             <w:pPr>
               <w:pStyle w:val="TableText"/>
               <w:jc w:val="left"/>
+              <w:wordWrap w:val="0"/>
               <w:spacing w:before="0" w:after="0" w:line="320" w:lineRule="exact"/>
             </w:pPr>
             <w:r>
@@ -1055,6 +1081,7 @@
             <w:pPr>
               <w:pStyle w:val="TableText"/>
               <w:jc w:val="left"/>
+              <w:wordWrap w:val="0"/>
               <w:spacing w:before="0" w:after="0" w:line="320" w:lineRule="exact"/>
             </w:pPr>
             <w:r>
@@ -1079,6 +1106,7 @@
             <w:pPr>
               <w:pStyle w:val="TableText"/>
               <w:jc w:val="left"/>
+              <w:wordWrap w:val="0"/>
               <w:spacing w:before="0" w:after="0" w:line="320" w:lineRule="exact"/>
             </w:pPr>
             <w:r>
@@ -1097,6 +1125,7 @@
             <w:pPr>
               <w:pStyle w:val="TableText"/>
               <w:jc w:val="left"/>
+              <w:wordWrap w:val="0"/>
               <w:spacing w:before="0" w:after="0" w:line="320" w:lineRule="exact"/>
             </w:pPr>
             <w:r>
@@ -1115,6 +1144,7 @@
             <w:pPr>
               <w:pStyle w:val="TableText"/>
               <w:jc w:val="left"/>
+              <w:wordWrap w:val="0"/>
               <w:spacing w:before="0" w:after="0" w:line="320" w:lineRule="exact"/>
             </w:pPr>
             <w:r>
@@ -1138,6 +1168,7 @@
             <w:pPr>
               <w:pStyle w:val="TableText"/>
               <w:jc w:val="left"/>
+              <w:wordWrap w:val="0"/>
               <w:spacing w:before="0" w:after="0" w:line="320" w:lineRule="exact"/>
             </w:pPr>
             <w:r>
@@ -1156,6 +1187,7 @@
             <w:pPr>
               <w:pStyle w:val="TableText"/>
               <w:jc w:val="left"/>
+              <w:wordWrap w:val="0"/>
               <w:spacing w:before="0" w:after="0" w:line="320" w:lineRule="exact"/>
             </w:pPr>
             <w:r>
@@ -1174,6 +1206,7 @@
             <w:pPr>
               <w:pStyle w:val="TableText"/>
               <w:jc w:val="left"/>
+              <w:wordWrap w:val="0"/>
               <w:spacing w:before="0" w:after="0" w:line="320" w:lineRule="exact"/>
             </w:pPr>
             <w:r>
@@ -1197,6 +1230,7 @@
             <w:pPr>
               <w:pStyle w:val="TableText"/>
               <w:jc w:val="left"/>
+              <w:wordWrap w:val="0"/>
               <w:spacing w:before="0" w:after="0" w:line="320" w:lineRule="exact"/>
             </w:pPr>
             <w:r>
@@ -1215,6 +1249,7 @@
             <w:pPr>
               <w:pStyle w:val="TableText"/>
               <w:jc w:val="left"/>
+              <w:wordWrap w:val="0"/>
               <w:spacing w:before="0" w:after="0" w:line="320" w:lineRule="exact"/>
             </w:pPr>
             <w:r>
@@ -1233,6 +1268,7 @@
             <w:pPr>
               <w:pStyle w:val="TableText"/>
               <w:jc w:val="left"/>
+              <w:wordWrap w:val="0"/>
               <w:spacing w:before="0" w:after="0" w:line="320" w:lineRule="exact"/>
             </w:pPr>
             <w:r>
@@ -1256,6 +1292,7 @@
             <w:pPr>
               <w:pStyle w:val="TableText"/>
               <w:jc w:val="left"/>
+              <w:wordWrap w:val="0"/>
               <w:spacing w:before="0" w:after="0" w:line="320" w:lineRule="exact"/>
             </w:pPr>
             <w:r>
@@ -1274,6 +1311,7 @@
             <w:pPr>
               <w:pStyle w:val="TableText"/>
               <w:jc w:val="left"/>
+              <w:wordWrap w:val="0"/>
               <w:spacing w:before="0" w:after="0" w:line="320" w:lineRule="exact"/>
             </w:pPr>
             <w:r>
@@ -1292,6 +1330,7 @@
             <w:pPr>
               <w:pStyle w:val="TableText"/>
               <w:jc w:val="left"/>
+              <w:wordWrap w:val="0"/>
               <w:spacing w:before="0" w:after="0" w:line="320" w:lineRule="exact"/>
             </w:pPr>
             <w:r>
@@ -1433,6 +1472,7 @@
             <w:pPr>
               <w:pStyle w:val="TableText"/>
               <w:jc w:val="left"/>
+              <w:wordWrap w:val="0"/>
               <w:spacing w:before="0" w:after="0" w:line="320" w:lineRule="exact"/>
             </w:pPr>
             <w:r>
@@ -1454,6 +1494,7 @@
             <w:pPr>
               <w:pStyle w:val="TableText"/>
               <w:jc w:val="left"/>
+              <w:wordWrap w:val="0"/>
               <w:spacing w:before="0" w:after="0" w:line="320" w:lineRule="exact"/>
             </w:pPr>
             <w:r>
@@ -1475,6 +1516,7 @@
             <w:pPr>
               <w:pStyle w:val="TableText"/>
               <w:jc w:val="left"/>
+              <w:wordWrap w:val="0"/>
               <w:spacing w:before="0" w:after="0" w:line="320" w:lineRule="exact"/>
             </w:pPr>
             <w:r>
@@ -1496,6 +1538,7 @@
             <w:pPr>
               <w:pStyle w:val="TableText"/>
               <w:jc w:val="left"/>
+              <w:wordWrap w:val="0"/>
               <w:spacing w:before="0" w:after="0" w:line="320" w:lineRule="exact"/>
             </w:pPr>
             <w:r>
@@ -1520,6 +1563,7 @@
             <w:pPr>
               <w:pStyle w:val="TableText"/>
               <w:jc w:val="left"/>
+              <w:wordWrap w:val="0"/>
               <w:spacing w:before="0" w:after="0" w:line="320" w:lineRule="exact"/>
             </w:pPr>
             <w:r>
@@ -1538,6 +1582,7 @@
             <w:pPr>
               <w:pStyle w:val="TableText"/>
               <w:jc w:val="left"/>
+              <w:wordWrap w:val="0"/>
               <w:spacing w:before="0" w:after="0" w:line="320" w:lineRule="exact"/>
             </w:pPr>
             <w:r>
@@ -1556,6 +1601,7 @@
             <w:pPr>
               <w:pStyle w:val="TableText"/>
               <w:jc w:val="left"/>
+              <w:wordWrap w:val="0"/>
               <w:spacing w:before="0" w:after="0" w:line="320" w:lineRule="exact"/>
             </w:pPr>
             <w:r>
@@ -1574,6 +1620,7 @@
             <w:pPr>
               <w:pStyle w:val="TableText"/>
               <w:jc w:val="left"/>
+              <w:wordWrap w:val="0"/>
               <w:spacing w:before="0" w:after="0" w:line="320" w:lineRule="exact"/>
             </w:pPr>
             <w:r>
@@ -1597,6 +1644,7 @@
             <w:pPr>
               <w:pStyle w:val="TableText"/>
               <w:jc w:val="left"/>
+              <w:wordWrap w:val="0"/>
               <w:spacing w:before="0" w:after="0" w:line="320" w:lineRule="exact"/>
             </w:pPr>
             <w:r>
@@ -1615,6 +1663,7 @@
             <w:pPr>
               <w:pStyle w:val="TableText"/>
               <w:jc w:val="left"/>
+              <w:wordWrap w:val="0"/>
               <w:spacing w:before="0" w:after="0" w:line="320" w:lineRule="exact"/>
             </w:pPr>
             <w:r>
@@ -1633,6 +1682,7 @@
             <w:pPr>
               <w:pStyle w:val="TableText"/>
               <w:jc w:val="left"/>
+              <w:wordWrap w:val="0"/>
               <w:spacing w:before="0" w:after="0" w:line="320" w:lineRule="exact"/>
             </w:pPr>
             <w:r>
@@ -1651,6 +1701,7 @@
             <w:pPr>
               <w:pStyle w:val="TableText"/>
               <w:jc w:val="left"/>
+              <w:wordWrap w:val="0"/>
               <w:spacing w:before="0" w:after="0" w:line="320" w:lineRule="exact"/>
             </w:pPr>
             <w:r>
@@ -1674,6 +1725,7 @@
             <w:pPr>
               <w:pStyle w:val="TableText"/>
               <w:jc w:val="left"/>
+              <w:wordWrap w:val="0"/>
               <w:spacing w:before="0" w:after="0" w:line="320" w:lineRule="exact"/>
             </w:pPr>
             <w:r>
@@ -1692,6 +1744,7 @@
             <w:pPr>
               <w:pStyle w:val="TableText"/>
               <w:jc w:val="left"/>
+              <w:wordWrap w:val="0"/>
               <w:spacing w:before="0" w:after="0" w:line="320" w:lineRule="exact"/>
             </w:pPr>
             <w:r>
@@ -1710,6 +1763,7 @@
             <w:pPr>
               <w:pStyle w:val="TableText"/>
               <w:jc w:val="left"/>
+              <w:wordWrap w:val="0"/>
               <w:spacing w:before="0" w:after="0" w:line="320" w:lineRule="exact"/>
             </w:pPr>
             <w:r>
@@ -1728,6 +1782,7 @@
             <w:pPr>
               <w:pStyle w:val="TableText"/>
               <w:jc w:val="left"/>
+              <w:wordWrap w:val="0"/>
               <w:spacing w:before="0" w:after="0" w:line="320" w:lineRule="exact"/>
             </w:pPr>
             <w:r>
@@ -1751,6 +1806,7 @@
             <w:pPr>
               <w:pStyle w:val="TableText"/>
               <w:jc w:val="left"/>
+              <w:wordWrap w:val="0"/>
               <w:spacing w:before="0" w:after="0" w:line="320" w:lineRule="exact"/>
             </w:pPr>
             <w:r>
@@ -1769,6 +1825,7 @@
             <w:pPr>
               <w:pStyle w:val="TableText"/>
               <w:jc w:val="left"/>
+              <w:wordWrap w:val="0"/>
               <w:spacing w:before="0" w:after="0" w:line="320" w:lineRule="exact"/>
             </w:pPr>
             <w:r>
@@ -1787,6 +1844,7 @@
             <w:pPr>
               <w:pStyle w:val="TableText"/>
               <w:jc w:val="left"/>
+              <w:wordWrap w:val="0"/>
               <w:spacing w:before="0" w:after="0" w:line="320" w:lineRule="exact"/>
             </w:pPr>
             <w:r>
@@ -1805,6 +1863,7 @@
             <w:pPr>
               <w:pStyle w:val="TableText"/>
               <w:jc w:val="left"/>
+              <w:wordWrap w:val="0"/>
               <w:spacing w:before="0" w:after="0" w:line="320" w:lineRule="exact"/>
             </w:pPr>
             <w:r>
@@ -2067,6 +2126,7 @@
             <w:pPr>
               <w:pStyle w:val="TableText"/>
               <w:jc w:val="left"/>
+              <w:wordWrap w:val="0"/>
               <w:spacing w:before="0" w:after="0" w:line="320" w:lineRule="exact"/>
             </w:pPr>
             <w:r>
@@ -2088,6 +2148,7 @@
             <w:pPr>
               <w:pStyle w:val="TableText"/>
               <w:jc w:val="left"/>
+              <w:wordWrap w:val="0"/>
               <w:spacing w:before="0" w:after="0" w:line="320" w:lineRule="exact"/>
             </w:pPr>
             <w:r>
@@ -2112,6 +2173,7 @@
             <w:pPr>
               <w:pStyle w:val="TableText"/>
               <w:jc w:val="left"/>
+              <w:wordWrap w:val="0"/>
               <w:spacing w:before="0" w:after="0" w:line="320" w:lineRule="exact"/>
             </w:pPr>
             <w:r>
@@ -2130,6 +2192,7 @@
             <w:pPr>
               <w:pStyle w:val="TableText"/>
               <w:jc w:val="left"/>
+              <w:wordWrap w:val="0"/>
               <w:spacing w:before="0" w:after="0" w:line="320" w:lineRule="exact"/>
             </w:pPr>
             <w:r>
@@ -2153,6 +2216,7 @@
             <w:pPr>
               <w:pStyle w:val="TableText"/>
               <w:jc w:val="left"/>
+              <w:wordWrap w:val="0"/>
               <w:spacing w:before="0" w:after="0" w:line="320" w:lineRule="exact"/>
             </w:pPr>
             <w:r>
@@ -2171,6 +2235,7 @@
             <w:pPr>
               <w:pStyle w:val="TableText"/>
               <w:jc w:val="left"/>
+              <w:wordWrap w:val="0"/>
               <w:spacing w:before="0" w:after="0" w:line="320" w:lineRule="exact"/>
             </w:pPr>
             <w:r>
@@ -2194,6 +2259,7 @@
             <w:pPr>
               <w:pStyle w:val="TableText"/>
               <w:jc w:val="left"/>
+              <w:wordWrap w:val="0"/>
               <w:spacing w:before="0" w:after="0" w:line="320" w:lineRule="exact"/>
             </w:pPr>
             <w:r>
@@ -2212,6 +2278,7 @@
             <w:pPr>
               <w:pStyle w:val="TableText"/>
               <w:jc w:val="left"/>
+              <w:wordWrap w:val="0"/>
               <w:spacing w:before="0" w:after="0" w:line="320" w:lineRule="exact"/>
             </w:pPr>
             <w:r>
@@ -2235,6 +2302,7 @@
             <w:pPr>
               <w:pStyle w:val="TableText"/>
               <w:jc w:val="left"/>
+              <w:wordWrap w:val="0"/>
               <w:spacing w:before="0" w:after="0" w:line="320" w:lineRule="exact"/>
             </w:pPr>
             <w:r>
@@ -2253,6 +2321,7 @@
             <w:pPr>
               <w:pStyle w:val="TableText"/>
               <w:jc w:val="left"/>
+              <w:wordWrap w:val="0"/>
               <w:spacing w:before="0" w:after="0" w:line="320" w:lineRule="exact"/>
             </w:pPr>
             <w:r>
@@ -2276,6 +2345,7 @@
             <w:pPr>
               <w:pStyle w:val="TableText"/>
               <w:jc w:val="left"/>
+              <w:wordWrap w:val="0"/>
               <w:spacing w:before="0" w:after="0" w:line="320" w:lineRule="exact"/>
             </w:pPr>
             <w:r>
@@ -2294,6 +2364,7 @@
             <w:pPr>
               <w:pStyle w:val="TableText"/>
               <w:jc w:val="left"/>
+              <w:wordWrap w:val="0"/>
               <w:spacing w:before="0" w:after="0" w:line="320" w:lineRule="exact"/>
             </w:pPr>
             <w:r>
@@ -2317,6 +2388,7 @@
             <w:pPr>
               <w:pStyle w:val="TableText"/>
               <w:jc w:val="left"/>
+              <w:wordWrap w:val="0"/>
               <w:spacing w:before="0" w:after="0" w:line="320" w:lineRule="exact"/>
             </w:pPr>
             <w:r>
@@ -2335,6 +2407,7 @@
             <w:pPr>
               <w:pStyle w:val="TableText"/>
               <w:jc w:val="left"/>
+              <w:wordWrap w:val="0"/>
               <w:spacing w:before="0" w:after="0" w:line="320" w:lineRule="exact"/>
             </w:pPr>
             <w:r>
@@ -2358,6 +2431,7 @@
             <w:pPr>
               <w:pStyle w:val="TableText"/>
               <w:jc w:val="left"/>
+              <w:wordWrap w:val="0"/>
               <w:spacing w:before="0" w:after="0" w:line="320" w:lineRule="exact"/>
             </w:pPr>
             <w:r>
@@ -2376,6 +2450,7 @@
             <w:pPr>
               <w:pStyle w:val="TableText"/>
               <w:jc w:val="left"/>
+              <w:wordWrap w:val="0"/>
               <w:spacing w:before="0" w:after="0" w:line="320" w:lineRule="exact"/>
             </w:pPr>
             <w:r>
@@ -2730,6 +2805,7 @@
             <w:pPr>
               <w:pStyle w:val="TableText"/>
               <w:jc w:val="left"/>
+              <w:wordWrap w:val="0"/>
               <w:spacing w:before="0" w:after="0" w:line="320" w:lineRule="exact"/>
             </w:pPr>
             <w:r>
@@ -2751,6 +2827,7 @@
             <w:pPr>
               <w:pStyle w:val="TableText"/>
               <w:jc w:val="left"/>
+              <w:wordWrap w:val="0"/>
               <w:spacing w:before="0" w:after="0" w:line="320" w:lineRule="exact"/>
             </w:pPr>
             <w:r>
@@ -2772,6 +2849,7 @@
             <w:pPr>
               <w:pStyle w:val="TableText"/>
               <w:jc w:val="left"/>
+              <w:wordWrap w:val="0"/>
               <w:spacing w:before="0" w:after="0" w:line="320" w:lineRule="exact"/>
             </w:pPr>
             <w:r>
@@ -2793,6 +2871,7 @@
             <w:pPr>
               <w:pStyle w:val="TableText"/>
               <w:jc w:val="left"/>
+              <w:wordWrap w:val="0"/>
               <w:spacing w:before="0" w:after="0" w:line="320" w:lineRule="exact"/>
             </w:pPr>
             <w:r>
@@ -2817,6 +2896,7 @@
             <w:pPr>
               <w:pStyle w:val="TableText"/>
               <w:jc w:val="left"/>
+              <w:wordWrap w:val="0"/>
               <w:spacing w:before="0" w:after="0" w:line="320" w:lineRule="exact"/>
             </w:pPr>
             <w:r>
@@ -2835,6 +2915,7 @@
             <w:pPr>
               <w:pStyle w:val="TableText"/>
               <w:jc w:val="left"/>
+              <w:wordWrap w:val="0"/>
               <w:spacing w:before="0" w:after="0" w:line="320" w:lineRule="exact"/>
             </w:pPr>
             <w:r>
@@ -2853,6 +2934,7 @@
             <w:pPr>
               <w:pStyle w:val="TableText"/>
               <w:jc w:val="left"/>
+              <w:wordWrap w:val="0"/>
               <w:spacing w:before="0" w:after="0" w:line="320" w:lineRule="exact"/>
             </w:pPr>
             <w:r>
@@ -2871,6 +2953,7 @@
             <w:pPr>
               <w:pStyle w:val="TableText"/>
               <w:jc w:val="left"/>
+              <w:wordWrap w:val="0"/>
               <w:spacing w:before="0" w:after="0" w:line="320" w:lineRule="exact"/>
             </w:pPr>
             <w:r>
@@ -2894,6 +2977,7 @@
             <w:pPr>
               <w:pStyle w:val="TableText"/>
               <w:jc w:val="left"/>
+              <w:wordWrap w:val="0"/>
               <w:spacing w:before="0" w:after="0" w:line="320" w:lineRule="exact"/>
             </w:pPr>
             <w:r>
@@ -2912,6 +2996,7 @@
             <w:pPr>
               <w:pStyle w:val="TableText"/>
               <w:jc w:val="left"/>
+              <w:wordWrap w:val="0"/>
               <w:spacing w:before="0" w:after="0" w:line="320" w:lineRule="exact"/>
             </w:pPr>
             <w:r>
@@ -2930,6 +3015,7 @@
             <w:pPr>
               <w:pStyle w:val="TableText"/>
               <w:jc w:val="left"/>
+              <w:wordWrap w:val="0"/>
               <w:spacing w:before="0" w:after="0" w:line="320" w:lineRule="exact"/>
             </w:pPr>
             <w:r>
@@ -2948,6 +3034,7 @@
             <w:pPr>
               <w:pStyle w:val="TableText"/>
               <w:jc w:val="left"/>
+              <w:wordWrap w:val="0"/>
               <w:spacing w:before="0" w:after="0" w:line="320" w:lineRule="exact"/>
             </w:pPr>
             <w:r>
@@ -2971,6 +3058,7 @@
             <w:pPr>
               <w:pStyle w:val="TableText"/>
               <w:jc w:val="left"/>
+              <w:wordWrap w:val="0"/>
               <w:spacing w:before="0" w:after="0" w:line="320" w:lineRule="exact"/>
             </w:pPr>
             <w:r>
@@ -2989,6 +3077,7 @@
             <w:pPr>
               <w:pStyle w:val="TableText"/>
               <w:jc w:val="left"/>
+              <w:wordWrap w:val="0"/>
               <w:spacing w:before="0" w:after="0" w:line="320" w:lineRule="exact"/>
             </w:pPr>
             <w:r>
@@ -3007,6 +3096,7 @@
             <w:pPr>
               <w:pStyle w:val="TableText"/>
               <w:jc w:val="left"/>
+              <w:wordWrap w:val="0"/>
               <w:spacing w:before="0" w:after="0" w:line="320" w:lineRule="exact"/>
             </w:pPr>
             <w:r>
@@ -3025,6 +3115,7 @@
             <w:pPr>
               <w:pStyle w:val="TableText"/>
               <w:jc w:val="left"/>
+              <w:wordWrap w:val="0"/>
               <w:spacing w:before="0" w:after="0" w:line="320" w:lineRule="exact"/>
             </w:pPr>
             <w:r>
@@ -3048,6 +3139,7 @@
             <w:pPr>
               <w:pStyle w:val="TableText"/>
               <w:jc w:val="left"/>
+              <w:wordWrap w:val="0"/>
               <w:spacing w:before="0" w:after="0" w:line="320" w:lineRule="exact"/>
             </w:pPr>
             <w:r>
@@ -3066,6 +3158,7 @@
             <w:pPr>
               <w:pStyle w:val="TableText"/>
               <w:jc w:val="left"/>
+              <w:wordWrap w:val="0"/>
               <w:spacing w:before="0" w:after="0" w:line="320" w:lineRule="exact"/>
             </w:pPr>
             <w:r>
@@ -3084,6 +3177,7 @@
             <w:pPr>
               <w:pStyle w:val="TableText"/>
               <w:jc w:val="left"/>
+              <w:wordWrap w:val="0"/>
               <w:spacing w:before="0" w:after="0" w:line="320" w:lineRule="exact"/>
             </w:pPr>
             <w:r>
@@ -3102,6 +3196,7 @@
             <w:pPr>
               <w:pStyle w:val="TableText"/>
               <w:jc w:val="left"/>
+              <w:wordWrap w:val="0"/>
               <w:spacing w:before="0" w:after="0" w:line="320" w:lineRule="exact"/>
             </w:pPr>
             <w:r>
@@ -3125,6 +3220,7 @@
             <w:pPr>
               <w:pStyle w:val="TableText"/>
               <w:jc w:val="left"/>
+              <w:wordWrap w:val="0"/>
               <w:spacing w:before="0" w:after="0" w:line="320" w:lineRule="exact"/>
             </w:pPr>
             <w:r>
@@ -3143,6 +3239,7 @@
             <w:pPr>
               <w:pStyle w:val="TableText"/>
               <w:jc w:val="left"/>
+              <w:wordWrap w:val="0"/>
               <w:spacing w:before="0" w:after="0" w:line="320" w:lineRule="exact"/>
             </w:pPr>
             <w:r>
@@ -3161,6 +3258,7 @@
             <w:pPr>
               <w:pStyle w:val="TableText"/>
               <w:jc w:val="left"/>
+              <w:wordWrap w:val="0"/>
               <w:spacing w:before="0" w:after="0" w:line="320" w:lineRule="exact"/>
             </w:pPr>
             <w:r>
@@ -3179,6 +3277,7 @@
             <w:pPr>
               <w:pStyle w:val="TableText"/>
               <w:jc w:val="left"/>
+              <w:wordWrap w:val="0"/>
               <w:spacing w:before="0" w:after="0" w:line="320" w:lineRule="exact"/>
             </w:pPr>
             <w:r>
@@ -3578,6 +3677,7 @@
             <w:pPr>
               <w:pStyle w:val="TableText"/>
               <w:jc w:val="left"/>
+              <w:wordWrap w:val="0"/>
               <w:spacing w:before="0" w:after="0" w:line="320" w:lineRule="exact"/>
             </w:pPr>
             <w:r>
@@ -3599,6 +3699,7 @@
             <w:pPr>
               <w:pStyle w:val="TableText"/>
               <w:jc w:val="left"/>
+              <w:wordWrap w:val="0"/>
               <w:spacing w:before="0" w:after="0" w:line="320" w:lineRule="exact"/>
             </w:pPr>
             <w:r>
@@ -3620,6 +3721,7 @@
             <w:pPr>
               <w:pStyle w:val="TableText"/>
               <w:jc w:val="left"/>
+              <w:wordWrap w:val="0"/>
               <w:spacing w:before="0" w:after="0" w:line="320" w:lineRule="exact"/>
             </w:pPr>
             <w:r>
@@ -3641,6 +3743,7 @@
             <w:pPr>
               <w:pStyle w:val="TableText"/>
               <w:jc w:val="left"/>
+              <w:wordWrap w:val="0"/>
               <w:spacing w:before="0" w:after="0" w:line="320" w:lineRule="exact"/>
             </w:pPr>
             <w:r>
@@ -3665,6 +3768,7 @@
             <w:pPr>
               <w:pStyle w:val="TableText"/>
               <w:jc w:val="left"/>
+              <w:wordWrap w:val="0"/>
               <w:spacing w:before="0" w:after="0" w:line="320" w:lineRule="exact"/>
             </w:pPr>
             <w:r>
@@ -3683,6 +3787,7 @@
             <w:pPr>
               <w:pStyle w:val="TableText"/>
               <w:jc w:val="left"/>
+              <w:wordWrap w:val="0"/>
               <w:spacing w:before="0" w:after="0" w:line="320" w:lineRule="exact"/>
             </w:pPr>
             <w:r>
@@ -3701,6 +3806,7 @@
             <w:pPr>
               <w:pStyle w:val="TableText"/>
               <w:jc w:val="left"/>
+              <w:wordWrap w:val="0"/>
               <w:spacing w:before="0" w:after="0" w:line="320" w:lineRule="exact"/>
             </w:pPr>
             <w:r>
@@ -3719,6 +3825,7 @@
             <w:pPr>
               <w:pStyle w:val="TableText"/>
               <w:jc w:val="left"/>
+              <w:wordWrap w:val="0"/>
               <w:spacing w:before="0" w:after="0" w:line="320" w:lineRule="exact"/>
             </w:pPr>
             <w:r>
@@ -3742,6 +3849,7 @@
             <w:pPr>
               <w:pStyle w:val="TableText"/>
               <w:jc w:val="left"/>
+              <w:wordWrap w:val="0"/>
               <w:spacing w:before="0" w:after="0" w:line="320" w:lineRule="exact"/>
             </w:pPr>
             <w:r>
@@ -3760,6 +3868,7 @@
             <w:pPr>
               <w:pStyle w:val="TableText"/>
               <w:jc w:val="left"/>
+              <w:wordWrap w:val="0"/>
               <w:spacing w:before="0" w:after="0" w:line="320" w:lineRule="exact"/>
             </w:pPr>
             <w:r>
@@ -3778,6 +3887,7 @@
             <w:pPr>
               <w:pStyle w:val="TableText"/>
               <w:jc w:val="left"/>
+              <w:wordWrap w:val="0"/>
               <w:spacing w:before="0" w:after="0" w:line="320" w:lineRule="exact"/>
             </w:pPr>
             <w:r>
@@ -3796,6 +3906,7 @@
             <w:pPr>
               <w:pStyle w:val="TableText"/>
               <w:jc w:val="left"/>
+              <w:wordWrap w:val="0"/>
               <w:spacing w:before="0" w:after="0" w:line="320" w:lineRule="exact"/>
             </w:pPr>
             <w:r>
@@ -3819,6 +3930,7 @@
             <w:pPr>
               <w:pStyle w:val="TableText"/>
               <w:jc w:val="left"/>
+              <w:wordWrap w:val="0"/>
               <w:spacing w:before="0" w:after="0" w:line="320" w:lineRule="exact"/>
             </w:pPr>
             <w:r>
@@ -3837,6 +3949,7 @@
             <w:pPr>
               <w:pStyle w:val="TableText"/>
               <w:jc w:val="left"/>
+              <w:wordWrap w:val="0"/>
               <w:spacing w:before="0" w:after="0" w:line="320" w:lineRule="exact"/>
             </w:pPr>
             <w:r>
@@ -3855,6 +3968,7 @@
             <w:pPr>
               <w:pStyle w:val="TableText"/>
               <w:jc w:val="left"/>
+              <w:wordWrap w:val="0"/>
               <w:spacing w:before="0" w:after="0" w:line="320" w:lineRule="exact"/>
             </w:pPr>
             <w:r>
@@ -3873,6 +3987,7 @@
             <w:pPr>
               <w:pStyle w:val="TableText"/>
               <w:jc w:val="left"/>
+              <w:wordWrap w:val="0"/>
               <w:spacing w:before="0" w:after="0" w:line="320" w:lineRule="exact"/>
             </w:pPr>
             <w:r>
@@ -3896,6 +4011,7 @@
             <w:pPr>
               <w:pStyle w:val="TableText"/>
               <w:jc w:val="left"/>
+              <w:wordWrap w:val="0"/>
               <w:spacing w:before="0" w:after="0" w:line="320" w:lineRule="exact"/>
             </w:pPr>
             <w:r>
@@ -3914,6 +4030,7 @@
             <w:pPr>
               <w:pStyle w:val="TableText"/>
               <w:jc w:val="left"/>
+              <w:wordWrap w:val="0"/>
               <w:spacing w:before="0" w:after="0" w:line="320" w:lineRule="exact"/>
             </w:pPr>
             <w:r>
@@ -3932,6 +4049,7 @@
             <w:pPr>
               <w:pStyle w:val="TableText"/>
               <w:jc w:val="left"/>
+              <w:wordWrap w:val="0"/>
               <w:spacing w:before="0" w:after="0" w:line="320" w:lineRule="exact"/>
             </w:pPr>
             <w:r>
@@ -3950,6 +4068,7 @@
             <w:pPr>
               <w:pStyle w:val="TableText"/>
               <w:jc w:val="left"/>
+              <w:wordWrap w:val="0"/>
               <w:spacing w:before="0" w:after="0" w:line="320" w:lineRule="exact"/>
             </w:pPr>
             <w:r>
@@ -3973,6 +4092,7 @@
             <w:pPr>
               <w:pStyle w:val="TableText"/>
               <w:jc w:val="left"/>
+              <w:wordWrap w:val="0"/>
               <w:spacing w:before="0" w:after="0" w:line="320" w:lineRule="exact"/>
             </w:pPr>
             <w:r>
@@ -3991,6 +4111,7 @@
             <w:pPr>
               <w:pStyle w:val="TableText"/>
               <w:jc w:val="left"/>
+              <w:wordWrap w:val="0"/>
               <w:spacing w:before="0" w:after="0" w:line="320" w:lineRule="exact"/>
             </w:pPr>
             <w:r>
@@ -4009,6 +4130,7 @@
             <w:pPr>
               <w:pStyle w:val="TableText"/>
               <w:jc w:val="left"/>
+              <w:wordWrap w:val="0"/>
               <w:spacing w:before="0" w:after="0" w:line="320" w:lineRule="exact"/>
             </w:pPr>
             <w:r>
@@ -4027,6 +4149,7 @@
             <w:pPr>
               <w:pStyle w:val="TableText"/>
               <w:jc w:val="left"/>
+              <w:wordWrap w:val="0"/>
               <w:spacing w:before="0" w:after="0" w:line="320" w:lineRule="exact"/>
             </w:pPr>
             <w:r>
@@ -4050,6 +4173,7 @@
             <w:pPr>
               <w:pStyle w:val="TableText"/>
               <w:jc w:val="left"/>
+              <w:wordWrap w:val="0"/>
               <w:spacing w:before="0" w:after="0" w:line="320" w:lineRule="exact"/>
             </w:pPr>
             <w:r>
@@ -4068,6 +4192,7 @@
             <w:pPr>
               <w:pStyle w:val="TableText"/>
               <w:jc w:val="left"/>
+              <w:wordWrap w:val="0"/>
               <w:spacing w:before="0" w:after="0" w:line="320" w:lineRule="exact"/>
             </w:pPr>
             <w:r>
@@ -4086,6 +4211,7 @@
             <w:pPr>
               <w:pStyle w:val="TableText"/>
               <w:jc w:val="left"/>
+              <w:wordWrap w:val="0"/>
               <w:spacing w:before="0" w:after="0" w:line="320" w:lineRule="exact"/>
             </w:pPr>
             <w:r>
@@ -4104,6 +4230,7 @@
             <w:pPr>
               <w:pStyle w:val="TableText"/>
               <w:jc w:val="left"/>
+              <w:wordWrap w:val="0"/>
               <w:spacing w:before="0" w:after="0" w:line="320" w:lineRule="exact"/>
             </w:pPr>
             <w:r>
@@ -4267,6 +4394,7 @@
             <w:pPr>
               <w:pStyle w:val="TableText"/>
               <w:jc w:val="left"/>
+              <w:wordWrap w:val="0"/>
               <w:spacing w:before="0" w:after="0" w:line="320" w:lineRule="exact"/>
             </w:pPr>
             <w:r>
@@ -4288,6 +4416,7 @@
             <w:pPr>
               <w:pStyle w:val="TableText"/>
               <w:jc w:val="left"/>
+              <w:wordWrap w:val="0"/>
               <w:spacing w:before="0" w:after="0" w:line="320" w:lineRule="exact"/>
             </w:pPr>
             <w:r>
@@ -4309,6 +4438,7 @@
             <w:pPr>
               <w:pStyle w:val="TableText"/>
               <w:jc w:val="left"/>
+              <w:wordWrap w:val="0"/>
               <w:spacing w:before="0" w:after="0" w:line="320" w:lineRule="exact"/>
             </w:pPr>
             <w:r>
@@ -4330,6 +4460,7 @@
             <w:pPr>
               <w:pStyle w:val="TableText"/>
               <w:jc w:val="left"/>
+              <w:wordWrap w:val="0"/>
               <w:spacing w:before="0" w:after="0" w:line="320" w:lineRule="exact"/>
             </w:pPr>
             <w:r>
@@ -4354,6 +4485,7 @@
             <w:pPr>
               <w:pStyle w:val="TableText"/>
               <w:jc w:val="left"/>
+              <w:wordWrap w:val="0"/>
               <w:spacing w:before="0" w:after="0" w:line="320" w:lineRule="exact"/>
             </w:pPr>
             <w:r>
@@ -4372,6 +4504,7 @@
             <w:pPr>
               <w:pStyle w:val="TableText"/>
               <w:jc w:val="left"/>
+              <w:wordWrap w:val="0"/>
               <w:spacing w:before="0" w:after="0" w:line="320" w:lineRule="exact"/>
             </w:pPr>
             <w:r>
@@ -4390,6 +4523,7 @@
             <w:pPr>
               <w:pStyle w:val="TableText"/>
               <w:jc w:val="left"/>
+              <w:wordWrap w:val="0"/>
               <w:spacing w:before="0" w:after="0" w:line="320" w:lineRule="exact"/>
             </w:pPr>
             <w:r>
@@ -4408,6 +4542,7 @@
             <w:pPr>
               <w:pStyle w:val="TableText"/>
               <w:jc w:val="left"/>
+              <w:wordWrap w:val="0"/>
               <w:spacing w:before="0" w:after="0" w:line="320" w:lineRule="exact"/>
             </w:pPr>
             <w:r>
@@ -4431,6 +4566,7 @@
             <w:pPr>
               <w:pStyle w:val="TableText"/>
               <w:jc w:val="left"/>
+              <w:wordWrap w:val="0"/>
               <w:spacing w:before="0" w:after="0" w:line="320" w:lineRule="exact"/>
             </w:pPr>
             <w:r>
@@ -4449,6 +4585,7 @@
             <w:pPr>
               <w:pStyle w:val="TableText"/>
               <w:jc w:val="left"/>
+              <w:wordWrap w:val="0"/>
               <w:spacing w:before="0" w:after="0" w:line="320" w:lineRule="exact"/>
             </w:pPr>
             <w:r>
@@ -4467,6 +4604,7 @@
             <w:pPr>
               <w:pStyle w:val="TableText"/>
               <w:jc w:val="left"/>
+              <w:wordWrap w:val="0"/>
               <w:spacing w:before="0" w:after="0" w:line="320" w:lineRule="exact"/>
             </w:pPr>
             <w:r>
@@ -4485,6 +4623,7 @@
             <w:pPr>
               <w:pStyle w:val="TableText"/>
               <w:jc w:val="left"/>
+              <w:wordWrap w:val="0"/>
               <w:spacing w:before="0" w:after="0" w:line="320" w:lineRule="exact"/>
             </w:pPr>
             <w:r>
@@ -4508,6 +4647,7 @@
             <w:pPr>
               <w:pStyle w:val="TableText"/>
               <w:jc w:val="left"/>
+              <w:wordWrap w:val="0"/>
               <w:spacing w:before="0" w:after="0" w:line="320" w:lineRule="exact"/>
             </w:pPr>
             <w:r>
@@ -4526,6 +4666,7 @@
             <w:pPr>
               <w:pStyle w:val="TableText"/>
               <w:jc w:val="left"/>
+              <w:wordWrap w:val="0"/>
               <w:spacing w:before="0" w:after="0" w:line="320" w:lineRule="exact"/>
             </w:pPr>
             <w:r>
@@ -4544,6 +4685,7 @@
             <w:pPr>
               <w:pStyle w:val="TableText"/>
               <w:jc w:val="left"/>
+              <w:wordWrap w:val="0"/>
               <w:spacing w:before="0" w:after="0" w:line="320" w:lineRule="exact"/>
             </w:pPr>
             <w:r>
@@ -4562,6 +4704,7 @@
             <w:pPr>
               <w:pStyle w:val="TableText"/>
               <w:jc w:val="left"/>
+              <w:wordWrap w:val="0"/>
               <w:spacing w:before="0" w:after="0" w:line="320" w:lineRule="exact"/>
             </w:pPr>
             <w:r>
@@ -4585,6 +4728,7 @@
             <w:pPr>
               <w:pStyle w:val="TableText"/>
               <w:jc w:val="left"/>
+              <w:wordWrap w:val="0"/>
               <w:spacing w:before="0" w:after="0" w:line="320" w:lineRule="exact"/>
             </w:pPr>
             <w:r>
@@ -4603,6 +4747,7 @@
             <w:pPr>
               <w:pStyle w:val="TableText"/>
               <w:jc w:val="left"/>
+              <w:wordWrap w:val="0"/>
               <w:spacing w:before="0" w:after="0" w:line="320" w:lineRule="exact"/>
             </w:pPr>
             <w:r>
@@ -4621,6 +4766,7 @@
             <w:pPr>
               <w:pStyle w:val="TableText"/>
               <w:jc w:val="left"/>
+              <w:wordWrap w:val="0"/>
               <w:spacing w:before="0" w:after="0" w:line="320" w:lineRule="exact"/>
             </w:pPr>
             <w:r>
@@ -4639,6 +4785,7 @@
             <w:pPr>
               <w:pStyle w:val="TableText"/>
               <w:jc w:val="left"/>
+              <w:wordWrap w:val="0"/>
               <w:spacing w:before="0" w:after="0" w:line="320" w:lineRule="exact"/>
             </w:pPr>
             <w:r>
@@ -4662,6 +4809,7 @@
             <w:pPr>
               <w:pStyle w:val="TableText"/>
               <w:jc w:val="left"/>
+              <w:wordWrap w:val="0"/>
               <w:spacing w:before="0" w:after="0" w:line="320" w:lineRule="exact"/>
             </w:pPr>
             <w:r>
@@ -4680,6 +4828,7 @@
             <w:pPr>
               <w:pStyle w:val="TableText"/>
               <w:jc w:val="left"/>
+              <w:wordWrap w:val="0"/>
               <w:spacing w:before="0" w:after="0" w:line="320" w:lineRule="exact"/>
             </w:pPr>
             <w:r>
@@ -4698,6 +4847,7 @@
             <w:pPr>
               <w:pStyle w:val="TableText"/>
               <w:jc w:val="left"/>
+              <w:wordWrap w:val="0"/>
               <w:spacing w:before="0" w:after="0" w:line="320" w:lineRule="exact"/>
             </w:pPr>
             <w:r>
@@ -4716,6 +4866,7 @@
             <w:pPr>
               <w:pStyle w:val="TableText"/>
               <w:jc w:val="left"/>
+              <w:wordWrap w:val="0"/>
               <w:spacing w:before="0" w:after="0" w:line="320" w:lineRule="exact"/>
             </w:pPr>
             <w:r>
@@ -4739,6 +4890,7 @@
             <w:pPr>
               <w:pStyle w:val="TableText"/>
               <w:jc w:val="left"/>
+              <w:wordWrap w:val="0"/>
               <w:spacing w:before="0" w:after="0" w:line="320" w:lineRule="exact"/>
             </w:pPr>
             <w:r>
@@ -4757,6 +4909,7 @@
             <w:pPr>
               <w:pStyle w:val="TableText"/>
               <w:jc w:val="left"/>
+              <w:wordWrap w:val="0"/>
               <w:spacing w:before="0" w:after="0" w:line="320" w:lineRule="exact"/>
             </w:pPr>
             <w:r>
@@ -4775,6 +4928,7 @@
             <w:pPr>
               <w:pStyle w:val="TableText"/>
               <w:jc w:val="left"/>
+              <w:wordWrap w:val="0"/>
               <w:spacing w:before="0" w:after="0" w:line="320" w:lineRule="exact"/>
             </w:pPr>
             <w:r>
@@ -4793,6 +4947,7 @@
             <w:pPr>
               <w:pStyle w:val="TableText"/>
               <w:jc w:val="left"/>
+              <w:wordWrap w:val="0"/>
               <w:spacing w:before="0" w:after="0" w:line="320" w:lineRule="exact"/>
             </w:pPr>
             <w:r>
@@ -4910,6 +5065,7 @@
             <w:pPr>
               <w:pStyle w:val="TableText"/>
               <w:jc w:val="left"/>
+              <w:wordWrap w:val="0"/>
               <w:spacing w:before="0" w:after="0" w:line="320" w:lineRule="exact"/>
             </w:pPr>
             <w:r>
@@ -4931,6 +5087,7 @@
             <w:pPr>
               <w:pStyle w:val="TableText"/>
               <w:jc w:val="left"/>
+              <w:wordWrap w:val="0"/>
               <w:spacing w:before="0" w:after="0" w:line="320" w:lineRule="exact"/>
             </w:pPr>
             <w:r>
@@ -4955,6 +5112,7 @@
             <w:pPr>
               <w:pStyle w:val="TableText"/>
               <w:jc w:val="left"/>
+              <w:wordWrap w:val="0"/>
               <w:spacing w:before="0" w:after="0" w:line="320" w:lineRule="exact"/>
             </w:pPr>
             <w:r>
@@ -4973,6 +5131,7 @@
             <w:pPr>
               <w:pStyle w:val="TableText"/>
               <w:jc w:val="left"/>
+              <w:wordWrap w:val="0"/>
               <w:spacing w:before="0" w:after="0" w:line="320" w:lineRule="exact"/>
             </w:pPr>
             <w:r>
@@ -4996,6 +5155,7 @@
             <w:pPr>
               <w:pStyle w:val="TableText"/>
               <w:jc w:val="left"/>
+              <w:wordWrap w:val="0"/>
               <w:spacing w:before="0" w:after="0" w:line="320" w:lineRule="exact"/>
             </w:pPr>
             <w:r>
@@ -5014,6 +5174,7 @@
             <w:pPr>
               <w:pStyle w:val="TableText"/>
               <w:jc w:val="left"/>
+              <w:wordWrap w:val="0"/>
               <w:spacing w:before="0" w:after="0" w:line="320" w:lineRule="exact"/>
             </w:pPr>
             <w:r>
@@ -5037,6 +5198,7 @@
             <w:pPr>
               <w:pStyle w:val="TableText"/>
               <w:jc w:val="left"/>
+              <w:wordWrap w:val="0"/>
               <w:spacing w:before="0" w:after="0" w:line="320" w:lineRule="exact"/>
             </w:pPr>
             <w:r>
@@ -5055,6 +5217,7 @@
             <w:pPr>
               <w:pStyle w:val="TableText"/>
               <w:jc w:val="left"/>
+              <w:wordWrap w:val="0"/>
               <w:spacing w:before="0" w:after="0" w:line="320" w:lineRule="exact"/>
             </w:pPr>
             <w:r>
@@ -5078,6 +5241,7 @@
             <w:pPr>
               <w:pStyle w:val="TableText"/>
               <w:jc w:val="left"/>
+              <w:wordWrap w:val="0"/>
               <w:spacing w:before="0" w:after="0" w:line="320" w:lineRule="exact"/>
             </w:pPr>
             <w:r>
@@ -5096,6 +5260,7 @@
             <w:pPr>
               <w:pStyle w:val="TableText"/>
               <w:jc w:val="left"/>
+              <w:wordWrap w:val="0"/>
               <w:spacing w:before="0" w:after="0" w:line="320" w:lineRule="exact"/>
             </w:pPr>
             <w:r>
@@ -5147,6 +5312,7 @@
             <w:pPr>
               <w:pStyle w:val="TableText"/>
               <w:jc w:val="left"/>
+              <w:wordWrap w:val="0"/>
               <w:spacing w:before="0" w:after="0" w:line="320" w:lineRule="exact"/>
             </w:pPr>
             <w:r>
@@ -5168,6 +5334,7 @@
             <w:pPr>
               <w:pStyle w:val="TableText"/>
               <w:jc w:val="left"/>
+              <w:wordWrap w:val="0"/>
               <w:spacing w:before="0" w:after="0" w:line="320" w:lineRule="exact"/>
             </w:pPr>
             <w:r>
@@ -5189,6 +5356,7 @@
             <w:pPr>
               <w:pStyle w:val="TableText"/>
               <w:jc w:val="left"/>
+              <w:wordWrap w:val="0"/>
               <w:spacing w:before="0" w:after="0" w:line="320" w:lineRule="exact"/>
             </w:pPr>
             <w:r>
@@ -5213,6 +5381,7 @@
             <w:pPr>
               <w:pStyle w:val="TableText"/>
               <w:jc w:val="left"/>
+              <w:wordWrap w:val="0"/>
               <w:spacing w:before="0" w:after="0" w:line="320" w:lineRule="exact"/>
             </w:pPr>
             <w:r>
@@ -5231,6 +5400,7 @@
             <w:pPr>
               <w:pStyle w:val="TableText"/>
               <w:jc w:val="left"/>
+              <w:wordWrap w:val="0"/>
               <w:spacing w:before="0" w:after="0" w:line="320" w:lineRule="exact"/>
             </w:pPr>
             <w:r>
@@ -5249,6 +5419,7 @@
             <w:pPr>
               <w:pStyle w:val="TableText"/>
               <w:jc w:val="left"/>
+              <w:wordWrap w:val="0"/>
               <w:spacing w:before="0" w:after="0" w:line="320" w:lineRule="exact"/>
             </w:pPr>
             <w:r>
@@ -5272,6 +5443,7 @@
             <w:pPr>
               <w:pStyle w:val="TableText"/>
               <w:jc w:val="left"/>
+              <w:wordWrap w:val="0"/>
               <w:spacing w:before="0" w:after="0" w:line="320" w:lineRule="exact"/>
             </w:pPr>
             <w:r>
@@ -5290,6 +5462,7 @@
             <w:pPr>
               <w:pStyle w:val="TableText"/>
               <w:jc w:val="left"/>
+              <w:wordWrap w:val="0"/>
               <w:spacing w:before="0" w:after="0" w:line="320" w:lineRule="exact"/>
             </w:pPr>
             <w:r>
@@ -5308,6 +5481,7 @@
             <w:pPr>
               <w:pStyle w:val="TableText"/>
               <w:jc w:val="left"/>
+              <w:wordWrap w:val="0"/>
               <w:spacing w:before="0" w:after="0" w:line="320" w:lineRule="exact"/>
             </w:pPr>
             <w:r>
@@ -5331,6 +5505,7 @@
             <w:pPr>
               <w:pStyle w:val="TableText"/>
               <w:jc w:val="left"/>
+              <w:wordWrap w:val="0"/>
               <w:spacing w:before="0" w:after="0" w:line="320" w:lineRule="exact"/>
             </w:pPr>
             <w:r>
@@ -5349,6 +5524,7 @@
             <w:pPr>
               <w:pStyle w:val="TableText"/>
               <w:jc w:val="left"/>
+              <w:wordWrap w:val="0"/>
               <w:spacing w:before="0" w:after="0" w:line="320" w:lineRule="exact"/>
             </w:pPr>
             <w:r>
@@ -5367,6 +5543,7 @@
             <w:pPr>
               <w:pStyle w:val="TableText"/>
               <w:jc w:val="left"/>
+              <w:wordWrap w:val="0"/>
               <w:spacing w:before="0" w:after="0" w:line="320" w:lineRule="exact"/>
             </w:pPr>
             <w:r>
@@ -5390,6 +5567,7 @@
             <w:pPr>
               <w:pStyle w:val="TableText"/>
               <w:jc w:val="left"/>
+              <w:wordWrap w:val="0"/>
               <w:spacing w:before="0" w:after="0" w:line="320" w:lineRule="exact"/>
             </w:pPr>
             <w:r>
@@ -5408,6 +5586,7 @@
             <w:pPr>
               <w:pStyle w:val="TableText"/>
               <w:jc w:val="left"/>
+              <w:wordWrap w:val="0"/>
               <w:spacing w:before="0" w:after="0" w:line="320" w:lineRule="exact"/>
             </w:pPr>
             <w:r>
@@ -5426,6 +5605,7 @@
             <w:pPr>
               <w:pStyle w:val="TableText"/>
               <w:jc w:val="left"/>
+              <w:wordWrap w:val="0"/>
               <w:spacing w:before="0" w:after="0" w:line="320" w:lineRule="exact"/>
             </w:pPr>
             <w:r>
@@ -5599,6 +5779,7 @@
             <w:pPr>
               <w:pStyle w:val="TableText"/>
               <w:jc w:val="left"/>
+              <w:wordWrap w:val="0"/>
               <w:spacing w:before="0" w:after="0" w:line="320" w:lineRule="exact"/>
             </w:pPr>
             <w:r>
@@ -5620,6 +5801,7 @@
             <w:pPr>
               <w:pStyle w:val="TableText"/>
               <w:jc w:val="left"/>
+              <w:wordWrap w:val="0"/>
               <w:spacing w:before="0" w:after="0" w:line="320" w:lineRule="exact"/>
             </w:pPr>
             <w:r>
@@ -5641,6 +5823,7 @@
             <w:pPr>
               <w:pStyle w:val="TableText"/>
               <w:jc w:val="left"/>
+              <w:wordWrap w:val="0"/>
               <w:spacing w:before="0" w:after="0" w:line="320" w:lineRule="exact"/>
             </w:pPr>
             <w:r>
@@ -5665,6 +5848,7 @@
             <w:pPr>
               <w:pStyle w:val="TableText"/>
               <w:jc w:val="left"/>
+              <w:wordWrap w:val="0"/>
               <w:spacing w:before="0" w:after="0" w:line="320" w:lineRule="exact"/>
             </w:pPr>
             <w:r>
@@ -5683,6 +5867,7 @@
             <w:pPr>
               <w:pStyle w:val="TableText"/>
               <w:jc w:val="left"/>
+              <w:wordWrap w:val="0"/>
               <w:spacing w:before="0" w:after="0" w:line="320" w:lineRule="exact"/>
             </w:pPr>
             <w:r>
@@ -5701,6 +5886,7 @@
             <w:pPr>
               <w:pStyle w:val="TableText"/>
               <w:jc w:val="left"/>
+              <w:wordWrap w:val="0"/>
               <w:spacing w:before="0" w:after="0" w:line="320" w:lineRule="exact"/>
             </w:pPr>
             <w:r>
@@ -5724,6 +5910,7 @@
             <w:pPr>
               <w:pStyle w:val="TableText"/>
               <w:jc w:val="left"/>
+              <w:wordWrap w:val="0"/>
               <w:spacing w:before="0" w:after="0" w:line="320" w:lineRule="exact"/>
             </w:pPr>
             <w:r>
@@ -5742,6 +5929,7 @@
             <w:pPr>
               <w:pStyle w:val="TableText"/>
               <w:jc w:val="left"/>
+              <w:wordWrap w:val="0"/>
               <w:spacing w:before="0" w:after="0" w:line="320" w:lineRule="exact"/>
             </w:pPr>
             <w:r>
@@ -5760,6 +5948,7 @@
             <w:pPr>
               <w:pStyle w:val="TableText"/>
               <w:jc w:val="left"/>
+              <w:wordWrap w:val="0"/>
               <w:spacing w:before="0" w:after="0" w:line="320" w:lineRule="exact"/>
             </w:pPr>
             <w:r>
@@ -5783,6 +5972,7 @@
             <w:pPr>
               <w:pStyle w:val="TableText"/>
               <w:jc w:val="left"/>
+              <w:wordWrap w:val="0"/>
               <w:spacing w:before="0" w:after="0" w:line="320" w:lineRule="exact"/>
             </w:pPr>
             <w:r>
@@ -5801,6 +5991,7 @@
             <w:pPr>
               <w:pStyle w:val="TableText"/>
               <w:jc w:val="left"/>
+              <w:wordWrap w:val="0"/>
               <w:spacing w:before="0" w:after="0" w:line="320" w:lineRule="exact"/>
             </w:pPr>
             <w:r>
@@ -5819,6 +6010,7 @@
             <w:pPr>
               <w:pStyle w:val="TableText"/>
               <w:jc w:val="left"/>
+              <w:wordWrap w:val="0"/>
               <w:spacing w:before="0" w:after="0" w:line="320" w:lineRule="exact"/>
             </w:pPr>
             <w:r>
@@ -5842,6 +6034,7 @@
             <w:pPr>
               <w:pStyle w:val="TableText"/>
               <w:jc w:val="left"/>
+              <w:wordWrap w:val="0"/>
               <w:spacing w:before="0" w:after="0" w:line="320" w:lineRule="exact"/>
             </w:pPr>
             <w:r>
@@ -5860,6 +6053,7 @@
             <w:pPr>
               <w:pStyle w:val="TableText"/>
               <w:jc w:val="left"/>
+              <w:wordWrap w:val="0"/>
               <w:spacing w:before="0" w:after="0" w:line="320" w:lineRule="exact"/>
             </w:pPr>
             <w:r>
@@ -5878,6 +6072,7 @@
             <w:pPr>
               <w:pStyle w:val="TableText"/>
               <w:jc w:val="left"/>
+              <w:wordWrap w:val="0"/>
               <w:spacing w:before="0" w:after="0" w:line="320" w:lineRule="exact"/>
             </w:pPr>
             <w:r>
@@ -5986,6 +6181,7 @@
             <w:pPr>
               <w:pStyle w:val="TableText"/>
               <w:jc w:val="left"/>
+              <w:wordWrap w:val="0"/>
               <w:spacing w:before="0" w:after="0" w:line="320" w:lineRule="exact"/>
             </w:pPr>
             <w:r>
@@ -6007,6 +6203,7 @@
             <w:pPr>
               <w:pStyle w:val="TableText"/>
               <w:jc w:val="left"/>
+              <w:wordWrap w:val="0"/>
               <w:spacing w:before="0" w:after="0" w:line="320" w:lineRule="exact"/>
             </w:pPr>
             <w:r>
@@ -6028,6 +6225,7 @@
             <w:pPr>
               <w:pStyle w:val="TableText"/>
               <w:jc w:val="left"/>
+              <w:wordWrap w:val="0"/>
               <w:spacing w:before="0" w:after="0" w:line="320" w:lineRule="exact"/>
             </w:pPr>
             <w:r>
@@ -6052,6 +6250,7 @@
             <w:pPr>
               <w:pStyle w:val="TableText"/>
               <w:jc w:val="left"/>
+              <w:wordWrap w:val="0"/>
               <w:spacing w:before="0" w:after="0" w:line="320" w:lineRule="exact"/>
             </w:pPr>
             <w:r>
@@ -6070,6 +6269,7 @@
             <w:pPr>
               <w:pStyle w:val="TableText"/>
               <w:jc w:val="left"/>
+              <w:wordWrap w:val="0"/>
               <w:spacing w:before="0" w:after="0" w:line="320" w:lineRule="exact"/>
             </w:pPr>
             <w:r>
@@ -6088,6 +6288,7 @@
             <w:pPr>
               <w:pStyle w:val="TableText"/>
               <w:jc w:val="left"/>
+              <w:wordWrap w:val="0"/>
               <w:spacing w:before="0" w:after="0" w:line="320" w:lineRule="exact"/>
             </w:pPr>
             <w:r>
@@ -6111,6 +6312,7 @@
             <w:pPr>
               <w:pStyle w:val="TableText"/>
               <w:jc w:val="left"/>
+              <w:wordWrap w:val="0"/>
               <w:spacing w:before="0" w:after="0" w:line="320" w:lineRule="exact"/>
             </w:pPr>
             <w:r>
@@ -6129,6 +6331,7 @@
             <w:pPr>
               <w:pStyle w:val="TableText"/>
               <w:jc w:val="left"/>
+              <w:wordWrap w:val="0"/>
               <w:spacing w:before="0" w:after="0" w:line="320" w:lineRule="exact"/>
             </w:pPr>
             <w:r>
@@ -6147,6 +6350,7 @@
             <w:pPr>
               <w:pStyle w:val="TableText"/>
               <w:jc w:val="left"/>
+              <w:wordWrap w:val="0"/>
               <w:spacing w:before="0" w:after="0" w:line="320" w:lineRule="exact"/>
             </w:pPr>
             <w:r>
@@ -6170,6 +6374,7 @@
             <w:pPr>
               <w:pStyle w:val="TableText"/>
               <w:jc w:val="left"/>
+              <w:wordWrap w:val="0"/>
               <w:spacing w:before="0" w:after="0" w:line="320" w:lineRule="exact"/>
             </w:pPr>
             <w:r>
@@ -6188,6 +6393,7 @@
             <w:pPr>
               <w:pStyle w:val="TableText"/>
               <w:jc w:val="left"/>
+              <w:wordWrap w:val="0"/>
               <w:spacing w:before="0" w:after="0" w:line="320" w:lineRule="exact"/>
             </w:pPr>
             <w:r>
@@ -6206,6 +6412,7 @@
             <w:pPr>
               <w:pStyle w:val="TableText"/>
               <w:jc w:val="left"/>
+              <w:wordWrap w:val="0"/>
               <w:spacing w:before="0" w:after="0" w:line="320" w:lineRule="exact"/>
             </w:pPr>
             <w:r>
@@ -6229,6 +6436,7 @@
             <w:pPr>
               <w:pStyle w:val="TableText"/>
               <w:jc w:val="left"/>
+              <w:wordWrap w:val="0"/>
               <w:spacing w:before="0" w:after="0" w:line="320" w:lineRule="exact"/>
             </w:pPr>
             <w:r>
@@ -6247,6 +6455,7 @@
             <w:pPr>
               <w:pStyle w:val="TableText"/>
               <w:jc w:val="left"/>
+              <w:wordWrap w:val="0"/>
               <w:spacing w:before="0" w:after="0" w:line="320" w:lineRule="exact"/>
             </w:pPr>
             <w:r>
@@ -6265,6 +6474,7 @@
             <w:pPr>
               <w:pStyle w:val="TableText"/>
               <w:jc w:val="left"/>
+              <w:wordWrap w:val="0"/>
               <w:spacing w:before="0" w:after="0" w:line="320" w:lineRule="exact"/>
             </w:pPr>
             <w:r>
@@ -6288,6 +6498,7 @@
             <w:pPr>
               <w:pStyle w:val="TableText"/>
               <w:jc w:val="left"/>
+              <w:wordWrap w:val="0"/>
               <w:spacing w:before="0" w:after="0" w:line="320" w:lineRule="exact"/>
             </w:pPr>
             <w:r>
@@ -6306,6 +6517,7 @@
             <w:pPr>
               <w:pStyle w:val="TableText"/>
               <w:jc w:val="left"/>
+              <w:wordWrap w:val="0"/>
               <w:spacing w:before="0" w:after="0" w:line="320" w:lineRule="exact"/>
             </w:pPr>
             <w:r>
@@ -6324,6 +6536,7 @@
             <w:pPr>
               <w:pStyle w:val="TableText"/>
               <w:jc w:val="left"/>
+              <w:wordWrap w:val="0"/>
               <w:spacing w:before="0" w:after="0" w:line="320" w:lineRule="exact"/>
             </w:pPr>
             <w:r>
@@ -6347,6 +6560,7 @@
             <w:pPr>
               <w:pStyle w:val="TableText"/>
               <w:jc w:val="left"/>
+              <w:wordWrap w:val="0"/>
               <w:spacing w:before="0" w:after="0" w:line="320" w:lineRule="exact"/>
             </w:pPr>
             <w:r>
@@ -6365,6 +6579,7 @@
             <w:pPr>
               <w:pStyle w:val="TableText"/>
               <w:jc w:val="left"/>
+              <w:wordWrap w:val="0"/>
               <w:spacing w:before="0" w:after="0" w:line="320" w:lineRule="exact"/>
             </w:pPr>
             <w:r>
@@ -6383,6 +6598,7 @@
             <w:pPr>
               <w:pStyle w:val="TableText"/>
               <w:jc w:val="left"/>
+              <w:wordWrap w:val="0"/>
               <w:spacing w:before="0" w:after="0" w:line="320" w:lineRule="exact"/>
             </w:pPr>
             <w:r>
@@ -6456,6 +6672,7 @@
             <w:pPr>
               <w:pStyle w:val="TableText"/>
               <w:jc w:val="left"/>
+              <w:wordWrap w:val="0"/>
               <w:spacing w:before="0" w:after="0" w:line="320" w:lineRule="exact"/>
             </w:pPr>
             <w:r>
@@ -6477,6 +6694,7 @@
             <w:pPr>
               <w:pStyle w:val="TableText"/>
               <w:jc w:val="left"/>
+              <w:wordWrap w:val="0"/>
               <w:spacing w:before="0" w:after="0" w:line="320" w:lineRule="exact"/>
             </w:pPr>
             <w:r>
@@ -6498,6 +6716,7 @@
             <w:pPr>
               <w:pStyle w:val="TableText"/>
               <w:jc w:val="left"/>
+              <w:wordWrap w:val="0"/>
               <w:spacing w:before="0" w:after="0" w:line="320" w:lineRule="exact"/>
             </w:pPr>
             <w:r>
@@ -6519,6 +6738,7 @@
             <w:pPr>
               <w:pStyle w:val="TableText"/>
               <w:jc w:val="left"/>
+              <w:wordWrap w:val="0"/>
               <w:spacing w:before="0" w:after="0" w:line="320" w:lineRule="exact"/>
             </w:pPr>
             <w:r>
@@ -6543,6 +6763,7 @@
             <w:pPr>
               <w:pStyle w:val="TableText"/>
               <w:jc w:val="left"/>
+              <w:wordWrap w:val="0"/>
               <w:spacing w:before="0" w:after="0" w:line="320" w:lineRule="exact"/>
             </w:pPr>
             <w:r>
@@ -6561,6 +6782,7 @@
             <w:pPr>
               <w:pStyle w:val="TableText"/>
               <w:jc w:val="left"/>
+              <w:wordWrap w:val="0"/>
               <w:spacing w:before="0" w:after="0" w:line="320" w:lineRule="exact"/>
             </w:pPr>
             <w:r>
@@ -6579,6 +6801,7 @@
             <w:pPr>
               <w:pStyle w:val="TableText"/>
               <w:jc w:val="left"/>
+              <w:wordWrap w:val="0"/>
               <w:spacing w:before="0" w:after="0" w:line="320" w:lineRule="exact"/>
             </w:pPr>
             <w:r>
@@ -6597,6 +6820,7 @@
             <w:pPr>
               <w:pStyle w:val="TableText"/>
               <w:jc w:val="left"/>
+              <w:wordWrap w:val="0"/>
               <w:spacing w:before="0" w:after="0" w:line="320" w:lineRule="exact"/>
             </w:pPr>
             <w:r>
@@ -6620,6 +6844,7 @@
             <w:pPr>
               <w:pStyle w:val="TableText"/>
               <w:jc w:val="left"/>
+              <w:wordWrap w:val="0"/>
               <w:spacing w:before="0" w:after="0" w:line="320" w:lineRule="exact"/>
             </w:pPr>
             <w:r>
@@ -6638,6 +6863,7 @@
             <w:pPr>
               <w:pStyle w:val="TableText"/>
               <w:jc w:val="left"/>
+              <w:wordWrap w:val="0"/>
               <w:spacing w:before="0" w:after="0" w:line="320" w:lineRule="exact"/>
             </w:pPr>
             <w:r>
@@ -6656,6 +6882,7 @@
             <w:pPr>
               <w:pStyle w:val="TableText"/>
               <w:jc w:val="left"/>
+              <w:wordWrap w:val="0"/>
               <w:spacing w:before="0" w:after="0" w:line="320" w:lineRule="exact"/>
             </w:pPr>
             <w:r>
@@ -6674,6 +6901,7 @@
             <w:pPr>
               <w:pStyle w:val="TableText"/>
               <w:jc w:val="left"/>
+              <w:wordWrap w:val="0"/>
               <w:spacing w:before="0" w:after="0" w:line="320" w:lineRule="exact"/>
             </w:pPr>
             <w:r>
@@ -6697,6 +6925,7 @@
             <w:pPr>
               <w:pStyle w:val="TableText"/>
               <w:jc w:val="left"/>
+              <w:wordWrap w:val="0"/>
               <w:spacing w:before="0" w:after="0" w:line="320" w:lineRule="exact"/>
             </w:pPr>
             <w:r>
@@ -6715,6 +6944,7 @@
             <w:pPr>
               <w:pStyle w:val="TableText"/>
               <w:jc w:val="left"/>
+              <w:wordWrap w:val="0"/>
               <w:spacing w:before="0" w:after="0" w:line="320" w:lineRule="exact"/>
             </w:pPr>
             <w:r>
@@ -6733,6 +6963,7 @@
             <w:pPr>
               <w:pStyle w:val="TableText"/>
               <w:jc w:val="left"/>
+              <w:wordWrap w:val="0"/>
               <w:spacing w:before="0" w:after="0" w:line="320" w:lineRule="exact"/>
             </w:pPr>
             <w:r>
@@ -6751,6 +6982,7 @@
             <w:pPr>
               <w:pStyle w:val="TableText"/>
               <w:jc w:val="left"/>
+              <w:wordWrap w:val="0"/>
               <w:spacing w:before="0" w:after="0" w:line="320" w:lineRule="exact"/>
             </w:pPr>
             <w:r>
@@ -6774,6 +7006,7 @@
             <w:pPr>
               <w:pStyle w:val="TableText"/>
               <w:jc w:val="left"/>
+              <w:wordWrap w:val="0"/>
               <w:spacing w:before="0" w:after="0" w:line="320" w:lineRule="exact"/>
             </w:pPr>
             <w:r>
@@ -6792,6 +7025,7 @@
             <w:pPr>
               <w:pStyle w:val="TableText"/>
               <w:jc w:val="left"/>
+              <w:wordWrap w:val="0"/>
               <w:spacing w:before="0" w:after="0" w:line="320" w:lineRule="exact"/>
             </w:pPr>
             <w:r>
@@ -6810,6 +7044,7 @@
             <w:pPr>
               <w:pStyle w:val="TableText"/>
               <w:jc w:val="left"/>
+              <w:wordWrap w:val="0"/>
               <w:spacing w:before="0" w:after="0" w:line="320" w:lineRule="exact"/>
             </w:pPr>
             <w:r>
@@ -6828,6 +7063,7 @@
             <w:pPr>
               <w:pStyle w:val="TableText"/>
               <w:jc w:val="left"/>
+              <w:wordWrap w:val="0"/>
               <w:spacing w:before="0" w:after="0" w:line="320" w:lineRule="exact"/>
             </w:pPr>
             <w:r>
@@ -6890,6 +7126,7 @@
             <w:pPr>
               <w:pStyle w:val="TableText"/>
               <w:jc w:val="left"/>
+              <w:wordWrap w:val="0"/>
               <w:spacing w:before="0" w:after="0" w:line="320" w:lineRule="exact"/>
             </w:pPr>
             <w:r>
@@ -6911,6 +7148,7 @@
             <w:pPr>
               <w:pStyle w:val="TableText"/>
               <w:jc w:val="left"/>
+              <w:wordWrap w:val="0"/>
               <w:spacing w:before="0" w:after="0" w:line="320" w:lineRule="exact"/>
             </w:pPr>
             <w:r>
@@ -6932,6 +7170,7 @@
             <w:pPr>
               <w:pStyle w:val="TableText"/>
               <w:jc w:val="left"/>
+              <w:wordWrap w:val="0"/>
               <w:spacing w:before="0" w:after="0" w:line="320" w:lineRule="exact"/>
             </w:pPr>
             <w:r>
@@ -6953,6 +7192,7 @@
             <w:pPr>
               <w:pStyle w:val="TableText"/>
               <w:jc w:val="left"/>
+              <w:wordWrap w:val="0"/>
               <w:spacing w:before="0" w:after="0" w:line="320" w:lineRule="exact"/>
             </w:pPr>
             <w:r>
@@ -6974,6 +7214,7 @@
             <w:pPr>
               <w:pStyle w:val="TableText"/>
               <w:jc w:val="left"/>
+              <w:wordWrap w:val="0"/>
               <w:spacing w:before="0" w:after="0" w:line="320" w:lineRule="exact"/>
             </w:pPr>
             <w:r>
@@ -6998,6 +7239,7 @@
             <w:pPr>
               <w:pStyle w:val="TableText"/>
               <w:jc w:val="left"/>
+              <w:wordWrap w:val="0"/>
               <w:spacing w:before="0" w:after="0" w:line="320" w:lineRule="exact"/>
             </w:pPr>
             <w:r>
@@ -7016,6 +7258,7 @@
             <w:pPr>
               <w:pStyle w:val="TableText"/>
               <w:jc w:val="left"/>
+              <w:wordWrap w:val="0"/>
               <w:spacing w:before="0" w:after="0" w:line="320" w:lineRule="exact"/>
             </w:pPr>
             <w:r>
@@ -7034,6 +7277,7 @@
             <w:pPr>
               <w:pStyle w:val="TableText"/>
               <w:jc w:val="left"/>
+              <w:wordWrap w:val="0"/>
               <w:spacing w:before="0" w:after="0" w:line="320" w:lineRule="exact"/>
             </w:pPr>
             <w:r>
@@ -7052,6 +7296,7 @@
             <w:pPr>
               <w:pStyle w:val="TableText"/>
               <w:jc w:val="left"/>
+              <w:wordWrap w:val="0"/>
               <w:spacing w:before="0" w:after="0" w:line="320" w:lineRule="exact"/>
             </w:pPr>
             <w:r>
@@ -7070,6 +7315,7 @@
             <w:pPr>
               <w:pStyle w:val="TableText"/>
               <w:jc w:val="left"/>
+              <w:wordWrap w:val="0"/>
               <w:spacing w:before="0" w:after="0" w:line="320" w:lineRule="exact"/>
             </w:pPr>
             <w:r>
@@ -7093,6 +7339,7 @@
             <w:pPr>
               <w:pStyle w:val="TableText"/>
               <w:jc w:val="left"/>
+              <w:wordWrap w:val="0"/>
               <w:spacing w:before="0" w:after="0" w:line="320" w:lineRule="exact"/>
             </w:pPr>
             <w:r>
@@ -7111,6 +7358,7 @@
             <w:pPr>
               <w:pStyle w:val="TableText"/>
               <w:jc w:val="left"/>
+              <w:wordWrap w:val="0"/>
               <w:spacing w:before="0" w:after="0" w:line="320" w:lineRule="exact"/>
             </w:pPr>
             <w:r>
@@ -7129,6 +7377,7 @@
             <w:pPr>
               <w:pStyle w:val="TableText"/>
               <w:jc w:val="left"/>
+              <w:wordWrap w:val="0"/>
               <w:spacing w:before="0" w:after="0" w:line="320" w:lineRule="exact"/>
             </w:pPr>
             <w:r>
@@ -7147,6 +7396,7 @@
             <w:pPr>
               <w:pStyle w:val="TableText"/>
               <w:jc w:val="left"/>
+              <w:wordWrap w:val="0"/>
               <w:spacing w:before="0" w:after="0" w:line="320" w:lineRule="exact"/>
             </w:pPr>
             <w:r>
@@ -7165,6 +7415,7 @@
             <w:pPr>
               <w:pStyle w:val="TableText"/>
               <w:jc w:val="left"/>
+              <w:wordWrap w:val="0"/>
               <w:spacing w:before="0" w:after="0" w:line="320" w:lineRule="exact"/>
             </w:pPr>
             <w:r>
@@ -7188,6 +7439,7 @@
             <w:pPr>
               <w:pStyle w:val="TableText"/>
               <w:jc w:val="left"/>
+              <w:wordWrap w:val="0"/>
               <w:spacing w:before="0" w:after="0" w:line="320" w:lineRule="exact"/>
             </w:pPr>
             <w:r>
@@ -7206,6 +7458,7 @@
             <w:pPr>
               <w:pStyle w:val="TableText"/>
               <w:jc w:val="left"/>
+              <w:wordWrap w:val="0"/>
               <w:spacing w:before="0" w:after="0" w:line="320" w:lineRule="exact"/>
             </w:pPr>
             <w:r>
@@ -7224,6 +7477,7 @@
             <w:pPr>
               <w:pStyle w:val="TableText"/>
               <w:jc w:val="left"/>
+              <w:wordWrap w:val="0"/>
               <w:spacing w:before="0" w:after="0" w:line="320" w:lineRule="exact"/>
             </w:pPr>
             <w:r>
@@ -7242,6 +7496,7 @@
             <w:pPr>
               <w:pStyle w:val="TableText"/>
               <w:jc w:val="left"/>
+              <w:wordWrap w:val="0"/>
               <w:spacing w:before="0" w:after="0" w:line="320" w:lineRule="exact"/>
             </w:pPr>
             <w:r>
@@ -7260,6 +7515,7 @@
             <w:pPr>
               <w:pStyle w:val="TableText"/>
               <w:jc w:val="left"/>
+              <w:wordWrap w:val="0"/>
               <w:spacing w:before="0" w:after="0" w:line="320" w:lineRule="exact"/>
             </w:pPr>
             <w:r>
@@ -7283,6 +7539,7 @@
             <w:pPr>
               <w:pStyle w:val="TableText"/>
               <w:jc w:val="left"/>
+              <w:wordWrap w:val="0"/>
               <w:spacing w:before="0" w:after="0" w:line="320" w:lineRule="exact"/>
             </w:pPr>
             <w:r>
@@ -7301,6 +7558,7 @@
             <w:pPr>
               <w:pStyle w:val="TableText"/>
               <w:jc w:val="left"/>
+              <w:wordWrap w:val="0"/>
               <w:spacing w:before="0" w:after="0" w:line="320" w:lineRule="exact"/>
             </w:pPr>
             <w:r>
@@ -7319,6 +7577,7 @@
             <w:pPr>
               <w:pStyle w:val="TableText"/>
               <w:jc w:val="left"/>
+              <w:wordWrap w:val="0"/>
               <w:spacing w:before="0" w:after="0" w:line="320" w:lineRule="exact"/>
             </w:pPr>
             <w:r>
@@ -7337,6 +7596,7 @@
             <w:pPr>
               <w:pStyle w:val="TableText"/>
               <w:jc w:val="left"/>
+              <w:wordWrap w:val="0"/>
               <w:spacing w:before="0" w:after="0" w:line="320" w:lineRule="exact"/>
             </w:pPr>
             <w:r>
@@ -7355,6 +7615,7 @@
             <w:pPr>
               <w:pStyle w:val="TableText"/>
               <w:jc w:val="left"/>
+              <w:wordWrap w:val="0"/>
               <w:spacing w:before="0" w:after="0" w:line="320" w:lineRule="exact"/>
             </w:pPr>
             <w:r>
@@ -7765,6 +8026,7 @@
             <w:pPr>
               <w:pStyle w:val="TableText"/>
               <w:jc w:val="left"/>
+              <w:wordWrap w:val="0"/>
               <w:spacing w:before="0" w:after="0" w:line="320" w:lineRule="exact"/>
             </w:pPr>
             <w:r>
@@ -7786,6 +8048,7 @@
             <w:pPr>
               <w:pStyle w:val="TableText"/>
               <w:jc w:val="left"/>
+              <w:wordWrap w:val="0"/>
               <w:spacing w:before="0" w:after="0" w:line="320" w:lineRule="exact"/>
             </w:pPr>
             <w:r>
@@ -7810,6 +8073,7 @@
             <w:pPr>
               <w:pStyle w:val="TableText"/>
               <w:jc w:val="left"/>
+              <w:wordWrap w:val="0"/>
               <w:spacing w:before="0" w:after="0" w:line="320" w:lineRule="exact"/>
             </w:pPr>
             <w:r>
@@ -7828,6 +8092,7 @@
             <w:pPr>
               <w:pStyle w:val="TableText"/>
               <w:jc w:val="left"/>
+              <w:wordWrap w:val="0"/>
               <w:spacing w:before="0" w:after="0" w:line="320" w:lineRule="exact"/>
             </w:pPr>
             <w:r>
@@ -7851,6 +8116,7 @@
             <w:pPr>
               <w:pStyle w:val="TableText"/>
               <w:jc w:val="left"/>
+              <w:wordWrap w:val="0"/>
               <w:spacing w:before="0" w:after="0" w:line="320" w:lineRule="exact"/>
             </w:pPr>
             <w:r>
@@ -7869,6 +8135,7 @@
             <w:pPr>
               <w:pStyle w:val="TableText"/>
               <w:jc w:val="left"/>
+              <w:wordWrap w:val="0"/>
               <w:spacing w:before="0" w:after="0" w:line="320" w:lineRule="exact"/>
             </w:pPr>
             <w:r>
@@ -7892,6 +8159,7 @@
             <w:pPr>
               <w:pStyle w:val="TableText"/>
               <w:jc w:val="left"/>
+              <w:wordWrap w:val="0"/>
               <w:spacing w:before="0" w:after="0" w:line="320" w:lineRule="exact"/>
             </w:pPr>
             <w:r>
@@ -7910,6 +8178,7 @@
             <w:pPr>
               <w:pStyle w:val="TableText"/>
               <w:jc w:val="left"/>
+              <w:wordWrap w:val="0"/>
               <w:spacing w:before="0" w:after="0" w:line="320" w:lineRule="exact"/>
             </w:pPr>
             <w:r>
@@ -7933,6 +8202,7 @@
             <w:pPr>
               <w:pStyle w:val="TableText"/>
               <w:jc w:val="left"/>
+              <w:wordWrap w:val="0"/>
               <w:spacing w:before="0" w:after="0" w:line="320" w:lineRule="exact"/>
             </w:pPr>
             <w:r>
@@ -7951,6 +8221,7 @@
             <w:pPr>
               <w:pStyle w:val="TableText"/>
               <w:jc w:val="left"/>
+              <w:wordWrap w:val="0"/>
               <w:spacing w:before="0" w:after="0" w:line="320" w:lineRule="exact"/>
             </w:pPr>
             <w:r>
@@ -7974,6 +8245,7 @@
             <w:pPr>
               <w:pStyle w:val="TableText"/>
               <w:jc w:val="left"/>
+              <w:wordWrap w:val="0"/>
               <w:spacing w:before="0" w:after="0" w:line="320" w:lineRule="exact"/>
             </w:pPr>
             <w:r>
@@ -7992,6 +8264,7 @@
             <w:pPr>
               <w:pStyle w:val="TableText"/>
               <w:jc w:val="left"/>
+              <w:wordWrap w:val="0"/>
               <w:spacing w:before="0" w:after="0" w:line="320" w:lineRule="exact"/>
             </w:pPr>
             <w:r>
@@ -8015,6 +8288,7 @@
             <w:pPr>
               <w:pStyle w:val="TableText"/>
               <w:jc w:val="left"/>
+              <w:wordWrap w:val="0"/>
               <w:spacing w:before="0" w:after="0" w:line="320" w:lineRule="exact"/>
             </w:pPr>
             <w:r>
@@ -8033,6 +8307,7 @@
             <w:pPr>
               <w:pStyle w:val="TableText"/>
               <w:jc w:val="left"/>
+              <w:wordWrap w:val="0"/>
               <w:spacing w:before="0" w:after="0" w:line="320" w:lineRule="exact"/>
             </w:pPr>
             <w:r>
@@ -8084,6 +8359,7 @@
             <w:pPr>
               <w:pStyle w:val="TableText"/>
               <w:jc w:val="left"/>
+              <w:wordWrap w:val="0"/>
               <w:spacing w:before="0" w:after="0" w:line="320" w:lineRule="exact"/>
             </w:pPr>
             <w:r>
@@ -8105,6 +8381,7 @@
             <w:pPr>
               <w:pStyle w:val="TableText"/>
               <w:jc w:val="left"/>
+              <w:wordWrap w:val="0"/>
               <w:spacing w:before="0" w:after="0" w:line="320" w:lineRule="exact"/>
             </w:pPr>
             <w:r>
@@ -8129,6 +8406,7 @@
             <w:pPr>
               <w:pStyle w:val="TableText"/>
               <w:jc w:val="left"/>
+              <w:wordWrap w:val="0"/>
               <w:spacing w:before="0" w:after="0" w:line="320" w:lineRule="exact"/>
             </w:pPr>
             <w:r>
@@ -8147,6 +8425,7 @@
             <w:pPr>
               <w:pStyle w:val="TableText"/>
               <w:jc w:val="left"/>
+              <w:wordWrap w:val="0"/>
               <w:spacing w:before="0" w:after="0" w:line="320" w:lineRule="exact"/>
             </w:pPr>
             <w:r>
@@ -8170,6 +8449,7 @@
             <w:pPr>
               <w:pStyle w:val="TableText"/>
               <w:jc w:val="left"/>
+              <w:wordWrap w:val="0"/>
               <w:spacing w:before="0" w:after="0" w:line="320" w:lineRule="exact"/>
             </w:pPr>
             <w:r>
@@ -8188,6 +8468,7 @@
             <w:pPr>
               <w:pStyle w:val="TableText"/>
               <w:jc w:val="left"/>
+              <w:wordWrap w:val="0"/>
               <w:spacing w:before="0" w:after="0" w:line="320" w:lineRule="exact"/>
             </w:pPr>
             <w:r>
@@ -8211,6 +8492,7 @@
             <w:pPr>
               <w:pStyle w:val="TableText"/>
               <w:jc w:val="left"/>
+              <w:wordWrap w:val="0"/>
               <w:spacing w:before="0" w:after="0" w:line="320" w:lineRule="exact"/>
             </w:pPr>
             <w:r>
@@ -8229,6 +8511,7 @@
             <w:pPr>
               <w:pStyle w:val="TableText"/>
               <w:jc w:val="left"/>
+              <w:wordWrap w:val="0"/>
               <w:spacing w:before="0" w:after="0" w:line="320" w:lineRule="exact"/>
             </w:pPr>
             <w:r>
@@ -8252,6 +8535,7 @@
             <w:pPr>
               <w:pStyle w:val="TableText"/>
               <w:jc w:val="left"/>
+              <w:wordWrap w:val="0"/>
               <w:spacing w:before="0" w:after="0" w:line="320" w:lineRule="exact"/>
             </w:pPr>
             <w:r>
@@ -8270,6 +8554,7 @@
             <w:pPr>
               <w:pStyle w:val="TableText"/>
               <w:jc w:val="left"/>
+              <w:wordWrap w:val="0"/>
               <w:spacing w:before="0" w:after="0" w:line="320" w:lineRule="exact"/>
             </w:pPr>
             <w:r>
@@ -8293,6 +8578,7 @@
             <w:pPr>
               <w:pStyle w:val="TableText"/>
               <w:jc w:val="left"/>
+              <w:wordWrap w:val="0"/>
               <w:spacing w:before="0" w:after="0" w:line="320" w:lineRule="exact"/>
             </w:pPr>
             <w:r>
@@ -8311,6 +8597,7 @@
             <w:pPr>
               <w:pStyle w:val="TableText"/>
               <w:jc w:val="left"/>
+              <w:wordWrap w:val="0"/>
               <w:spacing w:before="0" w:after="0" w:line="320" w:lineRule="exact"/>
             </w:pPr>
             <w:r>
@@ -8334,6 +8621,7 @@
             <w:pPr>
               <w:pStyle w:val="TableText"/>
               <w:jc w:val="left"/>
+              <w:wordWrap w:val="0"/>
               <w:spacing w:before="0" w:after="0" w:line="320" w:lineRule="exact"/>
             </w:pPr>
             <w:r>
@@ -8352,6 +8640,7 @@
             <w:pPr>
               <w:pStyle w:val="TableText"/>
               <w:jc w:val="left"/>
+              <w:wordWrap w:val="0"/>
               <w:spacing w:before="0" w:after="0" w:line="320" w:lineRule="exact"/>
             </w:pPr>
             <w:r>
@@ -8375,6 +8664,7 @@
             <w:pPr>
               <w:pStyle w:val="TableText"/>
               <w:jc w:val="left"/>
+              <w:wordWrap w:val="0"/>
               <w:spacing w:before="0" w:after="0" w:line="320" w:lineRule="exact"/>
             </w:pPr>
             <w:r>
@@ -8393,6 +8683,7 @@
             <w:pPr>
               <w:pStyle w:val="TableText"/>
               <w:jc w:val="left"/>
+              <w:wordWrap w:val="0"/>
               <w:spacing w:before="0" w:after="0" w:line="320" w:lineRule="exact"/>
             </w:pPr>
             <w:r>
@@ -8444,6 +8735,7 @@
             <w:pPr>
               <w:pStyle w:val="TableText"/>
               <w:jc w:val="left"/>
+              <w:wordWrap w:val="0"/>
               <w:spacing w:before="0" w:after="0" w:line="320" w:lineRule="exact"/>
             </w:pPr>
             <w:r>
@@ -8465,6 +8757,7 @@
             <w:pPr>
               <w:pStyle w:val="TableText"/>
               <w:jc w:val="left"/>
+              <w:wordWrap w:val="0"/>
               <w:spacing w:before="0" w:after="0" w:line="320" w:lineRule="exact"/>
             </w:pPr>
             <w:r>
@@ -8486,6 +8779,7 @@
             <w:pPr>
               <w:pStyle w:val="TableText"/>
               <w:jc w:val="left"/>
+              <w:wordWrap w:val="0"/>
               <w:spacing w:before="0" w:after="0" w:line="320" w:lineRule="exact"/>
             </w:pPr>
             <w:r>
@@ -8507,6 +8801,7 @@
             <w:pPr>
               <w:pStyle w:val="TableText"/>
               <w:jc w:val="left"/>
+              <w:wordWrap w:val="0"/>
               <w:spacing w:before="0" w:after="0" w:line="320" w:lineRule="exact"/>
             </w:pPr>
             <w:r>
@@ -8531,6 +8826,7 @@
             <w:pPr>
               <w:pStyle w:val="TableText"/>
               <w:jc w:val="left"/>
+              <w:wordWrap w:val="0"/>
               <w:spacing w:before="0" w:after="0" w:line="320" w:lineRule="exact"/>
             </w:pPr>
             <w:r>
@@ -8549,6 +8845,7 @@
             <w:pPr>
               <w:pStyle w:val="TableText"/>
               <w:jc w:val="left"/>
+              <w:wordWrap w:val="0"/>
               <w:spacing w:before="0" w:after="0" w:line="320" w:lineRule="exact"/>
             </w:pPr>
             <w:r>
@@ -8567,6 +8864,7 @@
             <w:pPr>
               <w:pStyle w:val="TableText"/>
               <w:jc w:val="left"/>
+              <w:wordWrap w:val="0"/>
               <w:spacing w:before="0" w:after="0" w:line="320" w:lineRule="exact"/>
             </w:pPr>
             <w:r>
@@ -8585,6 +8883,7 @@
             <w:pPr>
               <w:pStyle w:val="TableText"/>
               <w:jc w:val="left"/>
+              <w:wordWrap w:val="0"/>
               <w:spacing w:before="0" w:after="0" w:line="320" w:lineRule="exact"/>
             </w:pPr>
             <w:r>
@@ -8608,6 +8907,7 @@
             <w:pPr>
               <w:pStyle w:val="TableText"/>
               <w:jc w:val="left"/>
+              <w:wordWrap w:val="0"/>
               <w:spacing w:before="0" w:after="0" w:line="320" w:lineRule="exact"/>
             </w:pPr>
             <w:r>
@@ -8626,6 +8926,7 @@
             <w:pPr>
               <w:pStyle w:val="TableText"/>
               <w:jc w:val="left"/>
+              <w:wordWrap w:val="0"/>
               <w:spacing w:before="0" w:after="0" w:line="320" w:lineRule="exact"/>
             </w:pPr>
             <w:r>
@@ -8644,6 +8945,7 @@
             <w:pPr>
               <w:pStyle w:val="TableText"/>
               <w:jc w:val="left"/>
+              <w:wordWrap w:val="0"/>
               <w:spacing w:before="0" w:after="0" w:line="320" w:lineRule="exact"/>
             </w:pPr>
             <w:r>
@@ -8662,6 +8964,7 @@
             <w:pPr>
               <w:pStyle w:val="TableText"/>
               <w:jc w:val="left"/>
+              <w:wordWrap w:val="0"/>
               <w:spacing w:before="0" w:after="0" w:line="320" w:lineRule="exact"/>
             </w:pPr>
             <w:r>
@@ -8685,6 +8988,7 @@
             <w:pPr>
               <w:pStyle w:val="TableText"/>
               <w:jc w:val="left"/>
+              <w:wordWrap w:val="0"/>
               <w:spacing w:before="0" w:after="0" w:line="320" w:lineRule="exact"/>
             </w:pPr>
             <w:r>
@@ -8703,6 +9007,7 @@
             <w:pPr>
               <w:pStyle w:val="TableText"/>
               <w:jc w:val="left"/>
+              <w:wordWrap w:val="0"/>
               <w:spacing w:before="0" w:after="0" w:line="320" w:lineRule="exact"/>
             </w:pPr>
             <w:r>
@@ -8721,6 +9026,7 @@
             <w:pPr>
               <w:pStyle w:val="TableText"/>
               <w:jc w:val="left"/>
+              <w:wordWrap w:val="0"/>
               <w:spacing w:before="0" w:after="0" w:line="320" w:lineRule="exact"/>
             </w:pPr>
             <w:r>
@@ -8739,6 +9045,7 @@
             <w:pPr>
               <w:pStyle w:val="TableText"/>
               <w:jc w:val="left"/>
+              <w:wordWrap w:val="0"/>
               <w:spacing w:before="0" w:after="0" w:line="320" w:lineRule="exact"/>
             </w:pPr>
             <w:r>
@@ -8762,6 +9069,7 @@
             <w:pPr>
               <w:pStyle w:val="TableText"/>
               <w:jc w:val="left"/>
+              <w:wordWrap w:val="0"/>
               <w:spacing w:before="0" w:after="0" w:line="320" w:lineRule="exact"/>
             </w:pPr>
             <w:r>
@@ -8780,6 +9088,7 @@
             <w:pPr>
               <w:pStyle w:val="TableText"/>
               <w:jc w:val="left"/>
+              <w:wordWrap w:val="0"/>
               <w:spacing w:before="0" w:after="0" w:line="320" w:lineRule="exact"/>
             </w:pPr>
             <w:r>
@@ -8798,6 +9107,7 @@
             <w:pPr>
               <w:pStyle w:val="TableText"/>
               <w:jc w:val="left"/>
+              <w:wordWrap w:val="0"/>
               <w:spacing w:before="0" w:after="0" w:line="320" w:lineRule="exact"/>
             </w:pPr>
             <w:r>
@@ -8816,6 +9126,7 @@
             <w:pPr>
               <w:pStyle w:val="TableText"/>
               <w:jc w:val="left"/>
+              <w:wordWrap w:val="0"/>
               <w:spacing w:before="0" w:after="0" w:line="320" w:lineRule="exact"/>
             </w:pPr>
             <w:r>
@@ -8839,6 +9150,7 @@
             <w:pPr>
               <w:pStyle w:val="TableText"/>
               <w:jc w:val="left"/>
+              <w:wordWrap w:val="0"/>
               <w:spacing w:before="0" w:after="0" w:line="320" w:lineRule="exact"/>
             </w:pPr>
             <w:r>
@@ -8857,6 +9169,7 @@
             <w:pPr>
               <w:pStyle w:val="TableText"/>
               <w:jc w:val="left"/>
+              <w:wordWrap w:val="0"/>
               <w:spacing w:before="0" w:after="0" w:line="320" w:lineRule="exact"/>
             </w:pPr>
             <w:r>
@@ -8875,6 +9188,7 @@
             <w:pPr>
               <w:pStyle w:val="TableText"/>
               <w:jc w:val="left"/>
+              <w:wordWrap w:val="0"/>
               <w:spacing w:before="0" w:after="0" w:line="320" w:lineRule="exact"/>
             </w:pPr>
             <w:r>
@@ -8893,6 +9207,7 @@
             <w:pPr>
               <w:pStyle w:val="TableText"/>
               <w:jc w:val="left"/>
+              <w:wordWrap w:val="0"/>
               <w:spacing w:before="0" w:after="0" w:line="320" w:lineRule="exact"/>
             </w:pPr>
             <w:r>
@@ -8951,6 +9266,7 @@
             <w:pPr>
               <w:pStyle w:val="CompactGlossaryText"/>
               <w:jc w:val="left"/>
+              <w:wordWrap w:val="0"/>
               <w:spacing w:before="0" w:after="0" w:line="160" w:lineRule="exact"/>
             </w:pPr>
             <w:r>
@@ -8973,6 +9289,7 @@
             <w:pPr>
               <w:pStyle w:val="CompactGlossaryText"/>
               <w:jc w:val="left"/>
+              <w:wordWrap w:val="0"/>
               <w:spacing w:before="0" w:after="0" w:line="160" w:lineRule="exact"/>
             </w:pPr>
             <w:r>
@@ -8995,6 +9312,7 @@
             <w:pPr>
               <w:pStyle w:val="CompactGlossaryText"/>
               <w:jc w:val="left"/>
+              <w:wordWrap w:val="0"/>
               <w:spacing w:before="0" w:after="0" w:line="160" w:lineRule="exact"/>
             </w:pPr>
             <w:r>
@@ -9017,6 +9335,7 @@
             <w:pPr>
               <w:pStyle w:val="CompactGlossaryText"/>
               <w:jc w:val="left"/>
+              <w:wordWrap w:val="0"/>
               <w:spacing w:before="0" w:after="0" w:line="160" w:lineRule="exact"/>
             </w:pPr>
             <w:r>
@@ -9043,6 +9362,7 @@
             <w:pPr>
               <w:pStyle w:val="CompactGlossaryText"/>
               <w:jc w:val="left"/>
+              <w:wordWrap w:val="0"/>
               <w:spacing w:before="0" w:after="0" w:line="160" w:lineRule="exact"/>
             </w:pPr>
             <w:r>
@@ -9063,6 +9383,7 @@
             <w:pPr>
               <w:pStyle w:val="CompactGlossaryText"/>
               <w:jc w:val="left"/>
+              <w:wordWrap w:val="0"/>
               <w:spacing w:before="0" w:after="0" w:line="160" w:lineRule="exact"/>
             </w:pPr>
             <w:r>
@@ -9083,6 +9404,7 @@
             <w:pPr>
               <w:pStyle w:val="CompactGlossaryText"/>
               <w:jc w:val="left"/>
+              <w:wordWrap w:val="0"/>
               <w:spacing w:before="0" w:after="0" w:line="160" w:lineRule="exact"/>
             </w:pPr>
             <w:r>
@@ -9103,6 +9425,7 @@
             <w:pPr>
               <w:pStyle w:val="CompactGlossaryText"/>
               <w:jc w:val="left"/>
+              <w:wordWrap w:val="0"/>
               <w:spacing w:before="0" w:after="0" w:line="160" w:lineRule="exact"/>
             </w:pPr>
             <w:r>
@@ -9128,6 +9451,7 @@
             <w:pPr>
               <w:pStyle w:val="CompactGlossaryText"/>
               <w:jc w:val="left"/>
+              <w:wordWrap w:val="0"/>
               <w:spacing w:before="0" w:after="0" w:line="160" w:lineRule="exact"/>
             </w:pPr>
             <w:r>
@@ -9148,6 +9472,7 @@
             <w:pPr>
               <w:pStyle w:val="CompactGlossaryText"/>
               <w:jc w:val="left"/>
+              <w:wordWrap w:val="0"/>
               <w:spacing w:before="0" w:after="0" w:line="160" w:lineRule="exact"/>
             </w:pPr>
             <w:r>
@@ -9168,6 +9493,7 @@
             <w:pPr>
               <w:pStyle w:val="CompactGlossaryText"/>
               <w:jc w:val="left"/>
+              <w:wordWrap w:val="0"/>
               <w:spacing w:before="0" w:after="0" w:line="160" w:lineRule="exact"/>
             </w:pPr>
             <w:r>
@@ -9188,6 +9514,7 @@
             <w:pPr>
               <w:pStyle w:val="CompactGlossaryText"/>
               <w:jc w:val="left"/>
+              <w:wordWrap w:val="0"/>
               <w:spacing w:before="0" w:after="0" w:line="160" w:lineRule="exact"/>
             </w:pPr>
             <w:r>
@@ -9213,6 +9540,7 @@
             <w:pPr>
               <w:pStyle w:val="CompactGlossaryText"/>
               <w:jc w:val="left"/>
+              <w:wordWrap w:val="0"/>
               <w:spacing w:before="0" w:after="0" w:line="160" w:lineRule="exact"/>
             </w:pPr>
             <w:r>
@@ -9233,6 +9561,7 @@
             <w:pPr>
               <w:pStyle w:val="CompactGlossaryText"/>
               <w:jc w:val="left"/>
+              <w:wordWrap w:val="0"/>
               <w:spacing w:before="0" w:after="0" w:line="160" w:lineRule="exact"/>
             </w:pPr>
             <w:r>
@@ -9253,6 +9582,7 @@
             <w:pPr>
               <w:pStyle w:val="CompactGlossaryText"/>
               <w:jc w:val="left"/>
+              <w:wordWrap w:val="0"/>
               <w:spacing w:before="0" w:after="0" w:line="160" w:lineRule="exact"/>
             </w:pPr>
             <w:r>
@@ -9273,6 +9603,7 @@
             <w:pPr>
               <w:pStyle w:val="CompactGlossaryText"/>
               <w:jc w:val="left"/>
+              <w:wordWrap w:val="0"/>
               <w:spacing w:before="0" w:after="0" w:line="160" w:lineRule="exact"/>
             </w:pPr>
             <w:r>
@@ -9298,6 +9629,7 @@
             <w:pPr>
               <w:pStyle w:val="CompactGlossaryText"/>
               <w:jc w:val="left"/>
+              <w:wordWrap w:val="0"/>
               <w:spacing w:before="0" w:after="0" w:line="160" w:lineRule="exact"/>
             </w:pPr>
             <w:r>
@@ -9318,6 +9650,7 @@
             <w:pPr>
               <w:pStyle w:val="CompactGlossaryText"/>
               <w:jc w:val="left"/>
+              <w:wordWrap w:val="0"/>
               <w:spacing w:before="0" w:after="0" w:line="160" w:lineRule="exact"/>
             </w:pPr>
             <w:r>
@@ -9338,6 +9671,7 @@
             <w:pPr>
               <w:pStyle w:val="CompactGlossaryText"/>
               <w:jc w:val="left"/>
+              <w:wordWrap w:val="0"/>
               <w:spacing w:before="0" w:after="0" w:line="160" w:lineRule="exact"/>
             </w:pPr>
             <w:r>
@@ -9358,6 +9692,7 @@
             <w:pPr>
               <w:pStyle w:val="CompactGlossaryText"/>
               <w:jc w:val="left"/>
+              <w:wordWrap w:val="0"/>
               <w:spacing w:before="0" w:after="0" w:line="160" w:lineRule="exact"/>
             </w:pPr>
             <w:r>
@@ -9383,6 +9718,7 @@
             <w:pPr>
               <w:pStyle w:val="CompactGlossaryText"/>
               <w:jc w:val="left"/>
+              <w:wordWrap w:val="0"/>
               <w:spacing w:before="0" w:after="0" w:line="160" w:lineRule="exact"/>
             </w:pPr>
             <w:r>
@@ -9403,6 +9739,7 @@
             <w:pPr>
               <w:pStyle w:val="CompactGlossaryText"/>
               <w:jc w:val="left"/>
+              <w:wordWrap w:val="0"/>
               <w:spacing w:before="0" w:after="0" w:line="160" w:lineRule="exact"/>
             </w:pPr>
             <w:r>
@@ -9423,6 +9760,7 @@
             <w:pPr>
               <w:pStyle w:val="CompactGlossaryText"/>
               <w:jc w:val="left"/>
+              <w:wordWrap w:val="0"/>
               <w:spacing w:before="0" w:after="0" w:line="160" w:lineRule="exact"/>
             </w:pPr>
             <w:r>
@@ -9443,6 +9781,7 @@
             <w:pPr>
               <w:pStyle w:val="CompactGlossaryText"/>
               <w:jc w:val="left"/>
+              <w:wordWrap w:val="0"/>
               <w:spacing w:before="0" w:after="0" w:line="160" w:lineRule="exact"/>
             </w:pPr>
             <w:r>
@@ -9468,6 +9807,7 @@
             <w:pPr>
               <w:pStyle w:val="CompactGlossaryText"/>
               <w:jc w:val="left"/>
+              <w:wordWrap w:val="0"/>
               <w:spacing w:before="0" w:after="0" w:line="160" w:lineRule="exact"/>
             </w:pPr>
             <w:r>
@@ -9488,6 +9828,7 @@
             <w:pPr>
               <w:pStyle w:val="CompactGlossaryText"/>
               <w:jc w:val="left"/>
+              <w:wordWrap w:val="0"/>
               <w:spacing w:before="0" w:after="0" w:line="160" w:lineRule="exact"/>
             </w:pPr>
             <w:r>
@@ -9508,6 +9849,7 @@
             <w:pPr>
               <w:pStyle w:val="CompactGlossaryText"/>
               <w:jc w:val="left"/>
+              <w:wordWrap w:val="0"/>
               <w:spacing w:before="0" w:after="0" w:line="160" w:lineRule="exact"/>
             </w:pPr>
             <w:r>
@@ -9528,6 +9870,7 @@
             <w:pPr>
               <w:pStyle w:val="CompactGlossaryText"/>
               <w:jc w:val="left"/>
+              <w:wordWrap w:val="0"/>
               <w:spacing w:before="0" w:after="0" w:line="160" w:lineRule="exact"/>
             </w:pPr>
             <w:r>
@@ -9553,6 +9896,7 @@
             <w:pPr>
               <w:pStyle w:val="CompactGlossaryText"/>
               <w:jc w:val="left"/>
+              <w:wordWrap w:val="0"/>
               <w:spacing w:before="0" w:after="0" w:line="160" w:lineRule="exact"/>
             </w:pPr>
             <w:r>
@@ -9573,6 +9917,7 @@
             <w:pPr>
               <w:pStyle w:val="CompactGlossaryText"/>
               <w:jc w:val="left"/>
+              <w:wordWrap w:val="0"/>
               <w:spacing w:before="0" w:after="0" w:line="160" w:lineRule="exact"/>
             </w:pPr>
             <w:r>
@@ -9593,6 +9938,7 @@
             <w:pPr>
               <w:pStyle w:val="CompactGlossaryText"/>
               <w:jc w:val="left"/>
+              <w:wordWrap w:val="0"/>
               <w:spacing w:before="0" w:after="0" w:line="160" w:lineRule="exact"/>
             </w:pPr>
             <w:r>
@@ -9613,6 +9959,7 @@
             <w:pPr>
               <w:pStyle w:val="CompactGlossaryText"/>
               <w:jc w:val="left"/>
+              <w:wordWrap w:val="0"/>
               <w:spacing w:before="0" w:after="0" w:line="160" w:lineRule="exact"/>
             </w:pPr>
             <w:r>
@@ -9638,6 +9985,7 @@
             <w:pPr>
               <w:pStyle w:val="CompactGlossaryText"/>
               <w:jc w:val="left"/>
+              <w:wordWrap w:val="0"/>
               <w:spacing w:before="0" w:after="0" w:line="160" w:lineRule="exact"/>
             </w:pPr>
             <w:r>
@@ -9658,6 +10006,7 @@
             <w:pPr>
               <w:pStyle w:val="CompactGlossaryText"/>
               <w:jc w:val="left"/>
+              <w:wordWrap w:val="0"/>
               <w:spacing w:before="0" w:after="0" w:line="160" w:lineRule="exact"/>
             </w:pPr>
             <w:r>
@@ -9678,6 +10027,7 @@
             <w:pPr>
               <w:pStyle w:val="CompactGlossaryText"/>
               <w:jc w:val="left"/>
+              <w:wordWrap w:val="0"/>
               <w:spacing w:before="0" w:after="0" w:line="160" w:lineRule="exact"/>
             </w:pPr>
             <w:r>
@@ -9698,6 +10048,7 @@
             <w:pPr>
               <w:pStyle w:val="CompactGlossaryText"/>
               <w:jc w:val="left"/>
+              <w:wordWrap w:val="0"/>
               <w:spacing w:before="0" w:after="0" w:line="160" w:lineRule="exact"/>
             </w:pPr>
             <w:r>
@@ -9723,6 +10074,7 @@
             <w:pPr>
               <w:pStyle w:val="CompactGlossaryText"/>
               <w:jc w:val="left"/>
+              <w:wordWrap w:val="0"/>
               <w:spacing w:before="0" w:after="0" w:line="160" w:lineRule="exact"/>
             </w:pPr>
             <w:r>
@@ -9743,6 +10095,7 @@
             <w:pPr>
               <w:pStyle w:val="CompactGlossaryText"/>
               <w:jc w:val="left"/>
+              <w:wordWrap w:val="0"/>
               <w:spacing w:before="0" w:after="0" w:line="160" w:lineRule="exact"/>
             </w:pPr>
             <w:r>
@@ -9763,6 +10116,7 @@
             <w:pPr>
               <w:pStyle w:val="CompactGlossaryText"/>
               <w:jc w:val="left"/>
+              <w:wordWrap w:val="0"/>
               <w:spacing w:before="0" w:after="0" w:line="160" w:lineRule="exact"/>
             </w:pPr>
             <w:r>
@@ -9783,6 +10137,7 @@
             <w:pPr>
               <w:pStyle w:val="CompactGlossaryText"/>
               <w:jc w:val="left"/>
+              <w:wordWrap w:val="0"/>
               <w:spacing w:before="0" w:after="0" w:line="160" w:lineRule="exact"/>
             </w:pPr>
             <w:r>

</xml_diff>

<commit_message>
docs: update delivery analysis and metrics
</commit_message>
<xml_diff>
--- a/docs/design/cc_ep_deliverable2_verification_reliability_ha.docx
+++ b/docs/design/cc_ep_deliverable2_verification_reliability_ha.docx
@@ -212,7 +212,7 @@
         <w:rPr>
           <w:rFonts w:ascii="Calibri" w:hAnsi="Calibri" w:eastAsia="Microsoft YaHei" w:cs="Calibri"/>
         </w:rPr>
-        <w:t xml:space="preserve">本报告验证 UBCC 在正常执行、并发竞争和可恢复消息传输故障下的协议正确性，⁠重⁠点⁠覆⁠盖⁠：</w:t>
+        <w:t xml:space="preserve">本报告验证 UBCC 方案在正常执行、并发竞争和可恢复消息传输故障下的协议正确性，⁠重⁠点⁠覆⁠盖⁠：</w:t>
       </w:r>
     </w:p>
     <w:p>
@@ -323,7 +323,7 @@
         <w:rPr>
           <w:rFonts w:ascii="Calibri" w:hAnsi="Calibri" w:eastAsia="Microsoft YaHei" w:cs="Calibri"/>
         </w:rPr>
-        <w:t xml:space="preserve">UBCC 采用分层验证方法：形式化模型验证状态与动作规则，定向机制验证连接模⁠型⁠与⁠实⁠现⁠，</w:t>
+        <w:t xml:space="preserve">UBCC 方案采用分层验证方法：形式化模型验证状态与动作规则，定向机制验证连接模⁠型⁠与⁠实⁠现⁠，</w:t>
       </w:r>
     </w:p>
     <w:p>
@@ -878,7 +878,7 @@
                 <w:sz w:val="18"/>
                 <w:szCs w:val="18"/>
               </w:rPr>
-              <w:t xml:space="preserve">52 项物理运行</w:t>
+              <w:t xml:space="preserve">52 项仿真测试</w:t>
             </w:r>
           </w:p>
         </w:tc>
@@ -2907,10 +2907,10 @@
         </w:tblCellMar>
       </w:tblPr>
       <w:tblGrid>
-        <w:gridCol w:w="2792"/>
-        <w:gridCol w:w="2650"/>
-        <w:gridCol w:w="1507"/>
-        <w:gridCol w:w="2650"/>
+        <w:gridCol w:w="2708"/>
+        <w:gridCol w:w="2571"/>
+        <w:gridCol w:w="1473"/>
+        <w:gridCol w:w="2846"/>
       </w:tblGrid>
       <w:tr>
         <w:trPr>
@@ -2919,7 +2919,7 @@
         </w:trPr>
         <w:tc>
           <w:tcPr>
-            <w:tcW w:w="2792" w:type="dxa"/>
+            <w:tcW w:w="2708" w:type="dxa"/>
             <w:shd w:val="clear" w:color="auto" w:fill="D9E2F3"/>
           </w:tcPr>
           <w:p>
@@ -2942,7 +2942,7 @@
         </w:tc>
         <w:tc>
           <w:tcPr>
-            <w:tcW w:w="2650" w:type="dxa"/>
+            <w:tcW w:w="2571" w:type="dxa"/>
             <w:shd w:val="clear" w:color="auto" w:fill="D9E2F3"/>
           </w:tcPr>
           <w:p>
@@ -2965,7 +2965,7 @@
         </w:tc>
         <w:tc>
           <w:tcPr>
-            <w:tcW w:w="1507" w:type="dxa"/>
+            <w:tcW w:w="1473" w:type="dxa"/>
             <w:shd w:val="clear" w:color="auto" w:fill="D9E2F3"/>
           </w:tcPr>
           <w:p>
@@ -2988,7 +2988,7 @@
         </w:tc>
         <w:tc>
           <w:tcPr>
-            <w:tcW w:w="2650" w:type="dxa"/>
+            <w:tcW w:w="2846" w:type="dxa"/>
             <w:shd w:val="clear" w:color="auto" w:fill="D9E2F3"/>
           </w:tcPr>
           <w:p>
@@ -3016,7 +3016,7 @@
         </w:trPr>
         <w:tc>
           <w:tcPr>
-            <w:tcW w:w="2792" w:type="dxa"/>
+            <w:tcW w:w="2708" w:type="dxa"/>
           </w:tcPr>
           <w:p>
             <w:pPr>
@@ -3037,7 +3037,7 @@
         </w:tc>
         <w:tc>
           <w:tcPr>
-            <w:tcW w:w="2650" w:type="dxa"/>
+            <w:tcW w:w="2571" w:type="dxa"/>
           </w:tcPr>
           <w:p>
             <w:pPr>
@@ -3058,7 +3058,7 @@
         </w:tc>
         <w:tc>
           <w:tcPr>
-            <w:tcW w:w="1507" w:type="dxa"/>
+            <w:tcW w:w="1473" w:type="dxa"/>
           </w:tcPr>
           <w:p>
             <w:pPr>
@@ -3079,7 +3079,7 @@
         </w:tc>
         <w:tc>
           <w:tcPr>
-            <w:tcW w:w="2650" w:type="dxa"/>
+            <w:tcW w:w="2846" w:type="dxa"/>
           </w:tcPr>
           <w:p>
             <w:pPr>
@@ -3105,7 +3105,7 @@
         </w:trPr>
         <w:tc>
           <w:tcPr>
-            <w:tcW w:w="2792" w:type="dxa"/>
+            <w:tcW w:w="2708" w:type="dxa"/>
           </w:tcPr>
           <w:p>
             <w:pPr>
@@ -3126,7 +3126,7 @@
         </w:tc>
         <w:tc>
           <w:tcPr>
-            <w:tcW w:w="2650" w:type="dxa"/>
+            <w:tcW w:w="2571" w:type="dxa"/>
           </w:tcPr>
           <w:p>
             <w:pPr>
@@ -3147,7 +3147,7 @@
         </w:tc>
         <w:tc>
           <w:tcPr>
-            <w:tcW w:w="1507" w:type="dxa"/>
+            <w:tcW w:w="1473" w:type="dxa"/>
           </w:tcPr>
           <w:p>
             <w:pPr>
@@ -3168,7 +3168,7 @@
         </w:tc>
         <w:tc>
           <w:tcPr>
-            <w:tcW w:w="2650" w:type="dxa"/>
+            <w:tcW w:w="2846" w:type="dxa"/>
           </w:tcPr>
           <w:p>
             <w:pPr>
@@ -3194,7 +3194,7 @@
         </w:trPr>
         <w:tc>
           <w:tcPr>
-            <w:tcW w:w="2792" w:type="dxa"/>
+            <w:tcW w:w="2708" w:type="dxa"/>
           </w:tcPr>
           <w:p>
             <w:pPr>
@@ -3215,7 +3215,7 @@
         </w:tc>
         <w:tc>
           <w:tcPr>
-            <w:tcW w:w="2650" w:type="dxa"/>
+            <w:tcW w:w="2571" w:type="dxa"/>
           </w:tcPr>
           <w:p>
             <w:pPr>
@@ -3236,7 +3236,7 @@
         </w:tc>
         <w:tc>
           <w:tcPr>
-            <w:tcW w:w="1507" w:type="dxa"/>
+            <w:tcW w:w="1473" w:type="dxa"/>
           </w:tcPr>
           <w:p>
             <w:pPr>
@@ -3257,7 +3257,7 @@
         </w:tc>
         <w:tc>
           <w:tcPr>
-            <w:tcW w:w="2650" w:type="dxa"/>
+            <w:tcW w:w="2846" w:type="dxa"/>
           </w:tcPr>
           <w:p>
             <w:pPr>
@@ -3283,7 +3283,7 @@
         </w:trPr>
         <w:tc>
           <w:tcPr>
-            <w:tcW w:w="2792" w:type="dxa"/>
+            <w:tcW w:w="2708" w:type="dxa"/>
           </w:tcPr>
           <w:p>
             <w:pPr>
@@ -3304,7 +3304,7 @@
         </w:tc>
         <w:tc>
           <w:tcPr>
-            <w:tcW w:w="2650" w:type="dxa"/>
+            <w:tcW w:w="2571" w:type="dxa"/>
           </w:tcPr>
           <w:p>
             <w:pPr>
@@ -3325,7 +3325,7 @@
         </w:tc>
         <w:tc>
           <w:tcPr>
-            <w:tcW w:w="1507" w:type="dxa"/>
+            <w:tcW w:w="1473" w:type="dxa"/>
           </w:tcPr>
           <w:p>
             <w:pPr>
@@ -3346,22 +3346,22 @@
         </w:tc>
         <w:tc>
           <w:tcPr>
-            <w:tcW w:w="2650" w:type="dxa"/>
-          </w:tcPr>
-          <w:p>
-            <w:pPr>
-              <w:pStyle w:val="TableText"/>
-              <w:jc w:val="left"/>
-              <w:wordWrap w:val="0"/>
-              <w:spacing w:before="0" w:after="0" w:line="320" w:lineRule="exact"/>
-            </w:pPr>
-            <w:r>
-              <w:rPr>
-                <w:rFonts w:ascii="Calibri" w:hAnsi="Calibri" w:eastAsia="Microsoft YaHei" w:cs="Calibri"/>
-                <w:sz w:val="18"/>
-                <w:szCs w:val="18"/>
-              </w:rPr>
-              <w:t xml:space="preserve">未单独检查，由可执行验证补充</w:t>
+            <w:tcW w:w="2846" w:type="dxa"/>
+          </w:tcPr>
+          <w:p>
+            <w:pPr>
+              <w:pStyle w:val="TableText"/>
+              <w:jc w:val="left"/>
+              <w:wordWrap w:val="0"/>
+              <w:spacing w:before="0" w:after="0" w:line="320" w:lineRule="exact"/>
+            </w:pPr>
+            <w:r>
+              <w:rPr>
+                <w:rFonts w:ascii="Calibri" w:hAnsi="Calibri" w:eastAsia="Microsoft YaHei" w:cs="Calibri"/>
+                <w:sz w:val="18"/>
+                <w:szCs w:val="18"/>
+              </w:rPr>
+              <w:t xml:space="preserve">由 T⁠C⁠9⁠8 验证</w:t>
             </w:r>
           </w:p>
         </w:tc>
@@ -3372,7 +3372,7 @@
         </w:trPr>
         <w:tc>
           <w:tcPr>
-            <w:tcW w:w="2792" w:type="dxa"/>
+            <w:tcW w:w="2708" w:type="dxa"/>
           </w:tcPr>
           <w:p>
             <w:pPr>
@@ -3393,7 +3393,7 @@
         </w:tc>
         <w:tc>
           <w:tcPr>
-            <w:tcW w:w="2650" w:type="dxa"/>
+            <w:tcW w:w="2571" w:type="dxa"/>
           </w:tcPr>
           <w:p>
             <w:pPr>
@@ -3414,7 +3414,7 @@
         </w:tc>
         <w:tc>
           <w:tcPr>
-            <w:tcW w:w="1507" w:type="dxa"/>
+            <w:tcW w:w="1473" w:type="dxa"/>
           </w:tcPr>
           <w:p>
             <w:pPr>
@@ -3435,22 +3435,22 @@
         </w:tc>
         <w:tc>
           <w:tcPr>
-            <w:tcW w:w="2650" w:type="dxa"/>
-          </w:tcPr>
-          <w:p>
-            <w:pPr>
-              <w:pStyle w:val="TableText"/>
-              <w:jc w:val="left"/>
-              <w:wordWrap w:val="0"/>
-              <w:spacing w:before="0" w:after="0" w:line="320" w:lineRule="exact"/>
-            </w:pPr>
-            <w:r>
-              <w:rPr>
-                <w:rFonts w:ascii="Calibri" w:hAnsi="Calibri" w:eastAsia="Microsoft YaHei" w:cs="Calibri"/>
-                <w:sz w:val="18"/>
-                <w:szCs w:val="18"/>
-              </w:rPr>
-              <w:t xml:space="preserve">未单独检查，由可执行验证补充</w:t>
+            <w:tcW w:w="2846" w:type="dxa"/>
+          </w:tcPr>
+          <w:p>
+            <w:pPr>
+              <w:pStyle w:val="TableText"/>
+              <w:jc w:val="left"/>
+              <w:wordWrap w:val="0"/>
+              <w:spacing w:before="0" w:after="0" w:line="320" w:lineRule="exact"/>
+            </w:pPr>
+            <w:r>
+              <w:rPr>
+                <w:rFonts w:ascii="Calibri" w:hAnsi="Calibri" w:eastAsia="Microsoft YaHei" w:cs="Calibri"/>
+                <w:sz w:val="18"/>
+                <w:szCs w:val="18"/>
+              </w:rPr>
+              <w:t xml:space="preserve">由 T⁠C⁠2⁠2⁠4、T⁠C⁠1⁠2⁠6 验证</w:t>
             </w:r>
           </w:p>
         </w:tc>
@@ -3488,7 +3488,7 @@
         <w:rPr>
           <w:rFonts w:ascii="Calibri" w:hAnsi="Calibri" w:eastAsia="Microsoft YaHei" w:cs="Calibri"/>
         </w:rPr>
-        <w:t xml:space="preserve">UBCC 使用保留和提交两个阶段管理跨⁠节⁠点⁠授⁠权⁠：</w:t>
+        <w:t xml:space="preserve">Home UBCC 控制器使用保留和提交两个阶段管理跨⁠节⁠点⁠授⁠权⁠：</w:t>
       </w:r>
     </w:p>
     <w:p>
@@ -3499,7 +3499,7 @@
         <w:rPr>
           <w:rFonts w:ascii="Calibri" w:hAnsi="Calibri" w:eastAsia="Microsoft YaHei" w:cs="Calibri"/>
         </w:rPr>
-        <w:t xml:space="preserve">1. 请求通过仲裁后，UBCC 建立 outstanding 并记录 intended state；</w:t>
+        <w:t xml:space="preserve">1. 请求通过仲裁后，Home UBCC 控制器建立 outstanding 并记录 intended state；</w:t>
       </w:r>
     </w:p>
     <w:p>
@@ -3532,7 +3532,7 @@
         <w:rPr>
           <w:rFonts w:ascii="Calibri" w:hAnsi="Calibri" w:eastAsia="Microsoft YaHei" w:cs="Calibri"/>
         </w:rPr>
-        <w:t xml:space="preserve">4. UBCC 校验 epoch、reqId 和 requester；</w:t>
+        <w:t xml:space="preserve">4. Home UBCC 控制器校验 epoch、reqId 和 requester；</w:t>
       </w:r>
     </w:p>
     <w:p>
@@ -5250,7 +5250,7 @@
         <w:rPr>
           <w:rFonts w:ascii="Calibri" w:hAnsi="Calibri" w:eastAsia="Microsoft YaHei" w:cs="Calibri"/>
         </w:rPr>
-        <w:t xml:space="preserve">五组共 52 项物理运行，最终结果为 52/5⁠2⁠ ⁠通⁠过⁠。</w:t>
+        <w:t xml:space="preserve">五组共 52 项仿真测试，最终结果为 52/5⁠2⁠ ⁠通⁠过⁠。</w:t>
       </w:r>
     </w:p>
     <w:p>
@@ -5962,7 +5962,7 @@
         <w:rPr>
           <w:rFonts w:ascii="Calibri" w:hAnsi="Calibri" w:eastAsia="Microsoft YaHei" w:cs="Calibri"/>
         </w:rPr>
-        <w:t xml:space="preserve">同一 case 可同时包含多个动作，因此动作覆盖数不等于物理⁠运⁠行⁠总⁠数⁠。</w:t>
+        <w:t xml:space="preserve">同一测试可同时包含多个故障动作，因此动作覆盖数不等于仿真⁠测⁠试⁠总⁠数⁠。</w:t>
       </w:r>
     </w:p>
     <w:p>
@@ -7070,10 +7070,10 @@
         </w:tblCellMar>
       </w:tblPr>
       <w:tblGrid>
-        <w:gridCol w:w="1181"/>
-        <w:gridCol w:w="2953"/>
-        <w:gridCol w:w="1979"/>
-        <w:gridCol w:w="3485"/>
+        <w:gridCol w:w="1156"/>
+        <w:gridCol w:w="3180"/>
+        <w:gridCol w:w="1915"/>
+        <w:gridCol w:w="3348"/>
       </w:tblGrid>
       <w:tr>
         <w:trPr>
@@ -7082,7 +7082,7 @@
         </w:trPr>
         <w:tc>
           <w:tcPr>
-            <w:tcW w:w="1181" w:type="dxa"/>
+            <w:tcW w:w="1156" w:type="dxa"/>
             <w:shd w:val="clear" w:color="auto" w:fill="D9E2F3"/>
           </w:tcPr>
           <w:p>
@@ -7105,7 +7105,7 @@
         </w:tc>
         <w:tc>
           <w:tcPr>
-            <w:tcW w:w="2953" w:type="dxa"/>
+            <w:tcW w:w="3180" w:type="dxa"/>
             <w:shd w:val="clear" w:color="auto" w:fill="D9E2F3"/>
           </w:tcPr>
           <w:p>
@@ -7128,7 +7128,7 @@
         </w:tc>
         <w:tc>
           <w:tcPr>
-            <w:tcW w:w="1979" w:type="dxa"/>
+            <w:tcW w:w="1915" w:type="dxa"/>
             <w:shd w:val="clear" w:color="auto" w:fill="D9E2F3"/>
           </w:tcPr>
           <w:p>
@@ -7151,7 +7151,7 @@
         </w:tc>
         <w:tc>
           <w:tcPr>
-            <w:tcW w:w="3485" w:type="dxa"/>
+            <w:tcW w:w="3348" w:type="dxa"/>
             <w:shd w:val="clear" w:color="auto" w:fill="D9E2F3"/>
           </w:tcPr>
           <w:p>
@@ -7179,7 +7179,7 @@
         </w:trPr>
         <w:tc>
           <w:tcPr>
-            <w:tcW w:w="1181" w:type="dxa"/>
+            <w:tcW w:w="1156" w:type="dxa"/>
           </w:tcPr>
           <w:p>
             <w:pPr>
@@ -7200,7 +7200,7 @@
         </w:tc>
         <w:tc>
           <w:tcPr>
-            <w:tcW w:w="2953" w:type="dxa"/>
+            <w:tcW w:w="3180" w:type="dxa"/>
           </w:tcPr>
           <w:p>
             <w:pPr>
@@ -7221,7 +7221,7 @@
         </w:tc>
         <w:tc>
           <w:tcPr>
-            <w:tcW w:w="1979" w:type="dxa"/>
+            <w:tcW w:w="1915" w:type="dxa"/>
           </w:tcPr>
           <w:p>
             <w:pPr>
@@ -7242,7 +7242,7 @@
         </w:tc>
         <w:tc>
           <w:tcPr>
-            <w:tcW w:w="3485" w:type="dxa"/>
+            <w:tcW w:w="3348" w:type="dxa"/>
           </w:tcPr>
           <w:p>
             <w:pPr>
@@ -7268,7 +7268,7 @@
         </w:trPr>
         <w:tc>
           <w:tcPr>
-            <w:tcW w:w="1181" w:type="dxa"/>
+            <w:tcW w:w="1156" w:type="dxa"/>
           </w:tcPr>
           <w:p>
             <w:pPr>
@@ -7289,28 +7289,28 @@
         </w:tc>
         <w:tc>
           <w:tcPr>
-            <w:tcW w:w="2953" w:type="dxa"/>
-          </w:tcPr>
-          <w:p>
-            <w:pPr>
-              <w:pStyle w:val="TableText"/>
-              <w:jc w:val="left"/>
-              <w:wordWrap w:val="0"/>
-              <w:spacing w:before="0" w:after="0" w:line="320" w:lineRule="exact"/>
-            </w:pPr>
-            <w:r>
-              <w:rPr>
-                <w:rFonts w:ascii="Calibri" w:hAnsi="Calibri" w:eastAsia="Microsoft YaHei" w:cs="Calibri"/>
-                <w:sz w:val="18"/>
-                <w:szCs w:val="18"/>
-              </w:rPr>
-              <w:t xml:space="preserve">独立 R⁠e⁠s⁠i⁠d⁠e⁠n⁠t⁠D⁠i⁠r + B⁠a⁠c⁠k⁠s⁠t⁠o⁠r⁠e</w:t>
-            </w:r>
-          </w:p>
-        </w:tc>
-        <w:tc>
-          <w:tcPr>
-            <w:tcW w:w="1979" w:type="dxa"/>
+            <w:tcW w:w="3180" w:type="dxa"/>
+          </w:tcPr>
+          <w:p>
+            <w:pPr>
+              <w:pStyle w:val="TableText"/>
+              <w:jc w:val="left"/>
+              <w:wordWrap w:val="0"/>
+              <w:spacing w:before="0" w:after="0" w:line="320" w:lineRule="exact"/>
+            </w:pPr>
+            <w:r>
+              <w:rPr>
+                <w:rFonts w:ascii="Calibri" w:hAnsi="Calibri" w:eastAsia="Microsoft YaHei" w:cs="Calibri"/>
+                <w:sz w:val="18"/>
+                <w:szCs w:val="18"/>
+              </w:rPr>
+              <w:t xml:space="preserve">独立 R⁠e⁠s⁠i⁠d⁠e⁠n⁠t⁠D⁠i⁠r + H⁠6⁠4 B⁠a⁠c⁠k⁠s⁠t⁠o⁠r⁠e</w:t>
+            </w:r>
+          </w:p>
+        </w:tc>
+        <w:tc>
+          <w:tcPr>
+            <w:tcW w:w="1915" w:type="dxa"/>
           </w:tcPr>
           <w:p>
             <w:pPr>
@@ -7331,22 +7331,22 @@
         </w:tc>
         <w:tc>
           <w:tcPr>
-            <w:tcW w:w="3485" w:type="dxa"/>
-          </w:tcPr>
-          <w:p>
-            <w:pPr>
-              <w:pStyle w:val="TableText"/>
-              <w:jc w:val="left"/>
-              <w:wordWrap w:val="0"/>
-              <w:spacing w:before="0" w:after="0" w:line="320" w:lineRule="exact"/>
-            </w:pPr>
-            <w:r>
-              <w:rPr>
-                <w:rFonts w:ascii="Calibri" w:hAnsi="Calibri" w:eastAsia="Microsoft YaHei" w:cs="Calibri"/>
-                <w:sz w:val="18"/>
-                <w:szCs w:val="18"/>
-              </w:rPr>
-              <w:t xml:space="preserve">U⁠B⁠C⁠C 将全局元数据与节点内 H⁠o⁠m⁠e 资源解耦</w:t>
+            <w:tcW w:w="3348" w:type="dxa"/>
+          </w:tcPr>
+          <w:p>
+            <w:pPr>
+              <w:pStyle w:val="TableText"/>
+              <w:jc w:val="left"/>
+              <w:wordWrap w:val="0"/>
+              <w:spacing w:before="0" w:after="0" w:line="320" w:lineRule="exact"/>
+            </w:pPr>
+            <w:r>
+              <w:rPr>
+                <w:rFonts w:ascii="Calibri" w:hAnsi="Calibri" w:eastAsia="Microsoft YaHei" w:cs="Calibri"/>
+                <w:sz w:val="18"/>
+                <w:szCs w:val="18"/>
+              </w:rPr>
+              <w:t xml:space="preserve">U⁠B⁠C⁠C 方案将全局元数据与节点内 H⁠o⁠m⁠e 资源解耦</w:t>
             </w:r>
           </w:p>
         </w:tc>
@@ -7357,7 +7357,7 @@
         </w:trPr>
         <w:tc>
           <w:tcPr>
-            <w:tcW w:w="1181" w:type="dxa"/>
+            <w:tcW w:w="1156" w:type="dxa"/>
           </w:tcPr>
           <w:p>
             <w:pPr>
@@ -7378,7 +7378,7 @@
         </w:tc>
         <w:tc>
           <w:tcPr>
-            <w:tcW w:w="2953" w:type="dxa"/>
+            <w:tcW w:w="3180" w:type="dxa"/>
           </w:tcPr>
           <w:p>
             <w:pPr>
@@ -7399,7 +7399,7 @@
         </w:tc>
         <w:tc>
           <w:tcPr>
-            <w:tcW w:w="1979" w:type="dxa"/>
+            <w:tcW w:w="1915" w:type="dxa"/>
           </w:tcPr>
           <w:p>
             <w:pPr>
@@ -7420,7 +7420,7 @@
         </w:tc>
         <w:tc>
           <w:tcPr>
-            <w:tcW w:w="3485" w:type="dxa"/>
+            <w:tcW w:w="3348" w:type="dxa"/>
           </w:tcPr>
           <w:p>
             <w:pPr>
@@ -7446,7 +7446,7 @@
         </w:trPr>
         <w:tc>
           <w:tcPr>
-            <w:tcW w:w="1181" w:type="dxa"/>
+            <w:tcW w:w="1156" w:type="dxa"/>
           </w:tcPr>
           <w:p>
             <w:pPr>
@@ -7467,7 +7467,7 @@
         </w:tc>
         <w:tc>
           <w:tcPr>
-            <w:tcW w:w="2953" w:type="dxa"/>
+            <w:tcW w:w="3180" w:type="dxa"/>
           </w:tcPr>
           <w:p>
             <w:pPr>
@@ -7488,7 +7488,7 @@
         </w:tc>
         <w:tc>
           <w:tcPr>
-            <w:tcW w:w="1979" w:type="dxa"/>
+            <w:tcW w:w="1915" w:type="dxa"/>
           </w:tcPr>
           <w:p>
             <w:pPr>
@@ -7509,7 +7509,7 @@
         </w:tc>
         <w:tc>
           <w:tcPr>
-            <w:tcW w:w="3485" w:type="dxa"/>
+            <w:tcW w:w="3348" w:type="dxa"/>
           </w:tcPr>
           <w:p>
             <w:pPr>
@@ -9769,7 +9769,7 @@
                 <w:sz w:val="18"/>
                 <w:szCs w:val="18"/>
               </w:rPr>
-              <w:t xml:space="preserve">U⁠B⁠C⁠C</w:t>
+              <w:t xml:space="preserve">U⁠B⁠C⁠C 方案</w:t>
             </w:r>
           </w:p>
         </w:tc>
@@ -9790,7 +9790,7 @@
                 <w:sz w:val="18"/>
                 <w:szCs w:val="18"/>
               </w:rPr>
-              <w:t xml:space="preserve">跨节点缓存一致性方案及全局目录控制器</w:t>
+              <w:t xml:space="preserve">采用独立 O⁠u⁠t⁠e⁠r 一致性层和分层目录的跨节点一致性体系结构</w:t>
             </w:r>
           </w:p>
         </w:tc>
@@ -9811,7 +9811,7 @@
                 <w:sz w:val="18"/>
                 <w:szCs w:val="18"/>
               </w:rPr>
-              <w:t xml:space="preserve">r⁠e⁠q⁠I⁠d</w:t>
+              <w:t xml:space="preserve">e⁠p⁠o⁠c⁠h</w:t>
             </w:r>
           </w:p>
         </w:tc>
@@ -9832,7 +9832,7 @@
                 <w:sz w:val="18"/>
                 <w:szCs w:val="18"/>
               </w:rPr>
-              <w:t xml:space="preserve">标识具体请求的事务编号</w:t>
+              <w:t xml:space="preserve">区分同址新旧事务的单调序号</w:t>
             </w:r>
           </w:p>
         </w:tc>
@@ -9858,7 +9858,7 @@
                 <w:sz w:val="18"/>
                 <w:szCs w:val="18"/>
               </w:rPr>
-              <w:t xml:space="preserve">E⁠P⁠-⁠R⁠N⁠F</w:t>
+              <w:t xml:space="preserve">U⁠B⁠C⁠C 控制器</w:t>
             </w:r>
           </w:p>
         </w:tc>
@@ -9879,7 +9879,7 @@
                 <w:sz w:val="18"/>
                 <w:szCs w:val="18"/>
               </w:rPr>
-              <w:t xml:space="preserve">代表 O⁠u⁠t⁠e⁠r 域参与节点内 s⁠n⁠o⁠o⁠p 的端点</w:t>
+              <w:t xml:space="preserve">维护全局目录并执行同址事务仲裁的控制器组件</w:t>
             </w:r>
           </w:p>
         </w:tc>
@@ -9900,7 +9900,7 @@
                 <w:sz w:val="18"/>
                 <w:szCs w:val="18"/>
               </w:rPr>
-              <w:t xml:space="preserve">s⁠t⁠a⁠b⁠l⁠e t⁠u⁠p⁠l⁠e</w:t>
+              <w:t xml:space="preserve">r⁠e⁠q⁠I⁠d</w:t>
             </w:r>
           </w:p>
         </w:tc>
@@ -9921,7 +9921,7 @@
                 <w:sz w:val="18"/>
                 <w:szCs w:val="18"/>
               </w:rPr>
-              <w:t xml:space="preserve">重试期间保持不变的事务身份</w:t>
+              <w:t xml:space="preserve">标识具体请求的事务编号</w:t>
             </w:r>
           </w:p>
         </w:tc>
@@ -9947,7 +9947,7 @@
                 <w:sz w:val="18"/>
                 <w:szCs w:val="18"/>
               </w:rPr>
-              <w:t xml:space="preserve">R⁠e⁠s⁠i⁠d⁠e⁠n⁠t⁠D⁠i⁠r</w:t>
+              <w:t xml:space="preserve">H⁠o⁠m⁠e U⁠B⁠C⁠C 控制器</w:t>
             </w:r>
           </w:p>
         </w:tc>
@@ -9968,7 +9968,7 @@
                 <w:sz w:val="18"/>
                 <w:szCs w:val="18"/>
               </w:rPr>
-              <w:t xml:space="preserve">S⁠R⁠A⁠M 驻留目录</w:t>
+              <w:t xml:space="preserve">由地址映射选定、负责目标地址目录和提交的控制器实例</w:t>
             </w:r>
           </w:p>
         </w:tc>
@@ -9989,7 +9989,7 @@
                 <w:sz w:val="18"/>
                 <w:szCs w:val="18"/>
               </w:rPr>
-              <w:t xml:space="preserve">t⁠o⁠m⁠b⁠s⁠t⁠o⁠n⁠e</w:t>
+              <w:t xml:space="preserve">s⁠t⁠a⁠b⁠l⁠e t⁠u⁠p⁠l⁠e</w:t>
             </w:r>
           </w:p>
         </w:tc>
@@ -10010,7 +10010,7 @@
                 <w:sz w:val="18"/>
                 <w:szCs w:val="18"/>
               </w:rPr>
-              <w:t xml:space="preserve">已完成事务的幂等确认记录</w:t>
+              <w:t xml:space="preserve">重试期间保持不变的事务身份</w:t>
             </w:r>
           </w:p>
         </w:tc>
@@ -10036,7 +10036,7 @@
                 <w:sz w:val="18"/>
                 <w:szCs w:val="18"/>
               </w:rPr>
-              <w:t xml:space="preserve">B⁠a⁠c⁠k⁠s⁠t⁠o⁠r⁠e</w:t>
+              <w:t xml:space="preserve">E⁠P⁠-⁠R⁠N⁠F</w:t>
             </w:r>
           </w:p>
         </w:tc>
@@ -10057,7 +10057,7 @@
                 <w:sz w:val="18"/>
                 <w:szCs w:val="18"/>
               </w:rPr>
-              <w:t xml:space="preserve">冷目录元数据的后备存储</w:t>
+              <w:t xml:space="preserve">代表 O⁠u⁠t⁠e⁠r 域参与节点内 s⁠n⁠o⁠o⁠p 的端点</w:t>
             </w:r>
           </w:p>
         </w:tc>
@@ -10078,7 +10078,7 @@
                 <w:sz w:val="18"/>
                 <w:szCs w:val="18"/>
               </w:rPr>
-              <w:t xml:space="preserve">p⁠a⁠r⁠t⁠i⁠a⁠l A⁠c⁠k</w:t>
+              <w:t xml:space="preserve">t⁠o⁠m⁠b⁠s⁠t⁠o⁠n⁠e</w:t>
             </w:r>
           </w:p>
         </w:tc>
@@ -10099,7 +10099,7 @@
                 <w:sz w:val="18"/>
                 <w:szCs w:val="18"/>
               </w:rPr>
-              <w:t xml:space="preserve">目标集合中部分节点已经完成确认</w:t>
+              <w:t xml:space="preserve">已完成事务的幂等确认记录</w:t>
             </w:r>
           </w:p>
         </w:tc>
@@ -10125,7 +10125,7 @@
                 <w:sz w:val="18"/>
                 <w:szCs w:val="18"/>
               </w:rPr>
-              <w:t xml:space="preserve">T⁠L⁠A+</w:t>
+              <w:t xml:space="preserve">R⁠e⁠s⁠i⁠d⁠e⁠n⁠t⁠D⁠i⁠r</w:t>
             </w:r>
           </w:p>
         </w:tc>
@@ -10146,7 +10146,7 @@
                 <w:sz w:val="18"/>
                 <w:szCs w:val="18"/>
               </w:rPr>
-              <w:t xml:space="preserve">用于描述并检查协议状态与动作的形式化语言</w:t>
+              <w:t xml:space="preserve">S⁠R⁠A⁠M 驻留目录</w:t>
             </w:r>
           </w:p>
         </w:tc>
@@ -10167,7 +10167,7 @@
                 <w:sz w:val="18"/>
                 <w:szCs w:val="18"/>
               </w:rPr>
-              <w:t xml:space="preserve">故障资格验证</w:t>
+              <w:t xml:space="preserve">p⁠a⁠r⁠t⁠i⁠a⁠l A⁠c⁠k</w:t>
             </w:r>
           </w:p>
         </w:tc>
@@ -10188,7 +10188,7 @@
                 <w:sz w:val="18"/>
                 <w:szCs w:val="18"/>
               </w:rPr>
-              <w:t xml:space="preserve">对可恢复消息传输故障的可执行验证矩阵</w:t>
+              <w:t xml:space="preserve">目标集合中部分节点已经完成确认</w:t>
             </w:r>
           </w:p>
         </w:tc>
@@ -10214,7 +10214,7 @@
                 <w:sz w:val="18"/>
                 <w:szCs w:val="18"/>
               </w:rPr>
-              <w:t xml:space="preserve">O⁠3</w:t>
+              <w:t xml:space="preserve">H⁠6⁠4 B⁠a⁠c⁠k⁠s⁠t⁠o⁠r⁠e</w:t>
             </w:r>
           </w:p>
         </w:tc>
@@ -10235,7 +10235,7 @@
                 <w:sz w:val="18"/>
                 <w:szCs w:val="18"/>
               </w:rPr>
-              <w:t xml:space="preserve">支持乱序执行的处理器模型</w:t>
+              <w:t xml:space="preserve">位于 m⁠e⁠t⁠a⁠d⁠a⁠t⁠a D⁠R⁠A⁠M、保存冷目录元数据的 64 B b⁠u⁠c⁠k⁠e⁠t 哈希表</w:t>
             </w:r>
           </w:p>
         </w:tc>
@@ -10303,7 +10303,7 @@
                 <w:sz w:val="18"/>
                 <w:szCs w:val="18"/>
               </w:rPr>
-              <w:t xml:space="preserve">S⁠a⁠f⁠e⁠t⁠y</w:t>
+              <w:t xml:space="preserve">T⁠L⁠A+</w:t>
             </w:r>
           </w:p>
         </w:tc>
@@ -10324,7 +10324,7 @@
                 <w:sz w:val="18"/>
                 <w:szCs w:val="18"/>
               </w:rPr>
-              <w:t xml:space="preserve">所有可达状态均满足的不变量</w:t>
+              <w:t xml:space="preserve">用于描述并检查协议状态与动作的形式化语言</w:t>
             </w:r>
           </w:p>
         </w:tc>
@@ -10392,7 +10392,7 @@
                 <w:sz w:val="18"/>
                 <w:szCs w:val="18"/>
               </w:rPr>
-              <w:t xml:space="preserve">L⁠i⁠v⁠e⁠n⁠e⁠s⁠s</w:t>
+              <w:t xml:space="preserve">O⁠3</w:t>
             </w:r>
           </w:p>
         </w:tc>
@@ -10413,7 +10413,7 @@
                 <w:sz w:val="18"/>
                 <w:szCs w:val="18"/>
               </w:rPr>
-              <w:t xml:space="preserve">在公平和最终可达条件下事务最终完成的性质</w:t>
+              <w:t xml:space="preserve">O⁠u⁠t⁠-⁠o⁠f⁠-⁠O⁠r⁠d⁠e⁠r，乱序执行并按架构顺序提交的处理器模型；用于验证乱序条件下的同步与一致性语义</w:t>
             </w:r>
           </w:p>
         </w:tc>
@@ -10481,7 +10481,7 @@
                 <w:sz w:val="18"/>
                 <w:szCs w:val="18"/>
               </w:rPr>
-              <w:t xml:space="preserve">e⁠p⁠o⁠c⁠h</w:t>
+              <w:t xml:space="preserve">S⁠a⁠f⁠e⁠t⁠y</w:t>
             </w:r>
           </w:p>
         </w:tc>
@@ -10502,7 +10502,7 @@
                 <w:sz w:val="18"/>
                 <w:szCs w:val="18"/>
               </w:rPr>
-              <w:t xml:space="preserve">区分同址新旧事务的单调序号</w:t>
+              <w:t xml:space="preserve">所有可达状态均满足的不变量</w:t>
             </w:r>
           </w:p>
         </w:tc>
@@ -10523,7 +10523,7 @@
                 <w:sz w:val="18"/>
                 <w:szCs w:val="18"/>
               </w:rPr>
-              <w:t xml:space="preserve"/>
+              <w:t xml:space="preserve">L⁠i⁠v⁠e⁠n⁠e⁠s⁠s</w:t>
             </w:r>
           </w:p>
         </w:tc>
@@ -10544,7 +10544,7 @@
                 <w:sz w:val="18"/>
                 <w:szCs w:val="18"/>
               </w:rPr>
-              <w:t xml:space="preserve"/>
+              <w:t xml:space="preserve">在公平调度和消息最终可达条件下，事务能够持续推进并最终完成的性质</w:t>
             </w:r>
           </w:p>
         </w:tc>

</xml_diff>

<commit_message>
docs: polish delivery release wording
</commit_message>
<xml_diff>
--- a/docs/design/cc_ep_deliverable2_verification_reliability_ha.docx
+++ b/docs/design/cc_ep_deliverable2_verification_reliability_ha.docx
@@ -117,7 +117,7 @@
         <w:rPr>
           <w:rFonts w:ascii="Calibri" w:hAnsi="Calibri" w:eastAsia="Microsoft YaHei" w:cs="Calibri"/>
         </w:rPr>
-        <w:t xml:space="preserve">8.⁠ ⁠交⁠付⁠范⁠围</w:t>
+        <w:t xml:space="preserve">8.⁠ ⁠交⁠付⁠内⁠容</w:t>
       </w:r>
     </w:p>
     <w:p>
@@ -981,7 +981,7 @@
         <w:rPr>
           <w:rFonts w:ascii="Calibri" w:hAnsi="Calibri" w:eastAsia="Microsoft YaHei" w:cs="Calibri"/>
         </w:rPr>
-        <w:t xml:space="preserve">表中 Liveness 结论仅适用于对应 temporal property、FairSpec/forward-progress 公平⁠性⁠和⁠可⁠恢⁠复</w:t>
+        <w:t xml:space="preserve">表中 Liveness 结论成立于对应 temporal property、FairSpec/forward-progress 公平⁠性⁠和⁠可⁠恢⁠复</w:t>
       </w:r>
     </w:p>
     <w:p>
@@ -992,7 +992,7 @@
         <w:rPr>
           <w:rFonts w:ascii="Calibri" w:hAnsi="Calibri" w:eastAsia="Microsoft YaHei" w:cs="Calibri"/>
         </w:rPr>
-        <w:t xml:space="preserve">故障最终解除的模型条件；focused 仲裁与 waiter 模型只单独检查 Safety，不作独立⁠活⁠性⁠证⁠明⁠。</w:t>
+        <w:t xml:space="preserve">故障最终解除的模型条件；focused 仲裁与 waiter 模型提供 Safety ⁠检⁠查⁠结⁠果⁠。</w:t>
       </w:r>
     </w:p>
     <w:p>
@@ -1031,9 +1031,9 @@
         </w:tblCellMar>
       </w:tblPr>
       <w:tblGrid>
-        <w:gridCol w:w="1305"/>
-        <w:gridCol w:w="4147"/>
-        <w:gridCol w:w="4147"/>
+        <w:gridCol w:w="1315"/>
+        <w:gridCol w:w="4197"/>
+        <w:gridCol w:w="4086"/>
       </w:tblGrid>
       <w:tr>
         <w:trPr>
@@ -1042,7 +1042,7 @@
         </w:trPr>
         <w:tc>
           <w:tcPr>
-            <w:tcW w:w="1305" w:type="dxa"/>
+            <w:tcW w:w="1315" w:type="dxa"/>
             <w:shd w:val="clear" w:color="auto" w:fill="D9E2F3"/>
           </w:tcPr>
           <w:p>
@@ -1065,7 +1065,7 @@
         </w:tc>
         <w:tc>
           <w:tcPr>
-            <w:tcW w:w="4147" w:type="dxa"/>
+            <w:tcW w:w="4197" w:type="dxa"/>
             <w:shd w:val="clear" w:color="auto" w:fill="D9E2F3"/>
           </w:tcPr>
           <w:p>
@@ -1088,7 +1088,7 @@
         </w:tc>
         <w:tc>
           <w:tcPr>
-            <w:tcW w:w="4147" w:type="dxa"/>
+            <w:tcW w:w="4086" w:type="dxa"/>
             <w:shd w:val="clear" w:color="auto" w:fill="D9E2F3"/>
           </w:tcPr>
           <w:p>
@@ -1116,7 +1116,7 @@
         </w:trPr>
         <w:tc>
           <w:tcPr>
-            <w:tcW w:w="1305" w:type="dxa"/>
+            <w:tcW w:w="1315" w:type="dxa"/>
           </w:tcPr>
           <w:p>
             <w:pPr>
@@ -1137,7 +1137,7 @@
         </w:tc>
         <w:tc>
           <w:tcPr>
-            <w:tcW w:w="4147" w:type="dxa"/>
+            <w:tcW w:w="4197" w:type="dxa"/>
           </w:tcPr>
           <w:p>
             <w:pPr>
@@ -1158,33 +1158,33 @@
         </w:tc>
         <w:tc>
           <w:tcPr>
-            <w:tcW w:w="4147" w:type="dxa"/>
-          </w:tcPr>
-          <w:p>
-            <w:pPr>
-              <w:pStyle w:val="TableText"/>
-              <w:jc w:val="left"/>
-              <w:wordWrap w:val="0"/>
-              <w:spacing w:before="0" w:after="0" w:line="320" w:lineRule="exact"/>
-            </w:pPr>
-            <w:r>
-              <w:rPr>
-                <w:rFonts w:ascii="Calibri" w:hAnsi="Calibri" w:eastAsia="Microsoft YaHei" w:cs="Calibri"/>
-                <w:sz w:val="18"/>
-                <w:szCs w:val="18"/>
-              </w:rPr>
-              <w:t xml:space="preserve">当前实现及冻结可执行场景</w:t>
-            </w:r>
-          </w:p>
-        </w:tc>
-      </w:tr>
-      <w:tr>
-        <w:trPr>
-          <w:cantSplit/>
-        </w:trPr>
-        <w:tc>
-          <w:tcPr>
-            <w:tcW w:w="1305" w:type="dxa"/>
+            <w:tcW w:w="4086" w:type="dxa"/>
+          </w:tcPr>
+          <w:p>
+            <w:pPr>
+              <w:pStyle w:val="TableText"/>
+              <w:jc w:val="left"/>
+              <w:wordWrap w:val="0"/>
+              <w:spacing w:before="0" w:after="0" w:line="320" w:lineRule="exact"/>
+            </w:pPr>
+            <w:r>
+              <w:rPr>
+                <w:rFonts w:ascii="Calibri" w:hAnsi="Calibri" w:eastAsia="Microsoft YaHei" w:cs="Calibri"/>
+                <w:sz w:val="18"/>
+                <w:szCs w:val="18"/>
+              </w:rPr>
+              <w:t xml:space="preserve">当前实现及既定可执行场景</w:t>
+            </w:r>
+          </w:p>
+        </w:tc>
+      </w:tr>
+      <w:tr>
+        <w:trPr>
+          <w:cantSplit/>
+        </w:trPr>
+        <w:tc>
+          <w:tcPr>
+            <w:tcW w:w="1315" w:type="dxa"/>
           </w:tcPr>
           <w:p>
             <w:pPr>
@@ -1205,7 +1205,7 @@
         </w:tc>
         <w:tc>
           <w:tcPr>
-            <w:tcW w:w="4147" w:type="dxa"/>
+            <w:tcW w:w="4197" w:type="dxa"/>
           </w:tcPr>
           <w:p>
             <w:pPr>
@@ -1226,7 +1226,7 @@
         </w:tc>
         <w:tc>
           <w:tcPr>
-            <w:tcW w:w="4147" w:type="dxa"/>
+            <w:tcW w:w="4086" w:type="dxa"/>
           </w:tcPr>
           <w:p>
             <w:pPr>
@@ -1252,7 +1252,7 @@
         </w:trPr>
         <w:tc>
           <w:tcPr>
-            <w:tcW w:w="1305" w:type="dxa"/>
+            <w:tcW w:w="1315" w:type="dxa"/>
           </w:tcPr>
           <w:p>
             <w:pPr>
@@ -1273,28 +1273,28 @@
         </w:tc>
         <w:tc>
           <w:tcPr>
-            <w:tcW w:w="4147" w:type="dxa"/>
-          </w:tcPr>
-          <w:p>
-            <w:pPr>
-              <w:pStyle w:val="TableText"/>
-              <w:jc w:val="left"/>
-              <w:wordWrap w:val="0"/>
-              <w:spacing w:before="0" w:after="0" w:line="320" w:lineRule="exact"/>
-            </w:pPr>
-            <w:r>
-              <w:rPr>
-                <w:rFonts w:ascii="Calibri" w:hAnsi="Calibri" w:eastAsia="Microsoft YaHei" w:cs="Calibri"/>
-                <w:sz w:val="18"/>
-                <w:szCs w:val="18"/>
-              </w:rPr>
-              <w:t xml:space="preserve">冻结 H⁠A⁠-⁠V⁠I 参考范围内聚合结果支持 U⁠B⁠C⁠C 优势</w:t>
-            </w:r>
-          </w:p>
-        </w:tc>
-        <w:tc>
-          <w:tcPr>
-            <w:tcW w:w="4147" w:type="dxa"/>
+            <w:tcW w:w="4197" w:type="dxa"/>
+          </w:tcPr>
+          <w:p>
+            <w:pPr>
+              <w:pStyle w:val="TableText"/>
+              <w:jc w:val="left"/>
+              <w:wordWrap w:val="0"/>
+              <w:spacing w:before="0" w:after="0" w:line="320" w:lineRule="exact"/>
+            </w:pPr>
+            <w:r>
+              <w:rPr>
+                <w:rFonts w:ascii="Calibri" w:hAnsi="Calibri" w:eastAsia="Microsoft YaHei" w:cs="Calibri"/>
+                <w:sz w:val="18"/>
+                <w:szCs w:val="18"/>
+              </w:rPr>
+              <w:t xml:space="preserve">既定 H⁠A⁠-⁠V⁠I 参考范围内聚合结果支持 U⁠B⁠C⁠C 优势</w:t>
+            </w:r>
+          </w:p>
+        </w:tc>
+        <w:tc>
+          <w:tcPr>
+            <w:tcW w:w="4086" w:type="dxa"/>
           </w:tcPr>
           <w:p>
             <w:pPr>
@@ -1310,74 +1310,6 @@
                 <w:szCs w:val="18"/>
               </w:rPr>
               <w:t xml:space="preserve">2N1S、O⁠3、单向完成语义和固定 256 K⁠i⁠B L⁠3 配置</w:t>
-            </w:r>
-          </w:p>
-        </w:tc>
-      </w:tr>
-      <w:tr>
-        <w:trPr>
-          <w:cantSplit/>
-        </w:trPr>
-        <w:tc>
-          <w:tcPr>
-            <w:tcW w:w="1305" w:type="dxa"/>
-          </w:tcPr>
-          <w:p>
-            <w:pPr>
-              <w:pStyle w:val="TableText"/>
-              <w:jc w:val="left"/>
-              <w:wordWrap w:val="0"/>
-              <w:spacing w:before="0" w:after="0" w:line="320" w:lineRule="exact"/>
-            </w:pPr>
-            <w:r>
-              <w:rPr>
-                <w:rFonts w:ascii="Calibri" w:hAnsi="Calibri" w:eastAsia="Microsoft YaHei" w:cs="Calibri"/>
-                <w:sz w:val="18"/>
-                <w:szCs w:val="18"/>
-              </w:rPr>
-              <w:t xml:space="preserve">范围外</w:t>
-            </w:r>
-          </w:p>
-        </w:tc>
-        <w:tc>
-          <w:tcPr>
-            <w:tcW w:w="4147" w:type="dxa"/>
-          </w:tcPr>
-          <w:p>
-            <w:pPr>
-              <w:pStyle w:val="TableText"/>
-              <w:jc w:val="left"/>
-              <w:wordWrap w:val="0"/>
-              <w:spacing w:before="0" w:after="0" w:line="320" w:lineRule="exact"/>
-            </w:pPr>
-            <w:r>
-              <w:rPr>
-                <w:rFonts w:ascii="Calibri" w:hAnsi="Calibri" w:eastAsia="Microsoft YaHei" w:cs="Calibri"/>
-                <w:sz w:val="18"/>
-                <w:szCs w:val="18"/>
-              </w:rPr>
-              <w:t xml:space="preserve">不作本次交付能力主张</w:t>
-            </w:r>
-          </w:p>
-        </w:tc>
-        <w:tc>
-          <w:tcPr>
-            <w:tcW w:w="4147" w:type="dxa"/>
-          </w:tcPr>
-          <w:p>
-            <w:pPr>
-              <w:pStyle w:val="TableText"/>
-              <w:jc w:val="left"/>
-              <w:wordWrap w:val="0"/>
-              <w:spacing w:before="0" w:after="0" w:line="320" w:lineRule="exact"/>
-            </w:pPr>
-            <w:r>
-              <w:rPr>
-                <w:rFonts w:ascii="Calibri" w:hAnsi="Calibri" w:eastAsia="Microsoft YaHei" w:cs="Calibri"/>
-                <w:sz w:val="18"/>
-                <w:szCs w:val="18"/>
-              </w:rPr>
-              <w:t xml:space="preserve">永久 H⁠o⁠m⁠e 故障在线恢复、物理芯片和端口级 S⁠w⁠i⁠t⁠c⁠h 微体系结构</w:t>
             </w:r>
           </w:p>
         </w:tc>
@@ -1498,10 +1430,9 @@
         </w:tblCellMar>
       </w:tblPr>
       <w:tblGrid>
-        <w:gridCol w:w="1922"/>
-        <w:gridCol w:w="2912"/>
-        <w:gridCol w:w="2912"/>
-        <w:gridCol w:w="1852"/>
+        <w:gridCol w:w="2329"/>
+        <w:gridCol w:w="3635"/>
+        <w:gridCol w:w="3635"/>
       </w:tblGrid>
       <w:tr>
         <w:trPr>
@@ -1510,7 +1441,7 @@
         </w:trPr>
         <w:tc>
           <w:tcPr>
-            <w:tcW w:w="1922" w:type="dxa"/>
+            <w:tcW w:w="2329" w:type="dxa"/>
             <w:shd w:val="clear" w:color="auto" w:fill="D9E2F3"/>
           </w:tcPr>
           <w:p>
@@ -1533,7 +1464,7 @@
         </w:tc>
         <w:tc>
           <w:tcPr>
-            <w:tcW w:w="2912" w:type="dxa"/>
+            <w:tcW w:w="3635" w:type="dxa"/>
             <w:shd w:val="clear" w:color="auto" w:fill="D9E2F3"/>
           </w:tcPr>
           <w:p>
@@ -1556,7 +1487,7 @@
         </w:tc>
         <w:tc>
           <w:tcPr>
-            <w:tcW w:w="2912" w:type="dxa"/>
+            <w:tcW w:w="3635" w:type="dxa"/>
             <w:shd w:val="clear" w:color="auto" w:fill="D9E2F3"/>
           </w:tcPr>
           <w:p>
@@ -1573,41 +1504,18 @@
                 <w:sz w:val="18"/>
                 <w:szCs w:val="18"/>
               </w:rPr>
-              <w:t xml:space="preserve">可支持的结论</w:t>
-            </w:r>
-          </w:p>
-        </w:tc>
-        <w:tc>
-          <w:tcPr>
-            <w:tcW w:w="1852" w:type="dxa"/>
-            <w:shd w:val="clear" w:color="auto" w:fill="D9E2F3"/>
-          </w:tcPr>
-          <w:p>
-            <w:pPr>
-              <w:pStyle w:val="TableText"/>
-              <w:jc w:val="left"/>
-              <w:wordWrap w:val="0"/>
-              <w:spacing w:before="0" w:after="0" w:line="320" w:lineRule="exact"/>
-            </w:pPr>
-            <w:r>
-              <w:rPr>
-                <w:rFonts w:ascii="Calibri" w:hAnsi="Calibri" w:eastAsia="SimHei" w:cs="Calibri"/>
-                <w:b/>
-                <w:sz w:val="18"/>
-                <w:szCs w:val="18"/>
-              </w:rPr>
-              <w:t xml:space="preserve">不应外推为</w:t>
-            </w:r>
-          </w:p>
-        </w:tc>
-      </w:tr>
-      <w:tr>
-        <w:trPr>
-          <w:cantSplit/>
-        </w:trPr>
-        <w:tc>
-          <w:tcPr>
-            <w:tcW w:w="1922" w:type="dxa"/>
+              <w:t xml:space="preserve">支持的结论</w:t>
+            </w:r>
+          </w:p>
+        </w:tc>
+      </w:tr>
+      <w:tr>
+        <w:trPr>
+          <w:cantSplit/>
+        </w:trPr>
+        <w:tc>
+          <w:tcPr>
+            <w:tcW w:w="2329" w:type="dxa"/>
           </w:tcPr>
           <w:p>
             <w:pPr>
@@ -1628,7 +1536,7 @@
         </w:tc>
         <w:tc>
           <w:tcPr>
-            <w:tcW w:w="2912" w:type="dxa"/>
+            <w:tcW w:w="3635" w:type="dxa"/>
           </w:tcPr>
           <w:p>
             <w:pPr>
@@ -1649,7 +1557,7 @@
         </w:tc>
         <w:tc>
           <w:tcPr>
-            <w:tcW w:w="2912" w:type="dxa"/>
+            <w:tcW w:w="3635" w:type="dxa"/>
           </w:tcPr>
           <w:p>
             <w:pPr>
@@ -1668,35 +1576,14 @@
             </w:r>
           </w:p>
         </w:tc>
-        <w:tc>
-          <w:tcPr>
-            <w:tcW w:w="1852" w:type="dxa"/>
-          </w:tcPr>
-          <w:p>
-            <w:pPr>
-              <w:pStyle w:val="TableText"/>
-              <w:jc w:val="left"/>
-              <w:wordWrap w:val="0"/>
-              <w:spacing w:before="0" w:after="0" w:line="320" w:lineRule="exact"/>
-            </w:pPr>
-            <w:r>
-              <w:rPr>
-                <w:rFonts w:ascii="Calibri" w:hAnsi="Calibri" w:eastAsia="Microsoft YaHei" w:cs="Calibri"/>
-                <w:sz w:val="18"/>
-                <w:szCs w:val="18"/>
-              </w:rPr>
-              <w:t xml:space="preserve">对所有环境和所有故障的穷尽证明</w:t>
-            </w:r>
-          </w:p>
-        </w:tc>
-      </w:tr>
-      <w:tr>
-        <w:trPr>
-          <w:cantSplit/>
-        </w:trPr>
-        <w:tc>
-          <w:tcPr>
-            <w:tcW w:w="1922" w:type="dxa"/>
+      </w:tr>
+      <w:tr>
+        <w:trPr>
+          <w:cantSplit/>
+        </w:trPr>
+        <w:tc>
+          <w:tcPr>
+            <w:tcW w:w="2329" w:type="dxa"/>
           </w:tcPr>
           <w:p>
             <w:pPr>
@@ -1717,7 +1604,7 @@
         </w:tc>
         <w:tc>
           <w:tcPr>
-            <w:tcW w:w="2912" w:type="dxa"/>
+            <w:tcW w:w="3635" w:type="dxa"/>
           </w:tcPr>
           <w:p>
             <w:pPr>
@@ -1738,54 +1625,33 @@
         </w:tc>
         <w:tc>
           <w:tcPr>
-            <w:tcW w:w="2912" w:type="dxa"/>
-          </w:tcPr>
-          <w:p>
-            <w:pPr>
-              <w:pStyle w:val="TableText"/>
-              <w:jc w:val="left"/>
-              <w:wordWrap w:val="0"/>
-              <w:spacing w:before="0" w:after="0" w:line="320" w:lineRule="exact"/>
-            </w:pPr>
-            <w:r>
-              <w:rPr>
-                <w:rFonts w:ascii="Calibri" w:hAnsi="Calibri" w:eastAsia="Microsoft YaHei" w:cs="Calibri"/>
-                <w:sz w:val="18"/>
-                <w:szCs w:val="18"/>
-              </w:rPr>
-              <w:t xml:space="preserve">核心/传输模型的 S⁠a⁠f⁠e⁠t⁠y/L⁠i⁠v⁠e⁠n⁠e⁠s⁠s，以及 f⁠o⁠c⁠u⁠s⁠e⁠d 模型声明的 S⁠a⁠f⁠e⁠t⁠y</w:t>
-            </w:r>
-          </w:p>
-        </w:tc>
-        <w:tc>
-          <w:tcPr>
-            <w:tcW w:w="1852" w:type="dxa"/>
-          </w:tcPr>
-          <w:p>
-            <w:pPr>
-              <w:pStyle w:val="TableText"/>
-              <w:jc w:val="left"/>
-              <w:wordWrap w:val="0"/>
-              <w:spacing w:before="0" w:after="0" w:line="320" w:lineRule="exact"/>
-            </w:pPr>
-            <w:r>
-              <w:rPr>
-                <w:rFonts w:ascii="Calibri" w:hAnsi="Calibri" w:eastAsia="Microsoft YaHei" w:cs="Calibri"/>
-                <w:sz w:val="18"/>
-                <w:szCs w:val="18"/>
-              </w:rPr>
-              <w:t xml:space="preserve">未建模硬件细节或完整系统的无界证明</w:t>
-            </w:r>
-          </w:p>
-        </w:tc>
-      </w:tr>
-      <w:tr>
-        <w:trPr>
-          <w:cantSplit/>
-        </w:trPr>
-        <w:tc>
-          <w:tcPr>
-            <w:tcW w:w="1922" w:type="dxa"/>
+            <w:tcW w:w="3635" w:type="dxa"/>
+          </w:tcPr>
+          <w:p>
+            <w:pPr>
+              <w:pStyle w:val="TableText"/>
+              <w:jc w:val="left"/>
+              <w:wordWrap w:val="0"/>
+              <w:spacing w:before="0" w:after="0" w:line="320" w:lineRule="exact"/>
+            </w:pPr>
+            <w:r>
+              <w:rPr>
+                <w:rFonts w:ascii="Calibri" w:hAnsi="Calibri" w:eastAsia="Microsoft YaHei" w:cs="Calibri"/>
+                <w:sz w:val="18"/>
+                <w:szCs w:val="18"/>
+              </w:rPr>
+              <w:t xml:space="preserve">核心与传输模型的 S⁠a⁠f⁠e⁠t⁠y/L⁠i⁠v⁠e⁠n⁠e⁠s⁠s，以及 f⁠o⁠c⁠u⁠s⁠e⁠d 模型声明的 S⁠a⁠f⁠e⁠t⁠y</w:t>
+            </w:r>
+          </w:p>
+        </w:tc>
+      </w:tr>
+      <w:tr>
+        <w:trPr>
+          <w:cantSplit/>
+        </w:trPr>
+        <w:tc>
+          <w:tcPr>
+            <w:tcW w:w="2329" w:type="dxa"/>
           </w:tcPr>
           <w:p>
             <w:pPr>
@@ -1806,7 +1672,7 @@
         </w:tc>
         <w:tc>
           <w:tcPr>
-            <w:tcW w:w="2912" w:type="dxa"/>
+            <w:tcW w:w="3635" w:type="dxa"/>
           </w:tcPr>
           <w:p>
             <w:pPr>
@@ -1827,132 +1693,22 @@
         </w:tc>
         <w:tc>
           <w:tcPr>
-            <w:tcW w:w="2912" w:type="dxa"/>
-          </w:tcPr>
-          <w:p>
-            <w:pPr>
-              <w:pStyle w:val="TableText"/>
-              <w:jc w:val="left"/>
-              <w:wordWrap w:val="0"/>
-              <w:spacing w:before="0" w:after="0" w:line="320" w:lineRule="exact"/>
-            </w:pPr>
-            <w:r>
-              <w:rPr>
-                <w:rFonts w:ascii="Calibri" w:hAnsi="Calibri" w:eastAsia="Microsoft YaHei" w:cs="Calibri"/>
-                <w:sz w:val="18"/>
-                <w:szCs w:val="18"/>
-              </w:rPr>
-              <w:t xml:space="preserve">解释机制差异和实验结果来源</w:t>
-            </w:r>
-          </w:p>
-        </w:tc>
-        <w:tc>
-          <w:tcPr>
-            <w:tcW w:w="1852" w:type="dxa"/>
-          </w:tcPr>
-          <w:p>
-            <w:pPr>
-              <w:pStyle w:val="TableText"/>
-              <w:jc w:val="left"/>
-              <w:wordWrap w:val="0"/>
-              <w:spacing w:before="0" w:after="0" w:line="320" w:lineRule="exact"/>
-            </w:pPr>
-            <w:r>
-              <w:rPr>
-                <w:rFonts w:ascii="Calibri" w:hAnsi="Calibri" w:eastAsia="Microsoft YaHei" w:cs="Calibri"/>
-                <w:sz w:val="18"/>
-                <w:szCs w:val="18"/>
-              </w:rPr>
-              <w:t xml:space="preserve">实现通过、性能胜负或物理芯片测量</w:t>
-            </w:r>
-          </w:p>
-        </w:tc>
-      </w:tr>
-      <w:tr>
-        <w:trPr>
-          <w:cantSplit/>
-        </w:trPr>
-        <w:tc>
-          <w:tcPr>
-            <w:tcW w:w="1922" w:type="dxa"/>
-          </w:tcPr>
-          <w:p>
-            <w:pPr>
-              <w:pStyle w:val="TableText"/>
-              <w:jc w:val="left"/>
-              <w:wordWrap w:val="0"/>
-              <w:spacing w:before="0" w:after="0" w:line="320" w:lineRule="exact"/>
-            </w:pPr>
-            <w:r>
-              <w:rPr>
-                <w:rFonts w:ascii="Calibri" w:hAnsi="Calibri" w:eastAsia="Microsoft YaHei" w:cs="Calibri"/>
-                <w:sz w:val="18"/>
-                <w:szCs w:val="18"/>
-              </w:rPr>
-              <w:t xml:space="preserve">本次范围外</w:t>
-            </w:r>
-          </w:p>
-        </w:tc>
-        <w:tc>
-          <w:tcPr>
-            <w:tcW w:w="2912" w:type="dxa"/>
-          </w:tcPr>
-          <w:p>
-            <w:pPr>
-              <w:pStyle w:val="TableText"/>
-              <w:jc w:val="left"/>
-              <w:wordWrap w:val="0"/>
-              <w:spacing w:before="0" w:after="0" w:line="320" w:lineRule="exact"/>
-            </w:pPr>
-            <w:r>
-              <w:rPr>
-                <w:rFonts w:ascii="Calibri" w:hAnsi="Calibri" w:eastAsia="Microsoft YaHei" w:cs="Calibri"/>
-                <w:sz w:val="18"/>
-                <w:szCs w:val="18"/>
-              </w:rPr>
-              <w:t xml:space="preserve">永久 H⁠o⁠m⁠e 失效恢复、目标物理 H⁠A 和端口级 S⁠w⁠i⁠t⁠c⁠h 微体系结构</w:t>
-            </w:r>
-          </w:p>
-        </w:tc>
-        <w:tc>
-          <w:tcPr>
-            <w:tcW w:w="2912" w:type="dxa"/>
-          </w:tcPr>
-          <w:p>
-            <w:pPr>
-              <w:pStyle w:val="TableText"/>
-              <w:jc w:val="left"/>
-              <w:wordWrap w:val="0"/>
-              <w:spacing w:before="0" w:after="0" w:line="320" w:lineRule="exact"/>
-            </w:pPr>
-            <w:r>
-              <w:rPr>
-                <w:rFonts w:ascii="Calibri" w:hAnsi="Calibri" w:eastAsia="Microsoft YaHei" w:cs="Calibri"/>
-                <w:sz w:val="18"/>
-                <w:szCs w:val="18"/>
-              </w:rPr>
-              <w:t xml:space="preserve">明确交付边界</w:t>
-            </w:r>
-          </w:p>
-        </w:tc>
-        <w:tc>
-          <w:tcPr>
-            <w:tcW w:w="1852" w:type="dxa"/>
-          </w:tcPr>
-          <w:p>
-            <w:pPr>
-              <w:pStyle w:val="TableText"/>
-              <w:jc w:val="left"/>
-              <w:wordWrap w:val="0"/>
-              <w:spacing w:before="0" w:after="0" w:line="320" w:lineRule="exact"/>
-            </w:pPr>
-            <w:r>
-              <w:rPr>
-                <w:rFonts w:ascii="Calibri" w:hAnsi="Calibri" w:eastAsia="Microsoft YaHei" w:cs="Calibri"/>
-                <w:sz w:val="18"/>
-                <w:szCs w:val="18"/>
-              </w:rPr>
-              <w:t xml:space="preserve">已验证或已实现能力</w:t>
+            <w:tcW w:w="3635" w:type="dxa"/>
+          </w:tcPr>
+          <w:p>
+            <w:pPr>
+              <w:pStyle w:val="TableText"/>
+              <w:jc w:val="left"/>
+              <w:wordWrap w:val="0"/>
+              <w:spacing w:before="0" w:after="0" w:line="320" w:lineRule="exact"/>
+            </w:pPr>
+            <w:r>
+              <w:rPr>
+                <w:rFonts w:ascii="Calibri" w:hAnsi="Calibri" w:eastAsia="Microsoft YaHei" w:cs="Calibri"/>
+                <w:sz w:val="18"/>
+                <w:szCs w:val="18"/>
+              </w:rPr>
+              <w:t xml:space="preserve">机制差异、实验结果来源与适用条件</w:t>
             </w:r>
           </w:p>
         </w:tc>
@@ -2385,7 +2141,7 @@
                 <w:sz w:val="16"/>
                 <w:szCs w:val="16"/>
               </w:rPr>
-              <w:t xml:space="preserve">目标集合冻结、I⁠n⁠v⁠a⁠l⁠i⁠d⁠a⁠t⁠e⁠R⁠e⁠q 和 A⁠c⁠k 位图</w:t>
+              <w:t xml:space="preserve">目标集合确定并保持、I⁠n⁠v⁠a⁠l⁠i⁠d⁠a⁠t⁠e⁠R⁠e⁠q 和 A⁠c⁠k 位图</w:t>
             </w:r>
           </w:p>
         </w:tc>
@@ -3813,7 +3569,7 @@
         <w:rPr>
           <w:rFonts w:ascii="Calibri" w:hAnsi="Calibri" w:eastAsia="Microsoft YaHei" w:cs="Calibri"/>
         </w:rPr>
-        <w:t xml:space="preserve">本次可靠性结论面向可恢复传输故障。故障注入不改变节点和 Home 的持久⁠存⁠活⁠假⁠设⁠。</w:t>
+        <w:t xml:space="preserve">可靠性验证采用节点与 Home 持续存活、可恢复传输故障最终解除的⁠模⁠型⁠条⁠件⁠。</w:t>
       </w:r>
     </w:p>
     <w:tbl>
@@ -3829,10 +3585,10 @@
         </w:tblCellMar>
       </w:tblPr>
       <w:tblGrid>
-        <w:gridCol w:w="1831"/>
-        <w:gridCol w:w="3377"/>
-        <w:gridCol w:w="3013"/>
-        <w:gridCol w:w="1377"/>
+        <w:gridCol w:w="1250"/>
+        <w:gridCol w:w="3650"/>
+        <w:gridCol w:w="3250"/>
+        <w:gridCol w:w="1450"/>
       </w:tblGrid>
       <w:tr>
         <w:trPr>
@@ -3841,7 +3597,7 @@
         </w:trPr>
         <w:tc>
           <w:tcPr>
-            <w:tcW w:w="1831" w:type="dxa"/>
+            <w:tcW w:w="1250" w:type="dxa"/>
             <w:shd w:val="clear" w:color="auto" w:fill="D9E2F3"/>
           </w:tcPr>
           <w:p>
@@ -3864,7 +3620,7 @@
         </w:tc>
         <w:tc>
           <w:tcPr>
-            <w:tcW w:w="3377" w:type="dxa"/>
+            <w:tcW w:w="3650" w:type="dxa"/>
             <w:shd w:val="clear" w:color="auto" w:fill="D9E2F3"/>
           </w:tcPr>
           <w:p>
@@ -3887,7 +3643,7 @@
         </w:tc>
         <w:tc>
           <w:tcPr>
-            <w:tcW w:w="3013" w:type="dxa"/>
+            <w:tcW w:w="3250" w:type="dxa"/>
             <w:shd w:val="clear" w:color="auto" w:fill="D9E2F3"/>
           </w:tcPr>
           <w:p>
@@ -3910,7 +3666,7 @@
         </w:tc>
         <w:tc>
           <w:tcPr>
-            <w:tcW w:w="1377" w:type="dxa"/>
+            <w:tcW w:w="1450" w:type="dxa"/>
             <w:shd w:val="clear" w:color="auto" w:fill="D9E2F3"/>
           </w:tcPr>
           <w:p>
@@ -3927,18 +3683,18 @@
                 <w:sz w:val="18"/>
                 <w:szCs w:val="18"/>
               </w:rPr>
-              <w:t xml:space="preserve">本次证据边界</w:t>
-            </w:r>
-          </w:p>
-        </w:tc>
-      </w:tr>
-      <w:tr>
-        <w:trPr>
-          <w:cantSplit/>
-        </w:trPr>
-        <w:tc>
-          <w:tcPr>
-            <w:tcW w:w="1831" w:type="dxa"/>
+              <w:t xml:space="preserve">验证证据</w:t>
+            </w:r>
+          </w:p>
+        </w:tc>
+      </w:tr>
+      <w:tr>
+        <w:trPr>
+          <w:cantSplit/>
+        </w:trPr>
+        <w:tc>
+          <w:tcPr>
+            <w:tcW w:w="1250" w:type="dxa"/>
           </w:tcPr>
           <w:p>
             <w:pPr>
@@ -3959,7 +3715,7 @@
         </w:tc>
         <w:tc>
           <w:tcPr>
-            <w:tcW w:w="3377" w:type="dxa"/>
+            <w:tcW w:w="3650" w:type="dxa"/>
           </w:tcPr>
           <w:p>
             <w:pPr>
@@ -3980,7 +3736,7 @@
         </w:tc>
         <w:tc>
           <w:tcPr>
-            <w:tcW w:w="3013" w:type="dxa"/>
+            <w:tcW w:w="3250" w:type="dxa"/>
           </w:tcPr>
           <w:p>
             <w:pPr>
@@ -4001,7 +3757,7 @@
         </w:tc>
         <w:tc>
           <w:tcPr>
-            <w:tcW w:w="1377" w:type="dxa"/>
+            <w:tcW w:w="1450" w:type="dxa"/>
           </w:tcPr>
           <w:p>
             <w:pPr>
@@ -4027,7 +3783,7 @@
         </w:trPr>
         <w:tc>
           <w:tcPr>
-            <w:tcW w:w="1831" w:type="dxa"/>
+            <w:tcW w:w="1250" w:type="dxa"/>
           </w:tcPr>
           <w:p>
             <w:pPr>
@@ -4048,7 +3804,7 @@
         </w:tc>
         <w:tc>
           <w:tcPr>
-            <w:tcW w:w="3377" w:type="dxa"/>
+            <w:tcW w:w="3650" w:type="dxa"/>
           </w:tcPr>
           <w:p>
             <w:pPr>
@@ -4069,7 +3825,7 @@
         </w:tc>
         <w:tc>
           <w:tcPr>
-            <w:tcW w:w="3013" w:type="dxa"/>
+            <w:tcW w:w="3250" w:type="dxa"/>
           </w:tcPr>
           <w:p>
             <w:pPr>
@@ -4090,7 +3846,7 @@
         </w:tc>
         <w:tc>
           <w:tcPr>
-            <w:tcW w:w="1377" w:type="dxa"/>
+            <w:tcW w:w="1450" w:type="dxa"/>
           </w:tcPr>
           <w:p>
             <w:pPr>
@@ -4116,7 +3872,7 @@
         </w:trPr>
         <w:tc>
           <w:tcPr>
-            <w:tcW w:w="1831" w:type="dxa"/>
+            <w:tcW w:w="1250" w:type="dxa"/>
           </w:tcPr>
           <w:p>
             <w:pPr>
@@ -4137,7 +3893,7 @@
         </w:tc>
         <w:tc>
           <w:tcPr>
-            <w:tcW w:w="3377" w:type="dxa"/>
+            <w:tcW w:w="3650" w:type="dxa"/>
           </w:tcPr>
           <w:p>
             <w:pPr>
@@ -4158,7 +3914,7 @@
         </w:tc>
         <w:tc>
           <w:tcPr>
-            <w:tcW w:w="3013" w:type="dxa"/>
+            <w:tcW w:w="3250" w:type="dxa"/>
           </w:tcPr>
           <w:p>
             <w:pPr>
@@ -4179,7 +3935,7 @@
         </w:tc>
         <w:tc>
           <w:tcPr>
-            <w:tcW w:w="1377" w:type="dxa"/>
+            <w:tcW w:w="1450" w:type="dxa"/>
           </w:tcPr>
           <w:p>
             <w:pPr>
@@ -4205,7 +3961,7 @@
         </w:trPr>
         <w:tc>
           <w:tcPr>
-            <w:tcW w:w="1831" w:type="dxa"/>
+            <w:tcW w:w="1250" w:type="dxa"/>
           </w:tcPr>
           <w:p>
             <w:pPr>
@@ -4226,7 +3982,7 @@
         </w:tc>
         <w:tc>
           <w:tcPr>
-            <w:tcW w:w="3377" w:type="dxa"/>
+            <w:tcW w:w="3650" w:type="dxa"/>
           </w:tcPr>
           <w:p>
             <w:pPr>
@@ -4247,7 +4003,7 @@
         </w:tc>
         <w:tc>
           <w:tcPr>
-            <w:tcW w:w="3013" w:type="dxa"/>
+            <w:tcW w:w="3250" w:type="dxa"/>
           </w:tcPr>
           <w:p>
             <w:pPr>
@@ -4268,7 +4024,7 @@
         </w:tc>
         <w:tc>
           <w:tcPr>
-            <w:tcW w:w="1377" w:type="dxa"/>
+            <w:tcW w:w="1450" w:type="dxa"/>
           </w:tcPr>
           <w:p>
             <w:pPr>
@@ -4294,7 +4050,7 @@
         </w:trPr>
         <w:tc>
           <w:tcPr>
-            <w:tcW w:w="1831" w:type="dxa"/>
+            <w:tcW w:w="1250" w:type="dxa"/>
           </w:tcPr>
           <w:p>
             <w:pPr>
@@ -4315,7 +4071,7 @@
         </w:tc>
         <w:tc>
           <w:tcPr>
-            <w:tcW w:w="3377" w:type="dxa"/>
+            <w:tcW w:w="3650" w:type="dxa"/>
           </w:tcPr>
           <w:p>
             <w:pPr>
@@ -4336,7 +4092,7 @@
         </w:tc>
         <w:tc>
           <w:tcPr>
-            <w:tcW w:w="3013" w:type="dxa"/>
+            <w:tcW w:w="3250" w:type="dxa"/>
           </w:tcPr>
           <w:p>
             <w:pPr>
@@ -4357,7 +4113,7 @@
         </w:tc>
         <w:tc>
           <w:tcPr>
-            <w:tcW w:w="1377" w:type="dxa"/>
+            <w:tcW w:w="1450" w:type="dxa"/>
           </w:tcPr>
           <w:p>
             <w:pPr>
@@ -4373,95 +4129,6 @@
                 <w:szCs w:val="18"/>
               </w:rPr>
               <w:t xml:space="preserve">Q⁠4</w:t>
-            </w:r>
-          </w:p>
-        </w:tc>
-      </w:tr>
-      <w:tr>
-        <w:trPr>
-          <w:cantSplit/>
-        </w:trPr>
-        <w:tc>
-          <w:tcPr>
-            <w:tcW w:w="1831" w:type="dxa"/>
-          </w:tcPr>
-          <w:p>
-            <w:pPr>
-              <w:pStyle w:val="TableText"/>
-              <w:jc w:val="left"/>
-              <w:wordWrap w:val="0"/>
-              <w:spacing w:before="0" w:after="0" w:line="320" w:lineRule="exact"/>
-            </w:pPr>
-            <w:r>
-              <w:rPr>
-                <w:rFonts w:ascii="Calibri" w:hAnsi="Calibri" w:eastAsia="Microsoft YaHei" w:cs="Calibri"/>
-                <w:sz w:val="18"/>
-                <w:szCs w:val="18"/>
-              </w:rPr>
-              <w:t xml:space="preserve">永久节点或 H⁠o⁠m⁠e 故障</w:t>
-            </w:r>
-          </w:p>
-        </w:tc>
-        <w:tc>
-          <w:tcPr>
-            <w:tcW w:w="3377" w:type="dxa"/>
-          </w:tcPr>
-          <w:p>
-            <w:pPr>
-              <w:pStyle w:val="TableText"/>
-              <w:jc w:val="left"/>
-              <w:wordWrap w:val="0"/>
-              <w:spacing w:before="0" w:after="0" w:line="320" w:lineRule="exact"/>
-            </w:pPr>
-            <w:r>
-              <w:rPr>
-                <w:rFonts w:ascii="Calibri" w:hAnsi="Calibri" w:eastAsia="Microsoft YaHei" w:cs="Calibri"/>
-                <w:sz w:val="18"/>
-                <w:szCs w:val="18"/>
-              </w:rPr>
-              <w:t xml:space="preserve">节点不再恢复服务</w:t>
-            </w:r>
-          </w:p>
-        </w:tc>
-        <w:tc>
-          <w:tcPr>
-            <w:tcW w:w="3013" w:type="dxa"/>
-          </w:tcPr>
-          <w:p>
-            <w:pPr>
-              <w:pStyle w:val="TableText"/>
-              <w:jc w:val="left"/>
-              <w:wordWrap w:val="0"/>
-              <w:spacing w:before="0" w:after="0" w:line="320" w:lineRule="exact"/>
-            </w:pPr>
-            <w:r>
-              <w:rPr>
-                <w:rFonts w:ascii="Calibri" w:hAnsi="Calibri" w:eastAsia="Microsoft YaHei" w:cs="Calibri"/>
-                <w:sz w:val="18"/>
-                <w:szCs w:val="18"/>
-              </w:rPr>
-              <w:t xml:space="preserve">需要冗余 H⁠o⁠m⁠e、数据副本与在线重配置</w:t>
-            </w:r>
-          </w:p>
-        </w:tc>
-        <w:tc>
-          <w:tcPr>
-            <w:tcW w:w="1377" w:type="dxa"/>
-          </w:tcPr>
-          <w:p>
-            <w:pPr>
-              <w:pStyle w:val="TableText"/>
-              <w:jc w:val="left"/>
-              <w:wordWrap w:val="0"/>
-              <w:spacing w:before="0" w:after="0" w:line="320" w:lineRule="exact"/>
-            </w:pPr>
-            <w:r>
-              <w:rPr>
-                <w:rFonts w:ascii="Calibri" w:hAnsi="Calibri" w:eastAsia="Microsoft YaHei" w:cs="Calibri"/>
-                <w:sz w:val="18"/>
-                <w:szCs w:val="18"/>
-              </w:rPr>
-              <w:t xml:space="preserve">不在本次范围</w:t>
             </w:r>
           </w:p>
         </w:tc>
@@ -5255,61 +4922,6 @@
     </w:p>
     <w:p>
       <w:pPr>
-        <w:jc w:val="center"/>
-        <w:spacing w:before="100" w:after="40" w:line="240" w:lineRule="auto"/>
-      </w:pPr>
-      <w:r>
-        <w:drawing>
-          <wp:inline distT="0" distB="0" distL="0" distR="0">
-            <wp:extent cx="5579999" cy="3034650"/>
-            <wp:effectExtent l="0" t="0" r="0" b="0"/>
-            <wp:docPr id="3" name="图 5-1 Q1-Q5 故障资格结果" descr="图 5-1 Q1-Q5 故障资格结果"/>
-            <wp:cNvGraphicFramePr>
-              <a:graphicFrameLocks xmlns:a="http://schemas.openxmlformats.org/drawingml/2006/main" noChangeAspect="1"/>
-            </wp:cNvGraphicFramePr>
-            <a:graphic xmlns:a="http://schemas.openxmlformats.org/drawingml/2006/main">
-              <a:graphicData uri="http://schemas.openxmlformats.org/drawingml/2006/picture">
-                <pic:pic xmlns:pic="http://schemas.openxmlformats.org/drawingml/2006/picture">
-                  <pic:nvPicPr>
-                    <pic:cNvPr id="3" name="图 5-1 Q1-Q5 故障资格结果"/>
-                    <pic:cNvPicPr/>
-                  </pic:nvPicPr>
-                  <pic:blipFill>
-                    <a:blip xmlns:r="http://schemas.openxmlformats.org/officeDocument/2006/relationships" r:embed="rIdImage3"/>
-                    <a:stretch>
-                      <a:fillRect/>
-                    </a:stretch>
-                  </pic:blipFill>
-                  <pic:spPr>
-                    <a:xfrm>
-                      <a:off x="0" y="0"/>
-                      <a:ext cx="5579999" cy="3034650"/>
-                    </a:xfrm>
-                    <a:prstGeom prst="rect">
-                      <a:avLst/>
-                    </a:prstGeom>
-                  </pic:spPr>
-                </pic:pic>
-              </a:graphicData>
-            </a:graphic>
-          </wp:inline>
-        </w:drawing>
-      </w:r>
-    </w:p>
-    <w:p>
-      <w:pPr>
-        <w:pStyle w:val="FigureCaption"/>
-        <w:jc w:val="center"/>
-      </w:pPr>
-      <w:r>
-        <w:rPr>
-          <w:rFonts w:ascii="Calibri" w:hAnsi="Calibri" w:eastAsia="Microsoft YaHei" w:cs="Calibri"/>
-        </w:rPr>
-        <w:t xml:space="preserve">图 5-1　Q1-Q5 故障资格结果</w:t>
-      </w:r>
-    </w:p>
-    <w:p>
-      <w:pPr>
         <w:pStyle w:val="Heading3"/>
         <w:keepNext/>
       </w:pPr>
@@ -6474,7 +6086,7 @@
         <w:rPr>
           <w:rFonts w:ascii="Calibri" w:hAnsi="Calibri" w:eastAsia="SimHei" w:cs="Calibri"/>
         </w:rPr>
-        <w:t xml:space="preserve">6.1 比较目的与冻结范围</w:t>
+        <w:t xml:space="preserve">6.1 比较目的与固定范围</w:t>
       </w:r>
     </w:p>
     <w:p>
@@ -6485,7 +6097,7 @@
         <w:rPr>
           <w:rFonts w:ascii="Calibri" w:hAnsi="Calibri" w:eastAsia="Microsoft YaHei" w:cs="Calibri"/>
         </w:rPr>
-        <w:t xml:space="preserve">HA-VI 证据用于回答：在相同 workload、完成边界和冻结参数下，UBCC 的目录定位⁠与⁠权⁠限⁠路⁠径</w:t>
+        <w:t xml:space="preserve">HA-VI 证据用于回答：在相同 workload、完成边界和统一参数下，UBCC 的目录定位⁠与⁠权⁠限⁠路⁠径</w:t>
       </w:r>
     </w:p>
     <w:p>
@@ -6507,7 +6119,7 @@
         <w:rPr>
           <w:rFonts w:ascii="Calibri" w:hAnsi="Calibri" w:eastAsia="Microsoft YaHei" w:cs="Calibri"/>
         </w:rPr>
-        <w:t xml:space="preserve">L3 和 100% L3 压力；它是理论与可执行参考比较，不是物理⁠芯⁠片⁠测⁠量⁠。</w:t>
+        <w:t xml:space="preserve">L3 和 100% L3 压力；该结果定位为理论分析与可执行参考⁠模⁠型⁠比⁠较⁠。</w:t>
       </w:r>
     </w:p>
     <w:p>
@@ -6519,7 +6131,7 @@
         <w:rPr>
           <w:rFonts w:ascii="Calibri" w:hAnsi="Calibri" w:eastAsia="SimHei" w:cs="Calibri"/>
         </w:rPr>
-        <w:t xml:space="preserve">6.2 假设与公平性边界</w:t>
+        <w:t xml:space="preserve">6.2 参考条件与公平性定义</w:t>
       </w:r>
     </w:p>
     <w:tbl>
@@ -6535,9 +6147,9 @@
         </w:tblCellMar>
       </w:tblPr>
       <w:tblGrid>
-        <w:gridCol w:w="1961"/>
-        <w:gridCol w:w="4147"/>
-        <w:gridCol w:w="3491"/>
+        <w:gridCol w:w="1942"/>
+        <w:gridCol w:w="4097"/>
+        <w:gridCol w:w="3559"/>
       </w:tblGrid>
       <w:tr>
         <w:trPr>
@@ -6546,7 +6158,7 @@
         </w:trPr>
         <w:tc>
           <w:tcPr>
-            <w:tcW w:w="1961" w:type="dxa"/>
+            <w:tcW w:w="1942" w:type="dxa"/>
             <w:shd w:val="clear" w:color="auto" w:fill="D9E2F3"/>
           </w:tcPr>
           <w:p>
@@ -6569,7 +6181,7 @@
         </w:tc>
         <w:tc>
           <w:tcPr>
-            <w:tcW w:w="4147" w:type="dxa"/>
+            <w:tcW w:w="4097" w:type="dxa"/>
             <w:shd w:val="clear" w:color="auto" w:fill="D9E2F3"/>
           </w:tcPr>
           <w:p>
@@ -6586,13 +6198,13 @@
                 <w:sz w:val="18"/>
                 <w:szCs w:val="18"/>
               </w:rPr>
-              <w:t xml:space="preserve">冻结参考条件</w:t>
-            </w:r>
-          </w:p>
-        </w:tc>
-        <w:tc>
-          <w:tcPr>
-            <w:tcW w:w="3491" w:type="dxa"/>
+              <w:t xml:space="preserve">统一参考条件</w:t>
+            </w:r>
+          </w:p>
+        </w:tc>
+        <w:tc>
+          <w:tcPr>
+            <w:tcW w:w="3559" w:type="dxa"/>
             <w:shd w:val="clear" w:color="auto" w:fill="D9E2F3"/>
           </w:tcPr>
           <w:p>
@@ -6609,18 +6221,18 @@
                 <w:sz w:val="18"/>
                 <w:szCs w:val="18"/>
               </w:rPr>
-              <w:t xml:space="preserve">未建模硬件或禁止外推项</w:t>
-            </w:r>
-          </w:p>
-        </w:tc>
-      </w:tr>
-      <w:tr>
-        <w:trPr>
-          <w:cantSplit/>
-        </w:trPr>
-        <w:tc>
-          <w:tcPr>
-            <w:tcW w:w="1961" w:type="dxa"/>
+              <w:t xml:space="preserve">参考模型抽象</w:t>
+            </w:r>
+          </w:p>
+        </w:tc>
+      </w:tr>
+      <w:tr>
+        <w:trPr>
+          <w:cantSplit/>
+        </w:trPr>
+        <w:tc>
+          <w:tcPr>
+            <w:tcW w:w="1942" w:type="dxa"/>
           </w:tcPr>
           <w:p>
             <w:pPr>
@@ -6641,7 +6253,7 @@
         </w:tc>
         <w:tc>
           <w:tcPr>
-            <w:tcW w:w="4147" w:type="dxa"/>
+            <w:tcW w:w="4097" w:type="dxa"/>
           </w:tcPr>
           <w:p>
             <w:pPr>
@@ -6662,33 +6274,33 @@
         </w:tc>
         <w:tc>
           <w:tcPr>
-            <w:tcW w:w="3491" w:type="dxa"/>
-          </w:tcPr>
-          <w:p>
-            <w:pPr>
-              <w:pStyle w:val="TableText"/>
-              <w:jc w:val="left"/>
-              <w:wordWrap w:val="0"/>
-              <w:spacing w:before="0" w:after="0" w:line="320" w:lineRule="exact"/>
-            </w:pPr>
-            <w:r>
-              <w:rPr>
-                <w:rFonts w:ascii="Calibri" w:hAnsi="Calibri" w:eastAsia="Microsoft YaHei" w:cs="Calibri"/>
-                <w:sz w:val="18"/>
-                <w:szCs w:val="18"/>
-              </w:rPr>
-              <w:t xml:space="preserve">目标物理芯片的核、缓存和 H⁠o⁠m⁠e 微体系结构</w:t>
-            </w:r>
-          </w:p>
-        </w:tc>
-      </w:tr>
-      <w:tr>
-        <w:trPr>
-          <w:cantSplit/>
-        </w:trPr>
-        <w:tc>
-          <w:tcPr>
-            <w:tcW w:w="1961" w:type="dxa"/>
+            <w:tcW w:w="3559" w:type="dxa"/>
+          </w:tcPr>
+          <w:p>
+            <w:pPr>
+              <w:pStyle w:val="TableText"/>
+              <w:jc w:val="left"/>
+              <w:wordWrap w:val="0"/>
+              <w:spacing w:before="0" w:after="0" w:line="320" w:lineRule="exact"/>
+            </w:pPr>
+            <w:r>
+              <w:rPr>
+                <w:rFonts w:ascii="Calibri" w:hAnsi="Calibri" w:eastAsia="Microsoft YaHei" w:cs="Calibri"/>
+                <w:sz w:val="18"/>
+                <w:szCs w:val="18"/>
+              </w:rPr>
+              <w:t xml:space="preserve">处理器、缓存与 H⁠o⁠m⁠e 采用共同可执行环境配置</w:t>
+            </w:r>
+          </w:p>
+        </w:tc>
+      </w:tr>
+      <w:tr>
+        <w:trPr>
+          <w:cantSplit/>
+        </w:trPr>
+        <w:tc>
+          <w:tcPr>
+            <w:tcW w:w="1942" w:type="dxa"/>
           </w:tcPr>
           <w:p>
             <w:pPr>
@@ -6709,7 +6321,7 @@
         </w:tc>
         <w:tc>
           <w:tcPr>
-            <w:tcW w:w="4147" w:type="dxa"/>
+            <w:tcW w:w="4097" w:type="dxa"/>
           </w:tcPr>
           <w:p>
             <w:pPr>
@@ -6730,33 +6342,33 @@
         </w:tc>
         <w:tc>
           <w:tcPr>
-            <w:tcW w:w="3491" w:type="dxa"/>
-          </w:tcPr>
-          <w:p>
-            <w:pPr>
-              <w:pStyle w:val="TableText"/>
-              <w:jc w:val="left"/>
-              <w:wordWrap w:val="0"/>
-              <w:spacing w:before="0" w:after="0" w:line="320" w:lineRule="exact"/>
-            </w:pPr>
-            <w:r>
-              <w:rPr>
-                <w:rFonts w:ascii="Calibri" w:hAnsi="Calibri" w:eastAsia="Microsoft YaHei" w:cs="Calibri"/>
-                <w:sz w:val="18"/>
-                <w:szCs w:val="18"/>
-              </w:rPr>
-              <w:t xml:space="preserve">未冻结 w⁠o⁠r⁠k⁠l⁠o⁠a⁠d、流量分布和其他 L⁠3 配置</w:t>
-            </w:r>
-          </w:p>
-        </w:tc>
-      </w:tr>
-      <w:tr>
-        <w:trPr>
-          <w:cantSplit/>
-        </w:trPr>
-        <w:tc>
-          <w:tcPr>
-            <w:tcW w:w="1961" w:type="dxa"/>
+            <w:tcW w:w="3559" w:type="dxa"/>
+          </w:tcPr>
+          <w:p>
+            <w:pPr>
+              <w:pStyle w:val="TableText"/>
+              <w:jc w:val="left"/>
+              <w:wordWrap w:val="0"/>
+              <w:spacing w:before="0" w:after="0" w:line="320" w:lineRule="exact"/>
+            </w:pPr>
+            <w:r>
+              <w:rPr>
+                <w:rFonts w:ascii="Calibri" w:hAnsi="Calibri" w:eastAsia="Microsoft YaHei" w:cs="Calibri"/>
+                <w:sz w:val="18"/>
+                <w:szCs w:val="18"/>
+              </w:rPr>
+              <w:t xml:space="preserve">结果对应表列 w⁠o⁠r⁠k⁠l⁠o⁠a⁠d、输入配比与 L⁠3 配置</w:t>
+            </w:r>
+          </w:p>
+        </w:tc>
+      </w:tr>
+      <w:tr>
+        <w:trPr>
+          <w:cantSplit/>
+        </w:trPr>
+        <w:tc>
+          <w:tcPr>
+            <w:tcW w:w="1942" w:type="dxa"/>
           </w:tcPr>
           <w:p>
             <w:pPr>
@@ -6777,7 +6389,7 @@
         </w:tc>
         <w:tc>
           <w:tcPr>
-            <w:tcW w:w="4147" w:type="dxa"/>
+            <w:tcW w:w="4097" w:type="dxa"/>
           </w:tcPr>
           <w:p>
             <w:pPr>
@@ -6798,33 +6410,33 @@
         </w:tc>
         <w:tc>
           <w:tcPr>
-            <w:tcW w:w="3491" w:type="dxa"/>
-          </w:tcPr>
-          <w:p>
-            <w:pPr>
-              <w:pStyle w:val="TableText"/>
-              <w:jc w:val="left"/>
-              <w:wordWrap w:val="0"/>
-              <w:spacing w:before="0" w:after="0" w:line="320" w:lineRule="exact"/>
-            </w:pPr>
-            <w:r>
-              <w:rPr>
-                <w:rFonts w:ascii="Calibri" w:hAnsi="Calibri" w:eastAsia="Microsoft YaHei" w:cs="Calibri"/>
-                <w:sz w:val="18"/>
-                <w:szCs w:val="18"/>
-              </w:rPr>
-              <w:t xml:space="preserve">物理链路握手、未纳入主值的内部服务阶段</w:t>
-            </w:r>
-          </w:p>
-        </w:tc>
-      </w:tr>
-      <w:tr>
-        <w:trPr>
-          <w:cantSplit/>
-        </w:trPr>
-        <w:tc>
-          <w:tcPr>
-            <w:tcW w:w="1961" w:type="dxa"/>
+            <w:tcW w:w="3559" w:type="dxa"/>
+          </w:tcPr>
+          <w:p>
+            <w:pPr>
+              <w:pStyle w:val="TableText"/>
+              <w:jc w:val="left"/>
+              <w:wordWrap w:val="0"/>
+              <w:spacing w:before="0" w:after="0" w:line="320" w:lineRule="exact"/>
+            </w:pPr>
+            <w:r>
+              <w:rPr>
+                <w:rFonts w:ascii="Calibri" w:hAnsi="Calibri" w:eastAsia="Microsoft YaHei" w:cs="Calibri"/>
+                <w:sz w:val="18"/>
+                <w:szCs w:val="18"/>
+              </w:rPr>
+              <w:t xml:space="preserve">计量采用根操作单向完成事件</w:t>
+            </w:r>
+          </w:p>
+        </w:tc>
+      </w:tr>
+      <w:tr>
+        <w:trPr>
+          <w:cantSplit/>
+        </w:trPr>
+        <w:tc>
+          <w:tcPr>
+            <w:tcW w:w="1942" w:type="dxa"/>
           </w:tcPr>
           <w:p>
             <w:pPr>
@@ -6845,54 +6457,54 @@
         </w:tc>
         <w:tc>
           <w:tcPr>
-            <w:tcW w:w="4147" w:type="dxa"/>
-          </w:tcPr>
-          <w:p>
-            <w:pPr>
-              <w:pStyle w:val="TableText"/>
-              <w:jc w:val="left"/>
-              <w:wordWrap w:val="0"/>
-              <w:spacing w:before="0" w:after="0" w:line="320" w:lineRule="exact"/>
-            </w:pPr>
-            <w:r>
-              <w:rPr>
-                <w:rFonts w:ascii="Calibri" w:hAnsi="Calibri" w:eastAsia="Microsoft YaHei" w:cs="Calibri"/>
-                <w:sz w:val="18"/>
-                <w:szCs w:val="18"/>
-              </w:rPr>
-              <w:t xml:space="preserve">冻结 H⁠A⁠-⁠V⁠I 可执行参考模型及其目录、状态和时延参数</w:t>
-            </w:r>
-          </w:p>
-        </w:tc>
-        <w:tc>
-          <w:tcPr>
-            <w:tcW w:w="3491" w:type="dxa"/>
-          </w:tcPr>
-          <w:p>
-            <w:pPr>
-              <w:pStyle w:val="TableText"/>
-              <w:jc w:val="left"/>
-              <w:wordWrap w:val="0"/>
-              <w:spacing w:before="0" w:after="0" w:line="320" w:lineRule="exact"/>
-            </w:pPr>
-            <w:r>
-              <w:rPr>
-                <w:rFonts w:ascii="Calibri" w:hAnsi="Calibri" w:eastAsia="Microsoft YaHei" w:cs="Calibri"/>
-                <w:sz w:val="18"/>
-                <w:szCs w:val="18"/>
-              </w:rPr>
-              <w:t xml:space="preserve">未建模 H⁠A 的优化、缓冲、队列、预测和一致性扩展</w:t>
-            </w:r>
-          </w:p>
-        </w:tc>
-      </w:tr>
-      <w:tr>
-        <w:trPr>
-          <w:cantSplit/>
-        </w:trPr>
-        <w:tc>
-          <w:tcPr>
-            <w:tcW w:w="1961" w:type="dxa"/>
+            <w:tcW w:w="4097" w:type="dxa"/>
+          </w:tcPr>
+          <w:p>
+            <w:pPr>
+              <w:pStyle w:val="TableText"/>
+              <w:jc w:val="left"/>
+              <w:wordWrap w:val="0"/>
+              <w:spacing w:before="0" w:after="0" w:line="320" w:lineRule="exact"/>
+            </w:pPr>
+            <w:r>
+              <w:rPr>
+                <w:rFonts w:ascii="Calibri" w:hAnsi="Calibri" w:eastAsia="Microsoft YaHei" w:cs="Calibri"/>
+                <w:sz w:val="18"/>
+                <w:szCs w:val="18"/>
+              </w:rPr>
+              <w:t xml:space="preserve">既定 H⁠A⁠-⁠V⁠I 可执行参考模型及其目录、状态和时延参数</w:t>
+            </w:r>
+          </w:p>
+        </w:tc>
+        <w:tc>
+          <w:tcPr>
+            <w:tcW w:w="3559" w:type="dxa"/>
+          </w:tcPr>
+          <w:p>
+            <w:pPr>
+              <w:pStyle w:val="TableText"/>
+              <w:jc w:val="left"/>
+              <w:wordWrap w:val="0"/>
+              <w:spacing w:before="0" w:after="0" w:line="320" w:lineRule="exact"/>
+            </w:pPr>
+            <w:r>
+              <w:rPr>
+                <w:rFonts w:ascii="Calibri" w:hAnsi="Calibri" w:eastAsia="Microsoft YaHei" w:cs="Calibri"/>
+                <w:sz w:val="18"/>
+                <w:szCs w:val="18"/>
+              </w:rPr>
+              <w:t xml:space="preserve">H⁠A⁠-⁠V⁠I 按表列目录、状态与时延参数执行</w:t>
+            </w:r>
+          </w:p>
+        </w:tc>
+      </w:tr>
+      <w:tr>
+        <w:trPr>
+          <w:cantSplit/>
+        </w:trPr>
+        <w:tc>
+          <w:tcPr>
+            <w:tcW w:w="1942" w:type="dxa"/>
           </w:tcPr>
           <w:p>
             <w:pPr>
@@ -6913,7 +6525,7 @@
         </w:tc>
         <w:tc>
           <w:tcPr>
-            <w:tcW w:w="4147" w:type="dxa"/>
+            <w:tcW w:w="4097" w:type="dxa"/>
           </w:tcPr>
           <w:p>
             <w:pPr>
@@ -6934,33 +6546,33 @@
         </w:tc>
         <w:tc>
           <w:tcPr>
-            <w:tcW w:w="3491" w:type="dxa"/>
-          </w:tcPr>
-          <w:p>
-            <w:pPr>
-              <w:pStyle w:val="TableText"/>
-              <w:jc w:val="left"/>
-              <w:wordWrap w:val="0"/>
-              <w:spacing w:before="0" w:after="0" w:line="320" w:lineRule="exact"/>
-            </w:pPr>
-            <w:r>
-              <w:rPr>
-                <w:rFonts w:ascii="Calibri" w:hAnsi="Calibri" w:eastAsia="Microsoft YaHei" w:cs="Calibri"/>
-                <w:sz w:val="18"/>
-                <w:szCs w:val="18"/>
-              </w:rPr>
-              <w:t xml:space="preserve">端口级 S⁠w⁠i⁠t⁠c⁠h 排队、仲裁、拥塞和链路误码</w:t>
-            </w:r>
-          </w:p>
-        </w:tc>
-      </w:tr>
-      <w:tr>
-        <w:trPr>
-          <w:cantSplit/>
-        </w:trPr>
-        <w:tc>
-          <w:tcPr>
-            <w:tcW w:w="1961" w:type="dxa"/>
+            <w:tcW w:w="3559" w:type="dxa"/>
+          </w:tcPr>
+          <w:p>
+            <w:pPr>
+              <w:pStyle w:val="TableText"/>
+              <w:jc w:val="left"/>
+              <w:wordWrap w:val="0"/>
+              <w:spacing w:before="0" w:after="0" w:line="320" w:lineRule="exact"/>
+            </w:pPr>
+            <w:r>
+              <w:rPr>
+                <w:rFonts w:ascii="Calibri" w:hAnsi="Calibri" w:eastAsia="Microsoft YaHei" w:cs="Calibri"/>
+                <w:sz w:val="18"/>
+                <w:szCs w:val="18"/>
+              </w:rPr>
+              <w:t xml:space="preserve">通信采用共同可执行传输环境</w:t>
+            </w:r>
+          </w:p>
+        </w:tc>
+      </w:tr>
+      <w:tr>
+        <w:trPr>
+          <w:cantSplit/>
+        </w:trPr>
+        <w:tc>
+          <w:tcPr>
+            <w:tcW w:w="1942" w:type="dxa"/>
           </w:tcPr>
           <w:p>
             <w:pPr>
@@ -6981,43 +6593,43 @@
         </w:tc>
         <w:tc>
           <w:tcPr>
-            <w:tcW w:w="4147" w:type="dxa"/>
-          </w:tcPr>
-          <w:p>
-            <w:pPr>
-              <w:pStyle w:val="TableText"/>
-              <w:jc w:val="left"/>
-              <w:wordWrap w:val="0"/>
-              <w:spacing w:before="0" w:after="0" w:line="320" w:lineRule="exact"/>
-            </w:pPr>
-            <w:r>
-              <w:rPr>
-                <w:rFonts w:ascii="Calibri" w:hAnsi="Calibri" w:eastAsia="Microsoft YaHei" w:cs="Calibri"/>
-                <w:sz w:val="18"/>
-                <w:szCs w:val="18"/>
-              </w:rPr>
-              <w:t xml:space="preserve">按冻结主值形成核心场景组和代表场景组的等权聚合</w:t>
-            </w:r>
-          </w:p>
-        </w:tc>
-        <w:tc>
-          <w:tcPr>
-            <w:tcW w:w="3491" w:type="dxa"/>
-          </w:tcPr>
-          <w:p>
-            <w:pPr>
-              <w:pStyle w:val="TableText"/>
-              <w:jc w:val="left"/>
-              <w:wordWrap w:val="0"/>
-              <w:spacing w:before="0" w:after="0" w:line="320" w:lineRule="exact"/>
-            </w:pPr>
-            <w:r>
-              <w:rPr>
-                <w:rFonts w:ascii="Calibri" w:hAnsi="Calibri" w:eastAsia="Microsoft YaHei" w:cs="Calibri"/>
-                <w:sz w:val="18"/>
-                <w:szCs w:val="18"/>
-              </w:rPr>
-              <w:t xml:space="preserve">将参考模型结果外推为目标物理实现结果</w:t>
+            <w:tcW w:w="4097" w:type="dxa"/>
+          </w:tcPr>
+          <w:p>
+            <w:pPr>
+              <w:pStyle w:val="TableText"/>
+              <w:jc w:val="left"/>
+              <w:wordWrap w:val="0"/>
+              <w:spacing w:before="0" w:after="0" w:line="320" w:lineRule="exact"/>
+            </w:pPr>
+            <w:r>
+              <w:rPr>
+                <w:rFonts w:ascii="Calibri" w:hAnsi="Calibri" w:eastAsia="Microsoft YaHei" w:cs="Calibri"/>
+                <w:sz w:val="18"/>
+                <w:szCs w:val="18"/>
+              </w:rPr>
+              <w:t xml:space="preserve">按正式主值形成核心场景组和代表场景组的等权聚合</w:t>
+            </w:r>
+          </w:p>
+        </w:tc>
+        <w:tc>
+          <w:tcPr>
+            <w:tcW w:w="3559" w:type="dxa"/>
+          </w:tcPr>
+          <w:p>
+            <w:pPr>
+              <w:pStyle w:val="TableText"/>
+              <w:jc w:val="left"/>
+              <w:wordWrap w:val="0"/>
+              <w:spacing w:before="0" w:after="0" w:line="320" w:lineRule="exact"/>
+            </w:pPr>
+            <w:r>
+              <w:rPr>
+                <w:rFonts w:ascii="Calibri" w:hAnsi="Calibri" w:eastAsia="Microsoft YaHei" w:cs="Calibri"/>
+                <w:sz w:val="18"/>
+                <w:szCs w:val="18"/>
+              </w:rPr>
+              <w:t xml:space="preserve">结论适用于核心与代表场景组聚合</w:t>
             </w:r>
           </w:p>
         </w:tc>
@@ -7031,7 +6643,7 @@
         <w:rPr>
           <w:rFonts w:ascii="Calibri" w:hAnsi="Calibri" w:eastAsia="Microsoft YaHei" w:cs="Calibri"/>
         </w:rPr>
-        <w:t xml:space="preserve">这些条件保证配对比较在冻结参考范围内使用共同输入和共同完成边界。聚合优⁠势⁠表⁠示⁠冻⁠结</w:t>
+        <w:t xml:space="preserve">这些条件保证配对比较在既定参考范围内使用共同输入和共同完成边界。结论反映⁠核⁠心⁠场⁠景⁠组</w:t>
       </w:r>
     </w:p>
     <w:p>
@@ -7042,7 +6654,7 @@
         <w:rPr>
           <w:rFonts w:ascii="Calibri" w:hAnsi="Calibri" w:eastAsia="Microsoft YaHei" w:cs="Calibri"/>
         </w:rPr>
-        <w:t xml:space="preserve">场景组的平均主值占优，不表示每一个 testcase、内部阶段或子操作都⁠必⁠须⁠占⁠优⁠。</w:t>
+        <w:t xml:space="preserve">与代表场景组的平均主值⁠比⁠较⁠结⁠果⁠。</w:t>
       </w:r>
     </w:p>
     <w:p>
@@ -7145,7 +6757,7 @@
                 <w:sz w:val="18"/>
                 <w:szCs w:val="18"/>
               </w:rPr>
-              <w:t xml:space="preserve">H⁠A⁠-⁠V⁠I 冻结参考</w:t>
+              <w:t xml:space="preserve">H⁠A⁠-⁠V⁠I 既定参考模型</w:t>
             </w:r>
           </w:p>
         </w:tc>
@@ -7325,7 +6937,7 @@
                 <w:sz w:val="18"/>
                 <w:szCs w:val="18"/>
               </w:rPr>
-              <w:t xml:space="preserve">冻结参考目录组织</w:t>
+              <w:t xml:space="preserve">既定参考目录组织</w:t>
             </w:r>
           </w:p>
         </w:tc>
@@ -7538,7 +7150,7 @@
         <w:rPr>
           <w:rFonts w:ascii="Calibri" w:hAnsi="Calibri" w:eastAsia="Microsoft YaHei" w:cs="Calibri"/>
         </w:rPr>
-        <w:t xml:space="preserve">理论比较只解释结构差异，不单独构成性能胜负结论。性能裁决来自相同输入下的冻结⁠配⁠对⁠运⁠行⁠。</w:t>
+        <w:t xml:space="preserve">理论结构比较用于解释机制差异，性能结论由相同输入下的正式配对⁠运⁠行⁠给⁠出⁠。</w:t>
       </w:r>
     </w:p>
     <w:p>
@@ -7550,7 +7162,7 @@
         <w:rPr>
           <w:rFonts w:ascii="Calibri" w:hAnsi="Calibri" w:eastAsia="SimHei" w:cs="Calibri"/>
         </w:rPr>
-        <w:t xml:space="preserve">6.4 冻结 HA-VI 参考结果</w:t>
+        <w:t xml:space="preserve">6.4 HA-VI 参考结果</w:t>
       </w:r>
     </w:p>
     <w:tbl>
@@ -7933,7 +7545,7 @@
         <w:rPr>
           <w:rFonts w:ascii="Calibri" w:hAnsi="Calibri" w:eastAsia="Microsoft YaHei" w:cs="Calibri"/>
         </w:rPr>
-        <w:t xml:space="preserve">该结果与理论分析相互印证，但不外推到未建模 HA 机制或目标⁠物⁠理⁠实⁠现⁠。</w:t>
+        <w:t xml:space="preserve">该结果与理论分析相互印证，适用于上述 HA-VI 参考模型及固定⁠实⁠验⁠配⁠置⁠。</w:t>
       </w:r>
     </w:p>
     <w:p>
@@ -8035,7 +7647,7 @@
         <w:rPr>
           <w:rFonts w:ascii="Calibri" w:hAnsi="Calibri" w:eastAsia="SimHei" w:cs="Calibri"/>
         </w:rPr>
-        <w:t xml:space="preserve">7.2 16 节点能力与 Switch 边界</w:t>
+        <w:t xml:space="preserve">7.2 16 节点协议能力验证</w:t>
       </w:r>
     </w:p>
     <w:p>
@@ -8057,29 +7669,7 @@
         <w:rPr>
           <w:rFonts w:ascii="Calibri" w:hAnsi="Calibri" w:eastAsia="Microsoft YaHei" w:cs="Calibri"/>
         </w:rPr>
-        <w:t xml:space="preserve">该配置下的请求丢失、Ack 丢失和 Ack 延迟。这里的 Level-A 结论是节点规模与协议端点⁠能⁠力⁠结⁠论⁠；</w:t>
-      </w:r>
-    </w:p>
-    <w:p>
-      <w:pPr>
-        <w:ind w:left="0" w:firstLine="420"/>
-      </w:pPr>
-      <w:r>
-        <w:rPr>
-          <w:rFonts w:ascii="Calibri" w:hAnsi="Calibri" w:eastAsia="Microsoft YaHei" w:cs="Calibri"/>
-        </w:rPr>
-        <w:t xml:space="preserve">Switch 内部微体系结构、端口、排队、仲裁和拥塞模型未作为新的独立实验对象，因而⁠不⁠将⁠该⁠结⁠果</w:t>
-      </w:r>
-    </w:p>
-    <w:p>
-      <w:pPr>
-        <w:ind w:left="0" w:firstLine="420"/>
-      </w:pPr>
-      <w:r>
-        <w:rPr>
-          <w:rFonts w:ascii="Calibri" w:hAnsi="Calibri" w:eastAsia="Microsoft YaHei" w:cs="Calibri"/>
-        </w:rPr>
-        <w:t xml:space="preserve">表述为端口级 Switch ⁠实⁠现⁠验⁠证⁠。</w:t>
+        <w:t xml:space="preserve">该配置下的请求丢失、Ack 丢失和 Ack 延迟。结果确认了 16 节点规模下的协议端点与事务⁠收⁠敛⁠能⁠力⁠。</w:t>
       </w:r>
     </w:p>
     <w:p>
@@ -8091,19 +7681,7 @@
         <w:rPr>
           <w:rFonts w:ascii="Calibri" w:hAnsi="Calibri" w:eastAsia="SimHei" w:cs="Calibri"/>
         </w:rPr>
-        <w:t xml:space="preserve">8. 交付范围</w:t>
-      </w:r>
-    </w:p>
-    <w:p>
-      <w:pPr>
-        <w:pStyle w:val="Heading3"/>
-        <w:keepNext/>
-      </w:pPr>
-      <w:r>
-        <w:rPr>
-          <w:rFonts w:ascii="Calibri" w:hAnsi="Calibri" w:eastAsia="SimHei" w:cs="Calibri"/>
-        </w:rPr>
-        <w:t xml:space="preserve">8.1 已验证范围</w:t>
+        <w:t xml:space="preserve">8. 交付内容</w:t>
       </w:r>
     </w:p>
     <w:p>
@@ -8181,51 +7759,6 @@
           <w:rFonts w:ascii="Calibri" w:hAnsi="Calibri" w:eastAsia="Microsoft YaHei" w:cs="Calibri"/>
         </w:rPr>
         <w:t xml:space="preserve">• 性能矩阵执行前的正确性门禁。</w:t>
-      </w:r>
-    </w:p>
-    <w:p>
-      <w:pPr>
-        <w:pStyle w:val="Heading3"/>
-        <w:keepNext/>
-      </w:pPr>
-      <w:r>
-        <w:rPr>
-          <w:rFonts w:ascii="Calibri" w:hAnsi="Calibri" w:eastAsia="SimHei" w:cs="Calibri"/>
-        </w:rPr>
-        <w:t xml:space="preserve">8.2 本次交付范围外</w:t>
-      </w:r>
-    </w:p>
-    <w:p>
-      <w:pPr>
-        <w:ind w:left="0" w:firstLine="420"/>
-      </w:pPr>
-      <w:r>
-        <w:rPr>
-          <w:rFonts w:ascii="Calibri" w:hAnsi="Calibri" w:eastAsia="Microsoft YaHei" w:cs="Calibri"/>
-        </w:rPr>
-        <w:t xml:space="preserve">永久 Home 故障后的在线服务恢复不在本次交付范围。若后续合同要求该能力，需⁠要⁠增⁠加⁠冗⁠余</w:t>
-      </w:r>
-    </w:p>
-    <w:p>
-      <w:pPr>
-        <w:ind w:left="0" w:firstLine="420"/>
-      </w:pPr>
-      <w:r>
-        <w:rPr>
-          <w:rFonts w:ascii="Calibri" w:hAnsi="Calibri" w:eastAsia="Microsoft YaHei" w:cs="Calibri"/>
-        </w:rPr>
-        <w:t xml:space="preserve">Home、dirty 数据副本和在线重⁠配⁠置⁠机⁠制⁠。</w:t>
-      </w:r>
-    </w:p>
-    <w:p>
-      <w:pPr>
-        <w:ind w:left="0" w:firstLine="420"/>
-      </w:pPr>
-      <w:r>
-        <w:rPr>
-          <w:rFonts w:ascii="Calibri" w:hAnsi="Calibri" w:eastAsia="Microsoft YaHei" w:cs="Calibri"/>
-        </w:rPr>
-        <w:t xml:space="preserve">物理芯片 HA 微体系结构和端口级 Switch 排队、仲裁与拥塞不属于本次⁠验⁠证⁠结⁠论⁠。</w:t>
       </w:r>
     </w:p>
     <w:p>

</xml_diff>

<commit_message>
docs: streamline delivery wording and preserve technical boundaries
</commit_message>
<xml_diff>
--- a/docs/design/cc_ep_deliverable2_verification_reliability_ha.docx
+++ b/docs/design/cc_ep_deliverable2_verification_reliability_ha.docx
@@ -1402,7 +1402,7 @@
         <w:rPr>
           <w:rFonts w:ascii="Calibri" w:hAnsi="Calibri" w:eastAsia="Microsoft YaHei" w:cs="Calibri"/>
         </w:rPr>
-        <w:t xml:space="preserve">每个模型只承担明确的协议论证职责，最终由端到端测试补充真实数据路径、缓存容量和⁠运⁠行⁠拓⁠扑⁠。</w:t>
+        <w:t xml:space="preserve">各模型分别承担明确的协议论证职责，端到端测试补充数据路径、缓存容量和运行⁠拓⁠扑⁠验⁠证⁠。</w:t>
       </w:r>
     </w:p>
     <w:p>
@@ -1934,7 +1934,7 @@
         <w:rPr>
           <w:rFonts w:ascii="Calibri" w:hAnsi="Calibri" w:eastAsia="Microsoft YaHei" w:cs="Calibri"/>
         </w:rPr>
-        <w:t xml:space="preserve">模型动作与实现机制采用稳定语义对应，而不依赖⁠源⁠码⁠行⁠号⁠：</w:t>
+        <w:t xml:space="preserve">模型动作与实现机制采用稳定⁠语⁠义⁠对⁠应⁠：</w:t>
       </w:r>
     </w:p>
     <w:tbl>
@@ -5574,7 +5574,7 @@
         <w:rPr>
           <w:rFonts w:ascii="Calibri" w:hAnsi="Calibri" w:eastAsia="Microsoft YaHei" w:cs="Calibri"/>
         </w:rPr>
-        <w:t xml:space="preserve">同一测试可同时包含多个故障动作，因此动作覆盖数不等于仿真⁠测⁠试⁠总⁠数⁠。</w:t>
+        <w:t xml:space="preserve">故障动作按类别计数，同一测试可计入多个类别；仿真测试总数⁠为⁠ ⁠5⁠2⁠。</w:t>
       </w:r>
     </w:p>
     <w:p>

</xml_diff>

<commit_message>
docs: refine delivery figures and metric presentation
Publish the existing partial Stage2 working revision with paired DOCX/PDF artifacts, figure sources, recomputed data and document tests. Preserve the historical execution audit; it is not the current remote experiment status.

Validation: 3 document pairs synchronized, 41 unit tests passed, recomputed data matched. Full visual acceptance remains incomplete: four figures fail existing geometry/font checks and generated SVG has trailing whitespace. Exclude the stale layout QA report and all experiment/protocol/test-suite changes.
</commit_message>
<xml_diff>
--- a/docs/design/cc_ep_deliverable2_verification_reliability_ha.docx
+++ b/docs/design/cc_ep_deliverable2_verification_reliability_ha.docx
@@ -345,7 +345,7 @@
       <w:r>
         <w:drawing>
           <wp:inline distT="0" distB="0" distL="0" distR="0">
-            <wp:extent cx="5580000" cy="1134085"/>
+            <wp:extent cx="4636800" cy="4140000"/>
             <wp:effectExtent l="0" t="0" r="0" b="0"/>
             <wp:docPr id="1" name="图 1-1 UBCC 分层验证体系" descr="图 1-1 UBCC 分层验证体系"/>
             <wp:cNvGraphicFramePr>
@@ -367,7 +367,7 @@
                   <pic:spPr>
                     <a:xfrm>
                       <a:off x="0" y="0"/>
-                      <a:ext cx="5580000" cy="1134085"/>
+                      <a:ext cx="4636800" cy="4140000"/>
                     </a:xfrm>
                     <a:prstGeom prst="rect">
                       <a:avLst/>

</xml_diff>